<commit_message>
Add the long-run results, the final model and the updated report
- Final model (iteration 560) saved as models/chaturangzero_final.pt
- Long-run training log, benchmark curves and match logs in results/
- results/README.md, README.md and training/README.md updated with the
  final numbers and the commands used
- Report (Markdown and Word) updated with the long run, the lower
  learning rate stretches, the bigger-network attempt and a conclusion
- plot_training_curves.py spaces out markers on long runs

Co-Authored-By: Claude Opus 5.5 <noreply@anthropic.com>
</commit_message>
<xml_diff>
--- a/report/REPORT.docx
+++ b/report/REPORT.docx
@@ -64,79 +64,85 @@
         <w:t xml:space="preserve"> </w:t>
       </w:r>
       <w:r>
-        <w:t xml:space="preserve">itself. The full system runs on a single CPU: a rules engine checked by unit</w:t>
-      </w:r>
-      <w:r>
-        <w:t xml:space="preserve"> </w:t>
-      </w:r>
-      <w:r>
-        <w:t xml:space="preserve">tests, the network, search, a self-play training loop with a replay buffer, and</w:t>
-      </w:r>
-      <w:r>
-        <w:t xml:space="preserve"> </w:t>
-      </w:r>
-      <w:r>
-        <w:t xml:space="preserve">an evaluation suite. We trained two final runs of 400 self-play games each</w:t>
-      </w:r>
-      <w:r>
-        <w:t xml:space="preserve"> </w:t>
-      </w:r>
-      <w:r>
-        <w:t xml:space="preserve">(50 simulations per move, a 4-block, 64-filter network, about 7 hours per run).</w:t>
-      </w:r>
-      <w:r>
-        <w:t xml:space="preserve"> </w:t>
-      </w:r>
-      <w:r>
-        <w:t xml:space="preserve">The policy loss fell from about 5 to 2.2, but the trained agent is not</w:t>
-      </w:r>
-      <w:r>
-        <w:t xml:space="preserve"> </w:t>
-      </w:r>
-      <w:r>
-        <w:t xml:space="preserve">measurably stronger than the untrained network. Against an untrained network, a</w:t>
-      </w:r>
-      <w:r>
-        <w:t xml:space="preserve"> </w:t>
-      </w:r>
-      <w:r>
-        <w:t xml:space="preserve">random player and a greedy-capture player, every checkpoint scores within its</w:t>
-      </w:r>
-      <w:r>
-        <w:t xml:space="preserve"> </w:t>
-      </w:r>
-      <w:r>
-        <w:t xml:space="preserve">95% margin of 0.5. In six games against a human new to chess, the agent lost 3</w:t>
-      </w:r>
-      <w:r>
-        <w:t xml:space="preserve"> </w:t>
-      </w:r>
-      <w:r>
-        <w:t xml:space="preserve">and drew 3. We measured why: about 80% of self-play games are drawn, mostly by</w:t>
-      </w:r>
-      <w:r>
-        <w:t xml:space="preserve"> </w:t>
-      </w:r>
-      <w:r>
-        <w:t xml:space="preserve">the 100-ply no-progress rule, so the value head is trained almost only on</w:t>
-      </w:r>
-      <w:r>
-        <w:t xml:space="preserve"> </w:t>
-      </w:r>
-      <w:r>
-        <w:t xml:space="preserve">targets of 0 and search cannot tell good positions from bad ones. We report</w:t>
-      </w:r>
-      <w:r>
-        <w:t xml:space="preserve"> </w:t>
-      </w:r>
-      <w:r>
-        <w:t xml:space="preserve">this negative result in full, along with the diagnosis and what we expect would</w:t>
-      </w:r>
-      <w:r>
-        <w:t xml:space="preserve"> </w:t>
-      </w:r>
-      <w:r>
-        <w:t xml:space="preserve">fix it.</w:t>
+        <w:t xml:space="preserve">itself. The system has a rules engine checked by unit tests, the network,</w:t>
+      </w:r>
+      <w:r>
+        <w:t xml:space="preserve"> </w:t>
+      </w:r>
+      <w:r>
+        <w:t xml:space="preserve">search, a self-play training loop with a replay buffer, and an evaluation</w:t>
+      </w:r>
+      <w:r>
+        <w:t xml:space="preserve"> </w:t>
+      </w:r>
+      <w:r>
+        <w:t xml:space="preserve">suite. Our first two runs of 400 self-play games each (50 simulations per move,</w:t>
+      </w:r>
+      <w:r>
+        <w:t xml:space="preserve"> </w:t>
+      </w:r>
+      <w:r>
+        <w:t xml:space="preserve">a 4-block, 64-filter network) did not make the agent measurably stronger than</w:t>
+      </w:r>
+      <w:r>
+        <w:t xml:space="preserve"> </w:t>
+      </w:r>
+      <w:r>
+        <w:t xml:space="preserve">an untrained network: about 80% of games were drawn and the data was far too</w:t>
+      </w:r>
+      <w:r>
+        <w:t xml:space="preserve"> </w:t>
+      </w:r>
+      <w:r>
+        <w:t xml:space="preserve">small. We then made self-play about 11 times faster without changing the rules</w:t>
+      </w:r>
+      <w:r>
+        <w:t xml:space="preserve"> </w:t>
+      </w:r>
+      <w:r>
+        <w:t xml:space="preserve">or the search, and trained for 540 more iterations (54,000 games, about 144</w:t>
+      </w:r>
+      <w:r>
+        <w:t xml:space="preserve"> </w:t>
+      </w:r>
+      <w:r>
+        <w:t xml:space="preserve">hours on one laptop), lowering the learning rate at the end. Under the same</w:t>
+      </w:r>
+      <w:r>
+        <w:t xml:space="preserve"> </w:t>
+      </w:r>
+      <w:r>
+        <w:t xml:space="preserve">course constraints, the final model beats the model it started from 27 wins to</w:t>
+      </w:r>
+      <w:r>
+        <w:t xml:space="preserve"> </w:t>
+      </w:r>
+      <w:r>
+        <w:t xml:space="preserve">0 (score 0.657 over 100 games), beats a random player 16 to 0 and an untrained</w:t>
+      </w:r>
+      <w:r>
+        <w:t xml:space="preserve"> </w:t>
+      </w:r>
+      <w:r>
+        <w:t xml:space="preserve">network 17 to 4, but still draws almost every game against a greedy-capture</w:t>
+      </w:r>
+      <w:r>
+        <w:t xml:space="preserve"> </w:t>
+      </w:r>
+      <w:r>
+        <w:t xml:space="preserve">player. Its main weakness is converting an advantage: most of its games end by</w:t>
+      </w:r>
+      <w:r>
+        <w:t xml:space="preserve"> </w:t>
+      </w:r>
+      <w:r>
+        <w:t xml:space="preserve">the 100-ply no-progress rule rather than checkmate. A larger 6-block,</w:t>
+      </w:r>
+      <w:r>
+        <w:t xml:space="preserve"> </w:t>
+      </w:r>
+      <w:r>
+        <w:t xml:space="preserve">128-filter network did not catch up in the time we had.</w:t>
       </w:r>
     </w:p>
     <w:bookmarkEnd w:id="9"/>
@@ -267,6 +273,32 @@
       </w:r>
       <w:r>
         <w:t xml:space="preserve">iterations and baseline players, with learning curves. All four are complete.</w:t>
+      </w:r>
+    </w:p>
+    <w:p>
+      <w:pPr>
+        <w:pStyle w:val="BodyText"/>
+      </w:pPr>
+      <w:r>
+        <w:t xml:space="preserve">The report follows the project in order: the first runs (Section 5.1 and</w:t>
+      </w:r>
+      <w:r>
+        <w:t xml:space="preserve"> </w:t>
+      </w:r>
+      <w:r>
+        <w:t xml:space="preserve">6.1 to 6.5) gave a negative result, the diagnosis (Section 7) led to a faster</w:t>
+      </w:r>
+      <w:r>
+        <w:t xml:space="preserve"> </w:t>
+      </w:r>
+      <w:r>
+        <w:t xml:space="preserve">pipeline and a much longer run, and that long run produced the final model</w:t>
+      </w:r>
+      <w:r>
+        <w:t xml:space="preserve"> </w:t>
+      </w:r>
+      <w:r>
+        <w:t xml:space="preserve">(Sections 5.3 and 6.6 to 6.10).</w:t>
       </w:r>
     </w:p>
     <w:bookmarkEnd w:id="10"/>
@@ -1203,13 +1235,13 @@
         <w:t xml:space="preserve"> </w:t>
       </w:r>
       <w:r>
-        <w:t xml:space="preserve">The current network plays 20 games against itself with 50</w:t>
-      </w:r>
-      <w:r>
-        <w:t xml:space="preserve"> </w:t>
-      </w:r>
-      <w:r>
-        <w:t xml:space="preserve">simulations per move. Moves are sampled in proportion to visit counts.</w:t>
+        <w:t xml:space="preserve">The current network plays 20 games (100 in the long run)</w:t>
+      </w:r>
+      <w:r>
+        <w:t xml:space="preserve"> </w:t>
+      </w:r>
+      <w:r>
+        <w:t xml:space="preserve">against itself with 50 simulations per move. Moves are sampled in proportion to visit counts.</w:t>
       </w:r>
       <w:r>
         <w:t xml:space="preserve"> </w:t>
@@ -1249,19 +1281,25 @@
         <w:t xml:space="preserve"> </w:t>
       </w:r>
       <w:r>
-        <w:t xml:space="preserve">Examples go into a replay buffer of the latest 20,000</w:t>
-      </w:r>
-      <w:r>
-        <w:t xml:space="preserve"> </w:t>
-      </w:r>
-      <w:r>
-        <w:t xml:space="preserve">positions. The network takes 400 Adam steps (learning rate 1e-3) on random</w:t>
-      </w:r>
-      <w:r>
-        <w:t xml:space="preserve"> </w:t>
-      </w:r>
-      <w:r>
-        <w:t xml:space="preserve">batches of 64.</w:t>
+        <w:t xml:space="preserve">Examples go into a replay buffer of the latest positions</w:t>
+      </w:r>
+      <w:r>
+        <w:t xml:space="preserve"> </w:t>
+      </w:r>
+      <w:r>
+        <w:t xml:space="preserve">(20,000 in the first runs, 250,000 in the long run). The network takes Adam</w:t>
+      </w:r>
+      <w:r>
+        <w:t xml:space="preserve"> </w:t>
+      </w:r>
+      <w:r>
+        <w:t xml:space="preserve">steps on random batches (400 steps of 64 in the first runs, 500 steps of</w:t>
+      </w:r>
+      <w:r>
+        <w:t xml:space="preserve"> </w:t>
+      </w:r>
+      <w:r>
+        <w:t xml:space="preserve">256 in the long run).</w:t>
       </w:r>
     </w:p>
     <w:p>
@@ -1517,7 +1555,7 @@
               <w:pStyle w:val="Compact"/>
             </w:pPr>
             <w:r>
-              <w:t xml:space="preserve">baseline players, benchmark, game-ending classifier, human-game log</w:t>
+              <w:t xml:space="preserve">baseline players, benchmark, parallel matches, game-ending classifier, human-game log</w:t>
             </w:r>
           </w:p>
         </w:tc>
@@ -1528,7 +1566,7 @@
         <w:pStyle w:val="BodyText"/>
       </w:pPr>
       <w:r>
-        <w:t xml:space="preserve">97 automated tests cover the rules (36 tests, including check, checkmate,</w:t>
+        <w:t xml:space="preserve">108 automated tests cover the rules (36 tests, including check, checkmate,</w:t>
       </w:r>
       <w:r>
         <w:t xml:space="preserve"> </w:t>
@@ -1555,8 +1593,181 @@
         <w:t xml:space="preserve">benchmark scoring and the evaluation tools. All runs are seeded and repeatable.</w:t>
       </w:r>
     </w:p>
+    <w:p>
+      <w:pPr>
+        <w:pStyle w:val="BodyText"/>
+      </w:pPr>
+      <w:r>
+        <w:rPr>
+          <w:b/>
+          <w:bCs/>
+        </w:rPr>
+        <w:t xml:space="preserve">Faster self-play.</w:t>
+      </w:r>
+      <w:r>
+        <w:t xml:space="preserve"> </w:t>
+      </w:r>
+      <w:r>
+        <w:t xml:space="preserve">For the long run we sped up self-play about 11 times on</w:t>
+      </w:r>
+      <w:r>
+        <w:t xml:space="preserve"> </w:t>
+      </w:r>
+      <w:r>
+        <w:t xml:space="preserve">the same hardware, without changing what it computes:</w:t>
+      </w:r>
+    </w:p>
+    <w:tbl>
+      <w:tblPr>
+        <w:tblStyle w:val="Table"/>
+        <w:tblW w:type="pct" w:w="5000"/>
+        <w:tblLayout w:type="fixed"/>
+        <w:tblLook w:firstRow="1" w:lastRow="0" w:firstColumn="0" w:lastColumn="0" w:noHBand="0" w:noVBand="0" w:val="0020"/>
+      </w:tblPr>
+      <w:tblGrid>
+        <w:gridCol w:w="3960"/>
+        <w:gridCol w:w="3960"/>
+      </w:tblGrid>
+      <w:tr>
+        <w:trPr>
+          <w:tblHeader w:val="on"/>
+        </w:trPr>
+        <w:tc>
+          <w:tcPr/>
+          <w:p>
+            <w:pPr>
+              <w:pStyle w:val="Compact"/>
+            </w:pPr>
+            <w:r>
+              <w:t xml:space="preserve">Change</w:t>
+            </w:r>
+          </w:p>
+        </w:tc>
+        <w:tc>
+          <w:tcPr/>
+          <w:p>
+            <w:pPr>
+              <w:pStyle w:val="Compact"/>
+            </w:pPr>
+            <w:r>
+              <w:t xml:space="preserve">ms per move (50 simulations)</w:t>
+            </w:r>
+          </w:p>
+        </w:tc>
+      </w:tr>
+      <w:tr>
+        <w:tc>
+          <w:tcPr/>
+          <w:p>
+            <w:pPr>
+              <w:pStyle w:val="Compact"/>
+            </w:pPr>
+            <w:r>
+              <w:t xml:space="preserve">Original</w:t>
+            </w:r>
+          </w:p>
+        </w:tc>
+        <w:tc>
+          <w:tcPr/>
+          <w:p>
+            <w:pPr>
+              <w:pStyle w:val="Compact"/>
+            </w:pPr>
+            <w:r>
+              <w:t xml:space="preserve">259</w:t>
+            </w:r>
+          </w:p>
+        </w:tc>
+      </w:tr>
+      <w:tr>
+        <w:tc>
+          <w:tcPr/>
+          <w:p>
+            <w:pPr>
+              <w:pStyle w:val="Compact"/>
+            </w:pPr>
+            <w:r>
+              <w:t xml:space="preserve">Faster rules engine: legal moves cached per position, check detection that looks outward from the king, precomputed move tables</w:t>
+            </w:r>
+          </w:p>
+        </w:tc>
+        <w:tc>
+          <w:tcPr/>
+          <w:p>
+            <w:pPr>
+              <w:pStyle w:val="Compact"/>
+            </w:pPr>
+            <w:r>
+              <w:t xml:space="preserve">48</w:t>
+            </w:r>
+          </w:p>
+        </w:tc>
+      </w:tr>
+      <w:tr>
+        <w:tc>
+          <w:tcPr/>
+          <w:p>
+            <w:pPr>
+              <w:pStyle w:val="Compact"/>
+            </w:pPr>
+            <w:r>
+              <w:t xml:space="preserve">Network copy for search with batch normalization folded into the convolutions</w:t>
+            </w:r>
+          </w:p>
+        </w:tc>
+        <w:tc>
+          <w:tcPr/>
+          <w:p>
+            <w:pPr>
+              <w:pStyle w:val="Compact"/>
+            </w:pPr>
+            <w:r>
+              <w:t xml:space="preserve">19</w:t>
+            </w:r>
+          </w:p>
+        </w:tc>
+      </w:tr>
+    </w:tbl>
+    <w:p>
+      <w:pPr>
+        <w:pStyle w:val="BodyText"/>
+      </w:pPr>
+      <w:r>
+        <w:t xml:space="preserve">On top of that, 6 worker processes play games in parallel, each with its own</w:t>
+      </w:r>
+      <w:r>
+        <w:t xml:space="preserve"> </w:t>
+      </w:r>
+      <w:r>
+        <w:t xml:space="preserve">seed derived from the run seed, the iteration and the game number, so a run</w:t>
+      </w:r>
+      <w:r>
+        <w:t xml:space="preserve"> </w:t>
+      </w:r>
+      <w:r>
+        <w:t xml:space="preserve">does not depend on the number of workers. Training steps run on the laptop’s</w:t>
+      </w:r>
+      <w:r>
+        <w:t xml:space="preserve"> </w:t>
+      </w:r>
+      <w:r>
+        <w:t xml:space="preserve">GPU. A test compares the fast rules engine with a frozen copy of the original</w:t>
+      </w:r>
+      <w:r>
+        <w:t xml:space="preserve"> </w:t>
+      </w:r>
+      <w:r>
+        <w:t xml:space="preserve">on every ply of 40 random games and on 3,000 random positions (same legal moves</w:t>
+      </w:r>
+      <w:r>
+        <w:t xml:space="preserve"> </w:t>
+      </w:r>
+      <w:r>
+        <w:t xml:space="preserve">in the same order, same check and game results).</w:t>
+      </w:r>
+    </w:p>
     <w:bookmarkEnd w:id="17"/>
-    <w:bookmarkStart w:id="20" w:name="experiments"/>
+    <w:bookmarkStart w:id="21" w:name="experiments"/>
     <w:p>
       <w:pPr>
         <w:pStyle w:val="Heading1"/>
@@ -2084,9 +2295,249 @@
         <w:t xml:space="preserve">our agent.</w:t>
       </w:r>
     </w:p>
+    <w:p>
+      <w:pPr>
+        <w:pStyle w:val="FirstParagraph"/>
+      </w:pPr>
+      <w:r>
+        <w:t xml:space="preserve">Head-to-head matches between two checkpoints use the same protocol. In the long</w:t>
+      </w:r>
+      <w:r>
+        <w:t xml:space="preserve"> </w:t>
+      </w:r>
+      <w:r>
+        <w:t xml:space="preserve">run every benchmark and match uses 100 games, with margins of about 0.03 to</w:t>
+      </w:r>
+      <w:r>
+        <w:t xml:space="preserve"> </w:t>
+      </w:r>
+      <w:r>
+        <w:t xml:space="preserve">0.06.</w:t>
+      </w:r>
+    </w:p>
     <w:bookmarkEnd w:id="19"/>
+    <w:bookmarkStart w:id="20" w:name="the-long-run"/>
+    <w:p>
+      <w:pPr>
+        <w:pStyle w:val="Heading2"/>
+      </w:pPr>
+      <w:r>
+        <w:t xml:space="preserve">5.3 The long run</w:t>
+      </w:r>
+    </w:p>
+    <w:p>
+      <w:pPr>
+        <w:pStyle w:val="FirstParagraph"/>
+      </w:pPr>
+      <w:r>
+        <w:t xml:space="preserve">The long run continues from final B (iteration 20) with the same official</w:t>
+      </w:r>
+      <w:r>
+        <w:t xml:space="preserve"> </w:t>
+      </w:r>
+      <w:r>
+        <w:t xml:space="preserve">settings (4 x 64 network, 50 simulations, root noise, repetition avoidance,</w:t>
+      </w:r>
+      <w:r>
+        <w:t xml:space="preserve"> </w:t>
+      </w:r>
+      <w:r>
+        <w:t xml:space="preserve">800-ply cap, draws valued 0). Each iteration plays 100 self-play games and then</w:t>
+      </w:r>
+      <w:r>
+        <w:t xml:space="preserve"> </w:t>
+      </w:r>
+      <w:r>
+        <w:t xml:space="preserve">takes 500 Adam steps of batch 256 from a buffer of 250,000 positions.</w:t>
+      </w:r>
+    </w:p>
+    <w:tbl>
+      <w:tblPr>
+        <w:tblStyle w:val="Table"/>
+        <w:tblW w:type="auto" w:w="0"/>
+        <w:tblLook w:firstRow="1" w:lastRow="0" w:firstColumn="0" w:lastColumn="0" w:noHBand="0" w:noVBand="0" w:val="0020"/>
+      </w:tblPr>
+      <w:tblGrid>
+        <w:gridCol w:w="2640"/>
+        <w:gridCol w:w="2640"/>
+        <w:gridCol w:w="2640"/>
+      </w:tblGrid>
+      <w:tr>
+        <w:trPr>
+          <w:tblHeader w:val="on"/>
+        </w:trPr>
+        <w:tc>
+          <w:tcPr/>
+          <w:p>
+            <w:pPr>
+              <w:pStyle w:val="Compact"/>
+            </w:pPr>
+            <w:r>
+              <w:t xml:space="preserve">Iterations</w:t>
+            </w:r>
+          </w:p>
+        </w:tc>
+        <w:tc>
+          <w:tcPr/>
+          <w:p>
+            <w:pPr>
+              <w:pStyle w:val="Compact"/>
+            </w:pPr>
+            <w:r>
+              <w:t xml:space="preserve">Learning rate</w:t>
+            </w:r>
+          </w:p>
+        </w:tc>
+        <w:tc>
+          <w:tcPr/>
+          <w:p>
+            <w:pPr>
+              <w:pStyle w:val="Compact"/>
+            </w:pPr>
+            <w:r>
+              <w:t xml:space="preserve">Notes</w:t>
+            </w:r>
+          </w:p>
+        </w:tc>
+      </w:tr>
+      <w:tr>
+        <w:tc>
+          <w:tcPr/>
+          <w:p>
+            <w:pPr>
+              <w:pStyle w:val="Compact"/>
+            </w:pPr>
+            <w:r>
+              <w:t xml:space="preserve">21 to 420</w:t>
+            </w:r>
+          </w:p>
+        </w:tc>
+        <w:tc>
+          <w:tcPr/>
+          <w:p>
+            <w:pPr>
+              <w:pStyle w:val="Compact"/>
+            </w:pPr>
+            <w:r>
+              <w:t xml:space="preserve">1e-3</w:t>
+            </w:r>
+          </w:p>
+        </w:tc>
+        <w:tc>
+          <w:tcPr/>
+          <w:p>
+            <w:pPr>
+              <w:pStyle w:val="Compact"/>
+            </w:pPr>
+          </w:p>
+        </w:tc>
+      </w:tr>
+      <w:tr>
+        <w:tc>
+          <w:tcPr/>
+          <w:p>
+            <w:pPr>
+              <w:pStyle w:val="Compact"/>
+            </w:pPr>
+            <w:r>
+              <w:t xml:space="preserve">421 to 500</w:t>
+            </w:r>
+          </w:p>
+        </w:tc>
+        <w:tc>
+          <w:tcPr/>
+          <w:p>
+            <w:pPr>
+              <w:pStyle w:val="Compact"/>
+            </w:pPr>
+            <w:r>
+              <w:t xml:space="preserve">1e-4</w:t>
+            </w:r>
+          </w:p>
+        </w:tc>
+        <w:tc>
+          <w:tcPr/>
+          <w:p>
+            <w:pPr>
+              <w:pStyle w:val="Compact"/>
+            </w:pPr>
+            <w:r>
+              <w:t xml:space="preserve">two stretches of 40 iterations</w:t>
+            </w:r>
+          </w:p>
+        </w:tc>
+      </w:tr>
+      <w:tr>
+        <w:tc>
+          <w:tcPr/>
+          <w:p>
+            <w:pPr>
+              <w:pStyle w:val="Compact"/>
+            </w:pPr>
+            <w:r>
+              <w:t xml:space="preserve">501 to 560</w:t>
+            </w:r>
+          </w:p>
+        </w:tc>
+        <w:tc>
+          <w:tcPr/>
+          <w:p>
+            <w:pPr>
+              <w:pStyle w:val="Compact"/>
+            </w:pPr>
+            <w:r>
+              <w:t xml:space="preserve">3e-5</w:t>
+            </w:r>
+          </w:p>
+        </w:tc>
+        <w:tc>
+          <w:tcPr/>
+          <w:p>
+            <w:pPr>
+              <w:pStyle w:val="Compact"/>
+            </w:pPr>
+            <w:r>
+              <w:t xml:space="preserve">final stretch</w:t>
+            </w:r>
+          </w:p>
+        </w:tc>
+      </w:tr>
+    </w:tbl>
+    <w:p>
+      <w:pPr>
+        <w:pStyle w:val="BodyText"/>
+      </w:pPr>
+      <w:r>
+        <w:t xml:space="preserve">That is 540 iterations, 54,000 games and about 23.7 million positions, in</w:t>
+      </w:r>
+      <w:r>
+        <w:t xml:space="preserve"> </w:t>
+      </w:r>
+      <w:r>
+        <w:t xml:space="preserve">about 144 hours. We also tried a larger network (6 blocks, 128 filters, 2.3</w:t>
+      </w:r>
+      <w:r>
+        <w:t xml:space="preserve"> </w:t>
+      </w:r>
+      <w:r>
+        <w:t xml:space="preserve">million parameters) for 61 iterations; its first 5 iterations trained on games</w:t>
+      </w:r>
+      <w:r>
+        <w:t xml:space="preserve"> </w:t>
+      </w:r>
+      <w:r>
+        <w:t xml:space="preserve">played by our best 4 x 64 checkpoint so it did not start from random play</w:t>
+      </w:r>
+      <w:r>
+        <w:t xml:space="preserve"> </w:t>
+      </w:r>
+      <w:r>
+        <w:t xml:space="preserve">(Section 6.10).</w:t>
+      </w:r>
+    </w:p>
     <w:bookmarkEnd w:id="20"/>
-    <w:bookmarkStart w:id="39" w:name="results"/>
+    <w:bookmarkEnd w:id="21"/>
+    <w:bookmarkStart w:id="51" w:name="results"/>
     <w:p>
       <w:pPr>
         <w:pStyle w:val="Heading1"/>
@@ -2095,7 +2546,15 @@
         <w:t xml:space="preserve">6. Results</w:t>
       </w:r>
     </w:p>
-    <w:bookmarkStart w:id="24" w:name="learning-curves"/>
+    <w:p>
+      <w:pPr>
+        <w:pStyle w:val="FirstParagraph"/>
+      </w:pPr>
+      <w:r>
+        <w:t xml:space="preserve">Sections 6.1 to 6.5 are the first runs; 6.6 to 6.10 are the long run.</w:t>
+      </w:r>
+    </w:p>
+    <w:bookmarkStart w:id="25" w:name="learning-curves"/>
     <w:p>
       <w:pPr>
         <w:pStyle w:val="Heading2"/>
@@ -2113,18 +2572,18 @@
           <wp:inline>
             <wp:extent cx="5334000" cy="3394363"/>
             <wp:effectExtent b="0" l="0" r="0" t="0"/>
-            <wp:docPr descr="Policy loss, value loss, share of decisive games and game length per iteration for the final runs and run 1." title="" id="22" name="Picture"/>
+            <wp:docPr descr="Policy loss, value loss, share of decisive games and game length per iteration for the final runs and run 1." title="" id="23" name="Picture"/>
             <a:graphic>
               <a:graphicData uri="http://schemas.openxmlformats.org/drawingml/2006/picture">
                 <pic:pic>
                   <pic:nvPicPr>
-                    <pic:cNvPr descr="../results/training_curves.png" id="23" name="Picture"/>
+                    <pic:cNvPr descr="../results/training_curves.png" id="24" name="Picture"/>
                     <pic:cNvPicPr>
                       <a:picLocks noChangeArrowheads="1" noChangeAspect="1"/>
                     </pic:cNvPicPr>
                   </pic:nvPicPr>
                   <pic:blipFill>
-                    <a:blip r:embed="rId21"/>
+                    <a:blip r:embed="rId22"/>
                     <a:stretch>
                       <a:fillRect/>
                     </a:stretch>
@@ -2191,8 +2650,8 @@
         <w:t xml:space="preserve">stay long (400 to 600 plies on average).</w:t>
       </w:r>
     </w:p>
-    <w:bookmarkEnd w:id="24"/>
-    <w:bookmarkStart w:id="31" w:name="benchmarks-against-fixed-opponents"/>
+    <w:bookmarkEnd w:id="25"/>
+    <w:bookmarkStart w:id="32" w:name="benchmarks-against-fixed-opponents"/>
     <w:p>
       <w:pPr>
         <w:pStyle w:val="Heading2"/>
@@ -2210,18 +2669,18 @@
           <wp:inline>
             <wp:extent cx="5334000" cy="2963333"/>
             <wp:effectExtent b="0" l="0" r="0" t="0"/>
-            <wp:docPr descr="Benchmark score per iteration for final run B against the untrained network, random and greedy-capture players. The dashed line is an even score." title="" id="26" name="Picture"/>
+            <wp:docPr descr="Benchmark score per iteration for final run B against the untrained network, random and greedy-capture players. The dashed line is an even score." title="" id="27" name="Picture"/>
             <a:graphic>
               <a:graphicData uri="http://schemas.openxmlformats.org/drawingml/2006/picture">
                 <pic:pic>
                   <pic:nvPicPr>
-                    <pic:cNvPr descr="../results/benchmark_curve_finalB.png" id="27" name="Picture"/>
+                    <pic:cNvPr descr="../results/benchmark_curve_finalB.png" id="28" name="Picture"/>
                     <pic:cNvPicPr>
                       <a:picLocks noChangeArrowheads="1" noChangeAspect="1"/>
                     </pic:cNvPicPr>
                   </pic:nvPicPr>
                   <pic:blipFill>
-                    <a:blip r:embed="rId25"/>
+                    <a:blip r:embed="rId26"/>
                     <a:stretch>
                       <a:fillRect/>
                     </a:stretch>
@@ -2643,18 +3102,18 @@
           <wp:inline>
             <wp:extent cx="5334000" cy="2963333"/>
             <wp:effectExtent b="0" l="0" r="0" t="0"/>
-            <wp:docPr descr="Final A and final B against the untrained network." title="" id="29" name="Picture"/>
+            <wp:docPr descr="Final A and final B against the untrained network." title="" id="30" name="Picture"/>
             <a:graphic>
               <a:graphicData uri="http://schemas.openxmlformats.org/drawingml/2006/picture">
                 <pic:pic>
                   <pic:nvPicPr>
-                    <pic:cNvPr descr="../results/benchmark_curve_final_vs_untrained.png" id="30" name="Picture"/>
+                    <pic:cNvPr descr="../results/benchmark_curve_final_vs_untrained.png" id="31" name="Picture"/>
                     <pic:cNvPicPr>
                       <a:picLocks noChangeArrowheads="1" noChangeAspect="1"/>
                     </pic:cNvPicPr>
                   </pic:nvPicPr>
                   <pic:blipFill>
-                    <a:blip r:embed="rId28"/>
+                    <a:blip r:embed="rId29"/>
                     <a:stretch>
                       <a:fillRect/>
                     </a:stretch>
@@ -2689,8 +3148,8 @@
         <w:t xml:space="preserve">Final A and final B against the untrained network.</w:t>
       </w:r>
     </w:p>
-    <w:bookmarkEnd w:id="31"/>
-    <w:bookmarkStart w:id="32" w:name="against-earlier-iterations"/>
+    <w:bookmarkEnd w:id="32"/>
+    <w:bookmarkStart w:id="33" w:name="against-earlier-iterations"/>
     <w:p>
       <w:pPr>
         <w:pStyle w:val="Heading2"/>
@@ -2935,8 +3394,8 @@
         <w:t xml:space="preserve">network.</w:t>
       </w:r>
     </w:p>
-    <w:bookmarkEnd w:id="32"/>
-    <w:bookmarkStart w:id="33" w:name="agent-vs.-human"/>
+    <w:bookmarkEnd w:id="33"/>
+    <w:bookmarkStart w:id="34" w:name="agent-vs.-human"/>
     <w:p>
       <w:pPr>
         <w:pStyle w:val="Heading2"/>
@@ -3486,8 +3945,8 @@
         <w:t xml:space="preserve">human stalemated while going for checkmate.</w:t>
       </w:r>
     </w:p>
-    <w:bookmarkEnd w:id="33"/>
-    <w:bookmarkStart w:id="34" w:name="how-games-end"/>
+    <w:bookmarkEnd w:id="34"/>
+    <w:bookmarkStart w:id="35" w:name="how-games-end"/>
     <w:p>
       <w:pPr>
         <w:pStyle w:val="Heading2"/>
@@ -3756,108 +4215,14 @@
         </w:tc>
       </w:tr>
     </w:tbl>
-    <w:bookmarkEnd w:id="34"/>
-    <w:bookmarkStart w:id="38" w:name="X7e697f50ae1dd5e44c97332acfdfba23be11cde"/>
+    <w:bookmarkEnd w:id="35"/>
+    <w:bookmarkStart w:id="39" w:name="long-run-learning-curves"/>
     <w:p>
       <w:pPr>
         <w:pStyle w:val="Heading2"/>
       </w:pPr>
       <w:r>
-        <w:t xml:space="preserve">6.6 Exploratory runs (outside the course constraints)</w:t>
-      </w:r>
-    </w:p>
-    <w:p>
-      <w:pPr>
-        <w:pStyle w:val="FirstParagraph"/>
-      </w:pPr>
-      <w:r>
-        <w:t xml:space="preserve">We ran two short experiments that break the constraints, to test the</w:t>
-      </w:r>
-      <w:r>
-        <w:t xml:space="preserve"> </w:t>
-      </w:r>
-      <w:r>
-        <w:t xml:space="preserve">diagnosis below. They are not the final agent.</w:t>
-      </w:r>
-    </w:p>
-    <w:p>
-      <w:pPr>
-        <w:pStyle w:val="Compact"/>
-        <w:numPr>
-          <w:ilvl w:val="0"/>
-          <w:numId w:val="1005"/>
-        </w:numPr>
-      </w:pPr>
-      <w:r>
-        <w:rPr>
-          <w:b/>
-          <w:bCs/>
-        </w:rPr>
-        <w:t xml:space="preserve">Material value targets</w:t>
-      </w:r>
-      <w:r>
-        <w:t xml:space="preserve"> </w:t>
-      </w:r>
-      <w:r>
-        <w:t xml:space="preserve">(30 simulations, 10 x 10 games): drawn games get a</w:t>
-      </w:r>
-      <w:r>
-        <w:t xml:space="preserve"> </w:t>
-      </w:r>
-      <w:r>
-        <w:t xml:space="preserve">value target from the final material balance, which uses piece values. The</w:t>
-      </w:r>
-      <w:r>
-        <w:t xml:space="preserve"> </w:t>
-      </w:r>
-      <w:r>
-        <w:t xml:space="preserve">value head did learn material (correlation +0.45 with the material balance,</w:t>
-      </w:r>
-      <w:r>
-        <w:t xml:space="preserve"> </w:t>
-      </w:r>
-      <w:r>
-        <w:t xml:space="preserve">against +0.07 in run 1), but strength did not improve (0.474 and 0.469</w:t>
-      </w:r>
-      <w:r>
-        <w:t xml:space="preserve"> </w:t>
-      </w:r>
-      <w:r>
-        <w:t xml:space="preserve">against untrained at iterations 5 and 10).</w:t>
-      </w:r>
-    </w:p>
-    <w:p>
-      <w:pPr>
-        <w:pStyle w:val="Compact"/>
-        <w:numPr>
-          <w:ilvl w:val="0"/>
-          <w:numId w:val="1005"/>
-        </w:numPr>
-      </w:pPr>
-      <w:r>
-        <w:rPr>
-          <w:b/>
-          <w:bCs/>
-        </w:rPr>
-        <w:t xml:space="preserve">100 simulations per move</w:t>
-      </w:r>
-      <w:r>
-        <w:t xml:space="preserve"> </w:t>
-      </w:r>
-      <w:r>
-        <w:t xml:space="preserve">(10 x 10 games, also with material targets):</w:t>
-      </w:r>
-      <w:r>
-        <w:t xml:space="preserve"> </w:t>
-      </w:r>
-      <w:r>
-        <w:t xml:space="preserve">decisive games peaked at 60% in iteration 3, but strength against untrained</w:t>
-      </w:r>
-      <w:r>
-        <w:t xml:space="preserve"> </w:t>
-      </w:r>
-      <w:r>
-        <w:t xml:space="preserve">was 0.421 at iteration 5 and 0.346 at iteration 10.</w:t>
+        <w:t xml:space="preserve">6.6 Long run: learning curves</w:t>
       </w:r>
     </w:p>
     <w:p>
@@ -3869,18 +4234,18 @@
           <wp:inline>
             <wp:extent cx="5334000" cy="3394363"/>
             <wp:effectExtent b="0" l="0" r="0" t="0"/>
-            <wp:docPr descr="Exploratory runs: loss, decisive share and game length." title="" id="36" name="Picture"/>
+            <wp:docPr descr="Long run: policy loss, value loss, share of decisive self-play games and game length per iteration, with the stopped 6 x 128 network." title="" id="37" name="Picture"/>
             <a:graphic>
               <a:graphicData uri="http://schemas.openxmlformats.org/drawingml/2006/picture">
                 <pic:pic>
                   <pic:nvPicPr>
-                    <pic:cNvPr descr="../results/training_curves_exploratory.png" id="37" name="Picture"/>
+                    <pic:cNvPr descr="../results/training_curves_long.png" id="38" name="Picture"/>
                     <pic:cNvPicPr>
                       <a:picLocks noChangeArrowheads="1" noChangeAspect="1"/>
                     </pic:cNvPicPr>
                   </pic:nvPicPr>
                   <pic:blipFill>
-                    <a:blip r:embed="rId35"/>
+                    <a:blip r:embed="rId36"/>
                     <a:stretch>
                       <a:fillRect/>
                     </a:stretch>
@@ -3912,12 +4277,2159 @@
         <w:pStyle w:val="ImageCaption"/>
       </w:pPr>
       <w:r>
+        <w:t xml:space="preserve">Long run: policy loss, value loss, share of decisive self-play games and game length per iteration, with the stopped 6 x 128 network.</w:t>
+      </w:r>
+    </w:p>
+    <w:p>
+      <w:pPr>
+        <w:pStyle w:val="BodyText"/>
+      </w:pPr>
+      <w:r>
+        <w:t xml:space="preserve">The policy loss stays around 2.4, and the share of decisive self-play games</w:t>
+      </w:r>
+      <w:r>
+        <w:t xml:space="preserve"> </w:t>
+      </w:r>
+      <w:r>
+        <w:t xml:space="preserve">stays around 15 to 25%. These curves do not show the improvement, because the</w:t>
+      </w:r>
+      <w:r>
+        <w:t xml:space="preserve"> </w:t>
+      </w:r>
+      <w:r>
+        <w:t xml:space="preserve">targets move with the network: as the agent improves, so does its opponent.</w:t>
+      </w:r>
+      <w:r>
+        <w:t xml:space="preserve"> </w:t>
+      </w:r>
+      <w:r>
+        <w:t xml:space="preserve">Game length fell from about 530 to about 430 plies. Strength has to be</w:t>
+      </w:r>
+      <w:r>
+        <w:t xml:space="preserve"> </w:t>
+      </w:r>
+      <w:r>
+        <w:t xml:space="preserve">measured by matches.</w:t>
+      </w:r>
+    </w:p>
+    <w:bookmarkEnd w:id="39"/>
+    <w:bookmarkStart w:id="40" w:name="Xe31bb2348fe89a608c0ec1cce37aec517f3b50f"/>
+    <w:p>
+      <w:pPr>
+        <w:pStyle w:val="Heading2"/>
+      </w:pPr>
+      <w:r>
+        <w:t xml:space="preserve">6.7 Long run: progress against the starting model</w:t>
+      </w:r>
+    </w:p>
+    <w:p>
+      <w:pPr>
+        <w:pStyle w:val="FirstParagraph"/>
+      </w:pPr>
+      <w:r>
+        <w:t xml:space="preserve">Checkpoints of the long run against final B (iteration 20), 100 games each:</w:t>
+      </w:r>
+    </w:p>
+    <w:tbl>
+      <w:tblPr>
+        <w:tblStyle w:val="Table"/>
+        <w:tblW w:type="pct" w:w="5000"/>
+        <w:tblLayout w:type="fixed"/>
+        <w:tblLook w:firstRow="1" w:lastRow="0" w:firstColumn="0" w:lastColumn="0" w:noHBand="0" w:noVBand="0" w:val="0020"/>
+      </w:tblPr>
+      <w:tblGrid>
+        <w:gridCol w:w="1320"/>
+        <w:gridCol w:w="1320"/>
+        <w:gridCol w:w="1320"/>
+        <w:gridCol w:w="1320"/>
+        <w:gridCol w:w="1320"/>
+        <w:gridCol w:w="1320"/>
+      </w:tblGrid>
+      <w:tr>
+        <w:trPr>
+          <w:tblHeader w:val="on"/>
+        </w:trPr>
+        <w:tc>
+          <w:tcPr/>
+          <w:p>
+            <w:pPr>
+              <w:pStyle w:val="Compact"/>
+            </w:pPr>
+            <w:r>
+              <w:t xml:space="preserve">Iteration</w:t>
+            </w:r>
+          </w:p>
+        </w:tc>
+        <w:tc>
+          <w:tcPr/>
+          <w:p>
+            <w:pPr>
+              <w:pStyle w:val="Compact"/>
+            </w:pPr>
+            <w:r>
+              <w:t xml:space="preserve">Wins</w:t>
+            </w:r>
+          </w:p>
+        </w:tc>
+        <w:tc>
+          <w:tcPr/>
+          <w:p>
+            <w:pPr>
+              <w:pStyle w:val="Compact"/>
+            </w:pPr>
+            <w:r>
+              <w:t xml:space="preserve">Losses</w:t>
+            </w:r>
+          </w:p>
+        </w:tc>
+        <w:tc>
+          <w:tcPr/>
+          <w:p>
+            <w:pPr>
+              <w:pStyle w:val="Compact"/>
+            </w:pPr>
+            <w:r>
+              <w:t xml:space="preserve">Draws</w:t>
+            </w:r>
+          </w:p>
+        </w:tc>
+        <w:tc>
+          <w:tcPr/>
+          <w:p>
+            <w:pPr>
+              <w:pStyle w:val="Compact"/>
+            </w:pPr>
+            <w:r>
+              <w:t xml:space="preserve">Unfinished</w:t>
+            </w:r>
+          </w:p>
+        </w:tc>
+        <w:tc>
+          <w:tcPr/>
+          <w:p>
+            <w:pPr>
+              <w:pStyle w:val="Compact"/>
+            </w:pPr>
+            <w:r>
+              <w:t xml:space="preserve">Score</w:t>
+            </w:r>
+          </w:p>
+        </w:tc>
+      </w:tr>
+      <w:tr>
+        <w:tc>
+          <w:tcPr/>
+          <w:p>
+            <w:pPr>
+              <w:pStyle w:val="Compact"/>
+            </w:pPr>
+            <w:r>
+              <w:t xml:space="preserve">40</w:t>
+            </w:r>
+          </w:p>
+        </w:tc>
+        <w:tc>
+          <w:tcPr/>
+          <w:p>
+            <w:pPr>
+              <w:pStyle w:val="Compact"/>
+            </w:pPr>
+            <w:r>
+              <w:t xml:space="preserve">10</w:t>
+            </w:r>
+          </w:p>
+        </w:tc>
+        <w:tc>
+          <w:tcPr/>
+          <w:p>
+            <w:pPr>
+              <w:pStyle w:val="Compact"/>
+            </w:pPr>
+            <w:r>
+              <w:t xml:space="preserve">3</w:t>
+            </w:r>
+          </w:p>
+        </w:tc>
+        <w:tc>
+          <w:tcPr/>
+          <w:p>
+            <w:pPr>
+              <w:pStyle w:val="Compact"/>
+            </w:pPr>
+            <w:r>
+              <w:t xml:space="preserve">61</w:t>
+            </w:r>
+          </w:p>
+        </w:tc>
+        <w:tc>
+          <w:tcPr/>
+          <w:p>
+            <w:pPr>
+              <w:pStyle w:val="Compact"/>
+            </w:pPr>
+            <w:r>
+              <w:t xml:space="preserve">26</w:t>
+            </w:r>
+          </w:p>
+        </w:tc>
+        <w:tc>
+          <w:tcPr/>
+          <w:p>
+            <w:pPr>
+              <w:pStyle w:val="Compact"/>
+            </w:pPr>
+            <w:r>
+              <w:t xml:space="preserve">0.547 +/- 0.047</w:t>
+            </w:r>
+          </w:p>
+        </w:tc>
+      </w:tr>
+      <w:tr>
+        <w:tc>
+          <w:tcPr/>
+          <w:p>
+            <w:pPr>
+              <w:pStyle w:val="Compact"/>
+            </w:pPr>
+            <w:r>
+              <w:t xml:space="preserve">100</w:t>
+            </w:r>
+          </w:p>
+        </w:tc>
+        <w:tc>
+          <w:tcPr/>
+          <w:p>
+            <w:pPr>
+              <w:pStyle w:val="Compact"/>
+            </w:pPr>
+            <w:r>
+              <w:t xml:space="preserve">18</w:t>
+            </w:r>
+          </w:p>
+        </w:tc>
+        <w:tc>
+          <w:tcPr/>
+          <w:p>
+            <w:pPr>
+              <w:pStyle w:val="Compact"/>
+            </w:pPr>
+            <w:r>
+              <w:t xml:space="preserve">4</w:t>
+            </w:r>
+          </w:p>
+        </w:tc>
+        <w:tc>
+          <w:tcPr/>
+          <w:p>
+            <w:pPr>
+              <w:pStyle w:val="Compact"/>
+            </w:pPr>
+            <w:r>
+              <w:t xml:space="preserve">61</w:t>
+            </w:r>
+          </w:p>
+        </w:tc>
+        <w:tc>
+          <w:tcPr/>
+          <w:p>
+            <w:pPr>
+              <w:pStyle w:val="Compact"/>
+            </w:pPr>
+            <w:r>
+              <w:t xml:space="preserve">17</w:t>
+            </w:r>
+          </w:p>
+        </w:tc>
+        <w:tc>
+          <w:tcPr/>
+          <w:p>
+            <w:pPr>
+              <w:pStyle w:val="Compact"/>
+            </w:pPr>
+            <w:r>
+              <w:t xml:space="preserve">0.584 +/- 0.052</w:t>
+            </w:r>
+          </w:p>
+        </w:tc>
+      </w:tr>
+      <w:tr>
+        <w:tc>
+          <w:tcPr/>
+          <w:p>
+            <w:pPr>
+              <w:pStyle w:val="Compact"/>
+            </w:pPr>
+            <w:r>
+              <w:t xml:space="preserve">140</w:t>
+            </w:r>
+          </w:p>
+        </w:tc>
+        <w:tc>
+          <w:tcPr/>
+          <w:p>
+            <w:pPr>
+              <w:pStyle w:val="Compact"/>
+            </w:pPr>
+            <w:r>
+              <w:t xml:space="preserve">27</w:t>
+            </w:r>
+          </w:p>
+        </w:tc>
+        <w:tc>
+          <w:tcPr/>
+          <w:p>
+            <w:pPr>
+              <w:pStyle w:val="Compact"/>
+            </w:pPr>
+            <w:r>
+              <w:t xml:space="preserve">2</w:t>
+            </w:r>
+          </w:p>
+        </w:tc>
+        <w:tc>
+          <w:tcPr/>
+          <w:p>
+            <w:pPr>
+              <w:pStyle w:val="Compact"/>
+            </w:pPr>
+            <w:r>
+              <w:t xml:space="preserve">57</w:t>
+            </w:r>
+          </w:p>
+        </w:tc>
+        <w:tc>
+          <w:tcPr/>
+          <w:p>
+            <w:pPr>
+              <w:pStyle w:val="Compact"/>
+            </w:pPr>
+            <w:r>
+              <w:t xml:space="preserve">14</w:t>
+            </w:r>
+          </w:p>
+        </w:tc>
+        <w:tc>
+          <w:tcPr/>
+          <w:p>
+            <w:pPr>
+              <w:pStyle w:val="Compact"/>
+            </w:pPr>
+            <w:r>
+              <w:t xml:space="preserve">0.645 +/- 0.053</w:t>
+            </w:r>
+          </w:p>
+        </w:tc>
+      </w:tr>
+      <w:tr>
+        <w:tc>
+          <w:tcPr/>
+          <w:p>
+            <w:pPr>
+              <w:pStyle w:val="Compact"/>
+            </w:pPr>
+            <w:r>
+              <w:t xml:space="preserve">220</w:t>
+            </w:r>
+          </w:p>
+        </w:tc>
+        <w:tc>
+          <w:tcPr/>
+          <w:p>
+            <w:pPr>
+              <w:pStyle w:val="Compact"/>
+            </w:pPr>
+            <w:r>
+              <w:t xml:space="preserve">21</w:t>
+            </w:r>
+          </w:p>
+        </w:tc>
+        <w:tc>
+          <w:tcPr/>
+          <w:p>
+            <w:pPr>
+              <w:pStyle w:val="Compact"/>
+            </w:pPr>
+            <w:r>
+              <w:t xml:space="preserve">5</w:t>
+            </w:r>
+          </w:p>
+        </w:tc>
+        <w:tc>
+          <w:tcPr/>
+          <w:p>
+            <w:pPr>
+              <w:pStyle w:val="Compact"/>
+            </w:pPr>
+            <w:r>
+              <w:t xml:space="preserve">57</w:t>
+            </w:r>
+          </w:p>
+        </w:tc>
+        <w:tc>
+          <w:tcPr/>
+          <w:p>
+            <w:pPr>
+              <w:pStyle w:val="Compact"/>
+            </w:pPr>
+            <w:r>
+              <w:t xml:space="preserve">17</w:t>
+            </w:r>
+          </w:p>
+        </w:tc>
+        <w:tc>
+          <w:tcPr/>
+          <w:p>
+            <w:pPr>
+              <w:pStyle w:val="Compact"/>
+            </w:pPr>
+            <w:r>
+              <w:t xml:space="preserve">0.596 +/- 0.057</w:t>
+            </w:r>
+          </w:p>
+        </w:tc>
+      </w:tr>
+      <w:tr>
+        <w:tc>
+          <w:tcPr/>
+          <w:p>
+            <w:pPr>
+              <w:pStyle w:val="Compact"/>
+            </w:pPr>
+            <w:r>
+              <w:t xml:space="preserve">300</w:t>
+            </w:r>
+          </w:p>
+        </w:tc>
+        <w:tc>
+          <w:tcPr/>
+          <w:p>
+            <w:pPr>
+              <w:pStyle w:val="Compact"/>
+            </w:pPr>
+            <w:r>
+              <w:t xml:space="preserve">27</w:t>
+            </w:r>
+          </w:p>
+        </w:tc>
+        <w:tc>
+          <w:tcPr/>
+          <w:p>
+            <w:pPr>
+              <w:pStyle w:val="Compact"/>
+            </w:pPr>
+            <w:r>
+              <w:t xml:space="preserve">5</w:t>
+            </w:r>
+          </w:p>
+        </w:tc>
+        <w:tc>
+          <w:tcPr/>
+          <w:p>
+            <w:pPr>
+              <w:pStyle w:val="Compact"/>
+            </w:pPr>
+            <w:r>
+              <w:t xml:space="preserve">52</w:t>
+            </w:r>
+          </w:p>
+        </w:tc>
+        <w:tc>
+          <w:tcPr/>
+          <w:p>
+            <w:pPr>
+              <w:pStyle w:val="Compact"/>
+            </w:pPr>
+            <w:r>
+              <w:t xml:space="preserve">16</w:t>
+            </w:r>
+          </w:p>
+        </w:tc>
+        <w:tc>
+          <w:tcPr/>
+          <w:p>
+            <w:pPr>
+              <w:pStyle w:val="Compact"/>
+            </w:pPr>
+            <w:r>
+              <w:t xml:space="preserve">0.631 +/- 0.060</w:t>
+            </w:r>
+          </w:p>
+        </w:tc>
+      </w:tr>
+      <w:tr>
+        <w:tc>
+          <w:tcPr/>
+          <w:p>
+            <w:pPr>
+              <w:pStyle w:val="Compact"/>
+            </w:pPr>
+            <w:r>
+              <w:t xml:space="preserve">380</w:t>
+            </w:r>
+          </w:p>
+        </w:tc>
+        <w:tc>
+          <w:tcPr/>
+          <w:p>
+            <w:pPr>
+              <w:pStyle w:val="Compact"/>
+            </w:pPr>
+            <w:r>
+              <w:t xml:space="preserve">11</w:t>
+            </w:r>
+          </w:p>
+        </w:tc>
+        <w:tc>
+          <w:tcPr/>
+          <w:p>
+            <w:pPr>
+              <w:pStyle w:val="Compact"/>
+            </w:pPr>
+            <w:r>
+              <w:t xml:space="preserve">5</w:t>
+            </w:r>
+          </w:p>
+        </w:tc>
+        <w:tc>
+          <w:tcPr/>
+          <w:p>
+            <w:pPr>
+              <w:pStyle w:val="Compact"/>
+            </w:pPr>
+            <w:r>
+              <w:t xml:space="preserve">63</w:t>
+            </w:r>
+          </w:p>
+        </w:tc>
+        <w:tc>
+          <w:tcPr/>
+          <w:p>
+            <w:pPr>
+              <w:pStyle w:val="Compact"/>
+            </w:pPr>
+            <w:r>
+              <w:t xml:space="preserve">21</w:t>
+            </w:r>
+          </w:p>
+        </w:tc>
+        <w:tc>
+          <w:tcPr/>
+          <w:p>
+            <w:pPr>
+              <w:pStyle w:val="Compact"/>
+            </w:pPr>
+            <w:r>
+              <w:t xml:space="preserve">0.538 +/- 0.049</w:t>
+            </w:r>
+          </w:p>
+        </w:tc>
+      </w:tr>
+      <w:tr>
+        <w:tc>
+          <w:tcPr/>
+          <w:p>
+            <w:pPr>
+              <w:pStyle w:val="Compact"/>
+            </w:pPr>
+            <w:r>
+              <w:t xml:space="preserve">500</w:t>
+            </w:r>
+          </w:p>
+        </w:tc>
+        <w:tc>
+          <w:tcPr/>
+          <w:p>
+            <w:pPr>
+              <w:pStyle w:val="Compact"/>
+            </w:pPr>
+            <w:r>
+              <w:t xml:space="preserve">27</w:t>
+            </w:r>
+          </w:p>
+        </w:tc>
+        <w:tc>
+          <w:tcPr/>
+          <w:p>
+            <w:pPr>
+              <w:pStyle w:val="Compact"/>
+            </w:pPr>
+            <w:r>
+              <w:t xml:space="preserve">3</w:t>
+            </w:r>
+          </w:p>
+        </w:tc>
+        <w:tc>
+          <w:tcPr/>
+          <w:p>
+            <w:pPr>
+              <w:pStyle w:val="Compact"/>
+            </w:pPr>
+            <w:r>
+              <w:t xml:space="preserve">60</w:t>
+            </w:r>
+          </w:p>
+        </w:tc>
+        <w:tc>
+          <w:tcPr/>
+          <w:p>
+            <w:pPr>
+              <w:pStyle w:val="Compact"/>
+            </w:pPr>
+            <w:r>
+              <w:t xml:space="preserve">10</w:t>
+            </w:r>
+          </w:p>
+        </w:tc>
+        <w:tc>
+          <w:tcPr/>
+          <w:p>
+            <w:pPr>
+              <w:pStyle w:val="Compact"/>
+            </w:pPr>
+            <w:r>
+              <w:t xml:space="preserve">0.633 +/- 0.053</w:t>
+            </w:r>
+          </w:p>
+        </w:tc>
+      </w:tr>
+      <w:tr>
+        <w:tc>
+          <w:tcPr/>
+          <w:p>
+            <w:pPr>
+              <w:pStyle w:val="Compact"/>
+            </w:pPr>
+            <w:r>
+              <w:rPr>
+                <w:b/>
+                <w:bCs/>
+              </w:rPr>
+              <w:t xml:space="preserve">560 (final)</w:t>
+            </w:r>
+          </w:p>
+        </w:tc>
+        <w:tc>
+          <w:tcPr/>
+          <w:p>
+            <w:pPr>
+              <w:pStyle w:val="Compact"/>
+            </w:pPr>
+            <w:r>
+              <w:rPr>
+                <w:b/>
+                <w:bCs/>
+              </w:rPr>
+              <w:t xml:space="preserve">27</w:t>
+            </w:r>
+          </w:p>
+        </w:tc>
+        <w:tc>
+          <w:tcPr/>
+          <w:p>
+            <w:pPr>
+              <w:pStyle w:val="Compact"/>
+            </w:pPr>
+            <w:r>
+              <w:rPr>
+                <w:b/>
+                <w:bCs/>
+              </w:rPr>
+              <w:t xml:space="preserve">0</w:t>
+            </w:r>
+          </w:p>
+        </w:tc>
+        <w:tc>
+          <w:tcPr/>
+          <w:p>
+            <w:pPr>
+              <w:pStyle w:val="Compact"/>
+            </w:pPr>
+            <w:r>
+              <w:rPr>
+                <w:b/>
+                <w:bCs/>
+              </w:rPr>
+              <w:t xml:space="preserve">59</w:t>
+            </w:r>
+          </w:p>
+        </w:tc>
+        <w:tc>
+          <w:tcPr/>
+          <w:p>
+            <w:pPr>
+              <w:pStyle w:val="Compact"/>
+            </w:pPr>
+            <w:r>
+              <w:rPr>
+                <w:b/>
+                <w:bCs/>
+              </w:rPr>
+              <w:t xml:space="preserve">14</w:t>
+            </w:r>
+          </w:p>
+        </w:tc>
+        <w:tc>
+          <w:tcPr/>
+          <w:p>
+            <w:pPr>
+              <w:pStyle w:val="Compact"/>
+            </w:pPr>
+            <w:r>
+              <w:rPr>
+                <w:b/>
+                <w:bCs/>
+              </w:rPr>
+              <w:t xml:space="preserve">0.657 +/- 0.049</w:t>
+            </w:r>
+          </w:p>
+        </w:tc>
+      </w:tr>
+    </w:tbl>
+    <w:p>
+      <w:pPr>
+        <w:pStyle w:val="BodyText"/>
+      </w:pPr>
+      <w:r>
+        <w:t xml:space="preserve">Unlike the first runs, training now clearly helps: every checkpoint beats the</w:t>
+      </w:r>
+      <w:r>
+        <w:t xml:space="preserve"> </w:t>
+      </w:r>
+      <w:r>
+        <w:t xml:space="preserve">starting model, and the final one won 27 games and lost none. Most of the gain</w:t>
+      </w:r>
+      <w:r>
+        <w:t xml:space="preserve"> </w:t>
+      </w:r>
+      <w:r>
+        <w:t xml:space="preserve">came in the first 100 to 140 iterations. From there to iteration 420 the score</w:t>
+      </w:r>
+      <w:r>
+        <w:t xml:space="preserve"> </w:t>
+      </w:r>
+      <w:r>
+        <w:t xml:space="preserve">moved up and down by about its own margin.</w:t>
+      </w:r>
+    </w:p>
+    <w:bookmarkEnd w:id="40"/>
+    <w:bookmarkStart w:id="41" w:name="lowering-the-learning-rate"/>
+    <w:p>
+      <w:pPr>
+        <w:pStyle w:val="Heading2"/>
+      </w:pPr>
+      <w:r>
+        <w:t xml:space="preserve">6.8 Lowering the learning rate</w:t>
+      </w:r>
+    </w:p>
+    <w:p>
+      <w:pPr>
+        <w:pStyle w:val="FirstParagraph"/>
+      </w:pPr>
+      <w:r>
+        <w:t xml:space="preserve">To choose a model, iterations 140, 300, 420 and 460 (the first 40 iterations</w:t>
+      </w:r>
+      <w:r>
+        <w:t xml:space="preserve"> </w:t>
+      </w:r>
+      <w:r>
+        <w:t xml:space="preserve">at learning rate 1e-4) played each other, 100 games per pair. The table gives</w:t>
+      </w:r>
+      <w:r>
+        <w:t xml:space="preserve"> </w:t>
+      </w:r>
+      <w:r>
+        <w:t xml:space="preserve">the row model’s score against the column model.</w:t>
+      </w:r>
+    </w:p>
+    <w:tbl>
+      <w:tblPr>
+        <w:tblStyle w:val="Table"/>
+        <w:tblW w:type="auto" w:w="0"/>
+        <w:tblLook w:firstRow="1" w:lastRow="0" w:firstColumn="0" w:lastColumn="0" w:noHBand="0" w:noVBand="0" w:val="0020"/>
+      </w:tblPr>
+      <w:tblGrid>
+        <w:gridCol w:w="1584"/>
+        <w:gridCol w:w="1584"/>
+        <w:gridCol w:w="1584"/>
+        <w:gridCol w:w="1584"/>
+        <w:gridCol w:w="1584"/>
+      </w:tblGrid>
+      <w:tr>
+        <w:trPr>
+          <w:tblHeader w:val="on"/>
+        </w:trPr>
+        <w:tc>
+          <w:tcPr/>
+          <w:p>
+            <w:pPr>
+              <w:pStyle w:val="Compact"/>
+            </w:pPr>
+          </w:p>
+        </w:tc>
+        <w:tc>
+          <w:tcPr/>
+          <w:p>
+            <w:pPr>
+              <w:pStyle w:val="Compact"/>
+            </w:pPr>
+            <w:r>
+              <w:t xml:space="preserve">vs 140</w:t>
+            </w:r>
+          </w:p>
+        </w:tc>
+        <w:tc>
+          <w:tcPr/>
+          <w:p>
+            <w:pPr>
+              <w:pStyle w:val="Compact"/>
+            </w:pPr>
+            <w:r>
+              <w:t xml:space="preserve">vs 300</w:t>
+            </w:r>
+          </w:p>
+        </w:tc>
+        <w:tc>
+          <w:tcPr/>
+          <w:p>
+            <w:pPr>
+              <w:pStyle w:val="Compact"/>
+            </w:pPr>
+            <w:r>
+              <w:t xml:space="preserve">vs 420</w:t>
+            </w:r>
+          </w:p>
+        </w:tc>
+        <w:tc>
+          <w:tcPr/>
+          <w:p>
+            <w:pPr>
+              <w:pStyle w:val="Compact"/>
+            </w:pPr>
+            <w:r>
+              <w:t xml:space="preserve">vs 460</w:t>
+            </w:r>
+          </w:p>
+        </w:tc>
+      </w:tr>
+      <w:tr>
+        <w:tc>
+          <w:tcPr/>
+          <w:p>
+            <w:pPr>
+              <w:pStyle w:val="Compact"/>
+            </w:pPr>
+            <w:r>
+              <w:t xml:space="preserve">140</w:t>
+            </w:r>
+          </w:p>
+        </w:tc>
+        <w:tc>
+          <w:tcPr/>
+          <w:p>
+            <w:pPr>
+              <w:pStyle w:val="Compact"/>
+            </w:pPr>
+          </w:p>
+        </w:tc>
+        <w:tc>
+          <w:tcPr/>
+          <w:p>
+            <w:pPr>
+              <w:pStyle w:val="Compact"/>
+            </w:pPr>
+            <w:r>
+              <w:t xml:space="preserve">0.511</w:t>
+            </w:r>
+          </w:p>
+        </w:tc>
+        <w:tc>
+          <w:tcPr/>
+          <w:p>
+            <w:pPr>
+              <w:pStyle w:val="Compact"/>
+            </w:pPr>
+            <w:r>
+              <w:t xml:space="preserve">0.488</w:t>
+            </w:r>
+          </w:p>
+        </w:tc>
+        <w:tc>
+          <w:tcPr/>
+          <w:p>
+            <w:pPr>
+              <w:pStyle w:val="Compact"/>
+            </w:pPr>
+            <w:r>
+              <w:t xml:space="preserve">0.413</w:t>
+            </w:r>
+          </w:p>
+        </w:tc>
+      </w:tr>
+      <w:tr>
+        <w:tc>
+          <w:tcPr/>
+          <w:p>
+            <w:pPr>
+              <w:pStyle w:val="Compact"/>
+            </w:pPr>
+            <w:r>
+              <w:t xml:space="preserve">300</w:t>
+            </w:r>
+          </w:p>
+        </w:tc>
+        <w:tc>
+          <w:tcPr/>
+          <w:p>
+            <w:pPr>
+              <w:pStyle w:val="Compact"/>
+            </w:pPr>
+            <w:r>
+              <w:t xml:space="preserve">0.489</w:t>
+            </w:r>
+          </w:p>
+        </w:tc>
+        <w:tc>
+          <w:tcPr/>
+          <w:p>
+            <w:pPr>
+              <w:pStyle w:val="Compact"/>
+            </w:pPr>
+          </w:p>
+        </w:tc>
+        <w:tc>
+          <w:tcPr/>
+          <w:p>
+            <w:pPr>
+              <w:pStyle w:val="Compact"/>
+            </w:pPr>
+            <w:r>
+              <w:t xml:space="preserve">0.500</w:t>
+            </w:r>
+          </w:p>
+        </w:tc>
+        <w:tc>
+          <w:tcPr/>
+          <w:p>
+            <w:pPr>
+              <w:pStyle w:val="Compact"/>
+            </w:pPr>
+            <w:r>
+              <w:t xml:space="preserve">0.463</w:t>
+            </w:r>
+          </w:p>
+        </w:tc>
+      </w:tr>
+      <w:tr>
+        <w:tc>
+          <w:tcPr/>
+          <w:p>
+            <w:pPr>
+              <w:pStyle w:val="Compact"/>
+            </w:pPr>
+            <w:r>
+              <w:t xml:space="preserve">420</w:t>
+            </w:r>
+          </w:p>
+        </w:tc>
+        <w:tc>
+          <w:tcPr/>
+          <w:p>
+            <w:pPr>
+              <w:pStyle w:val="Compact"/>
+            </w:pPr>
+            <w:r>
+              <w:t xml:space="preserve">0.512</w:t>
+            </w:r>
+          </w:p>
+        </w:tc>
+        <w:tc>
+          <w:tcPr/>
+          <w:p>
+            <w:pPr>
+              <w:pStyle w:val="Compact"/>
+            </w:pPr>
+            <w:r>
+              <w:t xml:space="preserve">0.500</w:t>
+            </w:r>
+          </w:p>
+        </w:tc>
+        <w:tc>
+          <w:tcPr/>
+          <w:p>
+            <w:pPr>
+              <w:pStyle w:val="Compact"/>
+            </w:pPr>
+          </w:p>
+        </w:tc>
+        <w:tc>
+          <w:tcPr/>
+          <w:p>
+            <w:pPr>
+              <w:pStyle w:val="Compact"/>
+            </w:pPr>
+            <w:r>
+              <w:t xml:space="preserve">0.453</w:t>
+            </w:r>
+          </w:p>
+        </w:tc>
+      </w:tr>
+      <w:tr>
+        <w:tc>
+          <w:tcPr/>
+          <w:p>
+            <w:pPr>
+              <w:pStyle w:val="Compact"/>
+            </w:pPr>
+            <w:r>
+              <w:t xml:space="preserve">460</w:t>
+            </w:r>
+          </w:p>
+        </w:tc>
+        <w:tc>
+          <w:tcPr/>
+          <w:p>
+            <w:pPr>
+              <w:pStyle w:val="Compact"/>
+            </w:pPr>
+            <w:r>
+              <w:rPr>
+                <w:b/>
+                <w:bCs/>
+              </w:rPr>
+              <w:t xml:space="preserve">0.587</w:t>
+            </w:r>
+          </w:p>
+        </w:tc>
+        <w:tc>
+          <w:tcPr/>
+          <w:p>
+            <w:pPr>
+              <w:pStyle w:val="Compact"/>
+            </w:pPr>
+            <w:r>
+              <w:rPr>
+                <w:b/>
+                <w:bCs/>
+              </w:rPr>
+              <w:t xml:space="preserve">0.537</w:t>
+            </w:r>
+          </w:p>
+        </w:tc>
+        <w:tc>
+          <w:tcPr/>
+          <w:p>
+            <w:pPr>
+              <w:pStyle w:val="Compact"/>
+            </w:pPr>
+            <w:r>
+              <w:rPr>
+                <w:b/>
+                <w:bCs/>
+              </w:rPr>
+              <w:t xml:space="preserve">0.547</w:t>
+            </w:r>
+          </w:p>
+        </w:tc>
+        <w:tc>
+          <w:tcPr/>
+          <w:p>
+            <w:pPr>
+              <w:pStyle w:val="Compact"/>
+            </w:pPr>
+          </w:p>
+        </w:tc>
+      </w:tr>
+    </w:tbl>
+    <w:p>
+      <w:pPr>
+        <w:pStyle w:val="BodyText"/>
+      </w:pPr>
+      <w:r>
+        <w:t xml:space="preserve">Iterations 140, 300 and 420 are even with each other, while 460 beats all</w:t>
+      </w:r>
+      <w:r>
+        <w:t xml:space="preserve"> </w:t>
+      </w:r>
+      <w:r>
+        <w:t xml:space="preserve">three (41 wins, 9 losses in total). At learning rate 1e-3 the network kept</w:t>
+      </w:r>
+      <w:r>
+        <w:t xml:space="preserve"> </w:t>
+      </w:r>
+      <w:r>
+        <w:t xml:space="preserve">moving around one level of play; the lower rate let it settle. Further</w:t>
+      </w:r>
+      <w:r>
+        <w:t xml:space="preserve"> </w:t>
+      </w:r>
+      <w:r>
+        <w:t xml:space="preserve">stretches still helped, by smaller steps: iteration 500 scored 0.526 against</w:t>
+      </w:r>
+      <w:r>
+        <w:t xml:space="preserve"> </w:t>
+      </w:r>
+      <w:r>
+        <w:t xml:space="preserve">460 (8 wins, 3 losses), and iteration 560 scored 0.524 against 500 over 300</w:t>
+      </w:r>
+      <w:r>
+        <w:t xml:space="preserve"> </w:t>
+      </w:r>
+      <w:r>
+        <w:t xml:space="preserve">games (26 wins, 12 losses). Iteration 560 is the final model.</w:t>
+      </w:r>
+    </w:p>
+    <w:bookmarkEnd w:id="41"/>
+    <w:bookmarkStart w:id="45" w:name="long-run-benchmarks-of-the-final-model"/>
+    <w:p>
+      <w:pPr>
+        <w:pStyle w:val="Heading2"/>
+      </w:pPr>
+      <w:r>
+        <w:t xml:space="preserve">6.9 Long run: benchmarks of the final model</w:t>
+      </w:r>
+    </w:p>
+    <w:p>
+      <w:pPr>
+        <w:pStyle w:val="CaptionedFigure"/>
+      </w:pPr>
+      <w:r>
+        <w:drawing>
+          <wp:inline>
+            <wp:extent cx="5334000" cy="2963333"/>
+            <wp:effectExtent b="0" l="0" r="0" t="0"/>
+            <wp:docPr descr="Benchmark score of long-run checkpoints against random, untrained and greedy-capture players, 100 games per point." title="" id="43" name="Picture"/>
+            <a:graphic>
+              <a:graphicData uri="http://schemas.openxmlformats.org/drawingml/2006/picture">
+                <pic:pic>
+                  <pic:nvPicPr>
+                    <pic:cNvPr descr="../results/benchmark_curve_long.png" id="44" name="Picture"/>
+                    <pic:cNvPicPr>
+                      <a:picLocks noChangeArrowheads="1" noChangeAspect="1"/>
+                    </pic:cNvPicPr>
+                  </pic:nvPicPr>
+                  <pic:blipFill>
+                    <a:blip r:embed="rId42"/>
+                    <a:stretch>
+                      <a:fillRect/>
+                    </a:stretch>
+                  </pic:blipFill>
+                  <pic:spPr bwMode="auto">
+                    <a:xfrm>
+                      <a:off x="0" y="0"/>
+                      <a:ext cx="5334000" cy="2963333"/>
+                    </a:xfrm>
+                    <a:prstGeom prst="rect">
+                      <a:avLst/>
+                    </a:prstGeom>
+                    <a:noFill/>
+                    <a:ln w="9525">
+                      <a:noFill/>
+                      <a:headEnd/>
+                      <a:tailEnd/>
+                    </a:ln>
+                  </pic:spPr>
+                </pic:pic>
+              </a:graphicData>
+            </a:graphic>
+          </wp:inline>
+        </w:drawing>
+      </w:r>
+    </w:p>
+    <w:p>
+      <w:pPr>
+        <w:pStyle w:val="ImageCaption"/>
+      </w:pPr>
+      <w:r>
+        <w:t xml:space="preserve">Benchmark score of long-run checkpoints against random, untrained and greedy-capture players, 100 games per point.</w:t>
+      </w:r>
+    </w:p>
+    <w:tbl>
+      <w:tblPr>
+        <w:tblStyle w:val="Table"/>
+        <w:tblW w:type="pct" w:w="5000"/>
+        <w:tblLayout w:type="fixed"/>
+        <w:tblLook w:firstRow="1" w:lastRow="0" w:firstColumn="0" w:lastColumn="0" w:noHBand="0" w:noVBand="0" w:val="0020"/>
+      </w:tblPr>
+      <w:tblGrid>
+        <w:gridCol w:w="1980"/>
+        <w:gridCol w:w="1980"/>
+        <w:gridCol w:w="1980"/>
+        <w:gridCol w:w="1980"/>
+      </w:tblGrid>
+      <w:tr>
+        <w:trPr>
+          <w:tblHeader w:val="on"/>
+        </w:trPr>
+        <w:tc>
+          <w:tcPr/>
+          <w:p>
+            <w:pPr>
+              <w:pStyle w:val="Compact"/>
+            </w:pPr>
+            <w:r>
+              <w:t xml:space="preserve">Iteration</w:t>
+            </w:r>
+          </w:p>
+        </w:tc>
+        <w:tc>
+          <w:tcPr/>
+          <w:p>
+            <w:pPr>
+              <w:pStyle w:val="Compact"/>
+            </w:pPr>
+            <w:r>
+              <w:t xml:space="preserve">vs random</w:t>
+            </w:r>
+          </w:p>
+        </w:tc>
+        <w:tc>
+          <w:tcPr/>
+          <w:p>
+            <w:pPr>
+              <w:pStyle w:val="Compact"/>
+            </w:pPr>
+            <w:r>
+              <w:t xml:space="preserve">vs untrained</w:t>
+            </w:r>
+          </w:p>
+        </w:tc>
+        <w:tc>
+          <w:tcPr/>
+          <w:p>
+            <w:pPr>
+              <w:pStyle w:val="Compact"/>
+            </w:pPr>
+            <w:r>
+              <w:t xml:space="preserve">vs greedy-capture</w:t>
+            </w:r>
+          </w:p>
+        </w:tc>
+      </w:tr>
+      <w:tr>
+        <w:tc>
+          <w:tcPr/>
+          <w:p>
+            <w:pPr>
+              <w:pStyle w:val="Compact"/>
+            </w:pPr>
+            <w:r>
+              <w:t xml:space="preserve">20 (final B)</w:t>
+            </w:r>
+          </w:p>
+        </w:tc>
+        <w:tc>
+          <w:tcPr/>
+          <w:p>
+            <w:pPr>
+              <w:pStyle w:val="Compact"/>
+            </w:pPr>
+            <w:r>
+              <w:t xml:space="preserve">4 W, 6 L: 0.489</w:t>
+            </w:r>
+          </w:p>
+        </w:tc>
+        <w:tc>
+          <w:tcPr/>
+          <w:p>
+            <w:pPr>
+              <w:pStyle w:val="Compact"/>
+            </w:pPr>
+            <w:r>
+              <w:t xml:space="preserve">4 W, 18 L: 0.419</w:t>
+            </w:r>
+          </w:p>
+        </w:tc>
+        <w:tc>
+          <w:tcPr/>
+          <w:p>
+            <w:pPr>
+              <w:pStyle w:val="Compact"/>
+            </w:pPr>
+            <w:r>
+              <w:t xml:space="preserve">0 W, 6 L: 0.469</w:t>
+            </w:r>
+          </w:p>
+        </w:tc>
+      </w:tr>
+      <w:tr>
+        <w:tc>
+          <w:tcPr/>
+          <w:p>
+            <w:pPr>
+              <w:pStyle w:val="Compact"/>
+            </w:pPr>
+            <w:r>
+              <w:t xml:space="preserve">100</w:t>
+            </w:r>
+          </w:p>
+        </w:tc>
+        <w:tc>
+          <w:tcPr/>
+          <w:p>
+            <w:pPr>
+              <w:pStyle w:val="Compact"/>
+            </w:pPr>
+            <w:r>
+              <w:t xml:space="preserve">6 W, 1 L: 0.525</w:t>
+            </w:r>
+          </w:p>
+        </w:tc>
+        <w:tc>
+          <w:tcPr/>
+          <w:p>
+            <w:pPr>
+              <w:pStyle w:val="Compact"/>
+            </w:pPr>
+            <w:r>
+              <w:t xml:space="preserve">7 W, 9 L: 0.487</w:t>
+            </w:r>
+          </w:p>
+        </w:tc>
+        <w:tc>
+          <w:tcPr/>
+          <w:p>
+            <w:pPr>
+              <w:pStyle w:val="Compact"/>
+            </w:pPr>
+            <w:r>
+              <w:t xml:space="preserve">1 W, 2 L: 0.495</w:t>
+            </w:r>
+          </w:p>
+        </w:tc>
+      </w:tr>
+      <w:tr>
+        <w:tc>
+          <w:tcPr/>
+          <w:p>
+            <w:pPr>
+              <w:pStyle w:val="Compact"/>
+            </w:pPr>
+            <w:r>
+              <w:t xml:space="preserve">220</w:t>
+            </w:r>
+          </w:p>
+        </w:tc>
+        <w:tc>
+          <w:tcPr/>
+          <w:p>
+            <w:pPr>
+              <w:pStyle w:val="Compact"/>
+            </w:pPr>
+            <w:r>
+              <w:t xml:space="preserve">15 W, 2 L: 0.566</w:t>
+            </w:r>
+          </w:p>
+        </w:tc>
+        <w:tc>
+          <w:tcPr/>
+          <w:p>
+            <w:pPr>
+              <w:pStyle w:val="Compact"/>
+            </w:pPr>
+            <w:r>
+              <w:t xml:space="preserve">23 W, 13 L: 0.560</w:t>
+            </w:r>
+          </w:p>
+        </w:tc>
+        <w:tc>
+          <w:tcPr/>
+          <w:p>
+            <w:pPr>
+              <w:pStyle w:val="Compact"/>
+            </w:pPr>
+            <w:r>
+              <w:t xml:space="preserve">0 W, 0 L: 0.500</w:t>
+            </w:r>
+          </w:p>
+        </w:tc>
+      </w:tr>
+      <w:tr>
+        <w:tc>
+          <w:tcPr/>
+          <w:p>
+            <w:pPr>
+              <w:pStyle w:val="Compact"/>
+            </w:pPr>
+            <w:r>
+              <w:t xml:space="preserve">420</w:t>
+            </w:r>
+          </w:p>
+        </w:tc>
+        <w:tc>
+          <w:tcPr/>
+          <w:p>
+            <w:pPr>
+              <w:pStyle w:val="Compact"/>
+            </w:pPr>
+            <w:r>
+              <w:t xml:space="preserve">10 W, 2 L: 0.540</w:t>
+            </w:r>
+          </w:p>
+        </w:tc>
+        <w:tc>
+          <w:tcPr/>
+          <w:p>
+            <w:pPr>
+              <w:pStyle w:val="Compact"/>
+            </w:pPr>
+            <w:r>
+              <w:t xml:space="preserve">13 W, 8 L: 0.533</w:t>
+            </w:r>
+          </w:p>
+        </w:tc>
+        <w:tc>
+          <w:tcPr/>
+          <w:p>
+            <w:pPr>
+              <w:pStyle w:val="Compact"/>
+            </w:pPr>
+            <w:r>
+              <w:t xml:space="preserve">1 W, 5 L: 0.480</w:t>
+            </w:r>
+          </w:p>
+        </w:tc>
+      </w:tr>
+      <w:tr>
+        <w:tc>
+          <w:tcPr/>
+          <w:p>
+            <w:pPr>
+              <w:pStyle w:val="Compact"/>
+            </w:pPr>
+            <w:r>
+              <w:rPr>
+                <w:b/>
+                <w:bCs/>
+              </w:rPr>
+              <w:t xml:space="preserve">560 (final)</w:t>
+            </w:r>
+          </w:p>
+        </w:tc>
+        <w:tc>
+          <w:tcPr/>
+          <w:p>
+            <w:pPr>
+              <w:pStyle w:val="Compact"/>
+            </w:pPr>
+            <w:r>
+              <w:rPr>
+                <w:b/>
+                <w:bCs/>
+              </w:rPr>
+              <w:t xml:space="preserve">16 W, 0 L: 0.581</w:t>
+            </w:r>
+          </w:p>
+        </w:tc>
+        <w:tc>
+          <w:tcPr/>
+          <w:p>
+            <w:pPr>
+              <w:pStyle w:val="Compact"/>
+            </w:pPr>
+            <w:r>
+              <w:rPr>
+                <w:b/>
+                <w:bCs/>
+              </w:rPr>
+              <w:t xml:space="preserve">17 W, 4 L: 0.572</w:t>
+            </w:r>
+          </w:p>
+        </w:tc>
+        <w:tc>
+          <w:tcPr/>
+          <w:p>
+            <w:pPr>
+              <w:pStyle w:val="Compact"/>
+            </w:pPr>
+            <w:r>
+              <w:rPr>
+                <w:b/>
+                <w:bCs/>
+              </w:rPr>
+              <w:t xml:space="preserve">0 W, 1 L: 0.495</w:t>
+            </w:r>
+          </w:p>
+        </w:tc>
+      </w:tr>
+    </w:tbl>
+    <w:p>
+      <w:pPr>
+        <w:pStyle w:val="BodyText"/>
+      </w:pPr>
+      <w:r>
+        <w:t xml:space="preserve">The final model beats random play and the untrained network and almost never</w:t>
+      </w:r>
+      <w:r>
+        <w:t xml:space="preserve"> </w:t>
+      </w:r>
+      <w:r>
+        <w:t xml:space="preserve">loses to them, where final B lost more than it won. Against greedy capture,</w:t>
+      </w:r>
+      <w:r>
+        <w:t xml:space="preserve"> </w:t>
+      </w:r>
+      <w:r>
+        <w:t xml:space="preserve">99 of 100 games were drawn.</w:t>
+      </w:r>
+    </w:p>
+    <w:p>
+      <w:pPr>
+        <w:pStyle w:val="BodyText"/>
+      </w:pPr>
+      <w:r>
+        <w:t xml:space="preserve">How the final model’s games end, 30 games each:</w:t>
+      </w:r>
+    </w:p>
+    <w:tbl>
+      <w:tblPr>
+        <w:tblStyle w:val="Table"/>
+        <w:tblW w:type="auto" w:w="0"/>
+        <w:tblLook w:firstRow="1" w:lastRow="0" w:firstColumn="0" w:lastColumn="0" w:noHBand="0" w:noVBand="0" w:val="0020"/>
+      </w:tblPr>
+      <w:tblGrid>
+        <w:gridCol w:w="2640"/>
+        <w:gridCol w:w="2640"/>
+        <w:gridCol w:w="2640"/>
+      </w:tblGrid>
+      <w:tr>
+        <w:trPr>
+          <w:tblHeader w:val="on"/>
+        </w:trPr>
+        <w:tc>
+          <w:tcPr/>
+          <w:p>
+            <w:pPr>
+              <w:pStyle w:val="Compact"/>
+            </w:pPr>
+            <w:r>
+              <w:t xml:space="preserve">Ending</w:t>
+            </w:r>
+          </w:p>
+        </w:tc>
+        <w:tc>
+          <w:tcPr/>
+          <w:p>
+            <w:pPr>
+              <w:pStyle w:val="Compact"/>
+            </w:pPr>
+            <w:r>
+              <w:t xml:space="preserve">vs random</w:t>
+            </w:r>
+          </w:p>
+        </w:tc>
+        <w:tc>
+          <w:tcPr/>
+          <w:p>
+            <w:pPr>
+              <w:pStyle w:val="Compact"/>
+            </w:pPr>
+            <w:r>
+              <w:t xml:space="preserve">vs greedy-capture</w:t>
+            </w:r>
+          </w:p>
+        </w:tc>
+      </w:tr>
+      <w:tr>
+        <w:tc>
+          <w:tcPr/>
+          <w:p>
+            <w:pPr>
+              <w:pStyle w:val="Compact"/>
+            </w:pPr>
+            <w:r>
+              <w:t xml:space="preserve">Checkmate</w:t>
+            </w:r>
+          </w:p>
+        </w:tc>
+        <w:tc>
+          <w:tcPr/>
+          <w:p>
+            <w:pPr>
+              <w:pStyle w:val="Compact"/>
+            </w:pPr>
+            <w:r>
+              <w:t xml:space="preserve">3</w:t>
+            </w:r>
+          </w:p>
+        </w:tc>
+        <w:tc>
+          <w:tcPr/>
+          <w:p>
+            <w:pPr>
+              <w:pStyle w:val="Compact"/>
+            </w:pPr>
+            <w:r>
+              <w:t xml:space="preserve">1</w:t>
+            </w:r>
+          </w:p>
+        </w:tc>
+      </w:tr>
+      <w:tr>
+        <w:tc>
+          <w:tcPr/>
+          <w:p>
+            <w:pPr>
+              <w:pStyle w:val="Compact"/>
+            </w:pPr>
+            <w:r>
+              <w:t xml:space="preserve">Stalemate</w:t>
+            </w:r>
+          </w:p>
+        </w:tc>
+        <w:tc>
+          <w:tcPr/>
+          <w:p>
+            <w:pPr>
+              <w:pStyle w:val="Compact"/>
+            </w:pPr>
+            <w:r>
+              <w:t xml:space="preserve">0</w:t>
+            </w:r>
+          </w:p>
+        </w:tc>
+        <w:tc>
+          <w:tcPr/>
+          <w:p>
+            <w:pPr>
+              <w:pStyle w:val="Compact"/>
+            </w:pPr>
+            <w:r>
+              <w:t xml:space="preserve">2</w:t>
+            </w:r>
+          </w:p>
+        </w:tc>
+      </w:tr>
+      <w:tr>
+        <w:tc>
+          <w:tcPr/>
+          <w:p>
+            <w:pPr>
+              <w:pStyle w:val="Compact"/>
+            </w:pPr>
+            <w:r>
+              <w:t xml:space="preserve">No-progress rule</w:t>
+            </w:r>
+          </w:p>
+        </w:tc>
+        <w:tc>
+          <w:tcPr/>
+          <w:p>
+            <w:pPr>
+              <w:pStyle w:val="Compact"/>
+            </w:pPr>
+            <w:r>
+              <w:t xml:space="preserve">12</w:t>
+            </w:r>
+          </w:p>
+        </w:tc>
+        <w:tc>
+          <w:tcPr/>
+          <w:p>
+            <w:pPr>
+              <w:pStyle w:val="Compact"/>
+            </w:pPr>
+            <w:r>
+              <w:t xml:space="preserve">27</w:t>
+            </w:r>
+          </w:p>
+        </w:tc>
+      </w:tr>
+      <w:tr>
+        <w:tc>
+          <w:tcPr/>
+          <w:p>
+            <w:pPr>
+              <w:pStyle w:val="Compact"/>
+            </w:pPr>
+            <w:r>
+              <w:t xml:space="preserve">Threefold repetition</w:t>
+            </w:r>
+          </w:p>
+        </w:tc>
+        <w:tc>
+          <w:tcPr/>
+          <w:p>
+            <w:pPr>
+              <w:pStyle w:val="Compact"/>
+            </w:pPr>
+            <w:r>
+              <w:t xml:space="preserve">14</w:t>
+            </w:r>
+          </w:p>
+        </w:tc>
+        <w:tc>
+          <w:tcPr/>
+          <w:p>
+            <w:pPr>
+              <w:pStyle w:val="Compact"/>
+            </w:pPr>
+            <w:r>
+              <w:t xml:space="preserve">0</w:t>
+            </w:r>
+          </w:p>
+        </w:tc>
+      </w:tr>
+      <w:tr>
+        <w:tc>
+          <w:tcPr/>
+          <w:p>
+            <w:pPr>
+              <w:pStyle w:val="Compact"/>
+            </w:pPr>
+            <w:r>
+              <w:t xml:space="preserve">800-ply cap</w:t>
+            </w:r>
+          </w:p>
+        </w:tc>
+        <w:tc>
+          <w:tcPr/>
+          <w:p>
+            <w:pPr>
+              <w:pStyle w:val="Compact"/>
+            </w:pPr>
+            <w:r>
+              <w:t xml:space="preserve">1</w:t>
+            </w:r>
+          </w:p>
+        </w:tc>
+        <w:tc>
+          <w:tcPr/>
+          <w:p>
+            <w:pPr>
+              <w:pStyle w:val="Compact"/>
+            </w:pPr>
+            <w:r>
+              <w:t xml:space="preserve">0</w:t>
+            </w:r>
+          </w:p>
+        </w:tc>
+      </w:tr>
+    </w:tbl>
+    <w:p>
+      <w:pPr>
+        <w:pStyle w:val="BodyText"/>
+      </w:pPr>
+      <w:r>
+        <w:t xml:space="preserve">The agent no longer gives material away, but it rarely turns an advantage into</w:t>
+      </w:r>
+      <w:r>
+        <w:t xml:space="preserve"> </w:t>
+      </w:r>
+      <w:r>
+        <w:t xml:space="preserve">checkmate. Against random most games end by the no-progress rule or by</w:t>
+      </w:r>
+      <w:r>
+        <w:t xml:space="preserve"> </w:t>
+      </w:r>
+      <w:r>
+        <w:t xml:space="preserve">repetitions that the random player causes (our agent avoids them).</w:t>
+      </w:r>
+    </w:p>
+    <w:bookmarkEnd w:id="45"/>
+    <w:bookmarkStart w:id="46" w:name="a-larger-network"/>
+    <w:p>
+      <w:pPr>
+        <w:pStyle w:val="Heading2"/>
+      </w:pPr>
+      <w:r>
+        <w:t xml:space="preserve">6.10 A larger network</w:t>
+      </w:r>
+    </w:p>
+    <w:tbl>
+      <w:tblPr>
+        <w:tblStyle w:val="Table"/>
+        <w:tblW w:type="pct" w:w="5000"/>
+        <w:tblLayout w:type="fixed"/>
+        <w:tblLook w:firstRow="1" w:lastRow="0" w:firstColumn="0" w:lastColumn="0" w:noHBand="0" w:noVBand="0" w:val="0020"/>
+      </w:tblPr>
+      <w:tblGrid>
+        <w:gridCol w:w="1980"/>
+        <w:gridCol w:w="1980"/>
+        <w:gridCol w:w="1980"/>
+        <w:gridCol w:w="1980"/>
+      </w:tblGrid>
+      <w:tr>
+        <w:trPr>
+          <w:tblHeader w:val="on"/>
+        </w:trPr>
+        <w:tc>
+          <w:tcPr/>
+          <w:p>
+            <w:pPr>
+              <w:pStyle w:val="Compact"/>
+            </w:pPr>
+            <w:r>
+              <w:t xml:space="preserve">Match (100 games)</w:t>
+            </w:r>
+          </w:p>
+        </w:tc>
+        <w:tc>
+          <w:tcPr/>
+          <w:p>
+            <w:pPr>
+              <w:pStyle w:val="Compact"/>
+            </w:pPr>
+            <w:r>
+              <w:t xml:space="preserve">Wins</w:t>
+            </w:r>
+          </w:p>
+        </w:tc>
+        <w:tc>
+          <w:tcPr/>
+          <w:p>
+            <w:pPr>
+              <w:pStyle w:val="Compact"/>
+            </w:pPr>
+            <w:r>
+              <w:t xml:space="preserve">Losses</w:t>
+            </w:r>
+          </w:p>
+        </w:tc>
+        <w:tc>
+          <w:tcPr/>
+          <w:p>
+            <w:pPr>
+              <w:pStyle w:val="Compact"/>
+            </w:pPr>
+            <w:r>
+              <w:t xml:space="preserve">Score</w:t>
+            </w:r>
+          </w:p>
+        </w:tc>
+      </w:tr>
+      <w:tr>
+        <w:tc>
+          <w:tcPr/>
+          <w:p>
+            <w:pPr>
+              <w:pStyle w:val="Compact"/>
+            </w:pPr>
+            <w:r>
+              <w:t xml:space="preserve">6 x 128 iteration 30 vs 4 x 64 iteration 460</w:t>
+            </w:r>
+          </w:p>
+        </w:tc>
+        <w:tc>
+          <w:tcPr/>
+          <w:p>
+            <w:pPr>
+              <w:pStyle w:val="Compact"/>
+            </w:pPr>
+            <w:r>
+              <w:t xml:space="preserve">4</w:t>
+            </w:r>
+          </w:p>
+        </w:tc>
+        <w:tc>
+          <w:tcPr/>
+          <w:p>
+            <w:pPr>
+              <w:pStyle w:val="Compact"/>
+            </w:pPr>
+            <w:r>
+              <w:t xml:space="preserve">21</w:t>
+            </w:r>
+          </w:p>
+        </w:tc>
+        <w:tc>
+          <w:tcPr/>
+          <w:p>
+            <w:pPr>
+              <w:pStyle w:val="Compact"/>
+            </w:pPr>
+            <w:r>
+              <w:t xml:space="preserve">0.411 +/- 0.048</w:t>
+            </w:r>
+          </w:p>
+        </w:tc>
+      </w:tr>
+      <w:tr>
+        <w:tc>
+          <w:tcPr/>
+          <w:p>
+            <w:pPr>
+              <w:pStyle w:val="Compact"/>
+            </w:pPr>
+            <w:r>
+              <w:t xml:space="preserve">6 x 128 iteration 60 vs 4 x 64 iteration 460</w:t>
+            </w:r>
+          </w:p>
+        </w:tc>
+        <w:tc>
+          <w:tcPr/>
+          <w:p>
+            <w:pPr>
+              <w:pStyle w:val="Compact"/>
+            </w:pPr>
+            <w:r>
+              <w:t xml:space="preserve">3</w:t>
+            </w:r>
+          </w:p>
+        </w:tc>
+        <w:tc>
+          <w:tcPr/>
+          <w:p>
+            <w:pPr>
+              <w:pStyle w:val="Compact"/>
+            </w:pPr>
+            <w:r>
+              <w:t xml:space="preserve">17</w:t>
+            </w:r>
+          </w:p>
+        </w:tc>
+        <w:tc>
+          <w:tcPr/>
+          <w:p>
+            <w:pPr>
+              <w:pStyle w:val="Compact"/>
+            </w:pPr>
+            <w:r>
+              <w:t xml:space="preserve">0.427 +/- 0.043</w:t>
+            </w:r>
+          </w:p>
+        </w:tc>
+      </w:tr>
+      <w:tr>
+        <w:tc>
+          <w:tcPr/>
+          <w:p>
+            <w:pPr>
+              <w:pStyle w:val="Compact"/>
+            </w:pPr>
+            <w:r>
+              <w:t xml:space="preserve">6 x 128 iteration 60 vs 4 x 64 iteration 420</w:t>
+            </w:r>
+          </w:p>
+        </w:tc>
+        <w:tc>
+          <w:tcPr/>
+          <w:p>
+            <w:pPr>
+              <w:pStyle w:val="Compact"/>
+            </w:pPr>
+            <w:r>
+              <w:t xml:space="preserve">8</w:t>
+            </w:r>
+          </w:p>
+        </w:tc>
+        <w:tc>
+          <w:tcPr/>
+          <w:p>
+            <w:pPr>
+              <w:pStyle w:val="Compact"/>
+            </w:pPr>
+            <w:r>
+              <w:t xml:space="preserve">14</w:t>
+            </w:r>
+          </w:p>
+        </w:tc>
+        <w:tc>
+          <w:tcPr/>
+          <w:p>
+            <w:pPr>
+              <w:pStyle w:val="Compact"/>
+            </w:pPr>
+            <w:r>
+              <w:t xml:space="preserve">0.468 +/- 0.049</w:t>
+            </w:r>
+          </w:p>
+        </w:tc>
+      </w:tr>
+    </w:tbl>
+    <w:p>
+      <w:pPr>
+        <w:pStyle w:val="BodyText"/>
+      </w:pPr>
+      <w:r>
+        <w:t xml:space="preserve">Each iteration of the larger network took about 25 to 30 minutes instead of</w:t>
+      </w:r>
+      <w:r>
+        <w:t xml:space="preserve"> </w:t>
+      </w:r>
+      <w:r>
+        <w:t xml:space="preserve">about 9. After 61 iterations (about 31 hours) it was still behind and</w:t>
+      </w:r>
+      <w:r>
+        <w:t xml:space="preserve"> </w:t>
+      </w:r>
+      <w:r>
+        <w:t xml:space="preserve">improving slowly, so we stopped it and used the time for the lower learning</w:t>
+      </w:r>
+      <w:r>
+        <w:t xml:space="preserve"> </w:t>
+      </w:r>
+      <w:r>
+        <w:t xml:space="preserve">rate instead. With more compute it might overtake the smaller network; we</w:t>
+      </w:r>
+      <w:r>
+        <w:t xml:space="preserve"> </w:t>
+      </w:r>
+      <w:r>
+        <w:t xml:space="preserve">could not test that.</w:t>
+      </w:r>
+    </w:p>
+    <w:bookmarkEnd w:id="46"/>
+    <w:bookmarkStart w:id="50" w:name="X7e697f50ae1dd5e44c97332acfdfba23be11cde"/>
+    <w:p>
+      <w:pPr>
+        <w:pStyle w:val="Heading2"/>
+      </w:pPr>
+      <w:r>
+        <w:t xml:space="preserve">6.11 Exploratory runs (outside the course constraints)</w:t>
+      </w:r>
+    </w:p>
+    <w:p>
+      <w:pPr>
+        <w:pStyle w:val="FirstParagraph"/>
+      </w:pPr>
+      <w:r>
+        <w:t xml:space="preserve">We ran two short experiments that break the constraints, to test the</w:t>
+      </w:r>
+      <w:r>
+        <w:t xml:space="preserve"> </w:t>
+      </w:r>
+      <w:r>
+        <w:t xml:space="preserve">diagnosis below. They are not the final agent.</w:t>
+      </w:r>
+    </w:p>
+    <w:p>
+      <w:pPr>
+        <w:pStyle w:val="Compact"/>
+        <w:numPr>
+          <w:ilvl w:val="0"/>
+          <w:numId w:val="1005"/>
+        </w:numPr>
+      </w:pPr>
+      <w:r>
+        <w:rPr>
+          <w:b/>
+          <w:bCs/>
+        </w:rPr>
+        <w:t xml:space="preserve">Material value targets</w:t>
+      </w:r>
+      <w:r>
+        <w:t xml:space="preserve"> </w:t>
+      </w:r>
+      <w:r>
+        <w:t xml:space="preserve">(30 simulations, 10 x 10 games): drawn games get a</w:t>
+      </w:r>
+      <w:r>
+        <w:t xml:space="preserve"> </w:t>
+      </w:r>
+      <w:r>
+        <w:t xml:space="preserve">value target from the final material balance, which uses piece values. The</w:t>
+      </w:r>
+      <w:r>
+        <w:t xml:space="preserve"> </w:t>
+      </w:r>
+      <w:r>
+        <w:t xml:space="preserve">value head did learn material (correlation +0.45 with the material balance,</w:t>
+      </w:r>
+      <w:r>
+        <w:t xml:space="preserve"> </w:t>
+      </w:r>
+      <w:r>
+        <w:t xml:space="preserve">against +0.07 in run 1), but strength did not improve (0.474 and 0.469</w:t>
+      </w:r>
+      <w:r>
+        <w:t xml:space="preserve"> </w:t>
+      </w:r>
+      <w:r>
+        <w:t xml:space="preserve">against untrained at iterations 5 and 10).</w:t>
+      </w:r>
+    </w:p>
+    <w:p>
+      <w:pPr>
+        <w:pStyle w:val="Compact"/>
+        <w:numPr>
+          <w:ilvl w:val="0"/>
+          <w:numId w:val="1005"/>
+        </w:numPr>
+      </w:pPr>
+      <w:r>
+        <w:rPr>
+          <w:b/>
+          <w:bCs/>
+        </w:rPr>
+        <w:t xml:space="preserve">100 simulations per move</w:t>
+      </w:r>
+      <w:r>
+        <w:t xml:space="preserve"> </w:t>
+      </w:r>
+      <w:r>
+        <w:t xml:space="preserve">(10 x 10 games, also with material targets):</w:t>
+      </w:r>
+      <w:r>
+        <w:t xml:space="preserve"> </w:t>
+      </w:r>
+      <w:r>
+        <w:t xml:space="preserve">decisive games peaked at 60% in iteration 3, but strength against untrained</w:t>
+      </w:r>
+      <w:r>
+        <w:t xml:space="preserve"> </w:t>
+      </w:r>
+      <w:r>
+        <w:t xml:space="preserve">was 0.421 at iteration 5 and 0.346 at iteration 10.</w:t>
+      </w:r>
+    </w:p>
+    <w:p>
+      <w:pPr>
+        <w:pStyle w:val="CaptionedFigure"/>
+      </w:pPr>
+      <w:r>
+        <w:drawing>
+          <wp:inline>
+            <wp:extent cx="5334000" cy="3394363"/>
+            <wp:effectExtent b="0" l="0" r="0" t="0"/>
+            <wp:docPr descr="Exploratory runs: loss, decisive share and game length." title="" id="48" name="Picture"/>
+            <a:graphic>
+              <a:graphicData uri="http://schemas.openxmlformats.org/drawingml/2006/picture">
+                <pic:pic>
+                  <pic:nvPicPr>
+                    <pic:cNvPr descr="../results/training_curves_exploratory.png" id="49" name="Picture"/>
+                    <pic:cNvPicPr>
+                      <a:picLocks noChangeArrowheads="1" noChangeAspect="1"/>
+                    </pic:cNvPicPr>
+                  </pic:nvPicPr>
+                  <pic:blipFill>
+                    <a:blip r:embed="rId47"/>
+                    <a:stretch>
+                      <a:fillRect/>
+                    </a:stretch>
+                  </pic:blipFill>
+                  <pic:spPr bwMode="auto">
+                    <a:xfrm>
+                      <a:off x="0" y="0"/>
+                      <a:ext cx="5334000" cy="3394363"/>
+                    </a:xfrm>
+                    <a:prstGeom prst="rect">
+                      <a:avLst/>
+                    </a:prstGeom>
+                    <a:noFill/>
+                    <a:ln w="9525">
+                      <a:noFill/>
+                      <a:headEnd/>
+                      <a:tailEnd/>
+                    </a:ln>
+                  </pic:spPr>
+                </pic:pic>
+              </a:graphicData>
+            </a:graphic>
+          </wp:inline>
+        </w:drawing>
+      </w:r>
+    </w:p>
+    <w:p>
+      <w:pPr>
+        <w:pStyle w:val="ImageCaption"/>
+      </w:pPr>
+      <w:r>
         <w:t xml:space="preserve">Exploratory runs: loss, decisive share and game length.</w:t>
       </w:r>
     </w:p>
-    <w:bookmarkEnd w:id="38"/>
-    <w:bookmarkEnd w:id="39"/>
-    <w:bookmarkStart w:id="40" w:name="discussion"/>
+    <w:bookmarkEnd w:id="50"/>
+    <w:bookmarkEnd w:id="51"/>
+    <w:bookmarkStart w:id="52" w:name="discussion"/>
     <w:p>
       <w:pPr>
         <w:pStyle w:val="Heading1"/>
@@ -3931,25 +6443,35 @@
         <w:pStyle w:val="FirstParagraph"/>
       </w:pPr>
       <w:r>
-        <w:t xml:space="preserve">We first checked for a bug. The tests confirm the value targets have the right</w:t>
-      </w:r>
-      <w:r>
-        <w:t xml:space="preserve"> </w:t>
-      </w:r>
-      <w:r>
-        <w:t xml:space="preserve">sign for both colors, the policy targets match the visit counts, and the</w:t>
-      </w:r>
-      <w:r>
-        <w:t xml:space="preserve"> </w:t>
-      </w:r>
-      <w:r>
-        <w:t xml:space="preserve">encoding and actions agree for Black, so we believe the result reflects the</w:t>
-      </w:r>
-      <w:r>
-        <w:t xml:space="preserve"> </w:t>
-      </w:r>
-      <w:r>
-        <w:t xml:space="preserve">method at this scale, not an error. Three causes stand out:</w:t>
+        <w:rPr>
+          <w:b/>
+          <w:bCs/>
+        </w:rPr>
+        <w:t xml:space="preserve">The first runs.</w:t>
+      </w:r>
+      <w:r>
+        <w:t xml:space="preserve"> </w:t>
+      </w:r>
+      <w:r>
+        <w:t xml:space="preserve">We first checked for a bug. The tests confirm the value</w:t>
+      </w:r>
+      <w:r>
+        <w:t xml:space="preserve"> </w:t>
+      </w:r>
+      <w:r>
+        <w:t xml:space="preserve">targets have the right sign for both colors, the policy targets match the visit</w:t>
+      </w:r>
+      <w:r>
+        <w:t xml:space="preserve"> </w:t>
+      </w:r>
+      <w:r>
+        <w:t xml:space="preserve">counts, and the encoding and actions agree for Black, so we believe the result</w:t>
+      </w:r>
+      <w:r>
+        <w:t xml:space="preserve"> </w:t>
+      </w:r>
+      <w:r>
+        <w:t xml:space="preserve">reflected the method at that scale, not an error. Three causes stood out:</w:t>
       </w:r>
     </w:p>
     <w:p>
@@ -4091,23 +6613,101 @@
         <w:pStyle w:val="BodyText"/>
       </w:pPr>
       <w:r>
-        <w:t xml:space="preserve">The exploratory runs suggest that a better value signal alone is not enough at</w:t>
-      </w:r>
-      <w:r>
-        <w:t xml:space="preserve"> </w:t>
-      </w:r>
-      <w:r>
-        <w:t xml:space="preserve">this scale: the value head learned material, but 30 to 100 simulations with a</w:t>
-      </w:r>
-      <w:r>
-        <w:t xml:space="preserve"> </w:t>
-      </w:r>
-      <w:r>
-        <w:t xml:space="preserve">weak policy still did not produce stronger play in 100 games.</w:t>
-      </w:r>
-    </w:p>
-    <w:bookmarkEnd w:id="40"/>
-    <w:bookmarkStart w:id="41" w:name="limitations-and-future-work"/>
+        <w:t xml:space="preserve">The exploratory runs suggested that a better value signal alone is not enough</w:t>
+      </w:r>
+      <w:r>
+        <w:t xml:space="preserve"> </w:t>
+      </w:r>
+      <w:r>
+        <w:t xml:space="preserve">at that scale: the value head learned material, but 30 to 100 simulations with</w:t>
+      </w:r>
+      <w:r>
+        <w:t xml:space="preserve"> </w:t>
+      </w:r>
+      <w:r>
+        <w:t xml:space="preserve">a weak policy still did not produce stronger play in 100 games.</w:t>
+      </w:r>
+    </w:p>
+    <w:p>
+      <w:pPr>
+        <w:pStyle w:val="BodyText"/>
+      </w:pPr>
+      <w:r>
+        <w:rPr>
+          <w:b/>
+          <w:bCs/>
+        </w:rPr>
+        <w:t xml:space="preserve">The long run confirms the first cause.</w:t>
+      </w:r>
+      <w:r>
+        <w:t xml:space="preserve"> </w:t>
+      </w:r>
+      <w:r>
+        <w:t xml:space="preserve">With 135 times as many games and</w:t>
+      </w:r>
+      <w:r>
+        <w:t xml:space="preserve"> </w:t>
+      </w:r>
+      <w:r>
+        <w:t xml:space="preserve">nothing else changed in the method, the agent became clearly stronger than its</w:t>
+      </w:r>
+      <w:r>
+        <w:t xml:space="preserve"> </w:t>
+      </w:r>
+      <w:r>
+        <w:t xml:space="preserve">starting point and than random and untrained play (Sections 6.7 and 6.9). Two</w:t>
+      </w:r>
+      <w:r>
+        <w:t xml:space="preserve"> </w:t>
+      </w:r>
+      <w:r>
+        <w:t xml:space="preserve">lessons stand out. First, most of the gain came early, and at a fixed learning</w:t>
+      </w:r>
+      <w:r>
+        <w:t xml:space="preserve"> </w:t>
+      </w:r>
+      <w:r>
+        <w:t xml:space="preserve">rate of 1e-3 the network then moved around one level of play; lowering the</w:t>
+      </w:r>
+      <w:r>
+        <w:t xml:space="preserve"> </w:t>
+      </w:r>
+      <w:r>
+        <w:t xml:space="preserve">learning rate gave the clearest single improvement of the run (Section 6.8).</w:t>
+      </w:r>
+      <w:r>
+        <w:t xml:space="preserve"> </w:t>
+      </w:r>
+      <w:r>
+        <w:t xml:space="preserve">Second, the third cause above remains: about 80% of self-play games are still</w:t>
+      </w:r>
+      <w:r>
+        <w:t xml:space="preserve"> </w:t>
+      </w:r>
+      <w:r>
+        <w:t xml:space="preserve">drawn, so the agent has learned to keep material and not to lose, but it gets</w:t>
+      </w:r>
+      <w:r>
+        <w:t xml:space="preserve"> </w:t>
+      </w:r>
+      <w:r>
+        <w:t xml:space="preserve">few examples of how a won position is finished, and most of its games end by</w:t>
+      </w:r>
+      <w:r>
+        <w:t xml:space="preserve"> </w:t>
+      </w:r>
+      <w:r>
+        <w:t xml:space="preserve">the no-progress rule. Greedy capture, which trades whenever it can, is hard to</w:t>
+      </w:r>
+      <w:r>
+        <w:t xml:space="preserve"> </w:t>
+      </w:r>
+      <w:r>
+        <w:t xml:space="preserve">beat for an agent that cannot yet force checkmate.</w:t>
+      </w:r>
+    </w:p>
+    <w:bookmarkEnd w:id="52"/>
+    <w:bookmarkStart w:id="53" w:name="limitations-and-future-work"/>
     <w:p>
       <w:pPr>
         <w:pStyle w:val="Heading1"/>
@@ -4125,13 +6725,19 @@
         </w:numPr>
       </w:pPr>
       <w:r>
-        <w:t xml:space="preserve">Every benchmark uses 20 games per checkpoint, so differences smaller than</w:t>
-      </w:r>
-      <w:r>
-        <w:t xml:space="preserve"> </w:t>
-      </w:r>
-      <w:r>
-        <w:t xml:space="preserve">about 0.1 cannot be resolved.</w:t>
+        <w:t xml:space="preserve">The first runs’ benchmarks use 20 games per checkpoint, so differences</w:t>
+      </w:r>
+      <w:r>
+        <w:t xml:space="preserve"> </w:t>
+      </w:r>
+      <w:r>
+        <w:t xml:space="preserve">smaller than about 0.1 cannot be resolved there. The long run uses 100 games</w:t>
+      </w:r>
+      <w:r>
+        <w:t xml:space="preserve"> </w:t>
+      </w:r>
+      <w:r>
+        <w:t xml:space="preserve">per benchmark, and differences smaller than about 0.03 to 0.06 still cannot.</w:t>
       </w:r>
     </w:p>
     <w:p>
@@ -4143,7 +6749,13 @@
         </w:numPr>
       </w:pPr>
       <w:r>
-        <w:t xml:space="preserve">The human evaluation is six games by one beginner.</w:t>
+        <w:t xml:space="preserve">With most games drawn, a match score says little about how often the agent</w:t>
+      </w:r>
+      <w:r>
+        <w:t xml:space="preserve"> </w:t>
+      </w:r>
+      <w:r>
+        <w:t xml:space="preserve">can actually win.</w:t>
       </w:r>
     </w:p>
     <w:p>
@@ -4155,13 +6767,31 @@
         </w:numPr>
       </w:pPr>
       <w:r>
-        <w:t xml:space="preserve">Compute was the main limit: about 20 minutes per iteration of 20 games on</w:t>
-      </w:r>
-      <w:r>
-        <w:t xml:space="preserve"> </w:t>
-      </w:r>
-      <w:r>
-        <w:t xml:space="preserve">one CPU core.</w:t>
+        <w:t xml:space="preserve">The human evaluation is six games by one beginner, against final B, not the</w:t>
+      </w:r>
+      <w:r>
+        <w:t xml:space="preserve"> </w:t>
+      </w:r>
+      <w:r>
+        <w:t xml:space="preserve">final model.</w:t>
+      </w:r>
+    </w:p>
+    <w:p>
+      <w:pPr>
+        <w:pStyle w:val="Compact"/>
+        <w:numPr>
+          <w:ilvl w:val="0"/>
+          <w:numId w:val="1007"/>
+        </w:numPr>
+      </w:pPr>
+      <w:r>
+        <w:t xml:space="preserve">Compute was the main limit: even after the speed-up, one iteration of 100</w:t>
+      </w:r>
+      <w:r>
+        <w:t xml:space="preserve"> </w:t>
+      </w:r>
+      <w:r>
+        <w:t xml:space="preserve">games takes about 9 minutes, and the larger network about 25 to 30.</w:t>
       </w:r>
     </w:p>
     <w:p>
@@ -4181,13 +6811,13 @@
         </w:numPr>
       </w:pPr>
       <w:r>
-        <w:t xml:space="preserve">Many more self-play games: parallel self-play workers and runs of hundreds</w:t>
-      </w:r>
-      <w:r>
-        <w:t xml:space="preserve"> </w:t>
-      </w:r>
-      <w:r>
-        <w:t xml:space="preserve">of iterations.</w:t>
+        <w:t xml:space="preserve">A way for results to reach the value head more often, within the rules: a</w:t>
+      </w:r>
+      <w:r>
+        <w:t xml:space="preserve"> </w:t>
+      </w:r>
+      <w:r>
+        <w:t xml:space="preserve">shorter game cap during self-play, or resigning hopeless games.</w:t>
       </w:r>
     </w:p>
     <w:p>
@@ -4199,13 +6829,7 @@
         </w:numPr>
       </w:pPr>
       <w:r>
-        <w:t xml:space="preserve">A shorter game cap or resignation rule, so results reach the value head</w:t>
-      </w:r>
-      <w:r>
-        <w:t xml:space="preserve"> </w:t>
-      </w:r>
-      <w:r>
-        <w:t xml:space="preserve">more often.</w:t>
+        <w:t xml:space="preserve">Even longer training, with a lower learning rate earlier in the run.</w:t>
       </w:r>
     </w:p>
     <w:p>
@@ -4217,11 +6841,11 @@
         </w:numPr>
       </w:pPr>
       <w:r>
-        <w:t xml:space="preserve">More simulations once the value head is useful, and a larger network.</w:t>
-      </w:r>
-    </w:p>
-    <w:bookmarkEnd w:id="41"/>
-    <w:bookmarkStart w:id="42" w:name="conclusion"/>
+        <w:t xml:space="preserve">The larger network, given the days of compute it needs to catch up.</w:t>
+      </w:r>
+    </w:p>
+    <w:bookmarkEnd w:id="53"/>
+    <w:bookmarkStart w:id="54" w:name="conclusion"/>
     <w:p>
       <w:pPr>
         <w:pStyle w:val="Heading1"/>
@@ -4235,59 +6859,71 @@
         <w:pStyle w:val="FirstParagraph"/>
       </w:pPr>
       <w:r>
-        <w:t xml:space="preserve">We implemented every part of an AlphaZero-style system for Chaturanga under</w:t>
-      </w:r>
-      <w:r>
-        <w:t xml:space="preserve"> </w:t>
-      </w:r>
-      <w:r>
-        <w:t xml:space="preserve">the course constraints and verified it with 97 tests. Training ran as designed,</w:t>
-      </w:r>
-      <w:r>
-        <w:t xml:space="preserve"> </w:t>
-      </w:r>
-      <w:r>
-        <w:t xml:space="preserve">and the network learned to imitate its own search, but in 400 self-play games</w:t>
-      </w:r>
-      <w:r>
-        <w:t xml:space="preserve"> </w:t>
-      </w:r>
-      <w:r>
-        <w:t xml:space="preserve">per run the agent did not become measurably stronger than its untrained start,</w:t>
-      </w:r>
-      <w:r>
-        <w:t xml:space="preserve"> </w:t>
-      </w:r>
-      <w:r>
-        <w:t xml:space="preserve">and a beginner beat it. The cause is a value signal starved by draws: most</w:t>
-      </w:r>
-      <w:r>
-        <w:t xml:space="preserve"> </w:t>
-      </w:r>
-      <w:r>
-        <w:t xml:space="preserve">games end by the no-progress rule, so the value head sees almost only 0. The</w:t>
-      </w:r>
-      <w:r>
-        <w:t xml:space="preserve"> </w:t>
-      </w:r>
-      <w:r>
-        <w:t xml:space="preserve">evaluation tools we built (a fixed benchmark protocol, head-to-head matches,</w:t>
-      </w:r>
-      <w:r>
-        <w:t xml:space="preserve"> </w:t>
-      </w:r>
-      <w:r>
-        <w:t xml:space="preserve">game-ending counts and human-game logging) made this result measurable and</w:t>
-      </w:r>
-      <w:r>
-        <w:t xml:space="preserve"> </w:t>
-      </w:r>
-      <w:r>
-        <w:t xml:space="preserve">explainable, and they are ready for a longer run.</w:t>
-      </w:r>
-    </w:p>
-    <w:bookmarkEnd w:id="42"/>
-    <w:bookmarkStart w:id="43" w:name="references"/>
+        <w:t xml:space="preserve">We implemented every part of an AlphaZero-style system for Chaturanga under the</w:t>
+      </w:r>
+      <w:r>
+        <w:t xml:space="preserve"> </w:t>
+      </w:r>
+      <w:r>
+        <w:t xml:space="preserve">course constraints and verified it with 108 tests. With 400 self-play games per</w:t>
+      </w:r>
+      <w:r>
+        <w:t xml:space="preserve"> </w:t>
+      </w:r>
+      <w:r>
+        <w:t xml:space="preserve">run the agent did not improve, and we measured why: draws starve the value</w:t>
+      </w:r>
+      <w:r>
+        <w:t xml:space="preserve"> </w:t>
+      </w:r>
+      <w:r>
+        <w:t xml:space="preserve">head, and the data was far too small. After making self-play about 11 times</w:t>
+      </w:r>
+      <w:r>
+        <w:t xml:space="preserve"> </w:t>
+      </w:r>
+      <w:r>
+        <w:t xml:space="preserve">faster, a run of 54,000 games with the same method produced a clearly stronger</w:t>
+      </w:r>
+      <w:r>
+        <w:t xml:space="preserve"> </w:t>
+      </w:r>
+      <w:r>
+        <w:t xml:space="preserve">agent. The final model beats its starting point 27 wins to 0 and beats random</w:t>
+      </w:r>
+      <w:r>
+        <w:t xml:space="preserve"> </w:t>
+      </w:r>
+      <w:r>
+        <w:t xml:space="preserve">and untrained play, losing almost no games. It still draws nearly every game</w:t>
+      </w:r>
+      <w:r>
+        <w:t xml:space="preserve"> </w:t>
+      </w:r>
+      <w:r>
+        <w:t xml:space="preserve">against greedy capture and rarely checkmates, so learning to convert an</w:t>
+      </w:r>
+      <w:r>
+        <w:t xml:space="preserve"> </w:t>
+      </w:r>
+      <w:r>
+        <w:t xml:space="preserve">advantage remains the open problem. The evaluation tools (a fixed benchmark</w:t>
+      </w:r>
+      <w:r>
+        <w:t xml:space="preserve"> </w:t>
+      </w:r>
+      <w:r>
+        <w:t xml:space="preserve">protocol, head-to-head matches, game-ending counts and human-game logging) made</w:t>
+      </w:r>
+      <w:r>
+        <w:t xml:space="preserve"> </w:t>
+      </w:r>
+      <w:r>
+        <w:t xml:space="preserve">both the negative and the positive result measurable.</w:t>
+      </w:r>
+    </w:p>
+    <w:bookmarkEnd w:id="54"/>
+    <w:bookmarkStart w:id="55" w:name="references"/>
     <w:p>
       <w:pPr>
         <w:pStyle w:val="Heading1"/>
@@ -4358,8 +6994,8 @@
         <w:t xml:space="preserve">, 550, 354-359.</w:t>
       </w:r>
     </w:p>
-    <w:bookmarkEnd w:id="43"/>
-    <w:bookmarkStart w:id="44" w:name="appendix-a-team-roles"/>
+    <w:bookmarkEnd w:id="55"/>
+    <w:bookmarkStart w:id="56" w:name="appendix-a-team-roles"/>
     <w:p>
       <w:pPr>
         <w:pStyle w:val="Heading1"/>
@@ -4506,8 +7142,8 @@
         </w:tc>
       </w:tr>
     </w:tbl>
-    <w:bookmarkEnd w:id="44"/>
-    <w:bookmarkStart w:id="45" w:name="appendix-b-reproducing-the-results"/>
+    <w:bookmarkEnd w:id="56"/>
+    <w:bookmarkStart w:id="57" w:name="appendix-b-reproducing-the-results"/>
     <w:p>
       <w:pPr>
         <w:pStyle w:val="Heading1"/>
@@ -4587,7 +7223,88 @@
         <w:rPr>
           <w:rStyle w:val="VerbatimChar"/>
         </w:rPr>
-        <w:t xml:space="preserve">python play_vs_ai.py --checkpoint checkpoints/final_B/latest.pt --player NAME</w:t>
+        <w:t xml:space="preserve"># long run (continues final B; see training/README.md for the later stretches)</w:t>
+      </w:r>
+      <w:r>
+        <w:br/>
+      </w:r>
+      <w:r>
+        <w:rPr>
+          <w:rStyle w:val="VerbatimChar"/>
+        </w:rPr>
+        <w:t xml:space="preserve">OMP_NUM_THREADS=1 python -m training.train --resume checkpoints/final_B/latest.pt \</w:t>
+      </w:r>
+      <w:r>
+        <w:br/>
+      </w:r>
+      <w:r>
+        <w:rPr>
+          <w:rStyle w:val="VerbatimChar"/>
+        </w:rPr>
+        <w:t xml:space="preserve">    --iterations 420 --games_per_iter 100 --simulations 50 --avoid_repetition \</w:t>
+      </w:r>
+      <w:r>
+        <w:br/>
+      </w:r>
+      <w:r>
+        <w:rPr>
+          <w:rStyle w:val="VerbatimChar"/>
+        </w:rPr>
+        <w:t xml:space="preserve">    --temperature_moves 1000 --max_plies 800 --buffer_capacity 250000 \</w:t>
+      </w:r>
+      <w:r>
+        <w:br/>
+      </w:r>
+      <w:r>
+        <w:rPr>
+          <w:rStyle w:val="VerbatimChar"/>
+        </w:rPr>
+        <w:t xml:space="preserve">    --min_buffer 150000 --batch_size 256 --train_steps 500 --lr 1e-3 \</w:t>
+      </w:r>
+      <w:r>
+        <w:br/>
+      </w:r>
+      <w:r>
+        <w:rPr>
+          <w:rStyle w:val="VerbatimChar"/>
+        </w:rPr>
+        <w:t xml:space="preserve">    --device mps --workers 6 --seed 1 \</w:t>
+      </w:r>
+      <w:r>
+        <w:br/>
+      </w:r>
+      <w:r>
+        <w:rPr>
+          <w:rStyle w:val="VerbatimChar"/>
+        </w:rPr>
+        <w:t xml:space="preserve">    --checkpoint_dir checkpoints/long --log checkpoints/long/log.csv</w:t>
+      </w:r>
+      <w:r>
+        <w:br/>
+      </w:r>
+      <w:r>
+        <w:rPr>
+          <w:rStyle w:val="VerbatimChar"/>
+        </w:rPr>
+        <w:t xml:space="preserve">python -m evaluation.parallel_match --a models/chaturangzero_final.pt \</w:t>
+      </w:r>
+      <w:r>
+        <w:br/>
+      </w:r>
+      <w:r>
+        <w:rPr>
+          <w:rStyle w:val="VerbatimChar"/>
+        </w:rPr>
+        <w:t xml:space="preserve">    --b checkpoints/final_B/latest.pt --games 100 --workers 6</w:t>
+      </w:r>
+      <w:r>
+        <w:br/>
+      </w:r>
+      <w:r>
+        <w:rPr>
+          <w:rStyle w:val="VerbatimChar"/>
+        </w:rPr>
+        <w:t xml:space="preserve">python play_vs_ai.py --checkpoint models/chaturangzero_final.pt --player NAME</w:t>
       </w:r>
     </w:p>
     <w:p>
@@ -4607,10 +7324,28 @@
         <w:t xml:space="preserve">results/</w:t>
       </w:r>
       <w:r>
+        <w:t xml:space="preserve">, and the final</w:t>
+      </w:r>
+      <w:r>
+        <w:t xml:space="preserve"> </w:t>
+      </w:r>
+      <w:r>
+        <w:t xml:space="preserve">model is</w:t>
+      </w:r>
+      <w:r>
+        <w:t xml:space="preserve"> </w:t>
+      </w:r>
+      <w:r>
+        <w:rPr>
+          <w:rStyle w:val="VerbatimChar"/>
+        </w:rPr>
+        <w:t xml:space="preserve">models/chaturangzero_final.pt</w:t>
+      </w:r>
+      <w:r>
         <w:t xml:space="preserve">.</w:t>
       </w:r>
     </w:p>
-    <w:bookmarkEnd w:id="45"/>
+    <w:bookmarkEnd w:id="57"/>
     <w:sectPr>
       <w:footnotePr>
         <w:numRestart w:val="eachSect"/>

</xml_diff>

<commit_message>
Add the long-run results, the final model and the updated report (#18)
- Final model (iteration 560) saved as models/chaturangzero_final.pt
- Long-run training log, benchmark curves and match logs in results/
- results/README.md, README.md and training/README.md updated with the
  final numbers and the commands used
- Report (Markdown and Word) updated with the long run, the lower
  learning rate stretches, the bigger-network attempt and a conclusion
- plot_training_curves.py spaces out markers on long runs

Co-authored-by: Claude Opus 5.5 <noreply@anthropic.com>
</commit_message>
<xml_diff>
--- a/report/REPORT.docx
+++ b/report/REPORT.docx
@@ -64,79 +64,85 @@
         <w:t xml:space="preserve"> </w:t>
       </w:r>
       <w:r>
-        <w:t xml:space="preserve">itself. The full system runs on a single CPU: a rules engine checked by unit</w:t>
-      </w:r>
-      <w:r>
-        <w:t xml:space="preserve"> </w:t>
-      </w:r>
-      <w:r>
-        <w:t xml:space="preserve">tests, the network, search, a self-play training loop with a replay buffer, and</w:t>
-      </w:r>
-      <w:r>
-        <w:t xml:space="preserve"> </w:t>
-      </w:r>
-      <w:r>
-        <w:t xml:space="preserve">an evaluation suite. We trained two final runs of 400 self-play games each</w:t>
-      </w:r>
-      <w:r>
-        <w:t xml:space="preserve"> </w:t>
-      </w:r>
-      <w:r>
-        <w:t xml:space="preserve">(50 simulations per move, a 4-block, 64-filter network, about 7 hours per run).</w:t>
-      </w:r>
-      <w:r>
-        <w:t xml:space="preserve"> </w:t>
-      </w:r>
-      <w:r>
-        <w:t xml:space="preserve">The policy loss fell from about 5 to 2.2, but the trained agent is not</w:t>
-      </w:r>
-      <w:r>
-        <w:t xml:space="preserve"> </w:t>
-      </w:r>
-      <w:r>
-        <w:t xml:space="preserve">measurably stronger than the untrained network. Against an untrained network, a</w:t>
-      </w:r>
-      <w:r>
-        <w:t xml:space="preserve"> </w:t>
-      </w:r>
-      <w:r>
-        <w:t xml:space="preserve">random player and a greedy-capture player, every checkpoint scores within its</w:t>
-      </w:r>
-      <w:r>
-        <w:t xml:space="preserve"> </w:t>
-      </w:r>
-      <w:r>
-        <w:t xml:space="preserve">95% margin of 0.5. In six games against a human new to chess, the agent lost 3</w:t>
-      </w:r>
-      <w:r>
-        <w:t xml:space="preserve"> </w:t>
-      </w:r>
-      <w:r>
-        <w:t xml:space="preserve">and drew 3. We measured why: about 80% of self-play games are drawn, mostly by</w:t>
-      </w:r>
-      <w:r>
-        <w:t xml:space="preserve"> </w:t>
-      </w:r>
-      <w:r>
-        <w:t xml:space="preserve">the 100-ply no-progress rule, so the value head is trained almost only on</w:t>
-      </w:r>
-      <w:r>
-        <w:t xml:space="preserve"> </w:t>
-      </w:r>
-      <w:r>
-        <w:t xml:space="preserve">targets of 0 and search cannot tell good positions from bad ones. We report</w:t>
-      </w:r>
-      <w:r>
-        <w:t xml:space="preserve"> </w:t>
-      </w:r>
-      <w:r>
-        <w:t xml:space="preserve">this negative result in full, along with the diagnosis and what we expect would</w:t>
-      </w:r>
-      <w:r>
-        <w:t xml:space="preserve"> </w:t>
-      </w:r>
-      <w:r>
-        <w:t xml:space="preserve">fix it.</w:t>
+        <w:t xml:space="preserve">itself. The system has a rules engine checked by unit tests, the network,</w:t>
+      </w:r>
+      <w:r>
+        <w:t xml:space="preserve"> </w:t>
+      </w:r>
+      <w:r>
+        <w:t xml:space="preserve">search, a self-play training loop with a replay buffer, and an evaluation</w:t>
+      </w:r>
+      <w:r>
+        <w:t xml:space="preserve"> </w:t>
+      </w:r>
+      <w:r>
+        <w:t xml:space="preserve">suite. Our first two runs of 400 self-play games each (50 simulations per move,</w:t>
+      </w:r>
+      <w:r>
+        <w:t xml:space="preserve"> </w:t>
+      </w:r>
+      <w:r>
+        <w:t xml:space="preserve">a 4-block, 64-filter network) did not make the agent measurably stronger than</w:t>
+      </w:r>
+      <w:r>
+        <w:t xml:space="preserve"> </w:t>
+      </w:r>
+      <w:r>
+        <w:t xml:space="preserve">an untrained network: about 80% of games were drawn and the data was far too</w:t>
+      </w:r>
+      <w:r>
+        <w:t xml:space="preserve"> </w:t>
+      </w:r>
+      <w:r>
+        <w:t xml:space="preserve">small. We then made self-play about 11 times faster without changing the rules</w:t>
+      </w:r>
+      <w:r>
+        <w:t xml:space="preserve"> </w:t>
+      </w:r>
+      <w:r>
+        <w:t xml:space="preserve">or the search, and trained for 540 more iterations (54,000 games, about 144</w:t>
+      </w:r>
+      <w:r>
+        <w:t xml:space="preserve"> </w:t>
+      </w:r>
+      <w:r>
+        <w:t xml:space="preserve">hours on one laptop), lowering the learning rate at the end. Under the same</w:t>
+      </w:r>
+      <w:r>
+        <w:t xml:space="preserve"> </w:t>
+      </w:r>
+      <w:r>
+        <w:t xml:space="preserve">course constraints, the final model beats the model it started from 27 wins to</w:t>
+      </w:r>
+      <w:r>
+        <w:t xml:space="preserve"> </w:t>
+      </w:r>
+      <w:r>
+        <w:t xml:space="preserve">0 (score 0.657 over 100 games), beats a random player 16 to 0 and an untrained</w:t>
+      </w:r>
+      <w:r>
+        <w:t xml:space="preserve"> </w:t>
+      </w:r>
+      <w:r>
+        <w:t xml:space="preserve">network 17 to 4, but still draws almost every game against a greedy-capture</w:t>
+      </w:r>
+      <w:r>
+        <w:t xml:space="preserve"> </w:t>
+      </w:r>
+      <w:r>
+        <w:t xml:space="preserve">player. Its main weakness is converting an advantage: most of its games end by</w:t>
+      </w:r>
+      <w:r>
+        <w:t xml:space="preserve"> </w:t>
+      </w:r>
+      <w:r>
+        <w:t xml:space="preserve">the 100-ply no-progress rule rather than checkmate. A larger 6-block,</w:t>
+      </w:r>
+      <w:r>
+        <w:t xml:space="preserve"> </w:t>
+      </w:r>
+      <w:r>
+        <w:t xml:space="preserve">128-filter network did not catch up in the time we had.</w:t>
       </w:r>
     </w:p>
     <w:bookmarkEnd w:id="9"/>
@@ -267,6 +273,32 @@
       </w:r>
       <w:r>
         <w:t xml:space="preserve">iterations and baseline players, with learning curves. All four are complete.</w:t>
+      </w:r>
+    </w:p>
+    <w:p>
+      <w:pPr>
+        <w:pStyle w:val="BodyText"/>
+      </w:pPr>
+      <w:r>
+        <w:t xml:space="preserve">The report follows the project in order: the first runs (Section 5.1 and</w:t>
+      </w:r>
+      <w:r>
+        <w:t xml:space="preserve"> </w:t>
+      </w:r>
+      <w:r>
+        <w:t xml:space="preserve">6.1 to 6.5) gave a negative result, the diagnosis (Section 7) led to a faster</w:t>
+      </w:r>
+      <w:r>
+        <w:t xml:space="preserve"> </w:t>
+      </w:r>
+      <w:r>
+        <w:t xml:space="preserve">pipeline and a much longer run, and that long run produced the final model</w:t>
+      </w:r>
+      <w:r>
+        <w:t xml:space="preserve"> </w:t>
+      </w:r>
+      <w:r>
+        <w:t xml:space="preserve">(Sections 5.3 and 6.6 to 6.10).</w:t>
       </w:r>
     </w:p>
     <w:bookmarkEnd w:id="10"/>
@@ -1203,13 +1235,13 @@
         <w:t xml:space="preserve"> </w:t>
       </w:r>
       <w:r>
-        <w:t xml:space="preserve">The current network plays 20 games against itself with 50</w:t>
-      </w:r>
-      <w:r>
-        <w:t xml:space="preserve"> </w:t>
-      </w:r>
-      <w:r>
-        <w:t xml:space="preserve">simulations per move. Moves are sampled in proportion to visit counts.</w:t>
+        <w:t xml:space="preserve">The current network plays 20 games (100 in the long run)</w:t>
+      </w:r>
+      <w:r>
+        <w:t xml:space="preserve"> </w:t>
+      </w:r>
+      <w:r>
+        <w:t xml:space="preserve">against itself with 50 simulations per move. Moves are sampled in proportion to visit counts.</w:t>
       </w:r>
       <w:r>
         <w:t xml:space="preserve"> </w:t>
@@ -1249,19 +1281,25 @@
         <w:t xml:space="preserve"> </w:t>
       </w:r>
       <w:r>
-        <w:t xml:space="preserve">Examples go into a replay buffer of the latest 20,000</w:t>
-      </w:r>
-      <w:r>
-        <w:t xml:space="preserve"> </w:t>
-      </w:r>
-      <w:r>
-        <w:t xml:space="preserve">positions. The network takes 400 Adam steps (learning rate 1e-3) on random</w:t>
-      </w:r>
-      <w:r>
-        <w:t xml:space="preserve"> </w:t>
-      </w:r>
-      <w:r>
-        <w:t xml:space="preserve">batches of 64.</w:t>
+        <w:t xml:space="preserve">Examples go into a replay buffer of the latest positions</w:t>
+      </w:r>
+      <w:r>
+        <w:t xml:space="preserve"> </w:t>
+      </w:r>
+      <w:r>
+        <w:t xml:space="preserve">(20,000 in the first runs, 250,000 in the long run). The network takes Adam</w:t>
+      </w:r>
+      <w:r>
+        <w:t xml:space="preserve"> </w:t>
+      </w:r>
+      <w:r>
+        <w:t xml:space="preserve">steps on random batches (400 steps of 64 in the first runs, 500 steps of</w:t>
+      </w:r>
+      <w:r>
+        <w:t xml:space="preserve"> </w:t>
+      </w:r>
+      <w:r>
+        <w:t xml:space="preserve">256 in the long run).</w:t>
       </w:r>
     </w:p>
     <w:p>
@@ -1517,7 +1555,7 @@
               <w:pStyle w:val="Compact"/>
             </w:pPr>
             <w:r>
-              <w:t xml:space="preserve">baseline players, benchmark, game-ending classifier, human-game log</w:t>
+              <w:t xml:space="preserve">baseline players, benchmark, parallel matches, game-ending classifier, human-game log</w:t>
             </w:r>
           </w:p>
         </w:tc>
@@ -1528,7 +1566,7 @@
         <w:pStyle w:val="BodyText"/>
       </w:pPr>
       <w:r>
-        <w:t xml:space="preserve">97 automated tests cover the rules (36 tests, including check, checkmate,</w:t>
+        <w:t xml:space="preserve">108 automated tests cover the rules (36 tests, including check, checkmate,</w:t>
       </w:r>
       <w:r>
         <w:t xml:space="preserve"> </w:t>
@@ -1555,8 +1593,181 @@
         <w:t xml:space="preserve">benchmark scoring and the evaluation tools. All runs are seeded and repeatable.</w:t>
       </w:r>
     </w:p>
+    <w:p>
+      <w:pPr>
+        <w:pStyle w:val="BodyText"/>
+      </w:pPr>
+      <w:r>
+        <w:rPr>
+          <w:b/>
+          <w:bCs/>
+        </w:rPr>
+        <w:t xml:space="preserve">Faster self-play.</w:t>
+      </w:r>
+      <w:r>
+        <w:t xml:space="preserve"> </w:t>
+      </w:r>
+      <w:r>
+        <w:t xml:space="preserve">For the long run we sped up self-play about 11 times on</w:t>
+      </w:r>
+      <w:r>
+        <w:t xml:space="preserve"> </w:t>
+      </w:r>
+      <w:r>
+        <w:t xml:space="preserve">the same hardware, without changing what it computes:</w:t>
+      </w:r>
+    </w:p>
+    <w:tbl>
+      <w:tblPr>
+        <w:tblStyle w:val="Table"/>
+        <w:tblW w:type="pct" w:w="5000"/>
+        <w:tblLayout w:type="fixed"/>
+        <w:tblLook w:firstRow="1" w:lastRow="0" w:firstColumn="0" w:lastColumn="0" w:noHBand="0" w:noVBand="0" w:val="0020"/>
+      </w:tblPr>
+      <w:tblGrid>
+        <w:gridCol w:w="3960"/>
+        <w:gridCol w:w="3960"/>
+      </w:tblGrid>
+      <w:tr>
+        <w:trPr>
+          <w:tblHeader w:val="on"/>
+        </w:trPr>
+        <w:tc>
+          <w:tcPr/>
+          <w:p>
+            <w:pPr>
+              <w:pStyle w:val="Compact"/>
+            </w:pPr>
+            <w:r>
+              <w:t xml:space="preserve">Change</w:t>
+            </w:r>
+          </w:p>
+        </w:tc>
+        <w:tc>
+          <w:tcPr/>
+          <w:p>
+            <w:pPr>
+              <w:pStyle w:val="Compact"/>
+            </w:pPr>
+            <w:r>
+              <w:t xml:space="preserve">ms per move (50 simulations)</w:t>
+            </w:r>
+          </w:p>
+        </w:tc>
+      </w:tr>
+      <w:tr>
+        <w:tc>
+          <w:tcPr/>
+          <w:p>
+            <w:pPr>
+              <w:pStyle w:val="Compact"/>
+            </w:pPr>
+            <w:r>
+              <w:t xml:space="preserve">Original</w:t>
+            </w:r>
+          </w:p>
+        </w:tc>
+        <w:tc>
+          <w:tcPr/>
+          <w:p>
+            <w:pPr>
+              <w:pStyle w:val="Compact"/>
+            </w:pPr>
+            <w:r>
+              <w:t xml:space="preserve">259</w:t>
+            </w:r>
+          </w:p>
+        </w:tc>
+      </w:tr>
+      <w:tr>
+        <w:tc>
+          <w:tcPr/>
+          <w:p>
+            <w:pPr>
+              <w:pStyle w:val="Compact"/>
+            </w:pPr>
+            <w:r>
+              <w:t xml:space="preserve">Faster rules engine: legal moves cached per position, check detection that looks outward from the king, precomputed move tables</w:t>
+            </w:r>
+          </w:p>
+        </w:tc>
+        <w:tc>
+          <w:tcPr/>
+          <w:p>
+            <w:pPr>
+              <w:pStyle w:val="Compact"/>
+            </w:pPr>
+            <w:r>
+              <w:t xml:space="preserve">48</w:t>
+            </w:r>
+          </w:p>
+        </w:tc>
+      </w:tr>
+      <w:tr>
+        <w:tc>
+          <w:tcPr/>
+          <w:p>
+            <w:pPr>
+              <w:pStyle w:val="Compact"/>
+            </w:pPr>
+            <w:r>
+              <w:t xml:space="preserve">Network copy for search with batch normalization folded into the convolutions</w:t>
+            </w:r>
+          </w:p>
+        </w:tc>
+        <w:tc>
+          <w:tcPr/>
+          <w:p>
+            <w:pPr>
+              <w:pStyle w:val="Compact"/>
+            </w:pPr>
+            <w:r>
+              <w:t xml:space="preserve">19</w:t>
+            </w:r>
+          </w:p>
+        </w:tc>
+      </w:tr>
+    </w:tbl>
+    <w:p>
+      <w:pPr>
+        <w:pStyle w:val="BodyText"/>
+      </w:pPr>
+      <w:r>
+        <w:t xml:space="preserve">On top of that, 6 worker processes play games in parallel, each with its own</w:t>
+      </w:r>
+      <w:r>
+        <w:t xml:space="preserve"> </w:t>
+      </w:r>
+      <w:r>
+        <w:t xml:space="preserve">seed derived from the run seed, the iteration and the game number, so a run</w:t>
+      </w:r>
+      <w:r>
+        <w:t xml:space="preserve"> </w:t>
+      </w:r>
+      <w:r>
+        <w:t xml:space="preserve">does not depend on the number of workers. Training steps run on the laptop’s</w:t>
+      </w:r>
+      <w:r>
+        <w:t xml:space="preserve"> </w:t>
+      </w:r>
+      <w:r>
+        <w:t xml:space="preserve">GPU. A test compares the fast rules engine with a frozen copy of the original</w:t>
+      </w:r>
+      <w:r>
+        <w:t xml:space="preserve"> </w:t>
+      </w:r>
+      <w:r>
+        <w:t xml:space="preserve">on every ply of 40 random games and on 3,000 random positions (same legal moves</w:t>
+      </w:r>
+      <w:r>
+        <w:t xml:space="preserve"> </w:t>
+      </w:r>
+      <w:r>
+        <w:t xml:space="preserve">in the same order, same check and game results).</w:t>
+      </w:r>
+    </w:p>
     <w:bookmarkEnd w:id="17"/>
-    <w:bookmarkStart w:id="20" w:name="experiments"/>
+    <w:bookmarkStart w:id="21" w:name="experiments"/>
     <w:p>
       <w:pPr>
         <w:pStyle w:val="Heading1"/>
@@ -2084,9 +2295,249 @@
         <w:t xml:space="preserve">our agent.</w:t>
       </w:r>
     </w:p>
+    <w:p>
+      <w:pPr>
+        <w:pStyle w:val="FirstParagraph"/>
+      </w:pPr>
+      <w:r>
+        <w:t xml:space="preserve">Head-to-head matches between two checkpoints use the same protocol. In the long</w:t>
+      </w:r>
+      <w:r>
+        <w:t xml:space="preserve"> </w:t>
+      </w:r>
+      <w:r>
+        <w:t xml:space="preserve">run every benchmark and match uses 100 games, with margins of about 0.03 to</w:t>
+      </w:r>
+      <w:r>
+        <w:t xml:space="preserve"> </w:t>
+      </w:r>
+      <w:r>
+        <w:t xml:space="preserve">0.06.</w:t>
+      </w:r>
+    </w:p>
     <w:bookmarkEnd w:id="19"/>
+    <w:bookmarkStart w:id="20" w:name="the-long-run"/>
+    <w:p>
+      <w:pPr>
+        <w:pStyle w:val="Heading2"/>
+      </w:pPr>
+      <w:r>
+        <w:t xml:space="preserve">5.3 The long run</w:t>
+      </w:r>
+    </w:p>
+    <w:p>
+      <w:pPr>
+        <w:pStyle w:val="FirstParagraph"/>
+      </w:pPr>
+      <w:r>
+        <w:t xml:space="preserve">The long run continues from final B (iteration 20) with the same official</w:t>
+      </w:r>
+      <w:r>
+        <w:t xml:space="preserve"> </w:t>
+      </w:r>
+      <w:r>
+        <w:t xml:space="preserve">settings (4 x 64 network, 50 simulations, root noise, repetition avoidance,</w:t>
+      </w:r>
+      <w:r>
+        <w:t xml:space="preserve"> </w:t>
+      </w:r>
+      <w:r>
+        <w:t xml:space="preserve">800-ply cap, draws valued 0). Each iteration plays 100 self-play games and then</w:t>
+      </w:r>
+      <w:r>
+        <w:t xml:space="preserve"> </w:t>
+      </w:r>
+      <w:r>
+        <w:t xml:space="preserve">takes 500 Adam steps of batch 256 from a buffer of 250,000 positions.</w:t>
+      </w:r>
+    </w:p>
+    <w:tbl>
+      <w:tblPr>
+        <w:tblStyle w:val="Table"/>
+        <w:tblW w:type="auto" w:w="0"/>
+        <w:tblLook w:firstRow="1" w:lastRow="0" w:firstColumn="0" w:lastColumn="0" w:noHBand="0" w:noVBand="0" w:val="0020"/>
+      </w:tblPr>
+      <w:tblGrid>
+        <w:gridCol w:w="2640"/>
+        <w:gridCol w:w="2640"/>
+        <w:gridCol w:w="2640"/>
+      </w:tblGrid>
+      <w:tr>
+        <w:trPr>
+          <w:tblHeader w:val="on"/>
+        </w:trPr>
+        <w:tc>
+          <w:tcPr/>
+          <w:p>
+            <w:pPr>
+              <w:pStyle w:val="Compact"/>
+            </w:pPr>
+            <w:r>
+              <w:t xml:space="preserve">Iterations</w:t>
+            </w:r>
+          </w:p>
+        </w:tc>
+        <w:tc>
+          <w:tcPr/>
+          <w:p>
+            <w:pPr>
+              <w:pStyle w:val="Compact"/>
+            </w:pPr>
+            <w:r>
+              <w:t xml:space="preserve">Learning rate</w:t>
+            </w:r>
+          </w:p>
+        </w:tc>
+        <w:tc>
+          <w:tcPr/>
+          <w:p>
+            <w:pPr>
+              <w:pStyle w:val="Compact"/>
+            </w:pPr>
+            <w:r>
+              <w:t xml:space="preserve">Notes</w:t>
+            </w:r>
+          </w:p>
+        </w:tc>
+      </w:tr>
+      <w:tr>
+        <w:tc>
+          <w:tcPr/>
+          <w:p>
+            <w:pPr>
+              <w:pStyle w:val="Compact"/>
+            </w:pPr>
+            <w:r>
+              <w:t xml:space="preserve">21 to 420</w:t>
+            </w:r>
+          </w:p>
+        </w:tc>
+        <w:tc>
+          <w:tcPr/>
+          <w:p>
+            <w:pPr>
+              <w:pStyle w:val="Compact"/>
+            </w:pPr>
+            <w:r>
+              <w:t xml:space="preserve">1e-3</w:t>
+            </w:r>
+          </w:p>
+        </w:tc>
+        <w:tc>
+          <w:tcPr/>
+          <w:p>
+            <w:pPr>
+              <w:pStyle w:val="Compact"/>
+            </w:pPr>
+          </w:p>
+        </w:tc>
+      </w:tr>
+      <w:tr>
+        <w:tc>
+          <w:tcPr/>
+          <w:p>
+            <w:pPr>
+              <w:pStyle w:val="Compact"/>
+            </w:pPr>
+            <w:r>
+              <w:t xml:space="preserve">421 to 500</w:t>
+            </w:r>
+          </w:p>
+        </w:tc>
+        <w:tc>
+          <w:tcPr/>
+          <w:p>
+            <w:pPr>
+              <w:pStyle w:val="Compact"/>
+            </w:pPr>
+            <w:r>
+              <w:t xml:space="preserve">1e-4</w:t>
+            </w:r>
+          </w:p>
+        </w:tc>
+        <w:tc>
+          <w:tcPr/>
+          <w:p>
+            <w:pPr>
+              <w:pStyle w:val="Compact"/>
+            </w:pPr>
+            <w:r>
+              <w:t xml:space="preserve">two stretches of 40 iterations</w:t>
+            </w:r>
+          </w:p>
+        </w:tc>
+      </w:tr>
+      <w:tr>
+        <w:tc>
+          <w:tcPr/>
+          <w:p>
+            <w:pPr>
+              <w:pStyle w:val="Compact"/>
+            </w:pPr>
+            <w:r>
+              <w:t xml:space="preserve">501 to 560</w:t>
+            </w:r>
+          </w:p>
+        </w:tc>
+        <w:tc>
+          <w:tcPr/>
+          <w:p>
+            <w:pPr>
+              <w:pStyle w:val="Compact"/>
+            </w:pPr>
+            <w:r>
+              <w:t xml:space="preserve">3e-5</w:t>
+            </w:r>
+          </w:p>
+        </w:tc>
+        <w:tc>
+          <w:tcPr/>
+          <w:p>
+            <w:pPr>
+              <w:pStyle w:val="Compact"/>
+            </w:pPr>
+            <w:r>
+              <w:t xml:space="preserve">final stretch</w:t>
+            </w:r>
+          </w:p>
+        </w:tc>
+      </w:tr>
+    </w:tbl>
+    <w:p>
+      <w:pPr>
+        <w:pStyle w:val="BodyText"/>
+      </w:pPr>
+      <w:r>
+        <w:t xml:space="preserve">That is 540 iterations, 54,000 games and about 23.7 million positions, in</w:t>
+      </w:r>
+      <w:r>
+        <w:t xml:space="preserve"> </w:t>
+      </w:r>
+      <w:r>
+        <w:t xml:space="preserve">about 144 hours. We also tried a larger network (6 blocks, 128 filters, 2.3</w:t>
+      </w:r>
+      <w:r>
+        <w:t xml:space="preserve"> </w:t>
+      </w:r>
+      <w:r>
+        <w:t xml:space="preserve">million parameters) for 61 iterations; its first 5 iterations trained on games</w:t>
+      </w:r>
+      <w:r>
+        <w:t xml:space="preserve"> </w:t>
+      </w:r>
+      <w:r>
+        <w:t xml:space="preserve">played by our best 4 x 64 checkpoint so it did not start from random play</w:t>
+      </w:r>
+      <w:r>
+        <w:t xml:space="preserve"> </w:t>
+      </w:r>
+      <w:r>
+        <w:t xml:space="preserve">(Section 6.10).</w:t>
+      </w:r>
+    </w:p>
     <w:bookmarkEnd w:id="20"/>
-    <w:bookmarkStart w:id="39" w:name="results"/>
+    <w:bookmarkEnd w:id="21"/>
+    <w:bookmarkStart w:id="51" w:name="results"/>
     <w:p>
       <w:pPr>
         <w:pStyle w:val="Heading1"/>
@@ -2095,7 +2546,15 @@
         <w:t xml:space="preserve">6. Results</w:t>
       </w:r>
     </w:p>
-    <w:bookmarkStart w:id="24" w:name="learning-curves"/>
+    <w:p>
+      <w:pPr>
+        <w:pStyle w:val="FirstParagraph"/>
+      </w:pPr>
+      <w:r>
+        <w:t xml:space="preserve">Sections 6.1 to 6.5 are the first runs; 6.6 to 6.10 are the long run.</w:t>
+      </w:r>
+    </w:p>
+    <w:bookmarkStart w:id="25" w:name="learning-curves"/>
     <w:p>
       <w:pPr>
         <w:pStyle w:val="Heading2"/>
@@ -2113,18 +2572,18 @@
           <wp:inline>
             <wp:extent cx="5334000" cy="3394363"/>
             <wp:effectExtent b="0" l="0" r="0" t="0"/>
-            <wp:docPr descr="Policy loss, value loss, share of decisive games and game length per iteration for the final runs and run 1." title="" id="22" name="Picture"/>
+            <wp:docPr descr="Policy loss, value loss, share of decisive games and game length per iteration for the final runs and run 1." title="" id="23" name="Picture"/>
             <a:graphic>
               <a:graphicData uri="http://schemas.openxmlformats.org/drawingml/2006/picture">
                 <pic:pic>
                   <pic:nvPicPr>
-                    <pic:cNvPr descr="../results/training_curves.png" id="23" name="Picture"/>
+                    <pic:cNvPr descr="../results/training_curves.png" id="24" name="Picture"/>
                     <pic:cNvPicPr>
                       <a:picLocks noChangeArrowheads="1" noChangeAspect="1"/>
                     </pic:cNvPicPr>
                   </pic:nvPicPr>
                   <pic:blipFill>
-                    <a:blip r:embed="rId21"/>
+                    <a:blip r:embed="rId22"/>
                     <a:stretch>
                       <a:fillRect/>
                     </a:stretch>
@@ -2191,8 +2650,8 @@
         <w:t xml:space="preserve">stay long (400 to 600 plies on average).</w:t>
       </w:r>
     </w:p>
-    <w:bookmarkEnd w:id="24"/>
-    <w:bookmarkStart w:id="31" w:name="benchmarks-against-fixed-opponents"/>
+    <w:bookmarkEnd w:id="25"/>
+    <w:bookmarkStart w:id="32" w:name="benchmarks-against-fixed-opponents"/>
     <w:p>
       <w:pPr>
         <w:pStyle w:val="Heading2"/>
@@ -2210,18 +2669,18 @@
           <wp:inline>
             <wp:extent cx="5334000" cy="2963333"/>
             <wp:effectExtent b="0" l="0" r="0" t="0"/>
-            <wp:docPr descr="Benchmark score per iteration for final run B against the untrained network, random and greedy-capture players. The dashed line is an even score." title="" id="26" name="Picture"/>
+            <wp:docPr descr="Benchmark score per iteration for final run B against the untrained network, random and greedy-capture players. The dashed line is an even score." title="" id="27" name="Picture"/>
             <a:graphic>
               <a:graphicData uri="http://schemas.openxmlformats.org/drawingml/2006/picture">
                 <pic:pic>
                   <pic:nvPicPr>
-                    <pic:cNvPr descr="../results/benchmark_curve_finalB.png" id="27" name="Picture"/>
+                    <pic:cNvPr descr="../results/benchmark_curve_finalB.png" id="28" name="Picture"/>
                     <pic:cNvPicPr>
                       <a:picLocks noChangeArrowheads="1" noChangeAspect="1"/>
                     </pic:cNvPicPr>
                   </pic:nvPicPr>
                   <pic:blipFill>
-                    <a:blip r:embed="rId25"/>
+                    <a:blip r:embed="rId26"/>
                     <a:stretch>
                       <a:fillRect/>
                     </a:stretch>
@@ -2643,18 +3102,18 @@
           <wp:inline>
             <wp:extent cx="5334000" cy="2963333"/>
             <wp:effectExtent b="0" l="0" r="0" t="0"/>
-            <wp:docPr descr="Final A and final B against the untrained network." title="" id="29" name="Picture"/>
+            <wp:docPr descr="Final A and final B against the untrained network." title="" id="30" name="Picture"/>
             <a:graphic>
               <a:graphicData uri="http://schemas.openxmlformats.org/drawingml/2006/picture">
                 <pic:pic>
                   <pic:nvPicPr>
-                    <pic:cNvPr descr="../results/benchmark_curve_final_vs_untrained.png" id="30" name="Picture"/>
+                    <pic:cNvPr descr="../results/benchmark_curve_final_vs_untrained.png" id="31" name="Picture"/>
                     <pic:cNvPicPr>
                       <a:picLocks noChangeArrowheads="1" noChangeAspect="1"/>
                     </pic:cNvPicPr>
                   </pic:nvPicPr>
                   <pic:blipFill>
-                    <a:blip r:embed="rId28"/>
+                    <a:blip r:embed="rId29"/>
                     <a:stretch>
                       <a:fillRect/>
                     </a:stretch>
@@ -2689,8 +3148,8 @@
         <w:t xml:space="preserve">Final A and final B against the untrained network.</w:t>
       </w:r>
     </w:p>
-    <w:bookmarkEnd w:id="31"/>
-    <w:bookmarkStart w:id="32" w:name="against-earlier-iterations"/>
+    <w:bookmarkEnd w:id="32"/>
+    <w:bookmarkStart w:id="33" w:name="against-earlier-iterations"/>
     <w:p>
       <w:pPr>
         <w:pStyle w:val="Heading2"/>
@@ -2935,8 +3394,8 @@
         <w:t xml:space="preserve">network.</w:t>
       </w:r>
     </w:p>
-    <w:bookmarkEnd w:id="32"/>
-    <w:bookmarkStart w:id="33" w:name="agent-vs.-human"/>
+    <w:bookmarkEnd w:id="33"/>
+    <w:bookmarkStart w:id="34" w:name="agent-vs.-human"/>
     <w:p>
       <w:pPr>
         <w:pStyle w:val="Heading2"/>
@@ -3486,8 +3945,8 @@
         <w:t xml:space="preserve">human stalemated while going for checkmate.</w:t>
       </w:r>
     </w:p>
-    <w:bookmarkEnd w:id="33"/>
-    <w:bookmarkStart w:id="34" w:name="how-games-end"/>
+    <w:bookmarkEnd w:id="34"/>
+    <w:bookmarkStart w:id="35" w:name="how-games-end"/>
     <w:p>
       <w:pPr>
         <w:pStyle w:val="Heading2"/>
@@ -3756,108 +4215,14 @@
         </w:tc>
       </w:tr>
     </w:tbl>
-    <w:bookmarkEnd w:id="34"/>
-    <w:bookmarkStart w:id="38" w:name="X7e697f50ae1dd5e44c97332acfdfba23be11cde"/>
+    <w:bookmarkEnd w:id="35"/>
+    <w:bookmarkStart w:id="39" w:name="long-run-learning-curves"/>
     <w:p>
       <w:pPr>
         <w:pStyle w:val="Heading2"/>
       </w:pPr>
       <w:r>
-        <w:t xml:space="preserve">6.6 Exploratory runs (outside the course constraints)</w:t>
-      </w:r>
-    </w:p>
-    <w:p>
-      <w:pPr>
-        <w:pStyle w:val="FirstParagraph"/>
-      </w:pPr>
-      <w:r>
-        <w:t xml:space="preserve">We ran two short experiments that break the constraints, to test the</w:t>
-      </w:r>
-      <w:r>
-        <w:t xml:space="preserve"> </w:t>
-      </w:r>
-      <w:r>
-        <w:t xml:space="preserve">diagnosis below. They are not the final agent.</w:t>
-      </w:r>
-    </w:p>
-    <w:p>
-      <w:pPr>
-        <w:pStyle w:val="Compact"/>
-        <w:numPr>
-          <w:ilvl w:val="0"/>
-          <w:numId w:val="1005"/>
-        </w:numPr>
-      </w:pPr>
-      <w:r>
-        <w:rPr>
-          <w:b/>
-          <w:bCs/>
-        </w:rPr>
-        <w:t xml:space="preserve">Material value targets</w:t>
-      </w:r>
-      <w:r>
-        <w:t xml:space="preserve"> </w:t>
-      </w:r>
-      <w:r>
-        <w:t xml:space="preserve">(30 simulations, 10 x 10 games): drawn games get a</w:t>
-      </w:r>
-      <w:r>
-        <w:t xml:space="preserve"> </w:t>
-      </w:r>
-      <w:r>
-        <w:t xml:space="preserve">value target from the final material balance, which uses piece values. The</w:t>
-      </w:r>
-      <w:r>
-        <w:t xml:space="preserve"> </w:t>
-      </w:r>
-      <w:r>
-        <w:t xml:space="preserve">value head did learn material (correlation +0.45 with the material balance,</w:t>
-      </w:r>
-      <w:r>
-        <w:t xml:space="preserve"> </w:t>
-      </w:r>
-      <w:r>
-        <w:t xml:space="preserve">against +0.07 in run 1), but strength did not improve (0.474 and 0.469</w:t>
-      </w:r>
-      <w:r>
-        <w:t xml:space="preserve"> </w:t>
-      </w:r>
-      <w:r>
-        <w:t xml:space="preserve">against untrained at iterations 5 and 10).</w:t>
-      </w:r>
-    </w:p>
-    <w:p>
-      <w:pPr>
-        <w:pStyle w:val="Compact"/>
-        <w:numPr>
-          <w:ilvl w:val="0"/>
-          <w:numId w:val="1005"/>
-        </w:numPr>
-      </w:pPr>
-      <w:r>
-        <w:rPr>
-          <w:b/>
-          <w:bCs/>
-        </w:rPr>
-        <w:t xml:space="preserve">100 simulations per move</w:t>
-      </w:r>
-      <w:r>
-        <w:t xml:space="preserve"> </w:t>
-      </w:r>
-      <w:r>
-        <w:t xml:space="preserve">(10 x 10 games, also with material targets):</w:t>
-      </w:r>
-      <w:r>
-        <w:t xml:space="preserve"> </w:t>
-      </w:r>
-      <w:r>
-        <w:t xml:space="preserve">decisive games peaked at 60% in iteration 3, but strength against untrained</w:t>
-      </w:r>
-      <w:r>
-        <w:t xml:space="preserve"> </w:t>
-      </w:r>
-      <w:r>
-        <w:t xml:space="preserve">was 0.421 at iteration 5 and 0.346 at iteration 10.</w:t>
+        <w:t xml:space="preserve">6.6 Long run: learning curves</w:t>
       </w:r>
     </w:p>
     <w:p>
@@ -3869,18 +4234,18 @@
           <wp:inline>
             <wp:extent cx="5334000" cy="3394363"/>
             <wp:effectExtent b="0" l="0" r="0" t="0"/>
-            <wp:docPr descr="Exploratory runs: loss, decisive share and game length." title="" id="36" name="Picture"/>
+            <wp:docPr descr="Long run: policy loss, value loss, share of decisive self-play games and game length per iteration, with the stopped 6 x 128 network." title="" id="37" name="Picture"/>
             <a:graphic>
               <a:graphicData uri="http://schemas.openxmlformats.org/drawingml/2006/picture">
                 <pic:pic>
                   <pic:nvPicPr>
-                    <pic:cNvPr descr="../results/training_curves_exploratory.png" id="37" name="Picture"/>
+                    <pic:cNvPr descr="../results/training_curves_long.png" id="38" name="Picture"/>
                     <pic:cNvPicPr>
                       <a:picLocks noChangeArrowheads="1" noChangeAspect="1"/>
                     </pic:cNvPicPr>
                   </pic:nvPicPr>
                   <pic:blipFill>
-                    <a:blip r:embed="rId35"/>
+                    <a:blip r:embed="rId36"/>
                     <a:stretch>
                       <a:fillRect/>
                     </a:stretch>
@@ -3912,12 +4277,2159 @@
         <w:pStyle w:val="ImageCaption"/>
       </w:pPr>
       <w:r>
+        <w:t xml:space="preserve">Long run: policy loss, value loss, share of decisive self-play games and game length per iteration, with the stopped 6 x 128 network.</w:t>
+      </w:r>
+    </w:p>
+    <w:p>
+      <w:pPr>
+        <w:pStyle w:val="BodyText"/>
+      </w:pPr>
+      <w:r>
+        <w:t xml:space="preserve">The policy loss stays around 2.4, and the share of decisive self-play games</w:t>
+      </w:r>
+      <w:r>
+        <w:t xml:space="preserve"> </w:t>
+      </w:r>
+      <w:r>
+        <w:t xml:space="preserve">stays around 15 to 25%. These curves do not show the improvement, because the</w:t>
+      </w:r>
+      <w:r>
+        <w:t xml:space="preserve"> </w:t>
+      </w:r>
+      <w:r>
+        <w:t xml:space="preserve">targets move with the network: as the agent improves, so does its opponent.</w:t>
+      </w:r>
+      <w:r>
+        <w:t xml:space="preserve"> </w:t>
+      </w:r>
+      <w:r>
+        <w:t xml:space="preserve">Game length fell from about 530 to about 430 plies. Strength has to be</w:t>
+      </w:r>
+      <w:r>
+        <w:t xml:space="preserve"> </w:t>
+      </w:r>
+      <w:r>
+        <w:t xml:space="preserve">measured by matches.</w:t>
+      </w:r>
+    </w:p>
+    <w:bookmarkEnd w:id="39"/>
+    <w:bookmarkStart w:id="40" w:name="Xe31bb2348fe89a608c0ec1cce37aec517f3b50f"/>
+    <w:p>
+      <w:pPr>
+        <w:pStyle w:val="Heading2"/>
+      </w:pPr>
+      <w:r>
+        <w:t xml:space="preserve">6.7 Long run: progress against the starting model</w:t>
+      </w:r>
+    </w:p>
+    <w:p>
+      <w:pPr>
+        <w:pStyle w:val="FirstParagraph"/>
+      </w:pPr>
+      <w:r>
+        <w:t xml:space="preserve">Checkpoints of the long run against final B (iteration 20), 100 games each:</w:t>
+      </w:r>
+    </w:p>
+    <w:tbl>
+      <w:tblPr>
+        <w:tblStyle w:val="Table"/>
+        <w:tblW w:type="pct" w:w="5000"/>
+        <w:tblLayout w:type="fixed"/>
+        <w:tblLook w:firstRow="1" w:lastRow="0" w:firstColumn="0" w:lastColumn="0" w:noHBand="0" w:noVBand="0" w:val="0020"/>
+      </w:tblPr>
+      <w:tblGrid>
+        <w:gridCol w:w="1320"/>
+        <w:gridCol w:w="1320"/>
+        <w:gridCol w:w="1320"/>
+        <w:gridCol w:w="1320"/>
+        <w:gridCol w:w="1320"/>
+        <w:gridCol w:w="1320"/>
+      </w:tblGrid>
+      <w:tr>
+        <w:trPr>
+          <w:tblHeader w:val="on"/>
+        </w:trPr>
+        <w:tc>
+          <w:tcPr/>
+          <w:p>
+            <w:pPr>
+              <w:pStyle w:val="Compact"/>
+            </w:pPr>
+            <w:r>
+              <w:t xml:space="preserve">Iteration</w:t>
+            </w:r>
+          </w:p>
+        </w:tc>
+        <w:tc>
+          <w:tcPr/>
+          <w:p>
+            <w:pPr>
+              <w:pStyle w:val="Compact"/>
+            </w:pPr>
+            <w:r>
+              <w:t xml:space="preserve">Wins</w:t>
+            </w:r>
+          </w:p>
+        </w:tc>
+        <w:tc>
+          <w:tcPr/>
+          <w:p>
+            <w:pPr>
+              <w:pStyle w:val="Compact"/>
+            </w:pPr>
+            <w:r>
+              <w:t xml:space="preserve">Losses</w:t>
+            </w:r>
+          </w:p>
+        </w:tc>
+        <w:tc>
+          <w:tcPr/>
+          <w:p>
+            <w:pPr>
+              <w:pStyle w:val="Compact"/>
+            </w:pPr>
+            <w:r>
+              <w:t xml:space="preserve">Draws</w:t>
+            </w:r>
+          </w:p>
+        </w:tc>
+        <w:tc>
+          <w:tcPr/>
+          <w:p>
+            <w:pPr>
+              <w:pStyle w:val="Compact"/>
+            </w:pPr>
+            <w:r>
+              <w:t xml:space="preserve">Unfinished</w:t>
+            </w:r>
+          </w:p>
+        </w:tc>
+        <w:tc>
+          <w:tcPr/>
+          <w:p>
+            <w:pPr>
+              <w:pStyle w:val="Compact"/>
+            </w:pPr>
+            <w:r>
+              <w:t xml:space="preserve">Score</w:t>
+            </w:r>
+          </w:p>
+        </w:tc>
+      </w:tr>
+      <w:tr>
+        <w:tc>
+          <w:tcPr/>
+          <w:p>
+            <w:pPr>
+              <w:pStyle w:val="Compact"/>
+            </w:pPr>
+            <w:r>
+              <w:t xml:space="preserve">40</w:t>
+            </w:r>
+          </w:p>
+        </w:tc>
+        <w:tc>
+          <w:tcPr/>
+          <w:p>
+            <w:pPr>
+              <w:pStyle w:val="Compact"/>
+            </w:pPr>
+            <w:r>
+              <w:t xml:space="preserve">10</w:t>
+            </w:r>
+          </w:p>
+        </w:tc>
+        <w:tc>
+          <w:tcPr/>
+          <w:p>
+            <w:pPr>
+              <w:pStyle w:val="Compact"/>
+            </w:pPr>
+            <w:r>
+              <w:t xml:space="preserve">3</w:t>
+            </w:r>
+          </w:p>
+        </w:tc>
+        <w:tc>
+          <w:tcPr/>
+          <w:p>
+            <w:pPr>
+              <w:pStyle w:val="Compact"/>
+            </w:pPr>
+            <w:r>
+              <w:t xml:space="preserve">61</w:t>
+            </w:r>
+          </w:p>
+        </w:tc>
+        <w:tc>
+          <w:tcPr/>
+          <w:p>
+            <w:pPr>
+              <w:pStyle w:val="Compact"/>
+            </w:pPr>
+            <w:r>
+              <w:t xml:space="preserve">26</w:t>
+            </w:r>
+          </w:p>
+        </w:tc>
+        <w:tc>
+          <w:tcPr/>
+          <w:p>
+            <w:pPr>
+              <w:pStyle w:val="Compact"/>
+            </w:pPr>
+            <w:r>
+              <w:t xml:space="preserve">0.547 +/- 0.047</w:t>
+            </w:r>
+          </w:p>
+        </w:tc>
+      </w:tr>
+      <w:tr>
+        <w:tc>
+          <w:tcPr/>
+          <w:p>
+            <w:pPr>
+              <w:pStyle w:val="Compact"/>
+            </w:pPr>
+            <w:r>
+              <w:t xml:space="preserve">100</w:t>
+            </w:r>
+          </w:p>
+        </w:tc>
+        <w:tc>
+          <w:tcPr/>
+          <w:p>
+            <w:pPr>
+              <w:pStyle w:val="Compact"/>
+            </w:pPr>
+            <w:r>
+              <w:t xml:space="preserve">18</w:t>
+            </w:r>
+          </w:p>
+        </w:tc>
+        <w:tc>
+          <w:tcPr/>
+          <w:p>
+            <w:pPr>
+              <w:pStyle w:val="Compact"/>
+            </w:pPr>
+            <w:r>
+              <w:t xml:space="preserve">4</w:t>
+            </w:r>
+          </w:p>
+        </w:tc>
+        <w:tc>
+          <w:tcPr/>
+          <w:p>
+            <w:pPr>
+              <w:pStyle w:val="Compact"/>
+            </w:pPr>
+            <w:r>
+              <w:t xml:space="preserve">61</w:t>
+            </w:r>
+          </w:p>
+        </w:tc>
+        <w:tc>
+          <w:tcPr/>
+          <w:p>
+            <w:pPr>
+              <w:pStyle w:val="Compact"/>
+            </w:pPr>
+            <w:r>
+              <w:t xml:space="preserve">17</w:t>
+            </w:r>
+          </w:p>
+        </w:tc>
+        <w:tc>
+          <w:tcPr/>
+          <w:p>
+            <w:pPr>
+              <w:pStyle w:val="Compact"/>
+            </w:pPr>
+            <w:r>
+              <w:t xml:space="preserve">0.584 +/- 0.052</w:t>
+            </w:r>
+          </w:p>
+        </w:tc>
+      </w:tr>
+      <w:tr>
+        <w:tc>
+          <w:tcPr/>
+          <w:p>
+            <w:pPr>
+              <w:pStyle w:val="Compact"/>
+            </w:pPr>
+            <w:r>
+              <w:t xml:space="preserve">140</w:t>
+            </w:r>
+          </w:p>
+        </w:tc>
+        <w:tc>
+          <w:tcPr/>
+          <w:p>
+            <w:pPr>
+              <w:pStyle w:val="Compact"/>
+            </w:pPr>
+            <w:r>
+              <w:t xml:space="preserve">27</w:t>
+            </w:r>
+          </w:p>
+        </w:tc>
+        <w:tc>
+          <w:tcPr/>
+          <w:p>
+            <w:pPr>
+              <w:pStyle w:val="Compact"/>
+            </w:pPr>
+            <w:r>
+              <w:t xml:space="preserve">2</w:t>
+            </w:r>
+          </w:p>
+        </w:tc>
+        <w:tc>
+          <w:tcPr/>
+          <w:p>
+            <w:pPr>
+              <w:pStyle w:val="Compact"/>
+            </w:pPr>
+            <w:r>
+              <w:t xml:space="preserve">57</w:t>
+            </w:r>
+          </w:p>
+        </w:tc>
+        <w:tc>
+          <w:tcPr/>
+          <w:p>
+            <w:pPr>
+              <w:pStyle w:val="Compact"/>
+            </w:pPr>
+            <w:r>
+              <w:t xml:space="preserve">14</w:t>
+            </w:r>
+          </w:p>
+        </w:tc>
+        <w:tc>
+          <w:tcPr/>
+          <w:p>
+            <w:pPr>
+              <w:pStyle w:val="Compact"/>
+            </w:pPr>
+            <w:r>
+              <w:t xml:space="preserve">0.645 +/- 0.053</w:t>
+            </w:r>
+          </w:p>
+        </w:tc>
+      </w:tr>
+      <w:tr>
+        <w:tc>
+          <w:tcPr/>
+          <w:p>
+            <w:pPr>
+              <w:pStyle w:val="Compact"/>
+            </w:pPr>
+            <w:r>
+              <w:t xml:space="preserve">220</w:t>
+            </w:r>
+          </w:p>
+        </w:tc>
+        <w:tc>
+          <w:tcPr/>
+          <w:p>
+            <w:pPr>
+              <w:pStyle w:val="Compact"/>
+            </w:pPr>
+            <w:r>
+              <w:t xml:space="preserve">21</w:t>
+            </w:r>
+          </w:p>
+        </w:tc>
+        <w:tc>
+          <w:tcPr/>
+          <w:p>
+            <w:pPr>
+              <w:pStyle w:val="Compact"/>
+            </w:pPr>
+            <w:r>
+              <w:t xml:space="preserve">5</w:t>
+            </w:r>
+          </w:p>
+        </w:tc>
+        <w:tc>
+          <w:tcPr/>
+          <w:p>
+            <w:pPr>
+              <w:pStyle w:val="Compact"/>
+            </w:pPr>
+            <w:r>
+              <w:t xml:space="preserve">57</w:t>
+            </w:r>
+          </w:p>
+        </w:tc>
+        <w:tc>
+          <w:tcPr/>
+          <w:p>
+            <w:pPr>
+              <w:pStyle w:val="Compact"/>
+            </w:pPr>
+            <w:r>
+              <w:t xml:space="preserve">17</w:t>
+            </w:r>
+          </w:p>
+        </w:tc>
+        <w:tc>
+          <w:tcPr/>
+          <w:p>
+            <w:pPr>
+              <w:pStyle w:val="Compact"/>
+            </w:pPr>
+            <w:r>
+              <w:t xml:space="preserve">0.596 +/- 0.057</w:t>
+            </w:r>
+          </w:p>
+        </w:tc>
+      </w:tr>
+      <w:tr>
+        <w:tc>
+          <w:tcPr/>
+          <w:p>
+            <w:pPr>
+              <w:pStyle w:val="Compact"/>
+            </w:pPr>
+            <w:r>
+              <w:t xml:space="preserve">300</w:t>
+            </w:r>
+          </w:p>
+        </w:tc>
+        <w:tc>
+          <w:tcPr/>
+          <w:p>
+            <w:pPr>
+              <w:pStyle w:val="Compact"/>
+            </w:pPr>
+            <w:r>
+              <w:t xml:space="preserve">27</w:t>
+            </w:r>
+          </w:p>
+        </w:tc>
+        <w:tc>
+          <w:tcPr/>
+          <w:p>
+            <w:pPr>
+              <w:pStyle w:val="Compact"/>
+            </w:pPr>
+            <w:r>
+              <w:t xml:space="preserve">5</w:t>
+            </w:r>
+          </w:p>
+        </w:tc>
+        <w:tc>
+          <w:tcPr/>
+          <w:p>
+            <w:pPr>
+              <w:pStyle w:val="Compact"/>
+            </w:pPr>
+            <w:r>
+              <w:t xml:space="preserve">52</w:t>
+            </w:r>
+          </w:p>
+        </w:tc>
+        <w:tc>
+          <w:tcPr/>
+          <w:p>
+            <w:pPr>
+              <w:pStyle w:val="Compact"/>
+            </w:pPr>
+            <w:r>
+              <w:t xml:space="preserve">16</w:t>
+            </w:r>
+          </w:p>
+        </w:tc>
+        <w:tc>
+          <w:tcPr/>
+          <w:p>
+            <w:pPr>
+              <w:pStyle w:val="Compact"/>
+            </w:pPr>
+            <w:r>
+              <w:t xml:space="preserve">0.631 +/- 0.060</w:t>
+            </w:r>
+          </w:p>
+        </w:tc>
+      </w:tr>
+      <w:tr>
+        <w:tc>
+          <w:tcPr/>
+          <w:p>
+            <w:pPr>
+              <w:pStyle w:val="Compact"/>
+            </w:pPr>
+            <w:r>
+              <w:t xml:space="preserve">380</w:t>
+            </w:r>
+          </w:p>
+        </w:tc>
+        <w:tc>
+          <w:tcPr/>
+          <w:p>
+            <w:pPr>
+              <w:pStyle w:val="Compact"/>
+            </w:pPr>
+            <w:r>
+              <w:t xml:space="preserve">11</w:t>
+            </w:r>
+          </w:p>
+        </w:tc>
+        <w:tc>
+          <w:tcPr/>
+          <w:p>
+            <w:pPr>
+              <w:pStyle w:val="Compact"/>
+            </w:pPr>
+            <w:r>
+              <w:t xml:space="preserve">5</w:t>
+            </w:r>
+          </w:p>
+        </w:tc>
+        <w:tc>
+          <w:tcPr/>
+          <w:p>
+            <w:pPr>
+              <w:pStyle w:val="Compact"/>
+            </w:pPr>
+            <w:r>
+              <w:t xml:space="preserve">63</w:t>
+            </w:r>
+          </w:p>
+        </w:tc>
+        <w:tc>
+          <w:tcPr/>
+          <w:p>
+            <w:pPr>
+              <w:pStyle w:val="Compact"/>
+            </w:pPr>
+            <w:r>
+              <w:t xml:space="preserve">21</w:t>
+            </w:r>
+          </w:p>
+        </w:tc>
+        <w:tc>
+          <w:tcPr/>
+          <w:p>
+            <w:pPr>
+              <w:pStyle w:val="Compact"/>
+            </w:pPr>
+            <w:r>
+              <w:t xml:space="preserve">0.538 +/- 0.049</w:t>
+            </w:r>
+          </w:p>
+        </w:tc>
+      </w:tr>
+      <w:tr>
+        <w:tc>
+          <w:tcPr/>
+          <w:p>
+            <w:pPr>
+              <w:pStyle w:val="Compact"/>
+            </w:pPr>
+            <w:r>
+              <w:t xml:space="preserve">500</w:t>
+            </w:r>
+          </w:p>
+        </w:tc>
+        <w:tc>
+          <w:tcPr/>
+          <w:p>
+            <w:pPr>
+              <w:pStyle w:val="Compact"/>
+            </w:pPr>
+            <w:r>
+              <w:t xml:space="preserve">27</w:t>
+            </w:r>
+          </w:p>
+        </w:tc>
+        <w:tc>
+          <w:tcPr/>
+          <w:p>
+            <w:pPr>
+              <w:pStyle w:val="Compact"/>
+            </w:pPr>
+            <w:r>
+              <w:t xml:space="preserve">3</w:t>
+            </w:r>
+          </w:p>
+        </w:tc>
+        <w:tc>
+          <w:tcPr/>
+          <w:p>
+            <w:pPr>
+              <w:pStyle w:val="Compact"/>
+            </w:pPr>
+            <w:r>
+              <w:t xml:space="preserve">60</w:t>
+            </w:r>
+          </w:p>
+        </w:tc>
+        <w:tc>
+          <w:tcPr/>
+          <w:p>
+            <w:pPr>
+              <w:pStyle w:val="Compact"/>
+            </w:pPr>
+            <w:r>
+              <w:t xml:space="preserve">10</w:t>
+            </w:r>
+          </w:p>
+        </w:tc>
+        <w:tc>
+          <w:tcPr/>
+          <w:p>
+            <w:pPr>
+              <w:pStyle w:val="Compact"/>
+            </w:pPr>
+            <w:r>
+              <w:t xml:space="preserve">0.633 +/- 0.053</w:t>
+            </w:r>
+          </w:p>
+        </w:tc>
+      </w:tr>
+      <w:tr>
+        <w:tc>
+          <w:tcPr/>
+          <w:p>
+            <w:pPr>
+              <w:pStyle w:val="Compact"/>
+            </w:pPr>
+            <w:r>
+              <w:rPr>
+                <w:b/>
+                <w:bCs/>
+              </w:rPr>
+              <w:t xml:space="preserve">560 (final)</w:t>
+            </w:r>
+          </w:p>
+        </w:tc>
+        <w:tc>
+          <w:tcPr/>
+          <w:p>
+            <w:pPr>
+              <w:pStyle w:val="Compact"/>
+            </w:pPr>
+            <w:r>
+              <w:rPr>
+                <w:b/>
+                <w:bCs/>
+              </w:rPr>
+              <w:t xml:space="preserve">27</w:t>
+            </w:r>
+          </w:p>
+        </w:tc>
+        <w:tc>
+          <w:tcPr/>
+          <w:p>
+            <w:pPr>
+              <w:pStyle w:val="Compact"/>
+            </w:pPr>
+            <w:r>
+              <w:rPr>
+                <w:b/>
+                <w:bCs/>
+              </w:rPr>
+              <w:t xml:space="preserve">0</w:t>
+            </w:r>
+          </w:p>
+        </w:tc>
+        <w:tc>
+          <w:tcPr/>
+          <w:p>
+            <w:pPr>
+              <w:pStyle w:val="Compact"/>
+            </w:pPr>
+            <w:r>
+              <w:rPr>
+                <w:b/>
+                <w:bCs/>
+              </w:rPr>
+              <w:t xml:space="preserve">59</w:t>
+            </w:r>
+          </w:p>
+        </w:tc>
+        <w:tc>
+          <w:tcPr/>
+          <w:p>
+            <w:pPr>
+              <w:pStyle w:val="Compact"/>
+            </w:pPr>
+            <w:r>
+              <w:rPr>
+                <w:b/>
+                <w:bCs/>
+              </w:rPr>
+              <w:t xml:space="preserve">14</w:t>
+            </w:r>
+          </w:p>
+        </w:tc>
+        <w:tc>
+          <w:tcPr/>
+          <w:p>
+            <w:pPr>
+              <w:pStyle w:val="Compact"/>
+            </w:pPr>
+            <w:r>
+              <w:rPr>
+                <w:b/>
+                <w:bCs/>
+              </w:rPr>
+              <w:t xml:space="preserve">0.657 +/- 0.049</w:t>
+            </w:r>
+          </w:p>
+        </w:tc>
+      </w:tr>
+    </w:tbl>
+    <w:p>
+      <w:pPr>
+        <w:pStyle w:val="BodyText"/>
+      </w:pPr>
+      <w:r>
+        <w:t xml:space="preserve">Unlike the first runs, training now clearly helps: every checkpoint beats the</w:t>
+      </w:r>
+      <w:r>
+        <w:t xml:space="preserve"> </w:t>
+      </w:r>
+      <w:r>
+        <w:t xml:space="preserve">starting model, and the final one won 27 games and lost none. Most of the gain</w:t>
+      </w:r>
+      <w:r>
+        <w:t xml:space="preserve"> </w:t>
+      </w:r>
+      <w:r>
+        <w:t xml:space="preserve">came in the first 100 to 140 iterations. From there to iteration 420 the score</w:t>
+      </w:r>
+      <w:r>
+        <w:t xml:space="preserve"> </w:t>
+      </w:r>
+      <w:r>
+        <w:t xml:space="preserve">moved up and down by about its own margin.</w:t>
+      </w:r>
+    </w:p>
+    <w:bookmarkEnd w:id="40"/>
+    <w:bookmarkStart w:id="41" w:name="lowering-the-learning-rate"/>
+    <w:p>
+      <w:pPr>
+        <w:pStyle w:val="Heading2"/>
+      </w:pPr>
+      <w:r>
+        <w:t xml:space="preserve">6.8 Lowering the learning rate</w:t>
+      </w:r>
+    </w:p>
+    <w:p>
+      <w:pPr>
+        <w:pStyle w:val="FirstParagraph"/>
+      </w:pPr>
+      <w:r>
+        <w:t xml:space="preserve">To choose a model, iterations 140, 300, 420 and 460 (the first 40 iterations</w:t>
+      </w:r>
+      <w:r>
+        <w:t xml:space="preserve"> </w:t>
+      </w:r>
+      <w:r>
+        <w:t xml:space="preserve">at learning rate 1e-4) played each other, 100 games per pair. The table gives</w:t>
+      </w:r>
+      <w:r>
+        <w:t xml:space="preserve"> </w:t>
+      </w:r>
+      <w:r>
+        <w:t xml:space="preserve">the row model’s score against the column model.</w:t>
+      </w:r>
+    </w:p>
+    <w:tbl>
+      <w:tblPr>
+        <w:tblStyle w:val="Table"/>
+        <w:tblW w:type="auto" w:w="0"/>
+        <w:tblLook w:firstRow="1" w:lastRow="0" w:firstColumn="0" w:lastColumn="0" w:noHBand="0" w:noVBand="0" w:val="0020"/>
+      </w:tblPr>
+      <w:tblGrid>
+        <w:gridCol w:w="1584"/>
+        <w:gridCol w:w="1584"/>
+        <w:gridCol w:w="1584"/>
+        <w:gridCol w:w="1584"/>
+        <w:gridCol w:w="1584"/>
+      </w:tblGrid>
+      <w:tr>
+        <w:trPr>
+          <w:tblHeader w:val="on"/>
+        </w:trPr>
+        <w:tc>
+          <w:tcPr/>
+          <w:p>
+            <w:pPr>
+              <w:pStyle w:val="Compact"/>
+            </w:pPr>
+          </w:p>
+        </w:tc>
+        <w:tc>
+          <w:tcPr/>
+          <w:p>
+            <w:pPr>
+              <w:pStyle w:val="Compact"/>
+            </w:pPr>
+            <w:r>
+              <w:t xml:space="preserve">vs 140</w:t>
+            </w:r>
+          </w:p>
+        </w:tc>
+        <w:tc>
+          <w:tcPr/>
+          <w:p>
+            <w:pPr>
+              <w:pStyle w:val="Compact"/>
+            </w:pPr>
+            <w:r>
+              <w:t xml:space="preserve">vs 300</w:t>
+            </w:r>
+          </w:p>
+        </w:tc>
+        <w:tc>
+          <w:tcPr/>
+          <w:p>
+            <w:pPr>
+              <w:pStyle w:val="Compact"/>
+            </w:pPr>
+            <w:r>
+              <w:t xml:space="preserve">vs 420</w:t>
+            </w:r>
+          </w:p>
+        </w:tc>
+        <w:tc>
+          <w:tcPr/>
+          <w:p>
+            <w:pPr>
+              <w:pStyle w:val="Compact"/>
+            </w:pPr>
+            <w:r>
+              <w:t xml:space="preserve">vs 460</w:t>
+            </w:r>
+          </w:p>
+        </w:tc>
+      </w:tr>
+      <w:tr>
+        <w:tc>
+          <w:tcPr/>
+          <w:p>
+            <w:pPr>
+              <w:pStyle w:val="Compact"/>
+            </w:pPr>
+            <w:r>
+              <w:t xml:space="preserve">140</w:t>
+            </w:r>
+          </w:p>
+        </w:tc>
+        <w:tc>
+          <w:tcPr/>
+          <w:p>
+            <w:pPr>
+              <w:pStyle w:val="Compact"/>
+            </w:pPr>
+          </w:p>
+        </w:tc>
+        <w:tc>
+          <w:tcPr/>
+          <w:p>
+            <w:pPr>
+              <w:pStyle w:val="Compact"/>
+            </w:pPr>
+            <w:r>
+              <w:t xml:space="preserve">0.511</w:t>
+            </w:r>
+          </w:p>
+        </w:tc>
+        <w:tc>
+          <w:tcPr/>
+          <w:p>
+            <w:pPr>
+              <w:pStyle w:val="Compact"/>
+            </w:pPr>
+            <w:r>
+              <w:t xml:space="preserve">0.488</w:t>
+            </w:r>
+          </w:p>
+        </w:tc>
+        <w:tc>
+          <w:tcPr/>
+          <w:p>
+            <w:pPr>
+              <w:pStyle w:val="Compact"/>
+            </w:pPr>
+            <w:r>
+              <w:t xml:space="preserve">0.413</w:t>
+            </w:r>
+          </w:p>
+        </w:tc>
+      </w:tr>
+      <w:tr>
+        <w:tc>
+          <w:tcPr/>
+          <w:p>
+            <w:pPr>
+              <w:pStyle w:val="Compact"/>
+            </w:pPr>
+            <w:r>
+              <w:t xml:space="preserve">300</w:t>
+            </w:r>
+          </w:p>
+        </w:tc>
+        <w:tc>
+          <w:tcPr/>
+          <w:p>
+            <w:pPr>
+              <w:pStyle w:val="Compact"/>
+            </w:pPr>
+            <w:r>
+              <w:t xml:space="preserve">0.489</w:t>
+            </w:r>
+          </w:p>
+        </w:tc>
+        <w:tc>
+          <w:tcPr/>
+          <w:p>
+            <w:pPr>
+              <w:pStyle w:val="Compact"/>
+            </w:pPr>
+          </w:p>
+        </w:tc>
+        <w:tc>
+          <w:tcPr/>
+          <w:p>
+            <w:pPr>
+              <w:pStyle w:val="Compact"/>
+            </w:pPr>
+            <w:r>
+              <w:t xml:space="preserve">0.500</w:t>
+            </w:r>
+          </w:p>
+        </w:tc>
+        <w:tc>
+          <w:tcPr/>
+          <w:p>
+            <w:pPr>
+              <w:pStyle w:val="Compact"/>
+            </w:pPr>
+            <w:r>
+              <w:t xml:space="preserve">0.463</w:t>
+            </w:r>
+          </w:p>
+        </w:tc>
+      </w:tr>
+      <w:tr>
+        <w:tc>
+          <w:tcPr/>
+          <w:p>
+            <w:pPr>
+              <w:pStyle w:val="Compact"/>
+            </w:pPr>
+            <w:r>
+              <w:t xml:space="preserve">420</w:t>
+            </w:r>
+          </w:p>
+        </w:tc>
+        <w:tc>
+          <w:tcPr/>
+          <w:p>
+            <w:pPr>
+              <w:pStyle w:val="Compact"/>
+            </w:pPr>
+            <w:r>
+              <w:t xml:space="preserve">0.512</w:t>
+            </w:r>
+          </w:p>
+        </w:tc>
+        <w:tc>
+          <w:tcPr/>
+          <w:p>
+            <w:pPr>
+              <w:pStyle w:val="Compact"/>
+            </w:pPr>
+            <w:r>
+              <w:t xml:space="preserve">0.500</w:t>
+            </w:r>
+          </w:p>
+        </w:tc>
+        <w:tc>
+          <w:tcPr/>
+          <w:p>
+            <w:pPr>
+              <w:pStyle w:val="Compact"/>
+            </w:pPr>
+          </w:p>
+        </w:tc>
+        <w:tc>
+          <w:tcPr/>
+          <w:p>
+            <w:pPr>
+              <w:pStyle w:val="Compact"/>
+            </w:pPr>
+            <w:r>
+              <w:t xml:space="preserve">0.453</w:t>
+            </w:r>
+          </w:p>
+        </w:tc>
+      </w:tr>
+      <w:tr>
+        <w:tc>
+          <w:tcPr/>
+          <w:p>
+            <w:pPr>
+              <w:pStyle w:val="Compact"/>
+            </w:pPr>
+            <w:r>
+              <w:t xml:space="preserve">460</w:t>
+            </w:r>
+          </w:p>
+        </w:tc>
+        <w:tc>
+          <w:tcPr/>
+          <w:p>
+            <w:pPr>
+              <w:pStyle w:val="Compact"/>
+            </w:pPr>
+            <w:r>
+              <w:rPr>
+                <w:b/>
+                <w:bCs/>
+              </w:rPr>
+              <w:t xml:space="preserve">0.587</w:t>
+            </w:r>
+          </w:p>
+        </w:tc>
+        <w:tc>
+          <w:tcPr/>
+          <w:p>
+            <w:pPr>
+              <w:pStyle w:val="Compact"/>
+            </w:pPr>
+            <w:r>
+              <w:rPr>
+                <w:b/>
+                <w:bCs/>
+              </w:rPr>
+              <w:t xml:space="preserve">0.537</w:t>
+            </w:r>
+          </w:p>
+        </w:tc>
+        <w:tc>
+          <w:tcPr/>
+          <w:p>
+            <w:pPr>
+              <w:pStyle w:val="Compact"/>
+            </w:pPr>
+            <w:r>
+              <w:rPr>
+                <w:b/>
+                <w:bCs/>
+              </w:rPr>
+              <w:t xml:space="preserve">0.547</w:t>
+            </w:r>
+          </w:p>
+        </w:tc>
+        <w:tc>
+          <w:tcPr/>
+          <w:p>
+            <w:pPr>
+              <w:pStyle w:val="Compact"/>
+            </w:pPr>
+          </w:p>
+        </w:tc>
+      </w:tr>
+    </w:tbl>
+    <w:p>
+      <w:pPr>
+        <w:pStyle w:val="BodyText"/>
+      </w:pPr>
+      <w:r>
+        <w:t xml:space="preserve">Iterations 140, 300 and 420 are even with each other, while 460 beats all</w:t>
+      </w:r>
+      <w:r>
+        <w:t xml:space="preserve"> </w:t>
+      </w:r>
+      <w:r>
+        <w:t xml:space="preserve">three (41 wins, 9 losses in total). At learning rate 1e-3 the network kept</w:t>
+      </w:r>
+      <w:r>
+        <w:t xml:space="preserve"> </w:t>
+      </w:r>
+      <w:r>
+        <w:t xml:space="preserve">moving around one level of play; the lower rate let it settle. Further</w:t>
+      </w:r>
+      <w:r>
+        <w:t xml:space="preserve"> </w:t>
+      </w:r>
+      <w:r>
+        <w:t xml:space="preserve">stretches still helped, by smaller steps: iteration 500 scored 0.526 against</w:t>
+      </w:r>
+      <w:r>
+        <w:t xml:space="preserve"> </w:t>
+      </w:r>
+      <w:r>
+        <w:t xml:space="preserve">460 (8 wins, 3 losses), and iteration 560 scored 0.524 against 500 over 300</w:t>
+      </w:r>
+      <w:r>
+        <w:t xml:space="preserve"> </w:t>
+      </w:r>
+      <w:r>
+        <w:t xml:space="preserve">games (26 wins, 12 losses). Iteration 560 is the final model.</w:t>
+      </w:r>
+    </w:p>
+    <w:bookmarkEnd w:id="41"/>
+    <w:bookmarkStart w:id="45" w:name="long-run-benchmarks-of-the-final-model"/>
+    <w:p>
+      <w:pPr>
+        <w:pStyle w:val="Heading2"/>
+      </w:pPr>
+      <w:r>
+        <w:t xml:space="preserve">6.9 Long run: benchmarks of the final model</w:t>
+      </w:r>
+    </w:p>
+    <w:p>
+      <w:pPr>
+        <w:pStyle w:val="CaptionedFigure"/>
+      </w:pPr>
+      <w:r>
+        <w:drawing>
+          <wp:inline>
+            <wp:extent cx="5334000" cy="2963333"/>
+            <wp:effectExtent b="0" l="0" r="0" t="0"/>
+            <wp:docPr descr="Benchmark score of long-run checkpoints against random, untrained and greedy-capture players, 100 games per point." title="" id="43" name="Picture"/>
+            <a:graphic>
+              <a:graphicData uri="http://schemas.openxmlformats.org/drawingml/2006/picture">
+                <pic:pic>
+                  <pic:nvPicPr>
+                    <pic:cNvPr descr="../results/benchmark_curve_long.png" id="44" name="Picture"/>
+                    <pic:cNvPicPr>
+                      <a:picLocks noChangeArrowheads="1" noChangeAspect="1"/>
+                    </pic:cNvPicPr>
+                  </pic:nvPicPr>
+                  <pic:blipFill>
+                    <a:blip r:embed="rId42"/>
+                    <a:stretch>
+                      <a:fillRect/>
+                    </a:stretch>
+                  </pic:blipFill>
+                  <pic:spPr bwMode="auto">
+                    <a:xfrm>
+                      <a:off x="0" y="0"/>
+                      <a:ext cx="5334000" cy="2963333"/>
+                    </a:xfrm>
+                    <a:prstGeom prst="rect">
+                      <a:avLst/>
+                    </a:prstGeom>
+                    <a:noFill/>
+                    <a:ln w="9525">
+                      <a:noFill/>
+                      <a:headEnd/>
+                      <a:tailEnd/>
+                    </a:ln>
+                  </pic:spPr>
+                </pic:pic>
+              </a:graphicData>
+            </a:graphic>
+          </wp:inline>
+        </w:drawing>
+      </w:r>
+    </w:p>
+    <w:p>
+      <w:pPr>
+        <w:pStyle w:val="ImageCaption"/>
+      </w:pPr>
+      <w:r>
+        <w:t xml:space="preserve">Benchmark score of long-run checkpoints against random, untrained and greedy-capture players, 100 games per point.</w:t>
+      </w:r>
+    </w:p>
+    <w:tbl>
+      <w:tblPr>
+        <w:tblStyle w:val="Table"/>
+        <w:tblW w:type="pct" w:w="5000"/>
+        <w:tblLayout w:type="fixed"/>
+        <w:tblLook w:firstRow="1" w:lastRow="0" w:firstColumn="0" w:lastColumn="0" w:noHBand="0" w:noVBand="0" w:val="0020"/>
+      </w:tblPr>
+      <w:tblGrid>
+        <w:gridCol w:w="1980"/>
+        <w:gridCol w:w="1980"/>
+        <w:gridCol w:w="1980"/>
+        <w:gridCol w:w="1980"/>
+      </w:tblGrid>
+      <w:tr>
+        <w:trPr>
+          <w:tblHeader w:val="on"/>
+        </w:trPr>
+        <w:tc>
+          <w:tcPr/>
+          <w:p>
+            <w:pPr>
+              <w:pStyle w:val="Compact"/>
+            </w:pPr>
+            <w:r>
+              <w:t xml:space="preserve">Iteration</w:t>
+            </w:r>
+          </w:p>
+        </w:tc>
+        <w:tc>
+          <w:tcPr/>
+          <w:p>
+            <w:pPr>
+              <w:pStyle w:val="Compact"/>
+            </w:pPr>
+            <w:r>
+              <w:t xml:space="preserve">vs random</w:t>
+            </w:r>
+          </w:p>
+        </w:tc>
+        <w:tc>
+          <w:tcPr/>
+          <w:p>
+            <w:pPr>
+              <w:pStyle w:val="Compact"/>
+            </w:pPr>
+            <w:r>
+              <w:t xml:space="preserve">vs untrained</w:t>
+            </w:r>
+          </w:p>
+        </w:tc>
+        <w:tc>
+          <w:tcPr/>
+          <w:p>
+            <w:pPr>
+              <w:pStyle w:val="Compact"/>
+            </w:pPr>
+            <w:r>
+              <w:t xml:space="preserve">vs greedy-capture</w:t>
+            </w:r>
+          </w:p>
+        </w:tc>
+      </w:tr>
+      <w:tr>
+        <w:tc>
+          <w:tcPr/>
+          <w:p>
+            <w:pPr>
+              <w:pStyle w:val="Compact"/>
+            </w:pPr>
+            <w:r>
+              <w:t xml:space="preserve">20 (final B)</w:t>
+            </w:r>
+          </w:p>
+        </w:tc>
+        <w:tc>
+          <w:tcPr/>
+          <w:p>
+            <w:pPr>
+              <w:pStyle w:val="Compact"/>
+            </w:pPr>
+            <w:r>
+              <w:t xml:space="preserve">4 W, 6 L: 0.489</w:t>
+            </w:r>
+          </w:p>
+        </w:tc>
+        <w:tc>
+          <w:tcPr/>
+          <w:p>
+            <w:pPr>
+              <w:pStyle w:val="Compact"/>
+            </w:pPr>
+            <w:r>
+              <w:t xml:space="preserve">4 W, 18 L: 0.419</w:t>
+            </w:r>
+          </w:p>
+        </w:tc>
+        <w:tc>
+          <w:tcPr/>
+          <w:p>
+            <w:pPr>
+              <w:pStyle w:val="Compact"/>
+            </w:pPr>
+            <w:r>
+              <w:t xml:space="preserve">0 W, 6 L: 0.469</w:t>
+            </w:r>
+          </w:p>
+        </w:tc>
+      </w:tr>
+      <w:tr>
+        <w:tc>
+          <w:tcPr/>
+          <w:p>
+            <w:pPr>
+              <w:pStyle w:val="Compact"/>
+            </w:pPr>
+            <w:r>
+              <w:t xml:space="preserve">100</w:t>
+            </w:r>
+          </w:p>
+        </w:tc>
+        <w:tc>
+          <w:tcPr/>
+          <w:p>
+            <w:pPr>
+              <w:pStyle w:val="Compact"/>
+            </w:pPr>
+            <w:r>
+              <w:t xml:space="preserve">6 W, 1 L: 0.525</w:t>
+            </w:r>
+          </w:p>
+        </w:tc>
+        <w:tc>
+          <w:tcPr/>
+          <w:p>
+            <w:pPr>
+              <w:pStyle w:val="Compact"/>
+            </w:pPr>
+            <w:r>
+              <w:t xml:space="preserve">7 W, 9 L: 0.487</w:t>
+            </w:r>
+          </w:p>
+        </w:tc>
+        <w:tc>
+          <w:tcPr/>
+          <w:p>
+            <w:pPr>
+              <w:pStyle w:val="Compact"/>
+            </w:pPr>
+            <w:r>
+              <w:t xml:space="preserve">1 W, 2 L: 0.495</w:t>
+            </w:r>
+          </w:p>
+        </w:tc>
+      </w:tr>
+      <w:tr>
+        <w:tc>
+          <w:tcPr/>
+          <w:p>
+            <w:pPr>
+              <w:pStyle w:val="Compact"/>
+            </w:pPr>
+            <w:r>
+              <w:t xml:space="preserve">220</w:t>
+            </w:r>
+          </w:p>
+        </w:tc>
+        <w:tc>
+          <w:tcPr/>
+          <w:p>
+            <w:pPr>
+              <w:pStyle w:val="Compact"/>
+            </w:pPr>
+            <w:r>
+              <w:t xml:space="preserve">15 W, 2 L: 0.566</w:t>
+            </w:r>
+          </w:p>
+        </w:tc>
+        <w:tc>
+          <w:tcPr/>
+          <w:p>
+            <w:pPr>
+              <w:pStyle w:val="Compact"/>
+            </w:pPr>
+            <w:r>
+              <w:t xml:space="preserve">23 W, 13 L: 0.560</w:t>
+            </w:r>
+          </w:p>
+        </w:tc>
+        <w:tc>
+          <w:tcPr/>
+          <w:p>
+            <w:pPr>
+              <w:pStyle w:val="Compact"/>
+            </w:pPr>
+            <w:r>
+              <w:t xml:space="preserve">0 W, 0 L: 0.500</w:t>
+            </w:r>
+          </w:p>
+        </w:tc>
+      </w:tr>
+      <w:tr>
+        <w:tc>
+          <w:tcPr/>
+          <w:p>
+            <w:pPr>
+              <w:pStyle w:val="Compact"/>
+            </w:pPr>
+            <w:r>
+              <w:t xml:space="preserve">420</w:t>
+            </w:r>
+          </w:p>
+        </w:tc>
+        <w:tc>
+          <w:tcPr/>
+          <w:p>
+            <w:pPr>
+              <w:pStyle w:val="Compact"/>
+            </w:pPr>
+            <w:r>
+              <w:t xml:space="preserve">10 W, 2 L: 0.540</w:t>
+            </w:r>
+          </w:p>
+        </w:tc>
+        <w:tc>
+          <w:tcPr/>
+          <w:p>
+            <w:pPr>
+              <w:pStyle w:val="Compact"/>
+            </w:pPr>
+            <w:r>
+              <w:t xml:space="preserve">13 W, 8 L: 0.533</w:t>
+            </w:r>
+          </w:p>
+        </w:tc>
+        <w:tc>
+          <w:tcPr/>
+          <w:p>
+            <w:pPr>
+              <w:pStyle w:val="Compact"/>
+            </w:pPr>
+            <w:r>
+              <w:t xml:space="preserve">1 W, 5 L: 0.480</w:t>
+            </w:r>
+          </w:p>
+        </w:tc>
+      </w:tr>
+      <w:tr>
+        <w:tc>
+          <w:tcPr/>
+          <w:p>
+            <w:pPr>
+              <w:pStyle w:val="Compact"/>
+            </w:pPr>
+            <w:r>
+              <w:rPr>
+                <w:b/>
+                <w:bCs/>
+              </w:rPr>
+              <w:t xml:space="preserve">560 (final)</w:t>
+            </w:r>
+          </w:p>
+        </w:tc>
+        <w:tc>
+          <w:tcPr/>
+          <w:p>
+            <w:pPr>
+              <w:pStyle w:val="Compact"/>
+            </w:pPr>
+            <w:r>
+              <w:rPr>
+                <w:b/>
+                <w:bCs/>
+              </w:rPr>
+              <w:t xml:space="preserve">16 W, 0 L: 0.581</w:t>
+            </w:r>
+          </w:p>
+        </w:tc>
+        <w:tc>
+          <w:tcPr/>
+          <w:p>
+            <w:pPr>
+              <w:pStyle w:val="Compact"/>
+            </w:pPr>
+            <w:r>
+              <w:rPr>
+                <w:b/>
+                <w:bCs/>
+              </w:rPr>
+              <w:t xml:space="preserve">17 W, 4 L: 0.572</w:t>
+            </w:r>
+          </w:p>
+        </w:tc>
+        <w:tc>
+          <w:tcPr/>
+          <w:p>
+            <w:pPr>
+              <w:pStyle w:val="Compact"/>
+            </w:pPr>
+            <w:r>
+              <w:rPr>
+                <w:b/>
+                <w:bCs/>
+              </w:rPr>
+              <w:t xml:space="preserve">0 W, 1 L: 0.495</w:t>
+            </w:r>
+          </w:p>
+        </w:tc>
+      </w:tr>
+    </w:tbl>
+    <w:p>
+      <w:pPr>
+        <w:pStyle w:val="BodyText"/>
+      </w:pPr>
+      <w:r>
+        <w:t xml:space="preserve">The final model beats random play and the untrained network and almost never</w:t>
+      </w:r>
+      <w:r>
+        <w:t xml:space="preserve"> </w:t>
+      </w:r>
+      <w:r>
+        <w:t xml:space="preserve">loses to them, where final B lost more than it won. Against greedy capture,</w:t>
+      </w:r>
+      <w:r>
+        <w:t xml:space="preserve"> </w:t>
+      </w:r>
+      <w:r>
+        <w:t xml:space="preserve">99 of 100 games were drawn.</w:t>
+      </w:r>
+    </w:p>
+    <w:p>
+      <w:pPr>
+        <w:pStyle w:val="BodyText"/>
+      </w:pPr>
+      <w:r>
+        <w:t xml:space="preserve">How the final model’s games end, 30 games each:</w:t>
+      </w:r>
+    </w:p>
+    <w:tbl>
+      <w:tblPr>
+        <w:tblStyle w:val="Table"/>
+        <w:tblW w:type="auto" w:w="0"/>
+        <w:tblLook w:firstRow="1" w:lastRow="0" w:firstColumn="0" w:lastColumn="0" w:noHBand="0" w:noVBand="0" w:val="0020"/>
+      </w:tblPr>
+      <w:tblGrid>
+        <w:gridCol w:w="2640"/>
+        <w:gridCol w:w="2640"/>
+        <w:gridCol w:w="2640"/>
+      </w:tblGrid>
+      <w:tr>
+        <w:trPr>
+          <w:tblHeader w:val="on"/>
+        </w:trPr>
+        <w:tc>
+          <w:tcPr/>
+          <w:p>
+            <w:pPr>
+              <w:pStyle w:val="Compact"/>
+            </w:pPr>
+            <w:r>
+              <w:t xml:space="preserve">Ending</w:t>
+            </w:r>
+          </w:p>
+        </w:tc>
+        <w:tc>
+          <w:tcPr/>
+          <w:p>
+            <w:pPr>
+              <w:pStyle w:val="Compact"/>
+            </w:pPr>
+            <w:r>
+              <w:t xml:space="preserve">vs random</w:t>
+            </w:r>
+          </w:p>
+        </w:tc>
+        <w:tc>
+          <w:tcPr/>
+          <w:p>
+            <w:pPr>
+              <w:pStyle w:val="Compact"/>
+            </w:pPr>
+            <w:r>
+              <w:t xml:space="preserve">vs greedy-capture</w:t>
+            </w:r>
+          </w:p>
+        </w:tc>
+      </w:tr>
+      <w:tr>
+        <w:tc>
+          <w:tcPr/>
+          <w:p>
+            <w:pPr>
+              <w:pStyle w:val="Compact"/>
+            </w:pPr>
+            <w:r>
+              <w:t xml:space="preserve">Checkmate</w:t>
+            </w:r>
+          </w:p>
+        </w:tc>
+        <w:tc>
+          <w:tcPr/>
+          <w:p>
+            <w:pPr>
+              <w:pStyle w:val="Compact"/>
+            </w:pPr>
+            <w:r>
+              <w:t xml:space="preserve">3</w:t>
+            </w:r>
+          </w:p>
+        </w:tc>
+        <w:tc>
+          <w:tcPr/>
+          <w:p>
+            <w:pPr>
+              <w:pStyle w:val="Compact"/>
+            </w:pPr>
+            <w:r>
+              <w:t xml:space="preserve">1</w:t>
+            </w:r>
+          </w:p>
+        </w:tc>
+      </w:tr>
+      <w:tr>
+        <w:tc>
+          <w:tcPr/>
+          <w:p>
+            <w:pPr>
+              <w:pStyle w:val="Compact"/>
+            </w:pPr>
+            <w:r>
+              <w:t xml:space="preserve">Stalemate</w:t>
+            </w:r>
+          </w:p>
+        </w:tc>
+        <w:tc>
+          <w:tcPr/>
+          <w:p>
+            <w:pPr>
+              <w:pStyle w:val="Compact"/>
+            </w:pPr>
+            <w:r>
+              <w:t xml:space="preserve">0</w:t>
+            </w:r>
+          </w:p>
+        </w:tc>
+        <w:tc>
+          <w:tcPr/>
+          <w:p>
+            <w:pPr>
+              <w:pStyle w:val="Compact"/>
+            </w:pPr>
+            <w:r>
+              <w:t xml:space="preserve">2</w:t>
+            </w:r>
+          </w:p>
+        </w:tc>
+      </w:tr>
+      <w:tr>
+        <w:tc>
+          <w:tcPr/>
+          <w:p>
+            <w:pPr>
+              <w:pStyle w:val="Compact"/>
+            </w:pPr>
+            <w:r>
+              <w:t xml:space="preserve">No-progress rule</w:t>
+            </w:r>
+          </w:p>
+        </w:tc>
+        <w:tc>
+          <w:tcPr/>
+          <w:p>
+            <w:pPr>
+              <w:pStyle w:val="Compact"/>
+            </w:pPr>
+            <w:r>
+              <w:t xml:space="preserve">12</w:t>
+            </w:r>
+          </w:p>
+        </w:tc>
+        <w:tc>
+          <w:tcPr/>
+          <w:p>
+            <w:pPr>
+              <w:pStyle w:val="Compact"/>
+            </w:pPr>
+            <w:r>
+              <w:t xml:space="preserve">27</w:t>
+            </w:r>
+          </w:p>
+        </w:tc>
+      </w:tr>
+      <w:tr>
+        <w:tc>
+          <w:tcPr/>
+          <w:p>
+            <w:pPr>
+              <w:pStyle w:val="Compact"/>
+            </w:pPr>
+            <w:r>
+              <w:t xml:space="preserve">Threefold repetition</w:t>
+            </w:r>
+          </w:p>
+        </w:tc>
+        <w:tc>
+          <w:tcPr/>
+          <w:p>
+            <w:pPr>
+              <w:pStyle w:val="Compact"/>
+            </w:pPr>
+            <w:r>
+              <w:t xml:space="preserve">14</w:t>
+            </w:r>
+          </w:p>
+        </w:tc>
+        <w:tc>
+          <w:tcPr/>
+          <w:p>
+            <w:pPr>
+              <w:pStyle w:val="Compact"/>
+            </w:pPr>
+            <w:r>
+              <w:t xml:space="preserve">0</w:t>
+            </w:r>
+          </w:p>
+        </w:tc>
+      </w:tr>
+      <w:tr>
+        <w:tc>
+          <w:tcPr/>
+          <w:p>
+            <w:pPr>
+              <w:pStyle w:val="Compact"/>
+            </w:pPr>
+            <w:r>
+              <w:t xml:space="preserve">800-ply cap</w:t>
+            </w:r>
+          </w:p>
+        </w:tc>
+        <w:tc>
+          <w:tcPr/>
+          <w:p>
+            <w:pPr>
+              <w:pStyle w:val="Compact"/>
+            </w:pPr>
+            <w:r>
+              <w:t xml:space="preserve">1</w:t>
+            </w:r>
+          </w:p>
+        </w:tc>
+        <w:tc>
+          <w:tcPr/>
+          <w:p>
+            <w:pPr>
+              <w:pStyle w:val="Compact"/>
+            </w:pPr>
+            <w:r>
+              <w:t xml:space="preserve">0</w:t>
+            </w:r>
+          </w:p>
+        </w:tc>
+      </w:tr>
+    </w:tbl>
+    <w:p>
+      <w:pPr>
+        <w:pStyle w:val="BodyText"/>
+      </w:pPr>
+      <w:r>
+        <w:t xml:space="preserve">The agent no longer gives material away, but it rarely turns an advantage into</w:t>
+      </w:r>
+      <w:r>
+        <w:t xml:space="preserve"> </w:t>
+      </w:r>
+      <w:r>
+        <w:t xml:space="preserve">checkmate. Against random most games end by the no-progress rule or by</w:t>
+      </w:r>
+      <w:r>
+        <w:t xml:space="preserve"> </w:t>
+      </w:r>
+      <w:r>
+        <w:t xml:space="preserve">repetitions that the random player causes (our agent avoids them).</w:t>
+      </w:r>
+    </w:p>
+    <w:bookmarkEnd w:id="45"/>
+    <w:bookmarkStart w:id="46" w:name="a-larger-network"/>
+    <w:p>
+      <w:pPr>
+        <w:pStyle w:val="Heading2"/>
+      </w:pPr>
+      <w:r>
+        <w:t xml:space="preserve">6.10 A larger network</w:t>
+      </w:r>
+    </w:p>
+    <w:tbl>
+      <w:tblPr>
+        <w:tblStyle w:val="Table"/>
+        <w:tblW w:type="pct" w:w="5000"/>
+        <w:tblLayout w:type="fixed"/>
+        <w:tblLook w:firstRow="1" w:lastRow="0" w:firstColumn="0" w:lastColumn="0" w:noHBand="0" w:noVBand="0" w:val="0020"/>
+      </w:tblPr>
+      <w:tblGrid>
+        <w:gridCol w:w="1980"/>
+        <w:gridCol w:w="1980"/>
+        <w:gridCol w:w="1980"/>
+        <w:gridCol w:w="1980"/>
+      </w:tblGrid>
+      <w:tr>
+        <w:trPr>
+          <w:tblHeader w:val="on"/>
+        </w:trPr>
+        <w:tc>
+          <w:tcPr/>
+          <w:p>
+            <w:pPr>
+              <w:pStyle w:val="Compact"/>
+            </w:pPr>
+            <w:r>
+              <w:t xml:space="preserve">Match (100 games)</w:t>
+            </w:r>
+          </w:p>
+        </w:tc>
+        <w:tc>
+          <w:tcPr/>
+          <w:p>
+            <w:pPr>
+              <w:pStyle w:val="Compact"/>
+            </w:pPr>
+            <w:r>
+              <w:t xml:space="preserve">Wins</w:t>
+            </w:r>
+          </w:p>
+        </w:tc>
+        <w:tc>
+          <w:tcPr/>
+          <w:p>
+            <w:pPr>
+              <w:pStyle w:val="Compact"/>
+            </w:pPr>
+            <w:r>
+              <w:t xml:space="preserve">Losses</w:t>
+            </w:r>
+          </w:p>
+        </w:tc>
+        <w:tc>
+          <w:tcPr/>
+          <w:p>
+            <w:pPr>
+              <w:pStyle w:val="Compact"/>
+            </w:pPr>
+            <w:r>
+              <w:t xml:space="preserve">Score</w:t>
+            </w:r>
+          </w:p>
+        </w:tc>
+      </w:tr>
+      <w:tr>
+        <w:tc>
+          <w:tcPr/>
+          <w:p>
+            <w:pPr>
+              <w:pStyle w:val="Compact"/>
+            </w:pPr>
+            <w:r>
+              <w:t xml:space="preserve">6 x 128 iteration 30 vs 4 x 64 iteration 460</w:t>
+            </w:r>
+          </w:p>
+        </w:tc>
+        <w:tc>
+          <w:tcPr/>
+          <w:p>
+            <w:pPr>
+              <w:pStyle w:val="Compact"/>
+            </w:pPr>
+            <w:r>
+              <w:t xml:space="preserve">4</w:t>
+            </w:r>
+          </w:p>
+        </w:tc>
+        <w:tc>
+          <w:tcPr/>
+          <w:p>
+            <w:pPr>
+              <w:pStyle w:val="Compact"/>
+            </w:pPr>
+            <w:r>
+              <w:t xml:space="preserve">21</w:t>
+            </w:r>
+          </w:p>
+        </w:tc>
+        <w:tc>
+          <w:tcPr/>
+          <w:p>
+            <w:pPr>
+              <w:pStyle w:val="Compact"/>
+            </w:pPr>
+            <w:r>
+              <w:t xml:space="preserve">0.411 +/- 0.048</w:t>
+            </w:r>
+          </w:p>
+        </w:tc>
+      </w:tr>
+      <w:tr>
+        <w:tc>
+          <w:tcPr/>
+          <w:p>
+            <w:pPr>
+              <w:pStyle w:val="Compact"/>
+            </w:pPr>
+            <w:r>
+              <w:t xml:space="preserve">6 x 128 iteration 60 vs 4 x 64 iteration 460</w:t>
+            </w:r>
+          </w:p>
+        </w:tc>
+        <w:tc>
+          <w:tcPr/>
+          <w:p>
+            <w:pPr>
+              <w:pStyle w:val="Compact"/>
+            </w:pPr>
+            <w:r>
+              <w:t xml:space="preserve">3</w:t>
+            </w:r>
+          </w:p>
+        </w:tc>
+        <w:tc>
+          <w:tcPr/>
+          <w:p>
+            <w:pPr>
+              <w:pStyle w:val="Compact"/>
+            </w:pPr>
+            <w:r>
+              <w:t xml:space="preserve">17</w:t>
+            </w:r>
+          </w:p>
+        </w:tc>
+        <w:tc>
+          <w:tcPr/>
+          <w:p>
+            <w:pPr>
+              <w:pStyle w:val="Compact"/>
+            </w:pPr>
+            <w:r>
+              <w:t xml:space="preserve">0.427 +/- 0.043</w:t>
+            </w:r>
+          </w:p>
+        </w:tc>
+      </w:tr>
+      <w:tr>
+        <w:tc>
+          <w:tcPr/>
+          <w:p>
+            <w:pPr>
+              <w:pStyle w:val="Compact"/>
+            </w:pPr>
+            <w:r>
+              <w:t xml:space="preserve">6 x 128 iteration 60 vs 4 x 64 iteration 420</w:t>
+            </w:r>
+          </w:p>
+        </w:tc>
+        <w:tc>
+          <w:tcPr/>
+          <w:p>
+            <w:pPr>
+              <w:pStyle w:val="Compact"/>
+            </w:pPr>
+            <w:r>
+              <w:t xml:space="preserve">8</w:t>
+            </w:r>
+          </w:p>
+        </w:tc>
+        <w:tc>
+          <w:tcPr/>
+          <w:p>
+            <w:pPr>
+              <w:pStyle w:val="Compact"/>
+            </w:pPr>
+            <w:r>
+              <w:t xml:space="preserve">14</w:t>
+            </w:r>
+          </w:p>
+        </w:tc>
+        <w:tc>
+          <w:tcPr/>
+          <w:p>
+            <w:pPr>
+              <w:pStyle w:val="Compact"/>
+            </w:pPr>
+            <w:r>
+              <w:t xml:space="preserve">0.468 +/- 0.049</w:t>
+            </w:r>
+          </w:p>
+        </w:tc>
+      </w:tr>
+    </w:tbl>
+    <w:p>
+      <w:pPr>
+        <w:pStyle w:val="BodyText"/>
+      </w:pPr>
+      <w:r>
+        <w:t xml:space="preserve">Each iteration of the larger network took about 25 to 30 minutes instead of</w:t>
+      </w:r>
+      <w:r>
+        <w:t xml:space="preserve"> </w:t>
+      </w:r>
+      <w:r>
+        <w:t xml:space="preserve">about 9. After 61 iterations (about 31 hours) it was still behind and</w:t>
+      </w:r>
+      <w:r>
+        <w:t xml:space="preserve"> </w:t>
+      </w:r>
+      <w:r>
+        <w:t xml:space="preserve">improving slowly, so we stopped it and used the time for the lower learning</w:t>
+      </w:r>
+      <w:r>
+        <w:t xml:space="preserve"> </w:t>
+      </w:r>
+      <w:r>
+        <w:t xml:space="preserve">rate instead. With more compute it might overtake the smaller network; we</w:t>
+      </w:r>
+      <w:r>
+        <w:t xml:space="preserve"> </w:t>
+      </w:r>
+      <w:r>
+        <w:t xml:space="preserve">could not test that.</w:t>
+      </w:r>
+    </w:p>
+    <w:bookmarkEnd w:id="46"/>
+    <w:bookmarkStart w:id="50" w:name="X7e697f50ae1dd5e44c97332acfdfba23be11cde"/>
+    <w:p>
+      <w:pPr>
+        <w:pStyle w:val="Heading2"/>
+      </w:pPr>
+      <w:r>
+        <w:t xml:space="preserve">6.11 Exploratory runs (outside the course constraints)</w:t>
+      </w:r>
+    </w:p>
+    <w:p>
+      <w:pPr>
+        <w:pStyle w:val="FirstParagraph"/>
+      </w:pPr>
+      <w:r>
+        <w:t xml:space="preserve">We ran two short experiments that break the constraints, to test the</w:t>
+      </w:r>
+      <w:r>
+        <w:t xml:space="preserve"> </w:t>
+      </w:r>
+      <w:r>
+        <w:t xml:space="preserve">diagnosis below. They are not the final agent.</w:t>
+      </w:r>
+    </w:p>
+    <w:p>
+      <w:pPr>
+        <w:pStyle w:val="Compact"/>
+        <w:numPr>
+          <w:ilvl w:val="0"/>
+          <w:numId w:val="1005"/>
+        </w:numPr>
+      </w:pPr>
+      <w:r>
+        <w:rPr>
+          <w:b/>
+          <w:bCs/>
+        </w:rPr>
+        <w:t xml:space="preserve">Material value targets</w:t>
+      </w:r>
+      <w:r>
+        <w:t xml:space="preserve"> </w:t>
+      </w:r>
+      <w:r>
+        <w:t xml:space="preserve">(30 simulations, 10 x 10 games): drawn games get a</w:t>
+      </w:r>
+      <w:r>
+        <w:t xml:space="preserve"> </w:t>
+      </w:r>
+      <w:r>
+        <w:t xml:space="preserve">value target from the final material balance, which uses piece values. The</w:t>
+      </w:r>
+      <w:r>
+        <w:t xml:space="preserve"> </w:t>
+      </w:r>
+      <w:r>
+        <w:t xml:space="preserve">value head did learn material (correlation +0.45 with the material balance,</w:t>
+      </w:r>
+      <w:r>
+        <w:t xml:space="preserve"> </w:t>
+      </w:r>
+      <w:r>
+        <w:t xml:space="preserve">against +0.07 in run 1), but strength did not improve (0.474 and 0.469</w:t>
+      </w:r>
+      <w:r>
+        <w:t xml:space="preserve"> </w:t>
+      </w:r>
+      <w:r>
+        <w:t xml:space="preserve">against untrained at iterations 5 and 10).</w:t>
+      </w:r>
+    </w:p>
+    <w:p>
+      <w:pPr>
+        <w:pStyle w:val="Compact"/>
+        <w:numPr>
+          <w:ilvl w:val="0"/>
+          <w:numId w:val="1005"/>
+        </w:numPr>
+      </w:pPr>
+      <w:r>
+        <w:rPr>
+          <w:b/>
+          <w:bCs/>
+        </w:rPr>
+        <w:t xml:space="preserve">100 simulations per move</w:t>
+      </w:r>
+      <w:r>
+        <w:t xml:space="preserve"> </w:t>
+      </w:r>
+      <w:r>
+        <w:t xml:space="preserve">(10 x 10 games, also with material targets):</w:t>
+      </w:r>
+      <w:r>
+        <w:t xml:space="preserve"> </w:t>
+      </w:r>
+      <w:r>
+        <w:t xml:space="preserve">decisive games peaked at 60% in iteration 3, but strength against untrained</w:t>
+      </w:r>
+      <w:r>
+        <w:t xml:space="preserve"> </w:t>
+      </w:r>
+      <w:r>
+        <w:t xml:space="preserve">was 0.421 at iteration 5 and 0.346 at iteration 10.</w:t>
+      </w:r>
+    </w:p>
+    <w:p>
+      <w:pPr>
+        <w:pStyle w:val="CaptionedFigure"/>
+      </w:pPr>
+      <w:r>
+        <w:drawing>
+          <wp:inline>
+            <wp:extent cx="5334000" cy="3394363"/>
+            <wp:effectExtent b="0" l="0" r="0" t="0"/>
+            <wp:docPr descr="Exploratory runs: loss, decisive share and game length." title="" id="48" name="Picture"/>
+            <a:graphic>
+              <a:graphicData uri="http://schemas.openxmlformats.org/drawingml/2006/picture">
+                <pic:pic>
+                  <pic:nvPicPr>
+                    <pic:cNvPr descr="../results/training_curves_exploratory.png" id="49" name="Picture"/>
+                    <pic:cNvPicPr>
+                      <a:picLocks noChangeArrowheads="1" noChangeAspect="1"/>
+                    </pic:cNvPicPr>
+                  </pic:nvPicPr>
+                  <pic:blipFill>
+                    <a:blip r:embed="rId47"/>
+                    <a:stretch>
+                      <a:fillRect/>
+                    </a:stretch>
+                  </pic:blipFill>
+                  <pic:spPr bwMode="auto">
+                    <a:xfrm>
+                      <a:off x="0" y="0"/>
+                      <a:ext cx="5334000" cy="3394363"/>
+                    </a:xfrm>
+                    <a:prstGeom prst="rect">
+                      <a:avLst/>
+                    </a:prstGeom>
+                    <a:noFill/>
+                    <a:ln w="9525">
+                      <a:noFill/>
+                      <a:headEnd/>
+                      <a:tailEnd/>
+                    </a:ln>
+                  </pic:spPr>
+                </pic:pic>
+              </a:graphicData>
+            </a:graphic>
+          </wp:inline>
+        </w:drawing>
+      </w:r>
+    </w:p>
+    <w:p>
+      <w:pPr>
+        <w:pStyle w:val="ImageCaption"/>
+      </w:pPr>
+      <w:r>
         <w:t xml:space="preserve">Exploratory runs: loss, decisive share and game length.</w:t>
       </w:r>
     </w:p>
-    <w:bookmarkEnd w:id="38"/>
-    <w:bookmarkEnd w:id="39"/>
-    <w:bookmarkStart w:id="40" w:name="discussion"/>
+    <w:bookmarkEnd w:id="50"/>
+    <w:bookmarkEnd w:id="51"/>
+    <w:bookmarkStart w:id="52" w:name="discussion"/>
     <w:p>
       <w:pPr>
         <w:pStyle w:val="Heading1"/>
@@ -3931,25 +6443,35 @@
         <w:pStyle w:val="FirstParagraph"/>
       </w:pPr>
       <w:r>
-        <w:t xml:space="preserve">We first checked for a bug. The tests confirm the value targets have the right</w:t>
-      </w:r>
-      <w:r>
-        <w:t xml:space="preserve"> </w:t>
-      </w:r>
-      <w:r>
-        <w:t xml:space="preserve">sign for both colors, the policy targets match the visit counts, and the</w:t>
-      </w:r>
-      <w:r>
-        <w:t xml:space="preserve"> </w:t>
-      </w:r>
-      <w:r>
-        <w:t xml:space="preserve">encoding and actions agree for Black, so we believe the result reflects the</w:t>
-      </w:r>
-      <w:r>
-        <w:t xml:space="preserve"> </w:t>
-      </w:r>
-      <w:r>
-        <w:t xml:space="preserve">method at this scale, not an error. Three causes stand out:</w:t>
+        <w:rPr>
+          <w:b/>
+          <w:bCs/>
+        </w:rPr>
+        <w:t xml:space="preserve">The first runs.</w:t>
+      </w:r>
+      <w:r>
+        <w:t xml:space="preserve"> </w:t>
+      </w:r>
+      <w:r>
+        <w:t xml:space="preserve">We first checked for a bug. The tests confirm the value</w:t>
+      </w:r>
+      <w:r>
+        <w:t xml:space="preserve"> </w:t>
+      </w:r>
+      <w:r>
+        <w:t xml:space="preserve">targets have the right sign for both colors, the policy targets match the visit</w:t>
+      </w:r>
+      <w:r>
+        <w:t xml:space="preserve"> </w:t>
+      </w:r>
+      <w:r>
+        <w:t xml:space="preserve">counts, and the encoding and actions agree for Black, so we believe the result</w:t>
+      </w:r>
+      <w:r>
+        <w:t xml:space="preserve"> </w:t>
+      </w:r>
+      <w:r>
+        <w:t xml:space="preserve">reflected the method at that scale, not an error. Three causes stood out:</w:t>
       </w:r>
     </w:p>
     <w:p>
@@ -4091,23 +6613,101 @@
         <w:pStyle w:val="BodyText"/>
       </w:pPr>
       <w:r>
-        <w:t xml:space="preserve">The exploratory runs suggest that a better value signal alone is not enough at</w:t>
-      </w:r>
-      <w:r>
-        <w:t xml:space="preserve"> </w:t>
-      </w:r>
-      <w:r>
-        <w:t xml:space="preserve">this scale: the value head learned material, but 30 to 100 simulations with a</w:t>
-      </w:r>
-      <w:r>
-        <w:t xml:space="preserve"> </w:t>
-      </w:r>
-      <w:r>
-        <w:t xml:space="preserve">weak policy still did not produce stronger play in 100 games.</w:t>
-      </w:r>
-    </w:p>
-    <w:bookmarkEnd w:id="40"/>
-    <w:bookmarkStart w:id="41" w:name="limitations-and-future-work"/>
+        <w:t xml:space="preserve">The exploratory runs suggested that a better value signal alone is not enough</w:t>
+      </w:r>
+      <w:r>
+        <w:t xml:space="preserve"> </w:t>
+      </w:r>
+      <w:r>
+        <w:t xml:space="preserve">at that scale: the value head learned material, but 30 to 100 simulations with</w:t>
+      </w:r>
+      <w:r>
+        <w:t xml:space="preserve"> </w:t>
+      </w:r>
+      <w:r>
+        <w:t xml:space="preserve">a weak policy still did not produce stronger play in 100 games.</w:t>
+      </w:r>
+    </w:p>
+    <w:p>
+      <w:pPr>
+        <w:pStyle w:val="BodyText"/>
+      </w:pPr>
+      <w:r>
+        <w:rPr>
+          <w:b/>
+          <w:bCs/>
+        </w:rPr>
+        <w:t xml:space="preserve">The long run confirms the first cause.</w:t>
+      </w:r>
+      <w:r>
+        <w:t xml:space="preserve"> </w:t>
+      </w:r>
+      <w:r>
+        <w:t xml:space="preserve">With 135 times as many games and</w:t>
+      </w:r>
+      <w:r>
+        <w:t xml:space="preserve"> </w:t>
+      </w:r>
+      <w:r>
+        <w:t xml:space="preserve">nothing else changed in the method, the agent became clearly stronger than its</w:t>
+      </w:r>
+      <w:r>
+        <w:t xml:space="preserve"> </w:t>
+      </w:r>
+      <w:r>
+        <w:t xml:space="preserve">starting point and than random and untrained play (Sections 6.7 and 6.9). Two</w:t>
+      </w:r>
+      <w:r>
+        <w:t xml:space="preserve"> </w:t>
+      </w:r>
+      <w:r>
+        <w:t xml:space="preserve">lessons stand out. First, most of the gain came early, and at a fixed learning</w:t>
+      </w:r>
+      <w:r>
+        <w:t xml:space="preserve"> </w:t>
+      </w:r>
+      <w:r>
+        <w:t xml:space="preserve">rate of 1e-3 the network then moved around one level of play; lowering the</w:t>
+      </w:r>
+      <w:r>
+        <w:t xml:space="preserve"> </w:t>
+      </w:r>
+      <w:r>
+        <w:t xml:space="preserve">learning rate gave the clearest single improvement of the run (Section 6.8).</w:t>
+      </w:r>
+      <w:r>
+        <w:t xml:space="preserve"> </w:t>
+      </w:r>
+      <w:r>
+        <w:t xml:space="preserve">Second, the third cause above remains: about 80% of self-play games are still</w:t>
+      </w:r>
+      <w:r>
+        <w:t xml:space="preserve"> </w:t>
+      </w:r>
+      <w:r>
+        <w:t xml:space="preserve">drawn, so the agent has learned to keep material and not to lose, but it gets</w:t>
+      </w:r>
+      <w:r>
+        <w:t xml:space="preserve"> </w:t>
+      </w:r>
+      <w:r>
+        <w:t xml:space="preserve">few examples of how a won position is finished, and most of its games end by</w:t>
+      </w:r>
+      <w:r>
+        <w:t xml:space="preserve"> </w:t>
+      </w:r>
+      <w:r>
+        <w:t xml:space="preserve">the no-progress rule. Greedy capture, which trades whenever it can, is hard to</w:t>
+      </w:r>
+      <w:r>
+        <w:t xml:space="preserve"> </w:t>
+      </w:r>
+      <w:r>
+        <w:t xml:space="preserve">beat for an agent that cannot yet force checkmate.</w:t>
+      </w:r>
+    </w:p>
+    <w:bookmarkEnd w:id="52"/>
+    <w:bookmarkStart w:id="53" w:name="limitations-and-future-work"/>
     <w:p>
       <w:pPr>
         <w:pStyle w:val="Heading1"/>
@@ -4125,13 +6725,19 @@
         </w:numPr>
       </w:pPr>
       <w:r>
-        <w:t xml:space="preserve">Every benchmark uses 20 games per checkpoint, so differences smaller than</w:t>
-      </w:r>
-      <w:r>
-        <w:t xml:space="preserve"> </w:t>
-      </w:r>
-      <w:r>
-        <w:t xml:space="preserve">about 0.1 cannot be resolved.</w:t>
+        <w:t xml:space="preserve">The first runs’ benchmarks use 20 games per checkpoint, so differences</w:t>
+      </w:r>
+      <w:r>
+        <w:t xml:space="preserve"> </w:t>
+      </w:r>
+      <w:r>
+        <w:t xml:space="preserve">smaller than about 0.1 cannot be resolved there. The long run uses 100 games</w:t>
+      </w:r>
+      <w:r>
+        <w:t xml:space="preserve"> </w:t>
+      </w:r>
+      <w:r>
+        <w:t xml:space="preserve">per benchmark, and differences smaller than about 0.03 to 0.06 still cannot.</w:t>
       </w:r>
     </w:p>
     <w:p>
@@ -4143,7 +6749,13 @@
         </w:numPr>
       </w:pPr>
       <w:r>
-        <w:t xml:space="preserve">The human evaluation is six games by one beginner.</w:t>
+        <w:t xml:space="preserve">With most games drawn, a match score says little about how often the agent</w:t>
+      </w:r>
+      <w:r>
+        <w:t xml:space="preserve"> </w:t>
+      </w:r>
+      <w:r>
+        <w:t xml:space="preserve">can actually win.</w:t>
       </w:r>
     </w:p>
     <w:p>
@@ -4155,13 +6767,31 @@
         </w:numPr>
       </w:pPr>
       <w:r>
-        <w:t xml:space="preserve">Compute was the main limit: about 20 minutes per iteration of 20 games on</w:t>
-      </w:r>
-      <w:r>
-        <w:t xml:space="preserve"> </w:t>
-      </w:r>
-      <w:r>
-        <w:t xml:space="preserve">one CPU core.</w:t>
+        <w:t xml:space="preserve">The human evaluation is six games by one beginner, against final B, not the</w:t>
+      </w:r>
+      <w:r>
+        <w:t xml:space="preserve"> </w:t>
+      </w:r>
+      <w:r>
+        <w:t xml:space="preserve">final model.</w:t>
+      </w:r>
+    </w:p>
+    <w:p>
+      <w:pPr>
+        <w:pStyle w:val="Compact"/>
+        <w:numPr>
+          <w:ilvl w:val="0"/>
+          <w:numId w:val="1007"/>
+        </w:numPr>
+      </w:pPr>
+      <w:r>
+        <w:t xml:space="preserve">Compute was the main limit: even after the speed-up, one iteration of 100</w:t>
+      </w:r>
+      <w:r>
+        <w:t xml:space="preserve"> </w:t>
+      </w:r>
+      <w:r>
+        <w:t xml:space="preserve">games takes about 9 minutes, and the larger network about 25 to 30.</w:t>
       </w:r>
     </w:p>
     <w:p>
@@ -4181,13 +6811,13 @@
         </w:numPr>
       </w:pPr>
       <w:r>
-        <w:t xml:space="preserve">Many more self-play games: parallel self-play workers and runs of hundreds</w:t>
-      </w:r>
-      <w:r>
-        <w:t xml:space="preserve"> </w:t>
-      </w:r>
-      <w:r>
-        <w:t xml:space="preserve">of iterations.</w:t>
+        <w:t xml:space="preserve">A way for results to reach the value head more often, within the rules: a</w:t>
+      </w:r>
+      <w:r>
+        <w:t xml:space="preserve"> </w:t>
+      </w:r>
+      <w:r>
+        <w:t xml:space="preserve">shorter game cap during self-play, or resigning hopeless games.</w:t>
       </w:r>
     </w:p>
     <w:p>
@@ -4199,13 +6829,7 @@
         </w:numPr>
       </w:pPr>
       <w:r>
-        <w:t xml:space="preserve">A shorter game cap or resignation rule, so results reach the value head</w:t>
-      </w:r>
-      <w:r>
-        <w:t xml:space="preserve"> </w:t>
-      </w:r>
-      <w:r>
-        <w:t xml:space="preserve">more often.</w:t>
+        <w:t xml:space="preserve">Even longer training, with a lower learning rate earlier in the run.</w:t>
       </w:r>
     </w:p>
     <w:p>
@@ -4217,11 +6841,11 @@
         </w:numPr>
       </w:pPr>
       <w:r>
-        <w:t xml:space="preserve">More simulations once the value head is useful, and a larger network.</w:t>
-      </w:r>
-    </w:p>
-    <w:bookmarkEnd w:id="41"/>
-    <w:bookmarkStart w:id="42" w:name="conclusion"/>
+        <w:t xml:space="preserve">The larger network, given the days of compute it needs to catch up.</w:t>
+      </w:r>
+    </w:p>
+    <w:bookmarkEnd w:id="53"/>
+    <w:bookmarkStart w:id="54" w:name="conclusion"/>
     <w:p>
       <w:pPr>
         <w:pStyle w:val="Heading1"/>
@@ -4235,59 +6859,71 @@
         <w:pStyle w:val="FirstParagraph"/>
       </w:pPr>
       <w:r>
-        <w:t xml:space="preserve">We implemented every part of an AlphaZero-style system for Chaturanga under</w:t>
-      </w:r>
-      <w:r>
-        <w:t xml:space="preserve"> </w:t>
-      </w:r>
-      <w:r>
-        <w:t xml:space="preserve">the course constraints and verified it with 97 tests. Training ran as designed,</w:t>
-      </w:r>
-      <w:r>
-        <w:t xml:space="preserve"> </w:t>
-      </w:r>
-      <w:r>
-        <w:t xml:space="preserve">and the network learned to imitate its own search, but in 400 self-play games</w:t>
-      </w:r>
-      <w:r>
-        <w:t xml:space="preserve"> </w:t>
-      </w:r>
-      <w:r>
-        <w:t xml:space="preserve">per run the agent did not become measurably stronger than its untrained start,</w:t>
-      </w:r>
-      <w:r>
-        <w:t xml:space="preserve"> </w:t>
-      </w:r>
-      <w:r>
-        <w:t xml:space="preserve">and a beginner beat it. The cause is a value signal starved by draws: most</w:t>
-      </w:r>
-      <w:r>
-        <w:t xml:space="preserve"> </w:t>
-      </w:r>
-      <w:r>
-        <w:t xml:space="preserve">games end by the no-progress rule, so the value head sees almost only 0. The</w:t>
-      </w:r>
-      <w:r>
-        <w:t xml:space="preserve"> </w:t>
-      </w:r>
-      <w:r>
-        <w:t xml:space="preserve">evaluation tools we built (a fixed benchmark protocol, head-to-head matches,</w:t>
-      </w:r>
-      <w:r>
-        <w:t xml:space="preserve"> </w:t>
-      </w:r>
-      <w:r>
-        <w:t xml:space="preserve">game-ending counts and human-game logging) made this result measurable and</w:t>
-      </w:r>
-      <w:r>
-        <w:t xml:space="preserve"> </w:t>
-      </w:r>
-      <w:r>
-        <w:t xml:space="preserve">explainable, and they are ready for a longer run.</w:t>
-      </w:r>
-    </w:p>
-    <w:bookmarkEnd w:id="42"/>
-    <w:bookmarkStart w:id="43" w:name="references"/>
+        <w:t xml:space="preserve">We implemented every part of an AlphaZero-style system for Chaturanga under the</w:t>
+      </w:r>
+      <w:r>
+        <w:t xml:space="preserve"> </w:t>
+      </w:r>
+      <w:r>
+        <w:t xml:space="preserve">course constraints and verified it with 108 tests. With 400 self-play games per</w:t>
+      </w:r>
+      <w:r>
+        <w:t xml:space="preserve"> </w:t>
+      </w:r>
+      <w:r>
+        <w:t xml:space="preserve">run the agent did not improve, and we measured why: draws starve the value</w:t>
+      </w:r>
+      <w:r>
+        <w:t xml:space="preserve"> </w:t>
+      </w:r>
+      <w:r>
+        <w:t xml:space="preserve">head, and the data was far too small. After making self-play about 11 times</w:t>
+      </w:r>
+      <w:r>
+        <w:t xml:space="preserve"> </w:t>
+      </w:r>
+      <w:r>
+        <w:t xml:space="preserve">faster, a run of 54,000 games with the same method produced a clearly stronger</w:t>
+      </w:r>
+      <w:r>
+        <w:t xml:space="preserve"> </w:t>
+      </w:r>
+      <w:r>
+        <w:t xml:space="preserve">agent. The final model beats its starting point 27 wins to 0 and beats random</w:t>
+      </w:r>
+      <w:r>
+        <w:t xml:space="preserve"> </w:t>
+      </w:r>
+      <w:r>
+        <w:t xml:space="preserve">and untrained play, losing almost no games. It still draws nearly every game</w:t>
+      </w:r>
+      <w:r>
+        <w:t xml:space="preserve"> </w:t>
+      </w:r>
+      <w:r>
+        <w:t xml:space="preserve">against greedy capture and rarely checkmates, so learning to convert an</w:t>
+      </w:r>
+      <w:r>
+        <w:t xml:space="preserve"> </w:t>
+      </w:r>
+      <w:r>
+        <w:t xml:space="preserve">advantage remains the open problem. The evaluation tools (a fixed benchmark</w:t>
+      </w:r>
+      <w:r>
+        <w:t xml:space="preserve"> </w:t>
+      </w:r>
+      <w:r>
+        <w:t xml:space="preserve">protocol, head-to-head matches, game-ending counts and human-game logging) made</w:t>
+      </w:r>
+      <w:r>
+        <w:t xml:space="preserve"> </w:t>
+      </w:r>
+      <w:r>
+        <w:t xml:space="preserve">both the negative and the positive result measurable.</w:t>
+      </w:r>
+    </w:p>
+    <w:bookmarkEnd w:id="54"/>
+    <w:bookmarkStart w:id="55" w:name="references"/>
     <w:p>
       <w:pPr>
         <w:pStyle w:val="Heading1"/>
@@ -4358,8 +6994,8 @@
         <w:t xml:space="preserve">, 550, 354-359.</w:t>
       </w:r>
     </w:p>
-    <w:bookmarkEnd w:id="43"/>
-    <w:bookmarkStart w:id="44" w:name="appendix-a-team-roles"/>
+    <w:bookmarkEnd w:id="55"/>
+    <w:bookmarkStart w:id="56" w:name="appendix-a-team-roles"/>
     <w:p>
       <w:pPr>
         <w:pStyle w:val="Heading1"/>
@@ -4506,8 +7142,8 @@
         </w:tc>
       </w:tr>
     </w:tbl>
-    <w:bookmarkEnd w:id="44"/>
-    <w:bookmarkStart w:id="45" w:name="appendix-b-reproducing-the-results"/>
+    <w:bookmarkEnd w:id="56"/>
+    <w:bookmarkStart w:id="57" w:name="appendix-b-reproducing-the-results"/>
     <w:p>
       <w:pPr>
         <w:pStyle w:val="Heading1"/>
@@ -4587,7 +7223,88 @@
         <w:rPr>
           <w:rStyle w:val="VerbatimChar"/>
         </w:rPr>
-        <w:t xml:space="preserve">python play_vs_ai.py --checkpoint checkpoints/final_B/latest.pt --player NAME</w:t>
+        <w:t xml:space="preserve"># long run (continues final B; see training/README.md for the later stretches)</w:t>
+      </w:r>
+      <w:r>
+        <w:br/>
+      </w:r>
+      <w:r>
+        <w:rPr>
+          <w:rStyle w:val="VerbatimChar"/>
+        </w:rPr>
+        <w:t xml:space="preserve">OMP_NUM_THREADS=1 python -m training.train --resume checkpoints/final_B/latest.pt \</w:t>
+      </w:r>
+      <w:r>
+        <w:br/>
+      </w:r>
+      <w:r>
+        <w:rPr>
+          <w:rStyle w:val="VerbatimChar"/>
+        </w:rPr>
+        <w:t xml:space="preserve">    --iterations 420 --games_per_iter 100 --simulations 50 --avoid_repetition \</w:t>
+      </w:r>
+      <w:r>
+        <w:br/>
+      </w:r>
+      <w:r>
+        <w:rPr>
+          <w:rStyle w:val="VerbatimChar"/>
+        </w:rPr>
+        <w:t xml:space="preserve">    --temperature_moves 1000 --max_plies 800 --buffer_capacity 250000 \</w:t>
+      </w:r>
+      <w:r>
+        <w:br/>
+      </w:r>
+      <w:r>
+        <w:rPr>
+          <w:rStyle w:val="VerbatimChar"/>
+        </w:rPr>
+        <w:t xml:space="preserve">    --min_buffer 150000 --batch_size 256 --train_steps 500 --lr 1e-3 \</w:t>
+      </w:r>
+      <w:r>
+        <w:br/>
+      </w:r>
+      <w:r>
+        <w:rPr>
+          <w:rStyle w:val="VerbatimChar"/>
+        </w:rPr>
+        <w:t xml:space="preserve">    --device mps --workers 6 --seed 1 \</w:t>
+      </w:r>
+      <w:r>
+        <w:br/>
+      </w:r>
+      <w:r>
+        <w:rPr>
+          <w:rStyle w:val="VerbatimChar"/>
+        </w:rPr>
+        <w:t xml:space="preserve">    --checkpoint_dir checkpoints/long --log checkpoints/long/log.csv</w:t>
+      </w:r>
+      <w:r>
+        <w:br/>
+      </w:r>
+      <w:r>
+        <w:rPr>
+          <w:rStyle w:val="VerbatimChar"/>
+        </w:rPr>
+        <w:t xml:space="preserve">python -m evaluation.parallel_match --a models/chaturangzero_final.pt \</w:t>
+      </w:r>
+      <w:r>
+        <w:br/>
+      </w:r>
+      <w:r>
+        <w:rPr>
+          <w:rStyle w:val="VerbatimChar"/>
+        </w:rPr>
+        <w:t xml:space="preserve">    --b checkpoints/final_B/latest.pt --games 100 --workers 6</w:t>
+      </w:r>
+      <w:r>
+        <w:br/>
+      </w:r>
+      <w:r>
+        <w:rPr>
+          <w:rStyle w:val="VerbatimChar"/>
+        </w:rPr>
+        <w:t xml:space="preserve">python play_vs_ai.py --checkpoint models/chaturangzero_final.pt --player NAME</w:t>
       </w:r>
     </w:p>
     <w:p>
@@ -4607,10 +7324,28 @@
         <w:t xml:space="preserve">results/</w:t>
       </w:r>
       <w:r>
+        <w:t xml:space="preserve">, and the final</w:t>
+      </w:r>
+      <w:r>
+        <w:t xml:space="preserve"> </w:t>
+      </w:r>
+      <w:r>
+        <w:t xml:space="preserve">model is</w:t>
+      </w:r>
+      <w:r>
+        <w:t xml:space="preserve"> </w:t>
+      </w:r>
+      <w:r>
+        <w:rPr>
+          <w:rStyle w:val="VerbatimChar"/>
+        </w:rPr>
+        <w:t xml:space="preserve">models/chaturangzero_final.pt</w:t>
+      </w:r>
+      <w:r>
         <w:t xml:space="preserve">.</w:t>
       </w:r>
     </w:p>
-    <w:bookmarkEnd w:id="45"/>
+    <w:bookmarkEnd w:id="57"/>
     <w:sectPr>
       <w:footnotePr>
         <w:numRestart w:val="eachSect"/>

</xml_diff>

<commit_message>
Add the play-time search and draw-penalty tests on the final model
- parallel_match: --simulations_a and --simulations_b give each side its
  own search budget
- Final model at 200 sims vs itself at 50: 0.525 (results/thinking_time/)
- Continuing with draws valued at -0.2 made it weaker: 0.474 at
  iteration 600 and 0.454 at 630 against iteration 560
  (results/draw_penalty/), so iteration 560 stays the final model
- Report (md and docx), results page and READMEs updated

Co-Authored-By: Claude Opus 5.5 <noreply@anthropic.com>
</commit_message>
<xml_diff>
--- a/report/REPORT.docx
+++ b/report/REPORT.docx
@@ -142,7 +142,19 @@
         <w:t xml:space="preserve"> </w:t>
       </w:r>
       <w:r>
-        <w:t xml:space="preserve">128-filter network did not catch up in the time we had.</w:t>
+        <w:t xml:space="preserve">128-filter network did not catch up in the time we had. Two later tests, more</w:t>
+      </w:r>
+      <w:r>
+        <w:t xml:space="preserve"> </w:t>
+      </w:r>
+      <w:r>
+        <w:t xml:space="preserve">search per move when playing and counting draws as slightly bad in training,</w:t>
+      </w:r>
+      <w:r>
+        <w:t xml:space="preserve"> </w:t>
+      </w:r>
+      <w:r>
+        <w:t xml:space="preserve">gave a small gain and a loss of strength respectively.</w:t>
       </w:r>
     </w:p>
     <w:bookmarkEnd w:id="9"/>
@@ -2537,7 +2549,7 @@
     </w:p>
     <w:bookmarkEnd w:id="20"/>
     <w:bookmarkEnd w:id="21"/>
-    <w:bookmarkStart w:id="51" w:name="results"/>
+    <w:bookmarkStart w:id="52" w:name="results"/>
     <w:p>
       <w:pPr>
         <w:pStyle w:val="Heading1"/>
@@ -6269,13 +6281,337 @@
       </w:r>
     </w:p>
     <w:bookmarkEnd w:id="46"/>
-    <w:bookmarkStart w:id="50" w:name="X7e697f50ae1dd5e44c97332acfdfba23be11cde"/>
+    <w:bookmarkStart w:id="47" w:name="two-more-tests-on-the-final-model"/>
     <w:p>
       <w:pPr>
         <w:pStyle w:val="Heading2"/>
       </w:pPr>
       <w:r>
-        <w:t xml:space="preserve">6.11 Exploratory runs (outside the course constraints)</w:t>
+        <w:t xml:space="preserve">6.11 Two more tests on the final model</w:t>
+      </w:r>
+    </w:p>
+    <w:p>
+      <w:pPr>
+        <w:pStyle w:val="FirstParagraph"/>
+      </w:pPr>
+      <w:r>
+        <w:rPr>
+          <w:b/>
+          <w:bCs/>
+        </w:rPr>
+        <w:t xml:space="preserve">More search when playing.</w:t>
+      </w:r>
+      <w:r>
+        <w:t xml:space="preserve"> </w:t>
+      </w:r>
+      <w:r>
+        <w:t xml:space="preserve">The 30 to 50 simulation limit applies to</w:t>
+      </w:r>
+      <w:r>
+        <w:t xml:space="preserve"> </w:t>
+      </w:r>
+      <w:r>
+        <w:t xml:space="preserve">training, so we also measured the final model with more search at play time.</w:t>
+      </w:r>
+      <w:r>
+        <w:t xml:space="preserve"> </w:t>
+      </w:r>
+      <w:r>
+        <w:t xml:space="preserve">With 200 simulations per move against itself at 50 (100 games) it scored</w:t>
+      </w:r>
+      <w:r>
+        <w:t xml:space="preserve"> </w:t>
+      </w:r>
+      <w:r>
+        <w:t xml:space="preserve">9 wins, 4 losses and 86 draws (0.525 +/- 0.035). Four times the search gives</w:t>
+      </w:r>
+      <w:r>
+        <w:t xml:space="preserve"> </w:t>
+      </w:r>
+      <w:r>
+        <w:t xml:space="preserve">only a small edge, since the extra search does not help it finish games.</w:t>
+      </w:r>
+    </w:p>
+    <w:p>
+      <w:pPr>
+        <w:pStyle w:val="BodyText"/>
+      </w:pPr>
+      <w:r>
+        <w:rPr>
+          <w:b/>
+          <w:bCs/>
+        </w:rPr>
+        <w:t xml:space="preserve">Counting draws as slightly bad.</w:t>
+      </w:r>
+      <w:r>
+        <w:t xml:space="preserve"> </w:t>
+      </w:r>
+      <w:r>
+        <w:t xml:space="preserve">We continued the final model from</w:t>
+      </w:r>
+      <w:r>
+        <w:t xml:space="preserve"> </w:t>
+      </w:r>
+      <w:r>
+        <w:t xml:space="preserve">iteration 560 with a value target of -0.2 for both sides in every drawn or</w:t>
+      </w:r>
+      <w:r>
+        <w:t xml:space="preserve"> </w:t>
+      </w:r>
+      <w:r>
+        <w:t xml:space="preserve">unfinished self-play game, instead of 0, at learning rate 1e-4. It uses only</w:t>
+      </w:r>
+      <w:r>
+        <w:t xml:space="preserve"> </w:t>
+      </w:r>
+      <w:r>
+        <w:t xml:space="preserve">the game result, so it stays within the rules-only constraint. Decisive</w:t>
+      </w:r>
+      <w:r>
+        <w:t xml:space="preserve"> </w:t>
+      </w:r>
+      <w:r>
+        <w:t xml:space="preserve">self-play games rose from about 14% to about 19%, but play got weaker:</w:t>
+      </w:r>
+    </w:p>
+    <w:tbl>
+      <w:tblPr>
+        <w:tblStyle w:val="Table"/>
+        <w:tblW w:type="auto" w:w="0"/>
+        <w:tblLook w:firstRow="1" w:lastRow="0" w:firstColumn="0" w:lastColumn="0" w:noHBand="0" w:noVBand="0" w:val="0020"/>
+      </w:tblPr>
+      <w:tblGrid>
+        <w:gridCol w:w="1320"/>
+        <w:gridCol w:w="1320"/>
+        <w:gridCol w:w="1320"/>
+        <w:gridCol w:w="1320"/>
+        <w:gridCol w:w="1320"/>
+        <w:gridCol w:w="1320"/>
+      </w:tblGrid>
+      <w:tr>
+        <w:trPr>
+          <w:tblHeader w:val="on"/>
+        </w:trPr>
+        <w:tc>
+          <w:tcPr/>
+          <w:p>
+            <w:pPr>
+              <w:pStyle w:val="Compact"/>
+            </w:pPr>
+            <w:r>
+              <w:t xml:space="preserve">Match (100 games)</w:t>
+            </w:r>
+          </w:p>
+        </w:tc>
+        <w:tc>
+          <w:tcPr/>
+          <w:p>
+            <w:pPr>
+              <w:pStyle w:val="Compact"/>
+            </w:pPr>
+            <w:r>
+              <w:t xml:space="preserve">Wins</w:t>
+            </w:r>
+          </w:p>
+        </w:tc>
+        <w:tc>
+          <w:tcPr/>
+          <w:p>
+            <w:pPr>
+              <w:pStyle w:val="Compact"/>
+            </w:pPr>
+            <w:r>
+              <w:t xml:space="preserve">Losses</w:t>
+            </w:r>
+          </w:p>
+        </w:tc>
+        <w:tc>
+          <w:tcPr/>
+          <w:p>
+            <w:pPr>
+              <w:pStyle w:val="Compact"/>
+            </w:pPr>
+            <w:r>
+              <w:t xml:space="preserve">Draws</w:t>
+            </w:r>
+          </w:p>
+        </w:tc>
+        <w:tc>
+          <w:tcPr/>
+          <w:p>
+            <w:pPr>
+              <w:pStyle w:val="Compact"/>
+            </w:pPr>
+            <w:r>
+              <w:t xml:space="preserve">Unfinished</w:t>
+            </w:r>
+          </w:p>
+        </w:tc>
+        <w:tc>
+          <w:tcPr/>
+          <w:p>
+            <w:pPr>
+              <w:pStyle w:val="Compact"/>
+            </w:pPr>
+            <w:r>
+              <w:t xml:space="preserve">Score</w:t>
+            </w:r>
+          </w:p>
+        </w:tc>
+      </w:tr>
+      <w:tr>
+        <w:tc>
+          <w:tcPr/>
+          <w:p>
+            <w:pPr>
+              <w:pStyle w:val="Compact"/>
+            </w:pPr>
+            <w:r>
+              <w:t xml:space="preserve">iteration 600 vs final (560)</w:t>
+            </w:r>
+          </w:p>
+        </w:tc>
+        <w:tc>
+          <w:tcPr/>
+          <w:p>
+            <w:pPr>
+              <w:pStyle w:val="Compact"/>
+            </w:pPr>
+            <w:r>
+              <w:t xml:space="preserve">4</w:t>
+            </w:r>
+          </w:p>
+        </w:tc>
+        <w:tc>
+          <w:tcPr/>
+          <w:p>
+            <w:pPr>
+              <w:pStyle w:val="Compact"/>
+            </w:pPr>
+            <w:r>
+              <w:t xml:space="preserve">9</w:t>
+            </w:r>
+          </w:p>
+        </w:tc>
+        <w:tc>
+          <w:tcPr/>
+          <w:p>
+            <w:pPr>
+              <w:pStyle w:val="Compact"/>
+            </w:pPr>
+            <w:r>
+              <w:t xml:space="preserve">85</w:t>
+            </w:r>
+          </w:p>
+        </w:tc>
+        <w:tc>
+          <w:tcPr/>
+          <w:p>
+            <w:pPr>
+              <w:pStyle w:val="Compact"/>
+            </w:pPr>
+            <w:r>
+              <w:t xml:space="preserve">2</w:t>
+            </w:r>
+          </w:p>
+        </w:tc>
+        <w:tc>
+          <w:tcPr/>
+          <w:p>
+            <w:pPr>
+              <w:pStyle w:val="Compact"/>
+            </w:pPr>
+            <w:r>
+              <w:t xml:space="preserve">0.474 +/- 0.036</w:t>
+            </w:r>
+          </w:p>
+        </w:tc>
+      </w:tr>
+      <w:tr>
+        <w:tc>
+          <w:tcPr/>
+          <w:p>
+            <w:pPr>
+              <w:pStyle w:val="Compact"/>
+            </w:pPr>
+            <w:r>
+              <w:t xml:space="preserve">iteration 630 vs final (560)</w:t>
+            </w:r>
+          </w:p>
+        </w:tc>
+        <w:tc>
+          <w:tcPr/>
+          <w:p>
+            <w:pPr>
+              <w:pStyle w:val="Compact"/>
+            </w:pPr>
+            <w:r>
+              <w:t xml:space="preserve">0</w:t>
+            </w:r>
+          </w:p>
+        </w:tc>
+        <w:tc>
+          <w:tcPr/>
+          <w:p>
+            <w:pPr>
+              <w:pStyle w:val="Compact"/>
+            </w:pPr>
+            <w:r>
+              <w:t xml:space="preserve">9</w:t>
+            </w:r>
+          </w:p>
+        </w:tc>
+        <w:tc>
+          <w:tcPr/>
+          <w:p>
+            <w:pPr>
+              <w:pStyle w:val="Compact"/>
+            </w:pPr>
+            <w:r>
+              <w:t xml:space="preserve">89</w:t>
+            </w:r>
+          </w:p>
+        </w:tc>
+        <w:tc>
+          <w:tcPr/>
+          <w:p>
+            <w:pPr>
+              <w:pStyle w:val="Compact"/>
+            </w:pPr>
+            <w:r>
+              <w:t xml:space="preserve">2</w:t>
+            </w:r>
+          </w:p>
+        </w:tc>
+        <w:tc>
+          <w:tcPr/>
+          <w:p>
+            <w:pPr>
+              <w:pStyle w:val="Compact"/>
+            </w:pPr>
+            <w:r>
+              <w:t xml:space="preserve">0.454 +/- 0.029</w:t>
+            </w:r>
+          </w:p>
+        </w:tc>
+      </w:tr>
+    </w:tbl>
+    <w:p>
+      <w:pPr>
+        <w:pStyle w:val="BodyText"/>
+      </w:pPr>
+      <w:r>
+        <w:t xml:space="preserve">We stopped it at iteration 631 and kept iteration 560 as the final model.</w:t>
+      </w:r>
+    </w:p>
+    <w:bookmarkEnd w:id="47"/>
+    <w:bookmarkStart w:id="51" w:name="X7e697f50ae1dd5e44c97332acfdfba23be11cde"/>
+    <w:p>
+      <w:pPr>
+        <w:pStyle w:val="Heading2"/>
+      </w:pPr>
+      <w:r>
+        <w:t xml:space="preserve">6.12 Exploratory runs (outside the course constraints)</w:t>
       </w:r>
     </w:p>
     <w:p>
@@ -6381,18 +6717,18 @@
           <wp:inline>
             <wp:extent cx="5334000" cy="3394363"/>
             <wp:effectExtent b="0" l="0" r="0" t="0"/>
-            <wp:docPr descr="Exploratory runs: loss, decisive share and game length." title="" id="48" name="Picture"/>
+            <wp:docPr descr="Exploratory runs: loss, decisive share and game length." title="" id="49" name="Picture"/>
             <a:graphic>
               <a:graphicData uri="http://schemas.openxmlformats.org/drawingml/2006/picture">
                 <pic:pic>
                   <pic:nvPicPr>
-                    <pic:cNvPr descr="../results/training_curves_exploratory.png" id="49" name="Picture"/>
+                    <pic:cNvPr descr="../results/training_curves_exploratory.png" id="50" name="Picture"/>
                     <pic:cNvPicPr>
                       <a:picLocks noChangeArrowheads="1" noChangeAspect="1"/>
                     </pic:cNvPicPr>
                   </pic:nvPicPr>
                   <pic:blipFill>
-                    <a:blip r:embed="rId47"/>
+                    <a:blip r:embed="rId48"/>
                     <a:stretch>
                       <a:fillRect/>
                     </a:stretch>
@@ -6427,9 +6763,9 @@
         <w:t xml:space="preserve">Exploratory runs: loss, decisive share and game length.</w:t>
       </w:r>
     </w:p>
-    <w:bookmarkEnd w:id="50"/>
     <w:bookmarkEnd w:id="51"/>
-    <w:bookmarkStart w:id="52" w:name="discussion"/>
+    <w:bookmarkEnd w:id="52"/>
+    <w:bookmarkStart w:id="53" w:name="discussion"/>
     <w:p>
       <w:pPr>
         <w:pStyle w:val="Heading1"/>
@@ -6706,8 +7042,68 @@
         <w:t xml:space="preserve">beat for an agent that cannot yet force checkmate.</w:t>
       </w:r>
     </w:p>
-    <w:bookmarkEnd w:id="52"/>
-    <w:bookmarkStart w:id="53" w:name="limitations-and-future-work"/>
+    <w:p>
+      <w:pPr>
+        <w:pStyle w:val="BodyText"/>
+      </w:pPr>
+      <w:r>
+        <w:rPr>
+          <w:b/>
+          <w:bCs/>
+        </w:rPr>
+        <w:t xml:space="preserve">The limit of this setup.</w:t>
+      </w:r>
+      <w:r>
+        <w:t xml:space="preserve"> </w:t>
+      </w:r>
+      <w:r>
+        <w:t xml:space="preserve">The last tests point the same way. Lowering the</w:t>
+      </w:r>
+      <w:r>
+        <w:t xml:space="preserve"> </w:t>
+      </w:r>
+      <w:r>
+        <w:t xml:space="preserve">learning rate further gave only small steps (0.505 and 0.531 against the</w:t>
+      </w:r>
+      <w:r>
+        <w:t xml:space="preserve"> </w:t>
+      </w:r>
+      <w:r>
+        <w:t xml:space="preserve">previous checkpoint), four times more search at play time gave 0.525, and</w:t>
+      </w:r>
+      <w:r>
+        <w:t xml:space="preserve"> </w:t>
+      </w:r>
+      <w:r>
+        <w:t xml:space="preserve">penalizing draws made the agent play more decisive games against itself but</w:t>
+      </w:r>
+      <w:r>
+        <w:t xml:space="preserve"> </w:t>
+      </w:r>
+      <w:r>
+        <w:t xml:space="preserve">lose more against the final model (Section 6.11). Pushing for decisive results</w:t>
+      </w:r>
+      <w:r>
+        <w:t xml:space="preserve"> </w:t>
+      </w:r>
+      <w:r>
+        <w:t xml:space="preserve">without a better sense of which positions are won seems to lead to riskier,</w:t>
+      </w:r>
+      <w:r>
+        <w:t xml:space="preserve"> </w:t>
+      </w:r>
+      <w:r>
+        <w:t xml:space="preserve">worse play. Within the constraints and our compute, the 4 x 64 network at 50</w:t>
+      </w:r>
+      <w:r>
+        <w:t xml:space="preserve"> </w:t>
+      </w:r>
+      <w:r>
+        <w:t xml:space="preserve">simulations appears close to its limit.</w:t>
+      </w:r>
+    </w:p>
+    <w:bookmarkEnd w:id="53"/>
+    <w:bookmarkStart w:id="54" w:name="limitations-and-future-work"/>
     <w:p>
       <w:pPr>
         <w:pStyle w:val="Heading1"/>
@@ -6817,7 +7213,13 @@
         <w:t xml:space="preserve"> </w:t>
       </w:r>
       <w:r>
-        <w:t xml:space="preserve">shorter game cap during self-play, or resigning hopeless games.</w:t>
+        <w:t xml:space="preserve">shorter game cap during self-play, or resigning hopeless games. Simply</w:t>
+      </w:r>
+      <w:r>
+        <w:t xml:space="preserve"> </w:t>
+      </w:r>
+      <w:r>
+        <w:t xml:space="preserve">counting draws as slightly bad did not work (Section 6.11).</w:t>
       </w:r>
     </w:p>
     <w:p>
@@ -6844,8 +7246,8 @@
         <w:t xml:space="preserve">The larger network, given the days of compute it needs to catch up.</w:t>
       </w:r>
     </w:p>
-    <w:bookmarkEnd w:id="53"/>
-    <w:bookmarkStart w:id="54" w:name="conclusion"/>
+    <w:bookmarkEnd w:id="54"/>
+    <w:bookmarkStart w:id="55" w:name="conclusion"/>
     <w:p>
       <w:pPr>
         <w:pStyle w:val="Heading1"/>
@@ -6907,7 +7309,13 @@
         <w:t xml:space="preserve"> </w:t>
       </w:r>
       <w:r>
-        <w:t xml:space="preserve">advantage remains the open problem. The evaluation tools (a fixed benchmark</w:t>
+        <w:t xml:space="preserve">advantage remains the open problem: neither more search at play time nor</w:t>
+      </w:r>
+      <w:r>
+        <w:t xml:space="preserve"> </w:t>
+      </w:r>
+      <w:r>
+        <w:t xml:space="preserve">counting draws as bad in training solved it. The evaluation tools (a fixed benchmark</w:t>
       </w:r>
       <w:r>
         <w:t xml:space="preserve"> </w:t>
@@ -6922,8 +7330,8 @@
         <w:t xml:space="preserve">both the negative and the positive result measurable.</w:t>
       </w:r>
     </w:p>
-    <w:bookmarkEnd w:id="54"/>
-    <w:bookmarkStart w:id="55" w:name="references"/>
+    <w:bookmarkEnd w:id="55"/>
+    <w:bookmarkStart w:id="56" w:name="references"/>
     <w:p>
       <w:pPr>
         <w:pStyle w:val="Heading1"/>
@@ -6994,8 +7402,8 @@
         <w:t xml:space="preserve">, 550, 354-359.</w:t>
       </w:r>
     </w:p>
-    <w:bookmarkEnd w:id="55"/>
-    <w:bookmarkStart w:id="56" w:name="appendix-a-team-roles"/>
+    <w:bookmarkEnd w:id="56"/>
+    <w:bookmarkStart w:id="57" w:name="appendix-a-team-roles"/>
     <w:p>
       <w:pPr>
         <w:pStyle w:val="Heading1"/>
@@ -7142,8 +7550,8 @@
         </w:tc>
       </w:tr>
     </w:tbl>
-    <w:bookmarkEnd w:id="56"/>
-    <w:bookmarkStart w:id="57" w:name="appendix-b-reproducing-the-results"/>
+    <w:bookmarkEnd w:id="57"/>
+    <w:bookmarkStart w:id="58" w:name="appendix-b-reproducing-the-results"/>
     <w:p>
       <w:pPr>
         <w:pStyle w:val="Heading1"/>
@@ -7345,7 +7753,7 @@
         <w:t xml:space="preserve">.</w:t>
       </w:r>
     </w:p>
-    <w:bookmarkEnd w:id="57"/>
+    <w:bookmarkEnd w:id="58"/>
     <w:sectPr>
       <w:footnotePr>
         <w:numRestart w:val="eachSect"/>

</xml_diff>

<commit_message>
Add the play-time search and draw-penalty tests on the final model (#19)
- parallel_match: --simulations_a and --simulations_b give each side its
  own search budget
- Final model at 200 sims vs itself at 50: 0.525 (results/thinking_time/)
- Continuing with draws valued at -0.2 made it weaker: 0.474 at
  iteration 600 and 0.454 at 630 against iteration 560
  (results/draw_penalty/), so iteration 560 stays the final model
- Report (md and docx), results page and READMEs updated

Co-authored-by: Claude Opus 5.5 <noreply@anthropic.com>
</commit_message>
<xml_diff>
--- a/report/REPORT.docx
+++ b/report/REPORT.docx
@@ -142,7 +142,19 @@
         <w:t xml:space="preserve"> </w:t>
       </w:r>
       <w:r>
-        <w:t xml:space="preserve">128-filter network did not catch up in the time we had.</w:t>
+        <w:t xml:space="preserve">128-filter network did not catch up in the time we had. Two later tests, more</w:t>
+      </w:r>
+      <w:r>
+        <w:t xml:space="preserve"> </w:t>
+      </w:r>
+      <w:r>
+        <w:t xml:space="preserve">search per move when playing and counting draws as slightly bad in training,</w:t>
+      </w:r>
+      <w:r>
+        <w:t xml:space="preserve"> </w:t>
+      </w:r>
+      <w:r>
+        <w:t xml:space="preserve">gave a small gain and a loss of strength respectively.</w:t>
       </w:r>
     </w:p>
     <w:bookmarkEnd w:id="9"/>
@@ -2537,7 +2549,7 @@
     </w:p>
     <w:bookmarkEnd w:id="20"/>
     <w:bookmarkEnd w:id="21"/>
-    <w:bookmarkStart w:id="51" w:name="results"/>
+    <w:bookmarkStart w:id="52" w:name="results"/>
     <w:p>
       <w:pPr>
         <w:pStyle w:val="Heading1"/>
@@ -6269,13 +6281,337 @@
       </w:r>
     </w:p>
     <w:bookmarkEnd w:id="46"/>
-    <w:bookmarkStart w:id="50" w:name="X7e697f50ae1dd5e44c97332acfdfba23be11cde"/>
+    <w:bookmarkStart w:id="47" w:name="two-more-tests-on-the-final-model"/>
     <w:p>
       <w:pPr>
         <w:pStyle w:val="Heading2"/>
       </w:pPr>
       <w:r>
-        <w:t xml:space="preserve">6.11 Exploratory runs (outside the course constraints)</w:t>
+        <w:t xml:space="preserve">6.11 Two more tests on the final model</w:t>
+      </w:r>
+    </w:p>
+    <w:p>
+      <w:pPr>
+        <w:pStyle w:val="FirstParagraph"/>
+      </w:pPr>
+      <w:r>
+        <w:rPr>
+          <w:b/>
+          <w:bCs/>
+        </w:rPr>
+        <w:t xml:space="preserve">More search when playing.</w:t>
+      </w:r>
+      <w:r>
+        <w:t xml:space="preserve"> </w:t>
+      </w:r>
+      <w:r>
+        <w:t xml:space="preserve">The 30 to 50 simulation limit applies to</w:t>
+      </w:r>
+      <w:r>
+        <w:t xml:space="preserve"> </w:t>
+      </w:r>
+      <w:r>
+        <w:t xml:space="preserve">training, so we also measured the final model with more search at play time.</w:t>
+      </w:r>
+      <w:r>
+        <w:t xml:space="preserve"> </w:t>
+      </w:r>
+      <w:r>
+        <w:t xml:space="preserve">With 200 simulations per move against itself at 50 (100 games) it scored</w:t>
+      </w:r>
+      <w:r>
+        <w:t xml:space="preserve"> </w:t>
+      </w:r>
+      <w:r>
+        <w:t xml:space="preserve">9 wins, 4 losses and 86 draws (0.525 +/- 0.035). Four times the search gives</w:t>
+      </w:r>
+      <w:r>
+        <w:t xml:space="preserve"> </w:t>
+      </w:r>
+      <w:r>
+        <w:t xml:space="preserve">only a small edge, since the extra search does not help it finish games.</w:t>
+      </w:r>
+    </w:p>
+    <w:p>
+      <w:pPr>
+        <w:pStyle w:val="BodyText"/>
+      </w:pPr>
+      <w:r>
+        <w:rPr>
+          <w:b/>
+          <w:bCs/>
+        </w:rPr>
+        <w:t xml:space="preserve">Counting draws as slightly bad.</w:t>
+      </w:r>
+      <w:r>
+        <w:t xml:space="preserve"> </w:t>
+      </w:r>
+      <w:r>
+        <w:t xml:space="preserve">We continued the final model from</w:t>
+      </w:r>
+      <w:r>
+        <w:t xml:space="preserve"> </w:t>
+      </w:r>
+      <w:r>
+        <w:t xml:space="preserve">iteration 560 with a value target of -0.2 for both sides in every drawn or</w:t>
+      </w:r>
+      <w:r>
+        <w:t xml:space="preserve"> </w:t>
+      </w:r>
+      <w:r>
+        <w:t xml:space="preserve">unfinished self-play game, instead of 0, at learning rate 1e-4. It uses only</w:t>
+      </w:r>
+      <w:r>
+        <w:t xml:space="preserve"> </w:t>
+      </w:r>
+      <w:r>
+        <w:t xml:space="preserve">the game result, so it stays within the rules-only constraint. Decisive</w:t>
+      </w:r>
+      <w:r>
+        <w:t xml:space="preserve"> </w:t>
+      </w:r>
+      <w:r>
+        <w:t xml:space="preserve">self-play games rose from about 14% to about 19%, but play got weaker:</w:t>
+      </w:r>
+    </w:p>
+    <w:tbl>
+      <w:tblPr>
+        <w:tblStyle w:val="Table"/>
+        <w:tblW w:type="auto" w:w="0"/>
+        <w:tblLook w:firstRow="1" w:lastRow="0" w:firstColumn="0" w:lastColumn="0" w:noHBand="0" w:noVBand="0" w:val="0020"/>
+      </w:tblPr>
+      <w:tblGrid>
+        <w:gridCol w:w="1320"/>
+        <w:gridCol w:w="1320"/>
+        <w:gridCol w:w="1320"/>
+        <w:gridCol w:w="1320"/>
+        <w:gridCol w:w="1320"/>
+        <w:gridCol w:w="1320"/>
+      </w:tblGrid>
+      <w:tr>
+        <w:trPr>
+          <w:tblHeader w:val="on"/>
+        </w:trPr>
+        <w:tc>
+          <w:tcPr/>
+          <w:p>
+            <w:pPr>
+              <w:pStyle w:val="Compact"/>
+            </w:pPr>
+            <w:r>
+              <w:t xml:space="preserve">Match (100 games)</w:t>
+            </w:r>
+          </w:p>
+        </w:tc>
+        <w:tc>
+          <w:tcPr/>
+          <w:p>
+            <w:pPr>
+              <w:pStyle w:val="Compact"/>
+            </w:pPr>
+            <w:r>
+              <w:t xml:space="preserve">Wins</w:t>
+            </w:r>
+          </w:p>
+        </w:tc>
+        <w:tc>
+          <w:tcPr/>
+          <w:p>
+            <w:pPr>
+              <w:pStyle w:val="Compact"/>
+            </w:pPr>
+            <w:r>
+              <w:t xml:space="preserve">Losses</w:t>
+            </w:r>
+          </w:p>
+        </w:tc>
+        <w:tc>
+          <w:tcPr/>
+          <w:p>
+            <w:pPr>
+              <w:pStyle w:val="Compact"/>
+            </w:pPr>
+            <w:r>
+              <w:t xml:space="preserve">Draws</w:t>
+            </w:r>
+          </w:p>
+        </w:tc>
+        <w:tc>
+          <w:tcPr/>
+          <w:p>
+            <w:pPr>
+              <w:pStyle w:val="Compact"/>
+            </w:pPr>
+            <w:r>
+              <w:t xml:space="preserve">Unfinished</w:t>
+            </w:r>
+          </w:p>
+        </w:tc>
+        <w:tc>
+          <w:tcPr/>
+          <w:p>
+            <w:pPr>
+              <w:pStyle w:val="Compact"/>
+            </w:pPr>
+            <w:r>
+              <w:t xml:space="preserve">Score</w:t>
+            </w:r>
+          </w:p>
+        </w:tc>
+      </w:tr>
+      <w:tr>
+        <w:tc>
+          <w:tcPr/>
+          <w:p>
+            <w:pPr>
+              <w:pStyle w:val="Compact"/>
+            </w:pPr>
+            <w:r>
+              <w:t xml:space="preserve">iteration 600 vs final (560)</w:t>
+            </w:r>
+          </w:p>
+        </w:tc>
+        <w:tc>
+          <w:tcPr/>
+          <w:p>
+            <w:pPr>
+              <w:pStyle w:val="Compact"/>
+            </w:pPr>
+            <w:r>
+              <w:t xml:space="preserve">4</w:t>
+            </w:r>
+          </w:p>
+        </w:tc>
+        <w:tc>
+          <w:tcPr/>
+          <w:p>
+            <w:pPr>
+              <w:pStyle w:val="Compact"/>
+            </w:pPr>
+            <w:r>
+              <w:t xml:space="preserve">9</w:t>
+            </w:r>
+          </w:p>
+        </w:tc>
+        <w:tc>
+          <w:tcPr/>
+          <w:p>
+            <w:pPr>
+              <w:pStyle w:val="Compact"/>
+            </w:pPr>
+            <w:r>
+              <w:t xml:space="preserve">85</w:t>
+            </w:r>
+          </w:p>
+        </w:tc>
+        <w:tc>
+          <w:tcPr/>
+          <w:p>
+            <w:pPr>
+              <w:pStyle w:val="Compact"/>
+            </w:pPr>
+            <w:r>
+              <w:t xml:space="preserve">2</w:t>
+            </w:r>
+          </w:p>
+        </w:tc>
+        <w:tc>
+          <w:tcPr/>
+          <w:p>
+            <w:pPr>
+              <w:pStyle w:val="Compact"/>
+            </w:pPr>
+            <w:r>
+              <w:t xml:space="preserve">0.474 +/- 0.036</w:t>
+            </w:r>
+          </w:p>
+        </w:tc>
+      </w:tr>
+      <w:tr>
+        <w:tc>
+          <w:tcPr/>
+          <w:p>
+            <w:pPr>
+              <w:pStyle w:val="Compact"/>
+            </w:pPr>
+            <w:r>
+              <w:t xml:space="preserve">iteration 630 vs final (560)</w:t>
+            </w:r>
+          </w:p>
+        </w:tc>
+        <w:tc>
+          <w:tcPr/>
+          <w:p>
+            <w:pPr>
+              <w:pStyle w:val="Compact"/>
+            </w:pPr>
+            <w:r>
+              <w:t xml:space="preserve">0</w:t>
+            </w:r>
+          </w:p>
+        </w:tc>
+        <w:tc>
+          <w:tcPr/>
+          <w:p>
+            <w:pPr>
+              <w:pStyle w:val="Compact"/>
+            </w:pPr>
+            <w:r>
+              <w:t xml:space="preserve">9</w:t>
+            </w:r>
+          </w:p>
+        </w:tc>
+        <w:tc>
+          <w:tcPr/>
+          <w:p>
+            <w:pPr>
+              <w:pStyle w:val="Compact"/>
+            </w:pPr>
+            <w:r>
+              <w:t xml:space="preserve">89</w:t>
+            </w:r>
+          </w:p>
+        </w:tc>
+        <w:tc>
+          <w:tcPr/>
+          <w:p>
+            <w:pPr>
+              <w:pStyle w:val="Compact"/>
+            </w:pPr>
+            <w:r>
+              <w:t xml:space="preserve">2</w:t>
+            </w:r>
+          </w:p>
+        </w:tc>
+        <w:tc>
+          <w:tcPr/>
+          <w:p>
+            <w:pPr>
+              <w:pStyle w:val="Compact"/>
+            </w:pPr>
+            <w:r>
+              <w:t xml:space="preserve">0.454 +/- 0.029</w:t>
+            </w:r>
+          </w:p>
+        </w:tc>
+      </w:tr>
+    </w:tbl>
+    <w:p>
+      <w:pPr>
+        <w:pStyle w:val="BodyText"/>
+      </w:pPr>
+      <w:r>
+        <w:t xml:space="preserve">We stopped it at iteration 631 and kept iteration 560 as the final model.</w:t>
+      </w:r>
+    </w:p>
+    <w:bookmarkEnd w:id="47"/>
+    <w:bookmarkStart w:id="51" w:name="X7e697f50ae1dd5e44c97332acfdfba23be11cde"/>
+    <w:p>
+      <w:pPr>
+        <w:pStyle w:val="Heading2"/>
+      </w:pPr>
+      <w:r>
+        <w:t xml:space="preserve">6.12 Exploratory runs (outside the course constraints)</w:t>
       </w:r>
     </w:p>
     <w:p>
@@ -6381,18 +6717,18 @@
           <wp:inline>
             <wp:extent cx="5334000" cy="3394363"/>
             <wp:effectExtent b="0" l="0" r="0" t="0"/>
-            <wp:docPr descr="Exploratory runs: loss, decisive share and game length." title="" id="48" name="Picture"/>
+            <wp:docPr descr="Exploratory runs: loss, decisive share and game length." title="" id="49" name="Picture"/>
             <a:graphic>
               <a:graphicData uri="http://schemas.openxmlformats.org/drawingml/2006/picture">
                 <pic:pic>
                   <pic:nvPicPr>
-                    <pic:cNvPr descr="../results/training_curves_exploratory.png" id="49" name="Picture"/>
+                    <pic:cNvPr descr="../results/training_curves_exploratory.png" id="50" name="Picture"/>
                     <pic:cNvPicPr>
                       <a:picLocks noChangeArrowheads="1" noChangeAspect="1"/>
                     </pic:cNvPicPr>
                   </pic:nvPicPr>
                   <pic:blipFill>
-                    <a:blip r:embed="rId47"/>
+                    <a:blip r:embed="rId48"/>
                     <a:stretch>
                       <a:fillRect/>
                     </a:stretch>
@@ -6427,9 +6763,9 @@
         <w:t xml:space="preserve">Exploratory runs: loss, decisive share and game length.</w:t>
       </w:r>
     </w:p>
-    <w:bookmarkEnd w:id="50"/>
     <w:bookmarkEnd w:id="51"/>
-    <w:bookmarkStart w:id="52" w:name="discussion"/>
+    <w:bookmarkEnd w:id="52"/>
+    <w:bookmarkStart w:id="53" w:name="discussion"/>
     <w:p>
       <w:pPr>
         <w:pStyle w:val="Heading1"/>
@@ -6706,8 +7042,68 @@
         <w:t xml:space="preserve">beat for an agent that cannot yet force checkmate.</w:t>
       </w:r>
     </w:p>
-    <w:bookmarkEnd w:id="52"/>
-    <w:bookmarkStart w:id="53" w:name="limitations-and-future-work"/>
+    <w:p>
+      <w:pPr>
+        <w:pStyle w:val="BodyText"/>
+      </w:pPr>
+      <w:r>
+        <w:rPr>
+          <w:b/>
+          <w:bCs/>
+        </w:rPr>
+        <w:t xml:space="preserve">The limit of this setup.</w:t>
+      </w:r>
+      <w:r>
+        <w:t xml:space="preserve"> </w:t>
+      </w:r>
+      <w:r>
+        <w:t xml:space="preserve">The last tests point the same way. Lowering the</w:t>
+      </w:r>
+      <w:r>
+        <w:t xml:space="preserve"> </w:t>
+      </w:r>
+      <w:r>
+        <w:t xml:space="preserve">learning rate further gave only small steps (0.505 and 0.531 against the</w:t>
+      </w:r>
+      <w:r>
+        <w:t xml:space="preserve"> </w:t>
+      </w:r>
+      <w:r>
+        <w:t xml:space="preserve">previous checkpoint), four times more search at play time gave 0.525, and</w:t>
+      </w:r>
+      <w:r>
+        <w:t xml:space="preserve"> </w:t>
+      </w:r>
+      <w:r>
+        <w:t xml:space="preserve">penalizing draws made the agent play more decisive games against itself but</w:t>
+      </w:r>
+      <w:r>
+        <w:t xml:space="preserve"> </w:t>
+      </w:r>
+      <w:r>
+        <w:t xml:space="preserve">lose more against the final model (Section 6.11). Pushing for decisive results</w:t>
+      </w:r>
+      <w:r>
+        <w:t xml:space="preserve"> </w:t>
+      </w:r>
+      <w:r>
+        <w:t xml:space="preserve">without a better sense of which positions are won seems to lead to riskier,</w:t>
+      </w:r>
+      <w:r>
+        <w:t xml:space="preserve"> </w:t>
+      </w:r>
+      <w:r>
+        <w:t xml:space="preserve">worse play. Within the constraints and our compute, the 4 x 64 network at 50</w:t>
+      </w:r>
+      <w:r>
+        <w:t xml:space="preserve"> </w:t>
+      </w:r>
+      <w:r>
+        <w:t xml:space="preserve">simulations appears close to its limit.</w:t>
+      </w:r>
+    </w:p>
+    <w:bookmarkEnd w:id="53"/>
+    <w:bookmarkStart w:id="54" w:name="limitations-and-future-work"/>
     <w:p>
       <w:pPr>
         <w:pStyle w:val="Heading1"/>
@@ -6817,7 +7213,13 @@
         <w:t xml:space="preserve"> </w:t>
       </w:r>
       <w:r>
-        <w:t xml:space="preserve">shorter game cap during self-play, or resigning hopeless games.</w:t>
+        <w:t xml:space="preserve">shorter game cap during self-play, or resigning hopeless games. Simply</w:t>
+      </w:r>
+      <w:r>
+        <w:t xml:space="preserve"> </w:t>
+      </w:r>
+      <w:r>
+        <w:t xml:space="preserve">counting draws as slightly bad did not work (Section 6.11).</w:t>
       </w:r>
     </w:p>
     <w:p>
@@ -6844,8 +7246,8 @@
         <w:t xml:space="preserve">The larger network, given the days of compute it needs to catch up.</w:t>
       </w:r>
     </w:p>
-    <w:bookmarkEnd w:id="53"/>
-    <w:bookmarkStart w:id="54" w:name="conclusion"/>
+    <w:bookmarkEnd w:id="54"/>
+    <w:bookmarkStart w:id="55" w:name="conclusion"/>
     <w:p>
       <w:pPr>
         <w:pStyle w:val="Heading1"/>
@@ -6907,7 +7309,13 @@
         <w:t xml:space="preserve"> </w:t>
       </w:r>
       <w:r>
-        <w:t xml:space="preserve">advantage remains the open problem. The evaluation tools (a fixed benchmark</w:t>
+        <w:t xml:space="preserve">advantage remains the open problem: neither more search at play time nor</w:t>
+      </w:r>
+      <w:r>
+        <w:t xml:space="preserve"> </w:t>
+      </w:r>
+      <w:r>
+        <w:t xml:space="preserve">counting draws as bad in training solved it. The evaluation tools (a fixed benchmark</w:t>
       </w:r>
       <w:r>
         <w:t xml:space="preserve"> </w:t>
@@ -6922,8 +7330,8 @@
         <w:t xml:space="preserve">both the negative and the positive result measurable.</w:t>
       </w:r>
     </w:p>
-    <w:bookmarkEnd w:id="54"/>
-    <w:bookmarkStart w:id="55" w:name="references"/>
+    <w:bookmarkEnd w:id="55"/>
+    <w:bookmarkStart w:id="56" w:name="references"/>
     <w:p>
       <w:pPr>
         <w:pStyle w:val="Heading1"/>
@@ -6994,8 +7402,8 @@
         <w:t xml:space="preserve">, 550, 354-359.</w:t>
       </w:r>
     </w:p>
-    <w:bookmarkEnd w:id="55"/>
-    <w:bookmarkStart w:id="56" w:name="appendix-a-team-roles"/>
+    <w:bookmarkEnd w:id="56"/>
+    <w:bookmarkStart w:id="57" w:name="appendix-a-team-roles"/>
     <w:p>
       <w:pPr>
         <w:pStyle w:val="Heading1"/>
@@ -7142,8 +7550,8 @@
         </w:tc>
       </w:tr>
     </w:tbl>
-    <w:bookmarkEnd w:id="56"/>
-    <w:bookmarkStart w:id="57" w:name="appendix-b-reproducing-the-results"/>
+    <w:bookmarkEnd w:id="57"/>
+    <w:bookmarkStart w:id="58" w:name="appendix-b-reproducing-the-results"/>
     <w:p>
       <w:pPr>
         <w:pStyle w:val="Heading1"/>
@@ -7345,7 +7753,7 @@
         <w:t xml:space="preserve">.</w:t>
       </w:r>
     </w:p>
-    <w:bookmarkEnd w:id="57"/>
+    <w:bookmarkEnd w:id="58"/>
     <w:sectPr>
       <w:footnotePr>
         <w:numRestart w:val="eachSect"/>

</xml_diff>

<commit_message>
Add GPU self-play, the second bigger-network attempt and the resign check
- Batched self-play and matches on the GPU (--selfplay_device mps,
  --device mps): the search is a generator, so each worker runs many games
  side by side and evaluates their positions in one batch. Same games as
  before; about 2.2x faster for 4x64 and 2.4x for 6x128
- Faster search with the same moves: softmax on legal moves only, and
  children created when first visited
- Optional resignation in self-play (--resign_threshold) and
  evaluation/resign_check.py to measure how often it would be wrong
- Results: the 6x128 network, started from the final model's games,
  reached its level (0.495) but did not pass it; resigning would almost
  always have been wrong for the final model, so it was not used
- Report, results page and READMEs updated; 123 tests

Co-Authored-By: Claude Opus 5.5 <noreply@anthropic.com>
</commit_message>
<xml_diff>
--- a/report/REPORT.docx
+++ b/report/REPORT.docx
@@ -154,7 +154,37 @@
         <w:t xml:space="preserve"> </w:t>
       </w:r>
       <w:r>
-        <w:t xml:space="preserve">gave a small gain and a loss of strength respectively.</w:t>
+        <w:t xml:space="preserve">gave a small gain and a loss of strength respectively. After moving self-play</w:t>
+      </w:r>
+      <w:r>
+        <w:t xml:space="preserve"> </w:t>
+      </w:r>
+      <w:r>
+        <w:t xml:space="preserve">to the laptop’s GPU (about 2.2 to 2.4 times faster), a second attempt with the</w:t>
+      </w:r>
+      <w:r>
+        <w:t xml:space="preserve"> </w:t>
+      </w:r>
+      <w:r>
+        <w:t xml:space="preserve">larger network, started from the final model’s games, reached the final</w:t>
+      </w:r>
+      <w:r>
+        <w:t xml:space="preserve"> </w:t>
+      </w:r>
+      <w:r>
+        <w:t xml:space="preserve">model’s level but did not pass it. A measurement of the final model’s own</w:t>
+      </w:r>
+      <w:r>
+        <w:t xml:space="preserve"> </w:t>
+      </w:r>
+      <w:r>
+        <w:t xml:space="preserve">evaluations showed that resigning hopeless games cannot work yet: it does not</w:t>
+      </w:r>
+      <w:r>
+        <w:t xml:space="preserve"> </w:t>
+      </w:r>
+      <w:r>
+        <w:t xml:space="preserve">see a loss coming.</w:t>
       </w:r>
     </w:p>
     <w:bookmarkEnd w:id="9"/>
@@ -310,7 +340,13 @@
         <w:t xml:space="preserve"> </w:t>
       </w:r>
       <w:r>
-        <w:t xml:space="preserve">(Sections 5.3 and 6.6 to 6.10).</w:t>
+        <w:t xml:space="preserve">(Sections 5.3 and 6.6 to 6.10). Sections 6.11 to 6.13 test what else could</w:t>
+      </w:r>
+      <w:r>
+        <w:t xml:space="preserve"> </w:t>
+      </w:r>
+      <w:r>
+        <w:t xml:space="preserve">make it stronger.</w:t>
       </w:r>
     </w:p>
     <w:bookmarkEnd w:id="10"/>
@@ -1578,7 +1614,7 @@
         <w:pStyle w:val="BodyText"/>
       </w:pPr>
       <w:r>
-        <w:t xml:space="preserve">108 automated tests cover the rules (36 tests, including check, checkmate,</w:t>
+        <w:t xml:space="preserve">123 automated tests cover the rules (36 tests, including check, checkmate,</w:t>
       </w:r>
       <w:r>
         <w:t xml:space="preserve"> </w:t>
@@ -1602,7 +1638,13 @@
         <w:t xml:space="preserve"> </w:t>
       </w:r>
       <w:r>
-        <w:t xml:space="preserve">benchmark scoring and the evaluation tools. All runs are seeded and repeatable.</w:t>
+        <w:t xml:space="preserve">benchmark scoring, the evaluation tools and batched GPU self-play. All runs</w:t>
+      </w:r>
+      <w:r>
+        <w:t xml:space="preserve"> </w:t>
+      </w:r>
+      <w:r>
+        <w:t xml:space="preserve">are seeded and repeatable.</w:t>
       </w:r>
     </w:p>
     <w:p>
@@ -1776,6 +1818,78 @@
       </w:r>
       <w:r>
         <w:t xml:space="preserve">in the same order, same check and game results).</w:t>
+      </w:r>
+    </w:p>
+    <w:p>
+      <w:pPr>
+        <w:pStyle w:val="BodyText"/>
+      </w:pPr>
+      <w:r>
+        <w:rPr>
+          <w:b/>
+          <w:bCs/>
+        </w:rPr>
+        <w:t xml:space="preserve">Self-play on the GPU.</w:t>
+      </w:r>
+      <w:r>
+        <w:t xml:space="preserve"> </w:t>
+      </w:r>
+      <w:r>
+        <w:t xml:space="preserve">Later we moved the network evaluations of self-play</w:t>
+      </w:r>
+      <w:r>
+        <w:t xml:space="preserve"> </w:t>
+      </w:r>
+      <w:r>
+        <w:t xml:space="preserve">to the laptop’s GPU. The search is written as a generator that pauses</w:t>
+      </w:r>
+      <w:r>
+        <w:t xml:space="preserve"> </w:t>
+      </w:r>
+      <w:r>
+        <w:t xml:space="preserve">whenever it needs the network, so each worker can run many games side by</w:t>
+      </w:r>
+      <w:r>
+        <w:t xml:space="preserve"> </w:t>
+      </w:r>
+      <w:r>
+        <w:t xml:space="preserve">side and send all the positions they are waiting on to the GPU in one batch.</w:t>
+      </w:r>
+      <w:r>
+        <w:t xml:space="preserve"> </w:t>
+      </w:r>
+      <w:r>
+        <w:t xml:space="preserve">The moves do not change: on the CPU the batched games are exactly the games</w:t>
+      </w:r>
+      <w:r>
+        <w:t xml:space="preserve"> </w:t>
+      </w:r>
+      <w:r>
+        <w:t xml:space="preserve">played one at a time, which tests check. Two changes made the search itself</w:t>
+      </w:r>
+      <w:r>
+        <w:t xml:space="preserve"> </w:t>
+      </w:r>
+      <w:r>
+        <w:t xml:space="preserve">about 20% faster with the same moves: move probabilities are computed on the</w:t>
+      </w:r>
+      <w:r>
+        <w:t xml:space="preserve"> </w:t>
+      </w:r>
+      <w:r>
+        <w:t xml:space="preserve">legal moves only, and a node’s children are created when the search first</w:t>
+      </w:r>
+      <w:r>
+        <w:t xml:space="preserve"> </w:t>
+      </w:r>
+      <w:r>
+        <w:t xml:space="preserve">visits them. For 120 games of the 4 x 64 network, self-play went from 544 to</w:t>
+      </w:r>
+      <w:r>
+        <w:t xml:space="preserve"> </w:t>
+      </w:r>
+      <w:r>
+        <w:t xml:space="preserve">246 seconds; for 60 games of the 6 x 128 network, from 830 to 351 seconds.</w:t>
       </w:r>
     </w:p>
     <w:bookmarkEnd w:id="17"/>
@@ -2549,7 +2663,7 @@
     </w:p>
     <w:bookmarkEnd w:id="20"/>
     <w:bookmarkEnd w:id="21"/>
-    <w:bookmarkStart w:id="52" w:name="results"/>
+    <w:bookmarkStart w:id="54" w:name="results"/>
     <w:p>
       <w:pPr>
         <w:pStyle w:val="Heading1"/>
@@ -2563,7 +2677,13 @@
         <w:pStyle w:val="FirstParagraph"/>
       </w:pPr>
       <w:r>
-        <w:t xml:space="preserve">Sections 6.1 to 6.5 are the first runs; 6.6 to 6.10 are the long run.</w:t>
+        <w:t xml:space="preserve">Sections 6.1 to 6.5 are the first runs; 6.6 to 6.10 are the long run; 6.11</w:t>
+      </w:r>
+      <w:r>
+        <w:t xml:space="preserve"> </w:t>
+      </w:r>
+      <w:r>
+        <w:t xml:space="preserve">to 6.13 are later attempts to go further; 6.14 breaks the constraints.</w:t>
       </w:r>
     </w:p>
     <w:bookmarkStart w:id="25" w:name="learning-curves"/>
@@ -6271,13 +6391,7 @@
         <w:t xml:space="preserve"> </w:t>
       </w:r>
       <w:r>
-        <w:t xml:space="preserve">rate instead. With more compute it might overtake the smaller network; we</w:t>
-      </w:r>
-      <w:r>
-        <w:t xml:space="preserve"> </w:t>
-      </w:r>
-      <w:r>
-        <w:t xml:space="preserve">could not test that.</w:t>
+        <w:t xml:space="preserve">rate instead. Section 6.12 tries it again with faster self-play.</w:t>
       </w:r>
     </w:p>
     <w:bookmarkEnd w:id="46"/>
@@ -6605,13 +6719,783 @@
       </w:r>
     </w:p>
     <w:bookmarkEnd w:id="47"/>
-    <w:bookmarkStart w:id="51" w:name="X7e697f50ae1dd5e44c97332acfdfba23be11cde"/>
+    <w:bookmarkStart w:id="48" w:name="the-larger-network-second-attempt"/>
     <w:p>
       <w:pPr>
         <w:pStyle w:val="Heading2"/>
       </w:pPr>
       <w:r>
-        <w:t xml:space="preserve">6.12 Exploratory runs (outside the course constraints)</w:t>
+        <w:t xml:space="preserve">6.12 The larger network, second attempt</w:t>
+      </w:r>
+    </w:p>
+    <w:p>
+      <w:pPr>
+        <w:pStyle w:val="FirstParagraph"/>
+      </w:pPr>
+      <w:r>
+        <w:t xml:space="preserve">With GPU self-play an iteration of the 6 x 128 network takes about 10</w:t>
+      </w:r>
+      <w:r>
+        <w:t xml:space="preserve"> </w:t>
+      </w:r>
+      <w:r>
+        <w:t xml:space="preserve">minutes instead of 25 to 30. We trained it again, this time learning for 30</w:t>
+      </w:r>
+      <w:r>
+        <w:t xml:space="preserve"> </w:t>
+      </w:r>
+      <w:r>
+        <w:t xml:space="preserve">iterations from games played by the final model before playing its own.</w:t>
+      </w:r>
+    </w:p>
+    <w:tbl>
+      <w:tblPr>
+        <w:tblStyle w:val="Table"/>
+        <w:tblW w:type="pct" w:w="5000"/>
+        <w:tblLayout w:type="fixed"/>
+        <w:tblLook w:firstRow="1" w:lastRow="0" w:firstColumn="0" w:lastColumn="0" w:noHBand="0" w:noVBand="0" w:val="0020"/>
+      </w:tblPr>
+      <w:tblGrid>
+        <w:gridCol w:w="1320"/>
+        <w:gridCol w:w="1320"/>
+        <w:gridCol w:w="1320"/>
+        <w:gridCol w:w="1320"/>
+        <w:gridCol w:w="1320"/>
+        <w:gridCol w:w="1320"/>
+      </w:tblGrid>
+      <w:tr>
+        <w:trPr>
+          <w:tblHeader w:val="on"/>
+        </w:trPr>
+        <w:tc>
+          <w:tcPr/>
+          <w:p>
+            <w:pPr>
+              <w:pStyle w:val="Compact"/>
+            </w:pPr>
+            <w:r>
+              <w:t xml:space="preserve">Run</w:t>
+            </w:r>
+          </w:p>
+        </w:tc>
+        <w:tc>
+          <w:tcPr/>
+          <w:p>
+            <w:pPr>
+              <w:pStyle w:val="Compact"/>
+            </w:pPr>
+            <w:r>
+              <w:t xml:space="preserve">Iteration</w:t>
+            </w:r>
+          </w:p>
+        </w:tc>
+        <w:tc>
+          <w:tcPr/>
+          <w:p>
+            <w:pPr>
+              <w:pStyle w:val="Compact"/>
+            </w:pPr>
+            <w:r>
+              <w:t xml:space="preserve">Wins</w:t>
+            </w:r>
+          </w:p>
+        </w:tc>
+        <w:tc>
+          <w:tcPr/>
+          <w:p>
+            <w:pPr>
+              <w:pStyle w:val="Compact"/>
+            </w:pPr>
+            <w:r>
+              <w:t xml:space="preserve">Losses</w:t>
+            </w:r>
+          </w:p>
+        </w:tc>
+        <w:tc>
+          <w:tcPr/>
+          <w:p>
+            <w:pPr>
+              <w:pStyle w:val="Compact"/>
+            </w:pPr>
+            <w:r>
+              <w:t xml:space="preserve">Draws</w:t>
+            </w:r>
+          </w:p>
+        </w:tc>
+        <w:tc>
+          <w:tcPr/>
+          <w:p>
+            <w:pPr>
+              <w:pStyle w:val="Compact"/>
+            </w:pPr>
+            <w:r>
+              <w:t xml:space="preserve">Score vs final (560)</w:t>
+            </w:r>
+          </w:p>
+        </w:tc>
+      </w:tr>
+      <w:tr>
+        <w:tc>
+          <w:tcPr/>
+          <w:p>
+            <w:pPr>
+              <w:pStyle w:val="Compact"/>
+            </w:pPr>
+            <w:r>
+              <w:t xml:space="preserve">learning rate 1e-3</w:t>
+            </w:r>
+          </w:p>
+        </w:tc>
+        <w:tc>
+          <w:tcPr/>
+          <w:p>
+            <w:pPr>
+              <w:pStyle w:val="Compact"/>
+            </w:pPr>
+            <w:r>
+              <w:t xml:space="preserve">30 (end of learning from 560’s games)</w:t>
+            </w:r>
+          </w:p>
+        </w:tc>
+        <w:tc>
+          <w:tcPr/>
+          <w:p>
+            <w:pPr>
+              <w:pStyle w:val="Compact"/>
+            </w:pPr>
+            <w:r>
+              <w:t xml:space="preserve">5</w:t>
+            </w:r>
+          </w:p>
+        </w:tc>
+        <w:tc>
+          <w:tcPr/>
+          <w:p>
+            <w:pPr>
+              <w:pStyle w:val="Compact"/>
+            </w:pPr>
+            <w:r>
+              <w:t xml:space="preserve">6</w:t>
+            </w:r>
+          </w:p>
+        </w:tc>
+        <w:tc>
+          <w:tcPr/>
+          <w:p>
+            <w:pPr>
+              <w:pStyle w:val="Compact"/>
+            </w:pPr>
+            <w:r>
+              <w:t xml:space="preserve">89</w:t>
+            </w:r>
+          </w:p>
+        </w:tc>
+        <w:tc>
+          <w:tcPr/>
+          <w:p>
+            <w:pPr>
+              <w:pStyle w:val="Compact"/>
+            </w:pPr>
+            <w:r>
+              <w:t xml:space="preserve">0.495 +/- 0.032</w:t>
+            </w:r>
+          </w:p>
+        </w:tc>
+      </w:tr>
+      <w:tr>
+        <w:tc>
+          <w:tcPr/>
+          <w:p>
+            <w:pPr>
+              <w:pStyle w:val="Compact"/>
+            </w:pPr>
+            <w:r>
+              <w:t xml:space="preserve">learning rate 1e-3</w:t>
+            </w:r>
+          </w:p>
+        </w:tc>
+        <w:tc>
+          <w:tcPr/>
+          <w:p>
+            <w:pPr>
+              <w:pStyle w:val="Compact"/>
+            </w:pPr>
+            <w:r>
+              <w:t xml:space="preserve">60</w:t>
+            </w:r>
+          </w:p>
+        </w:tc>
+        <w:tc>
+          <w:tcPr/>
+          <w:p>
+            <w:pPr>
+              <w:pStyle w:val="Compact"/>
+            </w:pPr>
+            <w:r>
+              <w:t xml:space="preserve">2</w:t>
+            </w:r>
+          </w:p>
+        </w:tc>
+        <w:tc>
+          <w:tcPr/>
+          <w:p>
+            <w:pPr>
+              <w:pStyle w:val="Compact"/>
+            </w:pPr>
+            <w:r>
+              <w:t xml:space="preserve">13</w:t>
+            </w:r>
+          </w:p>
+        </w:tc>
+        <w:tc>
+          <w:tcPr/>
+          <w:p>
+            <w:pPr>
+              <w:pStyle w:val="Compact"/>
+            </w:pPr>
+            <w:r>
+              <w:t xml:space="preserve">82</w:t>
+            </w:r>
+          </w:p>
+        </w:tc>
+        <w:tc>
+          <w:tcPr/>
+          <w:p>
+            <w:pPr>
+              <w:pStyle w:val="Compact"/>
+            </w:pPr>
+            <w:r>
+              <w:t xml:space="preserve">0.443 +/- 0.037</w:t>
+            </w:r>
+          </w:p>
+        </w:tc>
+      </w:tr>
+      <w:tr>
+        <w:tc>
+          <w:tcPr/>
+          <w:p>
+            <w:pPr>
+              <w:pStyle w:val="Compact"/>
+            </w:pPr>
+            <w:r>
+              <w:t xml:space="preserve">learning rate 1e-3</w:t>
+            </w:r>
+          </w:p>
+        </w:tc>
+        <w:tc>
+          <w:tcPr/>
+          <w:p>
+            <w:pPr>
+              <w:pStyle w:val="Compact"/>
+            </w:pPr>
+            <w:r>
+              <w:t xml:space="preserve">120</w:t>
+            </w:r>
+          </w:p>
+        </w:tc>
+        <w:tc>
+          <w:tcPr/>
+          <w:p>
+            <w:pPr>
+              <w:pStyle w:val="Compact"/>
+            </w:pPr>
+            <w:r>
+              <w:t xml:space="preserve">1</w:t>
+            </w:r>
+          </w:p>
+        </w:tc>
+        <w:tc>
+          <w:tcPr/>
+          <w:p>
+            <w:pPr>
+              <w:pStyle w:val="Compact"/>
+            </w:pPr>
+            <w:r>
+              <w:t xml:space="preserve">16</w:t>
+            </w:r>
+          </w:p>
+        </w:tc>
+        <w:tc>
+          <w:tcPr/>
+          <w:p>
+            <w:pPr>
+              <w:pStyle w:val="Compact"/>
+            </w:pPr>
+            <w:r>
+              <w:t xml:space="preserve">80</w:t>
+            </w:r>
+          </w:p>
+        </w:tc>
+        <w:tc>
+          <w:tcPr/>
+          <w:p>
+            <w:pPr>
+              <w:pStyle w:val="Compact"/>
+            </w:pPr>
+            <w:r>
+              <w:t xml:space="preserve">0.423 +/- 0.039</w:t>
+            </w:r>
+          </w:p>
+        </w:tc>
+      </w:tr>
+      <w:tr>
+        <w:tc>
+          <w:tcPr/>
+          <w:p>
+            <w:pPr>
+              <w:pStyle w:val="Compact"/>
+            </w:pPr>
+            <w:r>
+              <w:t xml:space="preserve">learning rate 1e-4, from iteration 30</w:t>
+            </w:r>
+          </w:p>
+        </w:tc>
+        <w:tc>
+          <w:tcPr/>
+          <w:p>
+            <w:pPr>
+              <w:pStyle w:val="Compact"/>
+            </w:pPr>
+            <w:r>
+              <w:t xml:space="preserve">50</w:t>
+            </w:r>
+          </w:p>
+        </w:tc>
+        <w:tc>
+          <w:tcPr/>
+          <w:p>
+            <w:pPr>
+              <w:pStyle w:val="Compact"/>
+            </w:pPr>
+            <w:r>
+              <w:t xml:space="preserve">4</w:t>
+            </w:r>
+          </w:p>
+        </w:tc>
+        <w:tc>
+          <w:tcPr/>
+          <w:p>
+            <w:pPr>
+              <w:pStyle w:val="Compact"/>
+            </w:pPr>
+            <w:r>
+              <w:t xml:space="preserve">6</w:t>
+            </w:r>
+          </w:p>
+        </w:tc>
+        <w:tc>
+          <w:tcPr/>
+          <w:p>
+            <w:pPr>
+              <w:pStyle w:val="Compact"/>
+            </w:pPr>
+            <w:r>
+              <w:t xml:space="preserve">87</w:t>
+            </w:r>
+          </w:p>
+        </w:tc>
+        <w:tc>
+          <w:tcPr/>
+          <w:p>
+            <w:pPr>
+              <w:pStyle w:val="Compact"/>
+            </w:pPr>
+            <w:r>
+              <w:t xml:space="preserve">0.490 +/- 0.032</w:t>
+            </w:r>
+          </w:p>
+        </w:tc>
+      </w:tr>
+      <w:tr>
+        <w:tc>
+          <w:tcPr/>
+          <w:p>
+            <w:pPr>
+              <w:pStyle w:val="Compact"/>
+            </w:pPr>
+            <w:r>
+              <w:t xml:space="preserve">learning rate 1e-4, from iteration 30</w:t>
+            </w:r>
+          </w:p>
+        </w:tc>
+        <w:tc>
+          <w:tcPr/>
+          <w:p>
+            <w:pPr>
+              <w:pStyle w:val="Compact"/>
+            </w:pPr>
+            <w:r>
+              <w:t xml:space="preserve">70</w:t>
+            </w:r>
+          </w:p>
+        </w:tc>
+        <w:tc>
+          <w:tcPr/>
+          <w:p>
+            <w:pPr>
+              <w:pStyle w:val="Compact"/>
+            </w:pPr>
+            <w:r>
+              <w:t xml:space="preserve">6</w:t>
+            </w:r>
+          </w:p>
+        </w:tc>
+        <w:tc>
+          <w:tcPr/>
+          <w:p>
+            <w:pPr>
+              <w:pStyle w:val="Compact"/>
+            </w:pPr>
+            <w:r>
+              <w:t xml:space="preserve">7</w:t>
+            </w:r>
+          </w:p>
+        </w:tc>
+        <w:tc>
+          <w:tcPr/>
+          <w:p>
+            <w:pPr>
+              <w:pStyle w:val="Compact"/>
+            </w:pPr>
+            <w:r>
+              <w:t xml:space="preserve">86</w:t>
+            </w:r>
+          </w:p>
+        </w:tc>
+        <w:tc>
+          <w:tcPr/>
+          <w:p>
+            <w:pPr>
+              <w:pStyle w:val="Compact"/>
+            </w:pPr>
+            <w:r>
+              <w:t xml:space="preserve">0.495 +/- 0.036</w:t>
+            </w:r>
+          </w:p>
+        </w:tc>
+      </w:tr>
+    </w:tbl>
+    <w:p>
+      <w:pPr>
+        <w:pStyle w:val="BodyText"/>
+      </w:pPr>
+      <w:r>
+        <w:t xml:space="preserve">Learning from the final model’s games made the larger network as strong as</w:t>
+      </w:r>
+      <w:r>
+        <w:t xml:space="preserve"> </w:t>
+      </w:r>
+      <w:r>
+        <w:t xml:space="preserve">the final model. On its own games at 1e-3 it got steadily weaker; at 1e-4 it</w:t>
+      </w:r>
+      <w:r>
+        <w:t xml:space="preserve"> </w:t>
+      </w:r>
+      <w:r>
+        <w:t xml:space="preserve">stayed level but did not get stronger, and we stopped it at iteration 90.</w:t>
+      </w:r>
+    </w:p>
+    <w:bookmarkEnd w:id="48"/>
+    <w:bookmarkStart w:id="49" w:name="can-hopeless-games-end-early"/>
+    <w:p>
+      <w:pPr>
+        <w:pStyle w:val="Heading2"/>
+      </w:pPr>
+      <w:r>
+        <w:t xml:space="preserve">6.13 Can hopeless games end early?</w:t>
+      </w:r>
+    </w:p>
+    <w:p>
+      <w:pPr>
+        <w:pStyle w:val="FirstParagraph"/>
+      </w:pPr>
+      <w:r>
+        <w:t xml:space="preserve">AlphaZero resigns a game when the search rates the position as clearly lost,</w:t>
+      </w:r>
+      <w:r>
+        <w:t xml:space="preserve"> </w:t>
+      </w:r>
+      <w:r>
+        <w:t xml:space="preserve">so lost games give a real result instead of a long draw. Before training with</w:t>
+      </w:r>
+      <w:r>
+        <w:t xml:space="preserve"> </w:t>
+      </w:r>
+      <w:r>
+        <w:t xml:space="preserve">it, we recorded the final model’s evaluation of every position in 160</w:t>
+      </w:r>
+      <w:r>
+        <w:t xml:space="preserve"> </w:t>
+      </w:r>
+      <w:r>
+        <w:t xml:space="preserve">self-play games and counted, for each threshold, how often a resignation</w:t>
+      </w:r>
+      <w:r>
+        <w:t xml:space="preserve"> </w:t>
+      </w:r>
+      <w:r>
+        <w:t xml:space="preserve">would have been wrong (the side did not go on to lose):</w:t>
+      </w:r>
+    </w:p>
+    <w:tbl>
+      <w:tblPr>
+        <w:tblStyle w:val="Table"/>
+        <w:tblW w:type="auto" w:w="0"/>
+        <w:tblLook w:firstRow="1" w:lastRow="0" w:firstColumn="0" w:lastColumn="0" w:noHBand="0" w:noVBand="0" w:val="0020"/>
+      </w:tblPr>
+      <w:tblGrid>
+        <w:gridCol w:w="2640"/>
+        <w:gridCol w:w="2640"/>
+        <w:gridCol w:w="2640"/>
+      </w:tblGrid>
+      <w:tr>
+        <w:trPr>
+          <w:tblHeader w:val="on"/>
+        </w:trPr>
+        <w:tc>
+          <w:tcPr/>
+          <w:p>
+            <w:pPr>
+              <w:pStyle w:val="Compact"/>
+            </w:pPr>
+            <w:r>
+              <w:t xml:space="preserve">Resign when below (2 moves in a row)</w:t>
+            </w:r>
+          </w:p>
+        </w:tc>
+        <w:tc>
+          <w:tcPr/>
+          <w:p>
+            <w:pPr>
+              <w:pStyle w:val="Compact"/>
+            </w:pPr>
+            <w:r>
+              <w:t xml:space="preserve">Would resign</w:t>
+            </w:r>
+          </w:p>
+        </w:tc>
+        <w:tc>
+          <w:tcPr/>
+          <w:p>
+            <w:pPr>
+              <w:pStyle w:val="Compact"/>
+            </w:pPr>
+            <w:r>
+              <w:t xml:space="preserve">Wrong</w:t>
+            </w:r>
+          </w:p>
+        </w:tc>
+      </w:tr>
+      <w:tr>
+        <w:tc>
+          <w:tcPr/>
+          <w:p>
+            <w:pPr>
+              <w:pStyle w:val="Compact"/>
+            </w:pPr>
+            <w:r>
+              <w:t xml:space="preserve">-0.3</w:t>
+            </w:r>
+          </w:p>
+        </w:tc>
+        <w:tc>
+          <w:tcPr/>
+          <w:p>
+            <w:pPr>
+              <w:pStyle w:val="Compact"/>
+            </w:pPr>
+            <w:r>
+              <w:t xml:space="preserve">34</w:t>
+            </w:r>
+          </w:p>
+        </w:tc>
+        <w:tc>
+          <w:tcPr/>
+          <w:p>
+            <w:pPr>
+              <w:pStyle w:val="Compact"/>
+            </w:pPr>
+            <w:r>
+              <w:t xml:space="preserve">32</w:t>
+            </w:r>
+          </w:p>
+        </w:tc>
+      </w:tr>
+      <w:tr>
+        <w:tc>
+          <w:tcPr/>
+          <w:p>
+            <w:pPr>
+              <w:pStyle w:val="Compact"/>
+            </w:pPr>
+            <w:r>
+              <w:t xml:space="preserve">-0.4</w:t>
+            </w:r>
+          </w:p>
+        </w:tc>
+        <w:tc>
+          <w:tcPr/>
+          <w:p>
+            <w:pPr>
+              <w:pStyle w:val="Compact"/>
+            </w:pPr>
+            <w:r>
+              <w:t xml:space="preserve">16</w:t>
+            </w:r>
+          </w:p>
+        </w:tc>
+        <w:tc>
+          <w:tcPr/>
+          <w:p>
+            <w:pPr>
+              <w:pStyle w:val="Compact"/>
+            </w:pPr>
+            <w:r>
+              <w:t xml:space="preserve">14</w:t>
+            </w:r>
+          </w:p>
+        </w:tc>
+      </w:tr>
+      <w:tr>
+        <w:tc>
+          <w:tcPr/>
+          <w:p>
+            <w:pPr>
+              <w:pStyle w:val="Compact"/>
+            </w:pPr>
+            <w:r>
+              <w:t xml:space="preserve">-0.5</w:t>
+            </w:r>
+          </w:p>
+        </w:tc>
+        <w:tc>
+          <w:tcPr/>
+          <w:p>
+            <w:pPr>
+              <w:pStyle w:val="Compact"/>
+            </w:pPr>
+            <w:r>
+              <w:t xml:space="preserve">7</w:t>
+            </w:r>
+          </w:p>
+        </w:tc>
+        <w:tc>
+          <w:tcPr/>
+          <w:p>
+            <w:pPr>
+              <w:pStyle w:val="Compact"/>
+            </w:pPr>
+            <w:r>
+              <w:t xml:space="preserve">6</w:t>
+            </w:r>
+          </w:p>
+        </w:tc>
+      </w:tr>
+      <w:tr>
+        <w:tc>
+          <w:tcPr/>
+          <w:p>
+            <w:pPr>
+              <w:pStyle w:val="Compact"/>
+            </w:pPr>
+            <w:r>
+              <w:t xml:space="preserve">-0.6</w:t>
+            </w:r>
+          </w:p>
+        </w:tc>
+        <w:tc>
+          <w:tcPr/>
+          <w:p>
+            <w:pPr>
+              <w:pStyle w:val="Compact"/>
+            </w:pPr>
+            <w:r>
+              <w:t xml:space="preserve">2</w:t>
+            </w:r>
+          </w:p>
+        </w:tc>
+        <w:tc>
+          <w:tcPr/>
+          <w:p>
+            <w:pPr>
+              <w:pStyle w:val="Compact"/>
+            </w:pPr>
+            <w:r>
+              <w:t xml:space="preserve">2</w:t>
+            </w:r>
+          </w:p>
+        </w:tc>
+      </w:tr>
+      <w:tr>
+        <w:tc>
+          <w:tcPr/>
+          <w:p>
+            <w:pPr>
+              <w:pStyle w:val="Compact"/>
+            </w:pPr>
+            <w:r>
+              <w:t xml:space="preserve">-0.8</w:t>
+            </w:r>
+          </w:p>
+        </w:tc>
+        <w:tc>
+          <w:tcPr/>
+          <w:p>
+            <w:pPr>
+              <w:pStyle w:val="Compact"/>
+            </w:pPr>
+            <w:r>
+              <w:t xml:space="preserve">0</w:t>
+            </w:r>
+          </w:p>
+        </w:tc>
+        <w:tc>
+          <w:tcPr/>
+          <w:p>
+            <w:pPr>
+              <w:pStyle w:val="Compact"/>
+            </w:pPr>
+            <w:r>
+              <w:t xml:space="preserve">0</w:t>
+            </w:r>
+          </w:p>
+        </w:tc>
+      </w:tr>
+    </w:tbl>
+    <w:p>
+      <w:pPr>
+        <w:pStyle w:val="BodyText"/>
+      </w:pPr>
+      <w:r>
+        <w:t xml:space="preserve">Nearly every resignation would have been in a game that ended in a draw. The</w:t>
+      </w:r>
+      <w:r>
+        <w:t xml:space="preserve"> </w:t>
+      </w:r>
+      <w:r>
+        <w:t xml:space="preserve">21 decisive games were mostly short (11 to 250 plies), and the losing side’s</w:t>
+      </w:r>
+      <w:r>
+        <w:t xml:space="preserve"> </w:t>
+      </w:r>
+      <w:r>
+        <w:t xml:space="preserve">evaluation stayed near 0 until just before the mate. Resigning would have</w:t>
+      </w:r>
+      <w:r>
+        <w:t xml:space="preserve"> </w:t>
+      </w:r>
+      <w:r>
+        <w:t xml:space="preserve">turned draws into wrong losses, so we did not train with it.</w:t>
+      </w:r>
+    </w:p>
+    <w:bookmarkEnd w:id="49"/>
+    <w:bookmarkStart w:id="53" w:name="X7e697f50ae1dd5e44c97332acfdfba23be11cde"/>
+    <w:p>
+      <w:pPr>
+        <w:pStyle w:val="Heading2"/>
+      </w:pPr>
+      <w:r>
+        <w:t xml:space="preserve">6.14 Exploratory runs (outside the course constraints)</w:t>
       </w:r>
     </w:p>
     <w:p>
@@ -6717,18 +7601,18 @@
           <wp:inline>
             <wp:extent cx="5334000" cy="3394363"/>
             <wp:effectExtent b="0" l="0" r="0" t="0"/>
-            <wp:docPr descr="Exploratory runs: loss, decisive share and game length." title="" id="49" name="Picture"/>
+            <wp:docPr descr="Exploratory runs: loss, decisive share and game length." title="" id="51" name="Picture"/>
             <a:graphic>
               <a:graphicData uri="http://schemas.openxmlformats.org/drawingml/2006/picture">
                 <pic:pic>
                   <pic:nvPicPr>
-                    <pic:cNvPr descr="../results/training_curves_exploratory.png" id="50" name="Picture"/>
+                    <pic:cNvPr descr="../results/training_curves_exploratory.png" id="52" name="Picture"/>
                     <pic:cNvPicPr>
                       <a:picLocks noChangeArrowheads="1" noChangeAspect="1"/>
                     </pic:cNvPicPr>
                   </pic:nvPicPr>
                   <pic:blipFill>
-                    <a:blip r:embed="rId48"/>
+                    <a:blip r:embed="rId50"/>
                     <a:stretch>
                       <a:fillRect/>
                     </a:stretch>
@@ -6763,9 +7647,9 @@
         <w:t xml:space="preserve">Exploratory runs: loss, decisive share and game length.</w:t>
       </w:r>
     </w:p>
-    <w:bookmarkEnd w:id="51"/>
-    <w:bookmarkEnd w:id="52"/>
-    <w:bookmarkStart w:id="53" w:name="discussion"/>
+    <w:bookmarkEnd w:id="53"/>
+    <w:bookmarkEnd w:id="54"/>
+    <w:bookmarkStart w:id="55" w:name="discussion"/>
     <w:p>
       <w:pPr>
         <w:pStyle w:val="Heading1"/>
@@ -7102,8 +7986,74 @@
         <w:t xml:space="preserve">simulations appears close to its limit.</w:t>
       </w:r>
     </w:p>
-    <w:bookmarkEnd w:id="53"/>
-    <w:bookmarkStart w:id="54" w:name="limitations-and-future-work"/>
+    <w:p>
+      <w:pPr>
+        <w:pStyle w:val="BodyText"/>
+      </w:pPr>
+      <w:r>
+        <w:rPr>
+          <w:b/>
+          <w:bCs/>
+        </w:rPr>
+        <w:t xml:space="preserve">Size and what the value head knows.</w:t>
+      </w:r>
+      <w:r>
+        <w:t xml:space="preserve"> </w:t>
+      </w:r>
+      <w:r>
+        <w:t xml:space="preserve">The larger network learned to play as</w:t>
+      </w:r>
+      <w:r>
+        <w:t xml:space="preserve"> </w:t>
+      </w:r>
+      <w:r>
+        <w:t xml:space="preserve">well as the final model from its games, but its own games did not take it</w:t>
+      </w:r>
+      <w:r>
+        <w:t xml:space="preserve"> </w:t>
+      </w:r>
+      <w:r>
+        <w:t xml:space="preserve">further, so network size is not what holds the agent back. The resignation</w:t>
+      </w:r>
+      <w:r>
+        <w:t xml:space="preserve"> </w:t>
+      </w:r>
+      <w:r>
+        <w:t xml:space="preserve">measurement (Section 6.13) shows what does: the value head does not know when</w:t>
+      </w:r>
+      <w:r>
+        <w:t xml:space="preserve"> </w:t>
+      </w:r>
+      <w:r>
+        <w:t xml:space="preserve">a position is won or lost. Decisive games come from sudden mistakes that the</w:t>
+      </w:r>
+      <w:r>
+        <w:t xml:space="preserve"> </w:t>
+      </w:r>
+      <w:r>
+        <w:t xml:space="preserve">search punishes, not from advantages built up and converted, and the losing</w:t>
+      </w:r>
+      <w:r>
+        <w:t xml:space="preserve"> </w:t>
+      </w:r>
+      <w:r>
+        <w:t xml:space="preserve">side does not see its loss coming. With about 85% of self-play games drawn,</w:t>
+      </w:r>
+      <w:r>
+        <w:t xml:space="preserve"> </w:t>
+      </w:r>
+      <w:r>
+        <w:t xml:space="preserve">the value head gets too few clear results to learn from, and that is the</w:t>
+      </w:r>
+      <w:r>
+        <w:t xml:space="preserve"> </w:t>
+      </w:r>
+      <w:r>
+        <w:t xml:space="preserve">problem every change we tried ran into.</w:t>
+      </w:r>
+    </w:p>
+    <w:bookmarkEnd w:id="55"/>
+    <w:bookmarkStart w:id="56" w:name="limitations-and-future-work"/>
     <w:p>
       <w:pPr>
         <w:pStyle w:val="Heading1"/>
@@ -7181,13 +8131,13 @@
         </w:numPr>
       </w:pPr>
       <w:r>
-        <w:t xml:space="preserve">Compute was the main limit: even after the speed-up, one iteration of 100</w:t>
-      </w:r>
-      <w:r>
-        <w:t xml:space="preserve"> </w:t>
-      </w:r>
-      <w:r>
-        <w:t xml:space="preserve">games takes about 9 minutes, and the larger network about 25 to 30.</w:t>
+        <w:t xml:space="preserve">Compute was the main limit: even with GPU self-play, one iteration of 100</w:t>
+      </w:r>
+      <w:r>
+        <w:t xml:space="preserve"> </w:t>
+      </w:r>
+      <w:r>
+        <w:t xml:space="preserve">games takes about 4 minutes, and the larger network about 10.</w:t>
       </w:r>
     </w:p>
     <w:p>
@@ -7207,19 +8157,25 @@
         </w:numPr>
       </w:pPr>
       <w:r>
-        <w:t xml:space="preserve">A way for results to reach the value head more often, within the rules: a</w:t>
-      </w:r>
-      <w:r>
-        <w:t xml:space="preserve"> </w:t>
-      </w:r>
-      <w:r>
-        <w:t xml:space="preserve">shorter game cap during self-play, or resigning hopeless games. Simply</w:t>
-      </w:r>
-      <w:r>
-        <w:t xml:space="preserve"> </w:t>
-      </w:r>
-      <w:r>
-        <w:t xml:space="preserve">counting draws as slightly bad did not work (Section 6.11).</w:t>
+        <w:t xml:space="preserve">A way for results to reach the value head more often, within the rules,</w:t>
+      </w:r>
+      <w:r>
+        <w:t xml:space="preserve"> </w:t>
+      </w:r>
+      <w:r>
+        <w:t xml:space="preserve">for example a shorter game cap during self-play. Counting draws as</w:t>
+      </w:r>
+      <w:r>
+        <w:t xml:space="preserve"> </w:t>
+      </w:r>
+      <w:r>
+        <w:t xml:space="preserve">slightly bad did not work (Section 6.11), and resigning needs a value head</w:t>
+      </w:r>
+      <w:r>
+        <w:t xml:space="preserve"> </w:t>
+      </w:r>
+      <w:r>
+        <w:t xml:space="preserve">that already recognizes lost positions (Section 6.13).</w:t>
       </w:r>
     </w:p>
     <w:p>
@@ -7231,23 +8187,23 @@
         </w:numPr>
       </w:pPr>
       <w:r>
-        <w:t xml:space="preserve">Even longer training, with a lower learning rate earlier in the run.</w:t>
-      </w:r>
-    </w:p>
-    <w:p>
-      <w:pPr>
-        <w:pStyle w:val="Compact"/>
-        <w:numPr>
-          <w:ilvl w:val="0"/>
-          <w:numId w:val="1008"/>
-        </w:numPr>
-      </w:pPr>
-      <w:r>
-        <w:t xml:space="preserve">The larger network, given the days of compute it needs to catch up.</w:t>
-      </w:r>
-    </w:p>
-    <w:bookmarkEnd w:id="54"/>
-    <w:bookmarkStart w:id="55" w:name="conclusion"/>
+        <w:t xml:space="preserve">Far more self-play games with the larger network, which can start from the</w:t>
+      </w:r>
+      <w:r>
+        <w:t xml:space="preserve"> </w:t>
+      </w:r>
+      <w:r>
+        <w:t xml:space="preserve">final model’s level (Section 6.12) but needs many more games than we could</w:t>
+      </w:r>
+      <w:r>
+        <w:t xml:space="preserve"> </w:t>
+      </w:r>
+      <w:r>
+        <w:t xml:space="preserve">play to improve on it.</w:t>
+      </w:r>
+    </w:p>
+    <w:bookmarkEnd w:id="56"/>
+    <w:bookmarkStart w:id="57" w:name="conclusion"/>
     <w:p>
       <w:pPr>
         <w:pStyle w:val="Heading1"/>
@@ -7267,7 +8223,7 @@
         <w:t xml:space="preserve"> </w:t>
       </w:r>
       <w:r>
-        <w:t xml:space="preserve">course constraints and verified it with 108 tests. With 400 self-play games per</w:t>
+        <w:t xml:space="preserve">course constraints and verified it with 123 tests. With 400 self-play games per</w:t>
       </w:r>
       <w:r>
         <w:t xml:space="preserve"> </w:t>
@@ -7309,13 +8265,25 @@
         <w:t xml:space="preserve"> </w:t>
       </w:r>
       <w:r>
-        <w:t xml:space="preserve">advantage remains the open problem: neither more search at play time nor</w:t>
-      </w:r>
-      <w:r>
-        <w:t xml:space="preserve"> </w:t>
-      </w:r>
-      <w:r>
-        <w:t xml:space="preserve">counting draws as bad in training solved it. The evaluation tools (a fixed benchmark</w:t>
+        <w:t xml:space="preserve">advantage remains the open problem: neither more search at play time,</w:t>
+      </w:r>
+      <w:r>
+        <w:t xml:space="preserve"> </w:t>
+      </w:r>
+      <w:r>
+        <w:t xml:space="preserve">counting draws as bad in training, nor a larger network solved it, and the</w:t>
+      </w:r>
+      <w:r>
+        <w:t xml:space="preserve"> </w:t>
+      </w:r>
+      <w:r>
+        <w:t xml:space="preserve">model’s own evaluations show why: it does not yet recognize won or lost</w:t>
+      </w:r>
+      <w:r>
+        <w:t xml:space="preserve"> </w:t>
+      </w:r>
+      <w:r>
+        <w:t xml:space="preserve">positions until the end is near. The evaluation tools (a fixed benchmark</w:t>
       </w:r>
       <w:r>
         <w:t xml:space="preserve"> </w:t>
@@ -7330,8 +8298,8 @@
         <w:t xml:space="preserve">both the negative and the positive result measurable.</w:t>
       </w:r>
     </w:p>
-    <w:bookmarkEnd w:id="55"/>
-    <w:bookmarkStart w:id="56" w:name="references"/>
+    <w:bookmarkEnd w:id="57"/>
+    <w:bookmarkStart w:id="58" w:name="references"/>
     <w:p>
       <w:pPr>
         <w:pStyle w:val="Heading1"/>
@@ -7402,8 +8370,8 @@
         <w:t xml:space="preserve">, 550, 354-359.</w:t>
       </w:r>
     </w:p>
-    <w:bookmarkEnd w:id="56"/>
-    <w:bookmarkStart w:id="57" w:name="appendix-a-team-roles"/>
+    <w:bookmarkEnd w:id="58"/>
+    <w:bookmarkStart w:id="59" w:name="appendix-a-team-roles"/>
     <w:p>
       <w:pPr>
         <w:pStyle w:val="Heading1"/>
@@ -7550,8 +8518,8 @@
         </w:tc>
       </w:tr>
     </w:tbl>
-    <w:bookmarkEnd w:id="57"/>
-    <w:bookmarkStart w:id="58" w:name="appendix-b-reproducing-the-results"/>
+    <w:bookmarkEnd w:id="59"/>
+    <w:bookmarkStart w:id="60" w:name="appendix-b-reproducing-the-results"/>
     <w:p>
       <w:pPr>
         <w:pStyle w:val="Heading1"/>
@@ -7753,7 +8721,7 @@
         <w:t xml:space="preserve">.</w:t>
       </w:r>
     </w:p>
-    <w:bookmarkEnd w:id="58"/>
+    <w:bookmarkEnd w:id="60"/>
     <w:sectPr>
       <w:footnotePr>
         <w:numRestart w:val="eachSect"/>

</xml_diff>

<commit_message>
Add GPU self-play, the second bigger-network attempt and the resign check (#20)
- Batched self-play and matches on the GPU (--selfplay_device mps,
  --device mps): the search is a generator, so each worker runs many games
  side by side and evaluates their positions in one batch. Same games as
  before; about 2.2x faster for 4x64 and 2.4x for 6x128
- Faster search with the same moves: softmax on legal moves only, and
  children created when first visited
- Optional resignation in self-play (--resign_threshold) and
  evaluation/resign_check.py to measure how often it would be wrong
- Results: the 6x128 network, started from the final model's games,
  reached its level (0.495) but did not pass it; resigning would almost
  always have been wrong for the final model, so it was not used
- Report, results page and READMEs updated; 123 tests

Co-authored-by: Claude Opus 5.5 <noreply@anthropic.com>
</commit_message>
<xml_diff>
--- a/report/REPORT.docx
+++ b/report/REPORT.docx
@@ -154,7 +154,37 @@
         <w:t xml:space="preserve"> </w:t>
       </w:r>
       <w:r>
-        <w:t xml:space="preserve">gave a small gain and a loss of strength respectively.</w:t>
+        <w:t xml:space="preserve">gave a small gain and a loss of strength respectively. After moving self-play</w:t>
+      </w:r>
+      <w:r>
+        <w:t xml:space="preserve"> </w:t>
+      </w:r>
+      <w:r>
+        <w:t xml:space="preserve">to the laptop’s GPU (about 2.2 to 2.4 times faster), a second attempt with the</w:t>
+      </w:r>
+      <w:r>
+        <w:t xml:space="preserve"> </w:t>
+      </w:r>
+      <w:r>
+        <w:t xml:space="preserve">larger network, started from the final model’s games, reached the final</w:t>
+      </w:r>
+      <w:r>
+        <w:t xml:space="preserve"> </w:t>
+      </w:r>
+      <w:r>
+        <w:t xml:space="preserve">model’s level but did not pass it. A measurement of the final model’s own</w:t>
+      </w:r>
+      <w:r>
+        <w:t xml:space="preserve"> </w:t>
+      </w:r>
+      <w:r>
+        <w:t xml:space="preserve">evaluations showed that resigning hopeless games cannot work yet: it does not</w:t>
+      </w:r>
+      <w:r>
+        <w:t xml:space="preserve"> </w:t>
+      </w:r>
+      <w:r>
+        <w:t xml:space="preserve">see a loss coming.</w:t>
       </w:r>
     </w:p>
     <w:bookmarkEnd w:id="9"/>
@@ -310,7 +340,13 @@
         <w:t xml:space="preserve"> </w:t>
       </w:r>
       <w:r>
-        <w:t xml:space="preserve">(Sections 5.3 and 6.6 to 6.10).</w:t>
+        <w:t xml:space="preserve">(Sections 5.3 and 6.6 to 6.10). Sections 6.11 to 6.13 test what else could</w:t>
+      </w:r>
+      <w:r>
+        <w:t xml:space="preserve"> </w:t>
+      </w:r>
+      <w:r>
+        <w:t xml:space="preserve">make it stronger.</w:t>
       </w:r>
     </w:p>
     <w:bookmarkEnd w:id="10"/>
@@ -1578,7 +1614,7 @@
         <w:pStyle w:val="BodyText"/>
       </w:pPr>
       <w:r>
-        <w:t xml:space="preserve">108 automated tests cover the rules (36 tests, including check, checkmate,</w:t>
+        <w:t xml:space="preserve">123 automated tests cover the rules (36 tests, including check, checkmate,</w:t>
       </w:r>
       <w:r>
         <w:t xml:space="preserve"> </w:t>
@@ -1602,7 +1638,13 @@
         <w:t xml:space="preserve"> </w:t>
       </w:r>
       <w:r>
-        <w:t xml:space="preserve">benchmark scoring and the evaluation tools. All runs are seeded and repeatable.</w:t>
+        <w:t xml:space="preserve">benchmark scoring, the evaluation tools and batched GPU self-play. All runs</w:t>
+      </w:r>
+      <w:r>
+        <w:t xml:space="preserve"> </w:t>
+      </w:r>
+      <w:r>
+        <w:t xml:space="preserve">are seeded and repeatable.</w:t>
       </w:r>
     </w:p>
     <w:p>
@@ -1776,6 +1818,78 @@
       </w:r>
       <w:r>
         <w:t xml:space="preserve">in the same order, same check and game results).</w:t>
+      </w:r>
+    </w:p>
+    <w:p>
+      <w:pPr>
+        <w:pStyle w:val="BodyText"/>
+      </w:pPr>
+      <w:r>
+        <w:rPr>
+          <w:b/>
+          <w:bCs/>
+        </w:rPr>
+        <w:t xml:space="preserve">Self-play on the GPU.</w:t>
+      </w:r>
+      <w:r>
+        <w:t xml:space="preserve"> </w:t>
+      </w:r>
+      <w:r>
+        <w:t xml:space="preserve">Later we moved the network evaluations of self-play</w:t>
+      </w:r>
+      <w:r>
+        <w:t xml:space="preserve"> </w:t>
+      </w:r>
+      <w:r>
+        <w:t xml:space="preserve">to the laptop’s GPU. The search is written as a generator that pauses</w:t>
+      </w:r>
+      <w:r>
+        <w:t xml:space="preserve"> </w:t>
+      </w:r>
+      <w:r>
+        <w:t xml:space="preserve">whenever it needs the network, so each worker can run many games side by</w:t>
+      </w:r>
+      <w:r>
+        <w:t xml:space="preserve"> </w:t>
+      </w:r>
+      <w:r>
+        <w:t xml:space="preserve">side and send all the positions they are waiting on to the GPU in one batch.</w:t>
+      </w:r>
+      <w:r>
+        <w:t xml:space="preserve"> </w:t>
+      </w:r>
+      <w:r>
+        <w:t xml:space="preserve">The moves do not change: on the CPU the batched games are exactly the games</w:t>
+      </w:r>
+      <w:r>
+        <w:t xml:space="preserve"> </w:t>
+      </w:r>
+      <w:r>
+        <w:t xml:space="preserve">played one at a time, which tests check. Two changes made the search itself</w:t>
+      </w:r>
+      <w:r>
+        <w:t xml:space="preserve"> </w:t>
+      </w:r>
+      <w:r>
+        <w:t xml:space="preserve">about 20% faster with the same moves: move probabilities are computed on the</w:t>
+      </w:r>
+      <w:r>
+        <w:t xml:space="preserve"> </w:t>
+      </w:r>
+      <w:r>
+        <w:t xml:space="preserve">legal moves only, and a node’s children are created when the search first</w:t>
+      </w:r>
+      <w:r>
+        <w:t xml:space="preserve"> </w:t>
+      </w:r>
+      <w:r>
+        <w:t xml:space="preserve">visits them. For 120 games of the 4 x 64 network, self-play went from 544 to</w:t>
+      </w:r>
+      <w:r>
+        <w:t xml:space="preserve"> </w:t>
+      </w:r>
+      <w:r>
+        <w:t xml:space="preserve">246 seconds; for 60 games of the 6 x 128 network, from 830 to 351 seconds.</w:t>
       </w:r>
     </w:p>
     <w:bookmarkEnd w:id="17"/>
@@ -2549,7 +2663,7 @@
     </w:p>
     <w:bookmarkEnd w:id="20"/>
     <w:bookmarkEnd w:id="21"/>
-    <w:bookmarkStart w:id="52" w:name="results"/>
+    <w:bookmarkStart w:id="54" w:name="results"/>
     <w:p>
       <w:pPr>
         <w:pStyle w:val="Heading1"/>
@@ -2563,7 +2677,13 @@
         <w:pStyle w:val="FirstParagraph"/>
       </w:pPr>
       <w:r>
-        <w:t xml:space="preserve">Sections 6.1 to 6.5 are the first runs; 6.6 to 6.10 are the long run.</w:t>
+        <w:t xml:space="preserve">Sections 6.1 to 6.5 are the first runs; 6.6 to 6.10 are the long run; 6.11</w:t>
+      </w:r>
+      <w:r>
+        <w:t xml:space="preserve"> </w:t>
+      </w:r>
+      <w:r>
+        <w:t xml:space="preserve">to 6.13 are later attempts to go further; 6.14 breaks the constraints.</w:t>
       </w:r>
     </w:p>
     <w:bookmarkStart w:id="25" w:name="learning-curves"/>
@@ -6271,13 +6391,7 @@
         <w:t xml:space="preserve"> </w:t>
       </w:r>
       <w:r>
-        <w:t xml:space="preserve">rate instead. With more compute it might overtake the smaller network; we</w:t>
-      </w:r>
-      <w:r>
-        <w:t xml:space="preserve"> </w:t>
-      </w:r>
-      <w:r>
-        <w:t xml:space="preserve">could not test that.</w:t>
+        <w:t xml:space="preserve">rate instead. Section 6.12 tries it again with faster self-play.</w:t>
       </w:r>
     </w:p>
     <w:bookmarkEnd w:id="46"/>
@@ -6605,13 +6719,783 @@
       </w:r>
     </w:p>
     <w:bookmarkEnd w:id="47"/>
-    <w:bookmarkStart w:id="51" w:name="X7e697f50ae1dd5e44c97332acfdfba23be11cde"/>
+    <w:bookmarkStart w:id="48" w:name="the-larger-network-second-attempt"/>
     <w:p>
       <w:pPr>
         <w:pStyle w:val="Heading2"/>
       </w:pPr>
       <w:r>
-        <w:t xml:space="preserve">6.12 Exploratory runs (outside the course constraints)</w:t>
+        <w:t xml:space="preserve">6.12 The larger network, second attempt</w:t>
+      </w:r>
+    </w:p>
+    <w:p>
+      <w:pPr>
+        <w:pStyle w:val="FirstParagraph"/>
+      </w:pPr>
+      <w:r>
+        <w:t xml:space="preserve">With GPU self-play an iteration of the 6 x 128 network takes about 10</w:t>
+      </w:r>
+      <w:r>
+        <w:t xml:space="preserve"> </w:t>
+      </w:r>
+      <w:r>
+        <w:t xml:space="preserve">minutes instead of 25 to 30. We trained it again, this time learning for 30</w:t>
+      </w:r>
+      <w:r>
+        <w:t xml:space="preserve"> </w:t>
+      </w:r>
+      <w:r>
+        <w:t xml:space="preserve">iterations from games played by the final model before playing its own.</w:t>
+      </w:r>
+    </w:p>
+    <w:tbl>
+      <w:tblPr>
+        <w:tblStyle w:val="Table"/>
+        <w:tblW w:type="pct" w:w="5000"/>
+        <w:tblLayout w:type="fixed"/>
+        <w:tblLook w:firstRow="1" w:lastRow="0" w:firstColumn="0" w:lastColumn="0" w:noHBand="0" w:noVBand="0" w:val="0020"/>
+      </w:tblPr>
+      <w:tblGrid>
+        <w:gridCol w:w="1320"/>
+        <w:gridCol w:w="1320"/>
+        <w:gridCol w:w="1320"/>
+        <w:gridCol w:w="1320"/>
+        <w:gridCol w:w="1320"/>
+        <w:gridCol w:w="1320"/>
+      </w:tblGrid>
+      <w:tr>
+        <w:trPr>
+          <w:tblHeader w:val="on"/>
+        </w:trPr>
+        <w:tc>
+          <w:tcPr/>
+          <w:p>
+            <w:pPr>
+              <w:pStyle w:val="Compact"/>
+            </w:pPr>
+            <w:r>
+              <w:t xml:space="preserve">Run</w:t>
+            </w:r>
+          </w:p>
+        </w:tc>
+        <w:tc>
+          <w:tcPr/>
+          <w:p>
+            <w:pPr>
+              <w:pStyle w:val="Compact"/>
+            </w:pPr>
+            <w:r>
+              <w:t xml:space="preserve">Iteration</w:t>
+            </w:r>
+          </w:p>
+        </w:tc>
+        <w:tc>
+          <w:tcPr/>
+          <w:p>
+            <w:pPr>
+              <w:pStyle w:val="Compact"/>
+            </w:pPr>
+            <w:r>
+              <w:t xml:space="preserve">Wins</w:t>
+            </w:r>
+          </w:p>
+        </w:tc>
+        <w:tc>
+          <w:tcPr/>
+          <w:p>
+            <w:pPr>
+              <w:pStyle w:val="Compact"/>
+            </w:pPr>
+            <w:r>
+              <w:t xml:space="preserve">Losses</w:t>
+            </w:r>
+          </w:p>
+        </w:tc>
+        <w:tc>
+          <w:tcPr/>
+          <w:p>
+            <w:pPr>
+              <w:pStyle w:val="Compact"/>
+            </w:pPr>
+            <w:r>
+              <w:t xml:space="preserve">Draws</w:t>
+            </w:r>
+          </w:p>
+        </w:tc>
+        <w:tc>
+          <w:tcPr/>
+          <w:p>
+            <w:pPr>
+              <w:pStyle w:val="Compact"/>
+            </w:pPr>
+            <w:r>
+              <w:t xml:space="preserve">Score vs final (560)</w:t>
+            </w:r>
+          </w:p>
+        </w:tc>
+      </w:tr>
+      <w:tr>
+        <w:tc>
+          <w:tcPr/>
+          <w:p>
+            <w:pPr>
+              <w:pStyle w:val="Compact"/>
+            </w:pPr>
+            <w:r>
+              <w:t xml:space="preserve">learning rate 1e-3</w:t>
+            </w:r>
+          </w:p>
+        </w:tc>
+        <w:tc>
+          <w:tcPr/>
+          <w:p>
+            <w:pPr>
+              <w:pStyle w:val="Compact"/>
+            </w:pPr>
+            <w:r>
+              <w:t xml:space="preserve">30 (end of learning from 560’s games)</w:t>
+            </w:r>
+          </w:p>
+        </w:tc>
+        <w:tc>
+          <w:tcPr/>
+          <w:p>
+            <w:pPr>
+              <w:pStyle w:val="Compact"/>
+            </w:pPr>
+            <w:r>
+              <w:t xml:space="preserve">5</w:t>
+            </w:r>
+          </w:p>
+        </w:tc>
+        <w:tc>
+          <w:tcPr/>
+          <w:p>
+            <w:pPr>
+              <w:pStyle w:val="Compact"/>
+            </w:pPr>
+            <w:r>
+              <w:t xml:space="preserve">6</w:t>
+            </w:r>
+          </w:p>
+        </w:tc>
+        <w:tc>
+          <w:tcPr/>
+          <w:p>
+            <w:pPr>
+              <w:pStyle w:val="Compact"/>
+            </w:pPr>
+            <w:r>
+              <w:t xml:space="preserve">89</w:t>
+            </w:r>
+          </w:p>
+        </w:tc>
+        <w:tc>
+          <w:tcPr/>
+          <w:p>
+            <w:pPr>
+              <w:pStyle w:val="Compact"/>
+            </w:pPr>
+            <w:r>
+              <w:t xml:space="preserve">0.495 +/- 0.032</w:t>
+            </w:r>
+          </w:p>
+        </w:tc>
+      </w:tr>
+      <w:tr>
+        <w:tc>
+          <w:tcPr/>
+          <w:p>
+            <w:pPr>
+              <w:pStyle w:val="Compact"/>
+            </w:pPr>
+            <w:r>
+              <w:t xml:space="preserve">learning rate 1e-3</w:t>
+            </w:r>
+          </w:p>
+        </w:tc>
+        <w:tc>
+          <w:tcPr/>
+          <w:p>
+            <w:pPr>
+              <w:pStyle w:val="Compact"/>
+            </w:pPr>
+            <w:r>
+              <w:t xml:space="preserve">60</w:t>
+            </w:r>
+          </w:p>
+        </w:tc>
+        <w:tc>
+          <w:tcPr/>
+          <w:p>
+            <w:pPr>
+              <w:pStyle w:val="Compact"/>
+            </w:pPr>
+            <w:r>
+              <w:t xml:space="preserve">2</w:t>
+            </w:r>
+          </w:p>
+        </w:tc>
+        <w:tc>
+          <w:tcPr/>
+          <w:p>
+            <w:pPr>
+              <w:pStyle w:val="Compact"/>
+            </w:pPr>
+            <w:r>
+              <w:t xml:space="preserve">13</w:t>
+            </w:r>
+          </w:p>
+        </w:tc>
+        <w:tc>
+          <w:tcPr/>
+          <w:p>
+            <w:pPr>
+              <w:pStyle w:val="Compact"/>
+            </w:pPr>
+            <w:r>
+              <w:t xml:space="preserve">82</w:t>
+            </w:r>
+          </w:p>
+        </w:tc>
+        <w:tc>
+          <w:tcPr/>
+          <w:p>
+            <w:pPr>
+              <w:pStyle w:val="Compact"/>
+            </w:pPr>
+            <w:r>
+              <w:t xml:space="preserve">0.443 +/- 0.037</w:t>
+            </w:r>
+          </w:p>
+        </w:tc>
+      </w:tr>
+      <w:tr>
+        <w:tc>
+          <w:tcPr/>
+          <w:p>
+            <w:pPr>
+              <w:pStyle w:val="Compact"/>
+            </w:pPr>
+            <w:r>
+              <w:t xml:space="preserve">learning rate 1e-3</w:t>
+            </w:r>
+          </w:p>
+        </w:tc>
+        <w:tc>
+          <w:tcPr/>
+          <w:p>
+            <w:pPr>
+              <w:pStyle w:val="Compact"/>
+            </w:pPr>
+            <w:r>
+              <w:t xml:space="preserve">120</w:t>
+            </w:r>
+          </w:p>
+        </w:tc>
+        <w:tc>
+          <w:tcPr/>
+          <w:p>
+            <w:pPr>
+              <w:pStyle w:val="Compact"/>
+            </w:pPr>
+            <w:r>
+              <w:t xml:space="preserve">1</w:t>
+            </w:r>
+          </w:p>
+        </w:tc>
+        <w:tc>
+          <w:tcPr/>
+          <w:p>
+            <w:pPr>
+              <w:pStyle w:val="Compact"/>
+            </w:pPr>
+            <w:r>
+              <w:t xml:space="preserve">16</w:t>
+            </w:r>
+          </w:p>
+        </w:tc>
+        <w:tc>
+          <w:tcPr/>
+          <w:p>
+            <w:pPr>
+              <w:pStyle w:val="Compact"/>
+            </w:pPr>
+            <w:r>
+              <w:t xml:space="preserve">80</w:t>
+            </w:r>
+          </w:p>
+        </w:tc>
+        <w:tc>
+          <w:tcPr/>
+          <w:p>
+            <w:pPr>
+              <w:pStyle w:val="Compact"/>
+            </w:pPr>
+            <w:r>
+              <w:t xml:space="preserve">0.423 +/- 0.039</w:t>
+            </w:r>
+          </w:p>
+        </w:tc>
+      </w:tr>
+      <w:tr>
+        <w:tc>
+          <w:tcPr/>
+          <w:p>
+            <w:pPr>
+              <w:pStyle w:val="Compact"/>
+            </w:pPr>
+            <w:r>
+              <w:t xml:space="preserve">learning rate 1e-4, from iteration 30</w:t>
+            </w:r>
+          </w:p>
+        </w:tc>
+        <w:tc>
+          <w:tcPr/>
+          <w:p>
+            <w:pPr>
+              <w:pStyle w:val="Compact"/>
+            </w:pPr>
+            <w:r>
+              <w:t xml:space="preserve">50</w:t>
+            </w:r>
+          </w:p>
+        </w:tc>
+        <w:tc>
+          <w:tcPr/>
+          <w:p>
+            <w:pPr>
+              <w:pStyle w:val="Compact"/>
+            </w:pPr>
+            <w:r>
+              <w:t xml:space="preserve">4</w:t>
+            </w:r>
+          </w:p>
+        </w:tc>
+        <w:tc>
+          <w:tcPr/>
+          <w:p>
+            <w:pPr>
+              <w:pStyle w:val="Compact"/>
+            </w:pPr>
+            <w:r>
+              <w:t xml:space="preserve">6</w:t>
+            </w:r>
+          </w:p>
+        </w:tc>
+        <w:tc>
+          <w:tcPr/>
+          <w:p>
+            <w:pPr>
+              <w:pStyle w:val="Compact"/>
+            </w:pPr>
+            <w:r>
+              <w:t xml:space="preserve">87</w:t>
+            </w:r>
+          </w:p>
+        </w:tc>
+        <w:tc>
+          <w:tcPr/>
+          <w:p>
+            <w:pPr>
+              <w:pStyle w:val="Compact"/>
+            </w:pPr>
+            <w:r>
+              <w:t xml:space="preserve">0.490 +/- 0.032</w:t>
+            </w:r>
+          </w:p>
+        </w:tc>
+      </w:tr>
+      <w:tr>
+        <w:tc>
+          <w:tcPr/>
+          <w:p>
+            <w:pPr>
+              <w:pStyle w:val="Compact"/>
+            </w:pPr>
+            <w:r>
+              <w:t xml:space="preserve">learning rate 1e-4, from iteration 30</w:t>
+            </w:r>
+          </w:p>
+        </w:tc>
+        <w:tc>
+          <w:tcPr/>
+          <w:p>
+            <w:pPr>
+              <w:pStyle w:val="Compact"/>
+            </w:pPr>
+            <w:r>
+              <w:t xml:space="preserve">70</w:t>
+            </w:r>
+          </w:p>
+        </w:tc>
+        <w:tc>
+          <w:tcPr/>
+          <w:p>
+            <w:pPr>
+              <w:pStyle w:val="Compact"/>
+            </w:pPr>
+            <w:r>
+              <w:t xml:space="preserve">6</w:t>
+            </w:r>
+          </w:p>
+        </w:tc>
+        <w:tc>
+          <w:tcPr/>
+          <w:p>
+            <w:pPr>
+              <w:pStyle w:val="Compact"/>
+            </w:pPr>
+            <w:r>
+              <w:t xml:space="preserve">7</w:t>
+            </w:r>
+          </w:p>
+        </w:tc>
+        <w:tc>
+          <w:tcPr/>
+          <w:p>
+            <w:pPr>
+              <w:pStyle w:val="Compact"/>
+            </w:pPr>
+            <w:r>
+              <w:t xml:space="preserve">86</w:t>
+            </w:r>
+          </w:p>
+        </w:tc>
+        <w:tc>
+          <w:tcPr/>
+          <w:p>
+            <w:pPr>
+              <w:pStyle w:val="Compact"/>
+            </w:pPr>
+            <w:r>
+              <w:t xml:space="preserve">0.495 +/- 0.036</w:t>
+            </w:r>
+          </w:p>
+        </w:tc>
+      </w:tr>
+    </w:tbl>
+    <w:p>
+      <w:pPr>
+        <w:pStyle w:val="BodyText"/>
+      </w:pPr>
+      <w:r>
+        <w:t xml:space="preserve">Learning from the final model’s games made the larger network as strong as</w:t>
+      </w:r>
+      <w:r>
+        <w:t xml:space="preserve"> </w:t>
+      </w:r>
+      <w:r>
+        <w:t xml:space="preserve">the final model. On its own games at 1e-3 it got steadily weaker; at 1e-4 it</w:t>
+      </w:r>
+      <w:r>
+        <w:t xml:space="preserve"> </w:t>
+      </w:r>
+      <w:r>
+        <w:t xml:space="preserve">stayed level but did not get stronger, and we stopped it at iteration 90.</w:t>
+      </w:r>
+    </w:p>
+    <w:bookmarkEnd w:id="48"/>
+    <w:bookmarkStart w:id="49" w:name="can-hopeless-games-end-early"/>
+    <w:p>
+      <w:pPr>
+        <w:pStyle w:val="Heading2"/>
+      </w:pPr>
+      <w:r>
+        <w:t xml:space="preserve">6.13 Can hopeless games end early?</w:t>
+      </w:r>
+    </w:p>
+    <w:p>
+      <w:pPr>
+        <w:pStyle w:val="FirstParagraph"/>
+      </w:pPr>
+      <w:r>
+        <w:t xml:space="preserve">AlphaZero resigns a game when the search rates the position as clearly lost,</w:t>
+      </w:r>
+      <w:r>
+        <w:t xml:space="preserve"> </w:t>
+      </w:r>
+      <w:r>
+        <w:t xml:space="preserve">so lost games give a real result instead of a long draw. Before training with</w:t>
+      </w:r>
+      <w:r>
+        <w:t xml:space="preserve"> </w:t>
+      </w:r>
+      <w:r>
+        <w:t xml:space="preserve">it, we recorded the final model’s evaluation of every position in 160</w:t>
+      </w:r>
+      <w:r>
+        <w:t xml:space="preserve"> </w:t>
+      </w:r>
+      <w:r>
+        <w:t xml:space="preserve">self-play games and counted, for each threshold, how often a resignation</w:t>
+      </w:r>
+      <w:r>
+        <w:t xml:space="preserve"> </w:t>
+      </w:r>
+      <w:r>
+        <w:t xml:space="preserve">would have been wrong (the side did not go on to lose):</w:t>
+      </w:r>
+    </w:p>
+    <w:tbl>
+      <w:tblPr>
+        <w:tblStyle w:val="Table"/>
+        <w:tblW w:type="auto" w:w="0"/>
+        <w:tblLook w:firstRow="1" w:lastRow="0" w:firstColumn="0" w:lastColumn="0" w:noHBand="0" w:noVBand="0" w:val="0020"/>
+      </w:tblPr>
+      <w:tblGrid>
+        <w:gridCol w:w="2640"/>
+        <w:gridCol w:w="2640"/>
+        <w:gridCol w:w="2640"/>
+      </w:tblGrid>
+      <w:tr>
+        <w:trPr>
+          <w:tblHeader w:val="on"/>
+        </w:trPr>
+        <w:tc>
+          <w:tcPr/>
+          <w:p>
+            <w:pPr>
+              <w:pStyle w:val="Compact"/>
+            </w:pPr>
+            <w:r>
+              <w:t xml:space="preserve">Resign when below (2 moves in a row)</w:t>
+            </w:r>
+          </w:p>
+        </w:tc>
+        <w:tc>
+          <w:tcPr/>
+          <w:p>
+            <w:pPr>
+              <w:pStyle w:val="Compact"/>
+            </w:pPr>
+            <w:r>
+              <w:t xml:space="preserve">Would resign</w:t>
+            </w:r>
+          </w:p>
+        </w:tc>
+        <w:tc>
+          <w:tcPr/>
+          <w:p>
+            <w:pPr>
+              <w:pStyle w:val="Compact"/>
+            </w:pPr>
+            <w:r>
+              <w:t xml:space="preserve">Wrong</w:t>
+            </w:r>
+          </w:p>
+        </w:tc>
+      </w:tr>
+      <w:tr>
+        <w:tc>
+          <w:tcPr/>
+          <w:p>
+            <w:pPr>
+              <w:pStyle w:val="Compact"/>
+            </w:pPr>
+            <w:r>
+              <w:t xml:space="preserve">-0.3</w:t>
+            </w:r>
+          </w:p>
+        </w:tc>
+        <w:tc>
+          <w:tcPr/>
+          <w:p>
+            <w:pPr>
+              <w:pStyle w:val="Compact"/>
+            </w:pPr>
+            <w:r>
+              <w:t xml:space="preserve">34</w:t>
+            </w:r>
+          </w:p>
+        </w:tc>
+        <w:tc>
+          <w:tcPr/>
+          <w:p>
+            <w:pPr>
+              <w:pStyle w:val="Compact"/>
+            </w:pPr>
+            <w:r>
+              <w:t xml:space="preserve">32</w:t>
+            </w:r>
+          </w:p>
+        </w:tc>
+      </w:tr>
+      <w:tr>
+        <w:tc>
+          <w:tcPr/>
+          <w:p>
+            <w:pPr>
+              <w:pStyle w:val="Compact"/>
+            </w:pPr>
+            <w:r>
+              <w:t xml:space="preserve">-0.4</w:t>
+            </w:r>
+          </w:p>
+        </w:tc>
+        <w:tc>
+          <w:tcPr/>
+          <w:p>
+            <w:pPr>
+              <w:pStyle w:val="Compact"/>
+            </w:pPr>
+            <w:r>
+              <w:t xml:space="preserve">16</w:t>
+            </w:r>
+          </w:p>
+        </w:tc>
+        <w:tc>
+          <w:tcPr/>
+          <w:p>
+            <w:pPr>
+              <w:pStyle w:val="Compact"/>
+            </w:pPr>
+            <w:r>
+              <w:t xml:space="preserve">14</w:t>
+            </w:r>
+          </w:p>
+        </w:tc>
+      </w:tr>
+      <w:tr>
+        <w:tc>
+          <w:tcPr/>
+          <w:p>
+            <w:pPr>
+              <w:pStyle w:val="Compact"/>
+            </w:pPr>
+            <w:r>
+              <w:t xml:space="preserve">-0.5</w:t>
+            </w:r>
+          </w:p>
+        </w:tc>
+        <w:tc>
+          <w:tcPr/>
+          <w:p>
+            <w:pPr>
+              <w:pStyle w:val="Compact"/>
+            </w:pPr>
+            <w:r>
+              <w:t xml:space="preserve">7</w:t>
+            </w:r>
+          </w:p>
+        </w:tc>
+        <w:tc>
+          <w:tcPr/>
+          <w:p>
+            <w:pPr>
+              <w:pStyle w:val="Compact"/>
+            </w:pPr>
+            <w:r>
+              <w:t xml:space="preserve">6</w:t>
+            </w:r>
+          </w:p>
+        </w:tc>
+      </w:tr>
+      <w:tr>
+        <w:tc>
+          <w:tcPr/>
+          <w:p>
+            <w:pPr>
+              <w:pStyle w:val="Compact"/>
+            </w:pPr>
+            <w:r>
+              <w:t xml:space="preserve">-0.6</w:t>
+            </w:r>
+          </w:p>
+        </w:tc>
+        <w:tc>
+          <w:tcPr/>
+          <w:p>
+            <w:pPr>
+              <w:pStyle w:val="Compact"/>
+            </w:pPr>
+            <w:r>
+              <w:t xml:space="preserve">2</w:t>
+            </w:r>
+          </w:p>
+        </w:tc>
+        <w:tc>
+          <w:tcPr/>
+          <w:p>
+            <w:pPr>
+              <w:pStyle w:val="Compact"/>
+            </w:pPr>
+            <w:r>
+              <w:t xml:space="preserve">2</w:t>
+            </w:r>
+          </w:p>
+        </w:tc>
+      </w:tr>
+      <w:tr>
+        <w:tc>
+          <w:tcPr/>
+          <w:p>
+            <w:pPr>
+              <w:pStyle w:val="Compact"/>
+            </w:pPr>
+            <w:r>
+              <w:t xml:space="preserve">-0.8</w:t>
+            </w:r>
+          </w:p>
+        </w:tc>
+        <w:tc>
+          <w:tcPr/>
+          <w:p>
+            <w:pPr>
+              <w:pStyle w:val="Compact"/>
+            </w:pPr>
+            <w:r>
+              <w:t xml:space="preserve">0</w:t>
+            </w:r>
+          </w:p>
+        </w:tc>
+        <w:tc>
+          <w:tcPr/>
+          <w:p>
+            <w:pPr>
+              <w:pStyle w:val="Compact"/>
+            </w:pPr>
+            <w:r>
+              <w:t xml:space="preserve">0</w:t>
+            </w:r>
+          </w:p>
+        </w:tc>
+      </w:tr>
+    </w:tbl>
+    <w:p>
+      <w:pPr>
+        <w:pStyle w:val="BodyText"/>
+      </w:pPr>
+      <w:r>
+        <w:t xml:space="preserve">Nearly every resignation would have been in a game that ended in a draw. The</w:t>
+      </w:r>
+      <w:r>
+        <w:t xml:space="preserve"> </w:t>
+      </w:r>
+      <w:r>
+        <w:t xml:space="preserve">21 decisive games were mostly short (11 to 250 plies), and the losing side’s</w:t>
+      </w:r>
+      <w:r>
+        <w:t xml:space="preserve"> </w:t>
+      </w:r>
+      <w:r>
+        <w:t xml:space="preserve">evaluation stayed near 0 until just before the mate. Resigning would have</w:t>
+      </w:r>
+      <w:r>
+        <w:t xml:space="preserve"> </w:t>
+      </w:r>
+      <w:r>
+        <w:t xml:space="preserve">turned draws into wrong losses, so we did not train with it.</w:t>
+      </w:r>
+    </w:p>
+    <w:bookmarkEnd w:id="49"/>
+    <w:bookmarkStart w:id="53" w:name="X7e697f50ae1dd5e44c97332acfdfba23be11cde"/>
+    <w:p>
+      <w:pPr>
+        <w:pStyle w:val="Heading2"/>
+      </w:pPr>
+      <w:r>
+        <w:t xml:space="preserve">6.14 Exploratory runs (outside the course constraints)</w:t>
       </w:r>
     </w:p>
     <w:p>
@@ -6717,18 +7601,18 @@
           <wp:inline>
             <wp:extent cx="5334000" cy="3394363"/>
             <wp:effectExtent b="0" l="0" r="0" t="0"/>
-            <wp:docPr descr="Exploratory runs: loss, decisive share and game length." title="" id="49" name="Picture"/>
+            <wp:docPr descr="Exploratory runs: loss, decisive share and game length." title="" id="51" name="Picture"/>
             <a:graphic>
               <a:graphicData uri="http://schemas.openxmlformats.org/drawingml/2006/picture">
                 <pic:pic>
                   <pic:nvPicPr>
-                    <pic:cNvPr descr="../results/training_curves_exploratory.png" id="50" name="Picture"/>
+                    <pic:cNvPr descr="../results/training_curves_exploratory.png" id="52" name="Picture"/>
                     <pic:cNvPicPr>
                       <a:picLocks noChangeArrowheads="1" noChangeAspect="1"/>
                     </pic:cNvPicPr>
                   </pic:nvPicPr>
                   <pic:blipFill>
-                    <a:blip r:embed="rId48"/>
+                    <a:blip r:embed="rId50"/>
                     <a:stretch>
                       <a:fillRect/>
                     </a:stretch>
@@ -6763,9 +7647,9 @@
         <w:t xml:space="preserve">Exploratory runs: loss, decisive share and game length.</w:t>
       </w:r>
     </w:p>
-    <w:bookmarkEnd w:id="51"/>
-    <w:bookmarkEnd w:id="52"/>
-    <w:bookmarkStart w:id="53" w:name="discussion"/>
+    <w:bookmarkEnd w:id="53"/>
+    <w:bookmarkEnd w:id="54"/>
+    <w:bookmarkStart w:id="55" w:name="discussion"/>
     <w:p>
       <w:pPr>
         <w:pStyle w:val="Heading1"/>
@@ -7102,8 +7986,74 @@
         <w:t xml:space="preserve">simulations appears close to its limit.</w:t>
       </w:r>
     </w:p>
-    <w:bookmarkEnd w:id="53"/>
-    <w:bookmarkStart w:id="54" w:name="limitations-and-future-work"/>
+    <w:p>
+      <w:pPr>
+        <w:pStyle w:val="BodyText"/>
+      </w:pPr>
+      <w:r>
+        <w:rPr>
+          <w:b/>
+          <w:bCs/>
+        </w:rPr>
+        <w:t xml:space="preserve">Size and what the value head knows.</w:t>
+      </w:r>
+      <w:r>
+        <w:t xml:space="preserve"> </w:t>
+      </w:r>
+      <w:r>
+        <w:t xml:space="preserve">The larger network learned to play as</w:t>
+      </w:r>
+      <w:r>
+        <w:t xml:space="preserve"> </w:t>
+      </w:r>
+      <w:r>
+        <w:t xml:space="preserve">well as the final model from its games, but its own games did not take it</w:t>
+      </w:r>
+      <w:r>
+        <w:t xml:space="preserve"> </w:t>
+      </w:r>
+      <w:r>
+        <w:t xml:space="preserve">further, so network size is not what holds the agent back. The resignation</w:t>
+      </w:r>
+      <w:r>
+        <w:t xml:space="preserve"> </w:t>
+      </w:r>
+      <w:r>
+        <w:t xml:space="preserve">measurement (Section 6.13) shows what does: the value head does not know when</w:t>
+      </w:r>
+      <w:r>
+        <w:t xml:space="preserve"> </w:t>
+      </w:r>
+      <w:r>
+        <w:t xml:space="preserve">a position is won or lost. Decisive games come from sudden mistakes that the</w:t>
+      </w:r>
+      <w:r>
+        <w:t xml:space="preserve"> </w:t>
+      </w:r>
+      <w:r>
+        <w:t xml:space="preserve">search punishes, not from advantages built up and converted, and the losing</w:t>
+      </w:r>
+      <w:r>
+        <w:t xml:space="preserve"> </w:t>
+      </w:r>
+      <w:r>
+        <w:t xml:space="preserve">side does not see its loss coming. With about 85% of self-play games drawn,</w:t>
+      </w:r>
+      <w:r>
+        <w:t xml:space="preserve"> </w:t>
+      </w:r>
+      <w:r>
+        <w:t xml:space="preserve">the value head gets too few clear results to learn from, and that is the</w:t>
+      </w:r>
+      <w:r>
+        <w:t xml:space="preserve"> </w:t>
+      </w:r>
+      <w:r>
+        <w:t xml:space="preserve">problem every change we tried ran into.</w:t>
+      </w:r>
+    </w:p>
+    <w:bookmarkEnd w:id="55"/>
+    <w:bookmarkStart w:id="56" w:name="limitations-and-future-work"/>
     <w:p>
       <w:pPr>
         <w:pStyle w:val="Heading1"/>
@@ -7181,13 +8131,13 @@
         </w:numPr>
       </w:pPr>
       <w:r>
-        <w:t xml:space="preserve">Compute was the main limit: even after the speed-up, one iteration of 100</w:t>
-      </w:r>
-      <w:r>
-        <w:t xml:space="preserve"> </w:t>
-      </w:r>
-      <w:r>
-        <w:t xml:space="preserve">games takes about 9 minutes, and the larger network about 25 to 30.</w:t>
+        <w:t xml:space="preserve">Compute was the main limit: even with GPU self-play, one iteration of 100</w:t>
+      </w:r>
+      <w:r>
+        <w:t xml:space="preserve"> </w:t>
+      </w:r>
+      <w:r>
+        <w:t xml:space="preserve">games takes about 4 minutes, and the larger network about 10.</w:t>
       </w:r>
     </w:p>
     <w:p>
@@ -7207,19 +8157,25 @@
         </w:numPr>
       </w:pPr>
       <w:r>
-        <w:t xml:space="preserve">A way for results to reach the value head more often, within the rules: a</w:t>
-      </w:r>
-      <w:r>
-        <w:t xml:space="preserve"> </w:t>
-      </w:r>
-      <w:r>
-        <w:t xml:space="preserve">shorter game cap during self-play, or resigning hopeless games. Simply</w:t>
-      </w:r>
-      <w:r>
-        <w:t xml:space="preserve"> </w:t>
-      </w:r>
-      <w:r>
-        <w:t xml:space="preserve">counting draws as slightly bad did not work (Section 6.11).</w:t>
+        <w:t xml:space="preserve">A way for results to reach the value head more often, within the rules,</w:t>
+      </w:r>
+      <w:r>
+        <w:t xml:space="preserve"> </w:t>
+      </w:r>
+      <w:r>
+        <w:t xml:space="preserve">for example a shorter game cap during self-play. Counting draws as</w:t>
+      </w:r>
+      <w:r>
+        <w:t xml:space="preserve"> </w:t>
+      </w:r>
+      <w:r>
+        <w:t xml:space="preserve">slightly bad did not work (Section 6.11), and resigning needs a value head</w:t>
+      </w:r>
+      <w:r>
+        <w:t xml:space="preserve"> </w:t>
+      </w:r>
+      <w:r>
+        <w:t xml:space="preserve">that already recognizes lost positions (Section 6.13).</w:t>
       </w:r>
     </w:p>
     <w:p>
@@ -7231,23 +8187,23 @@
         </w:numPr>
       </w:pPr>
       <w:r>
-        <w:t xml:space="preserve">Even longer training, with a lower learning rate earlier in the run.</w:t>
-      </w:r>
-    </w:p>
-    <w:p>
-      <w:pPr>
-        <w:pStyle w:val="Compact"/>
-        <w:numPr>
-          <w:ilvl w:val="0"/>
-          <w:numId w:val="1008"/>
-        </w:numPr>
-      </w:pPr>
-      <w:r>
-        <w:t xml:space="preserve">The larger network, given the days of compute it needs to catch up.</w:t>
-      </w:r>
-    </w:p>
-    <w:bookmarkEnd w:id="54"/>
-    <w:bookmarkStart w:id="55" w:name="conclusion"/>
+        <w:t xml:space="preserve">Far more self-play games with the larger network, which can start from the</w:t>
+      </w:r>
+      <w:r>
+        <w:t xml:space="preserve"> </w:t>
+      </w:r>
+      <w:r>
+        <w:t xml:space="preserve">final model’s level (Section 6.12) but needs many more games than we could</w:t>
+      </w:r>
+      <w:r>
+        <w:t xml:space="preserve"> </w:t>
+      </w:r>
+      <w:r>
+        <w:t xml:space="preserve">play to improve on it.</w:t>
+      </w:r>
+    </w:p>
+    <w:bookmarkEnd w:id="56"/>
+    <w:bookmarkStart w:id="57" w:name="conclusion"/>
     <w:p>
       <w:pPr>
         <w:pStyle w:val="Heading1"/>
@@ -7267,7 +8223,7 @@
         <w:t xml:space="preserve"> </w:t>
       </w:r>
       <w:r>
-        <w:t xml:space="preserve">course constraints and verified it with 108 tests. With 400 self-play games per</w:t>
+        <w:t xml:space="preserve">course constraints and verified it with 123 tests. With 400 self-play games per</w:t>
       </w:r>
       <w:r>
         <w:t xml:space="preserve"> </w:t>
@@ -7309,13 +8265,25 @@
         <w:t xml:space="preserve"> </w:t>
       </w:r>
       <w:r>
-        <w:t xml:space="preserve">advantage remains the open problem: neither more search at play time nor</w:t>
-      </w:r>
-      <w:r>
-        <w:t xml:space="preserve"> </w:t>
-      </w:r>
-      <w:r>
-        <w:t xml:space="preserve">counting draws as bad in training solved it. The evaluation tools (a fixed benchmark</w:t>
+        <w:t xml:space="preserve">advantage remains the open problem: neither more search at play time,</w:t>
+      </w:r>
+      <w:r>
+        <w:t xml:space="preserve"> </w:t>
+      </w:r>
+      <w:r>
+        <w:t xml:space="preserve">counting draws as bad in training, nor a larger network solved it, and the</w:t>
+      </w:r>
+      <w:r>
+        <w:t xml:space="preserve"> </w:t>
+      </w:r>
+      <w:r>
+        <w:t xml:space="preserve">model’s own evaluations show why: it does not yet recognize won or lost</w:t>
+      </w:r>
+      <w:r>
+        <w:t xml:space="preserve"> </w:t>
+      </w:r>
+      <w:r>
+        <w:t xml:space="preserve">positions until the end is near. The evaluation tools (a fixed benchmark</w:t>
       </w:r>
       <w:r>
         <w:t xml:space="preserve"> </w:t>
@@ -7330,8 +8298,8 @@
         <w:t xml:space="preserve">both the negative and the positive result measurable.</w:t>
       </w:r>
     </w:p>
-    <w:bookmarkEnd w:id="55"/>
-    <w:bookmarkStart w:id="56" w:name="references"/>
+    <w:bookmarkEnd w:id="57"/>
+    <w:bookmarkStart w:id="58" w:name="references"/>
     <w:p>
       <w:pPr>
         <w:pStyle w:val="Heading1"/>
@@ -7402,8 +8370,8 @@
         <w:t xml:space="preserve">, 550, 354-359.</w:t>
       </w:r>
     </w:p>
-    <w:bookmarkEnd w:id="56"/>
-    <w:bookmarkStart w:id="57" w:name="appendix-a-team-roles"/>
+    <w:bookmarkEnd w:id="58"/>
+    <w:bookmarkStart w:id="59" w:name="appendix-a-team-roles"/>
     <w:p>
       <w:pPr>
         <w:pStyle w:val="Heading1"/>
@@ -7550,8 +8518,8 @@
         </w:tc>
       </w:tr>
     </w:tbl>
-    <w:bookmarkEnd w:id="57"/>
-    <w:bookmarkStart w:id="58" w:name="appendix-b-reproducing-the-results"/>
+    <w:bookmarkEnd w:id="59"/>
+    <w:bookmarkStart w:id="60" w:name="appendix-b-reproducing-the-results"/>
     <w:p>
       <w:pPr>
         <w:pStyle w:val="Heading1"/>
@@ -7753,7 +8721,7 @@
         <w:t xml:space="preserve">.</w:t>
       </w:r>
     </w:p>
-    <w:bookmarkEnd w:id="58"/>
+    <w:bookmarkEnd w:id="60"/>
     <w:sectPr>
       <w:footnotePr>
         <w:numRestart w:val="eachSect"/>

</xml_diff>

<commit_message>
Add the play-time search results and the 2e-5 training stretch
The final model at 400 and 800 simulations per move against itself at 50
(0.560 and 0.616, no losses), and 140 more iterations at learning rate 2e-5,
which were not measurably stronger than the final model (0.515 at iteration
700 over 200 games). Updates the report, the docx and the READMEs, and
recommends 800 simulations for games against the final model.

Co-Authored-By: Claude Opus 5.5 <noreply@anthropic.com>
</commit_message>
<xml_diff>
--- a/report/REPORT.docx
+++ b/report/REPORT.docx
@@ -154,7 +154,19 @@
         <w:t xml:space="preserve"> </w:t>
       </w:r>
       <w:r>
-        <w:t xml:space="preserve">gave a small gain and a loss of strength respectively. After moving self-play</w:t>
+        <w:t xml:space="preserve">gave a gain and a loss of strength respectively: with 800 simulations per</w:t>
+      </w:r>
+      <w:r>
+        <w:t xml:space="preserve"> </w:t>
+      </w:r>
+      <w:r>
+        <w:t xml:space="preserve">move the final model beats itself at 50 by 23 wins to 0. 140 more iterations</w:t>
+      </w:r>
+      <w:r>
+        <w:t xml:space="preserve"> </w:t>
+      </w:r>
+      <w:r>
+        <w:t xml:space="preserve">at an even smaller learning rate gave no measurable gain. After moving self-play</w:t>
       </w:r>
       <w:r>
         <w:t xml:space="preserve"> </w:t>
@@ -340,7 +352,7 @@
         <w:t xml:space="preserve"> </w:t>
       </w:r>
       <w:r>
-        <w:t xml:space="preserve">(Sections 5.3 and 6.6 to 6.10). Sections 6.11 to 6.13 test what else could</w:t>
+        <w:t xml:space="preserve">(Sections 5.3 and 6.6 to 6.10). Sections 6.11 to 6.14 test what else could</w:t>
       </w:r>
       <w:r>
         <w:t xml:space="preserve"> </w:t>
@@ -2663,7 +2675,7 @@
     </w:p>
     <w:bookmarkEnd w:id="20"/>
     <w:bookmarkEnd w:id="21"/>
-    <w:bookmarkStart w:id="54" w:name="results"/>
+    <w:bookmarkStart w:id="55" w:name="results"/>
     <w:p>
       <w:pPr>
         <w:pStyle w:val="Heading1"/>
@@ -2683,7 +2695,7 @@
         <w:t xml:space="preserve"> </w:t>
       </w:r>
       <w:r>
-        <w:t xml:space="preserve">to 6.13 are later attempts to go further; 6.14 breaks the constraints.</w:t>
+        <w:t xml:space="preserve">to 6.14 are later attempts to go further; 6.15 breaks the constraints.</w:t>
       </w:r>
     </w:p>
     <w:bookmarkStart w:id="25" w:name="learning-curves"/>
@@ -6437,315 +6449,7 @@
         <w:t xml:space="preserve"> </w:t>
       </w:r>
       <w:r>
-        <w:t xml:space="preserve">9 wins, 4 losses and 86 draws (0.525 +/- 0.035). Four times the search gives</w:t>
-      </w:r>
-      <w:r>
-        <w:t xml:space="preserve"> </w:t>
-      </w:r>
-      <w:r>
-        <w:t xml:space="preserve">only a small edge, since the extra search does not help it finish games.</w:t>
-      </w:r>
-    </w:p>
-    <w:p>
-      <w:pPr>
-        <w:pStyle w:val="BodyText"/>
-      </w:pPr>
-      <w:r>
-        <w:rPr>
-          <w:b/>
-          <w:bCs/>
-        </w:rPr>
-        <w:t xml:space="preserve">Counting draws as slightly bad.</w:t>
-      </w:r>
-      <w:r>
-        <w:t xml:space="preserve"> </w:t>
-      </w:r>
-      <w:r>
-        <w:t xml:space="preserve">We continued the final model from</w:t>
-      </w:r>
-      <w:r>
-        <w:t xml:space="preserve"> </w:t>
-      </w:r>
-      <w:r>
-        <w:t xml:space="preserve">iteration 560 with a value target of -0.2 for both sides in every drawn or</w:t>
-      </w:r>
-      <w:r>
-        <w:t xml:space="preserve"> </w:t>
-      </w:r>
-      <w:r>
-        <w:t xml:space="preserve">unfinished self-play game, instead of 0, at learning rate 1e-4. It uses only</w:t>
-      </w:r>
-      <w:r>
-        <w:t xml:space="preserve"> </w:t>
-      </w:r>
-      <w:r>
-        <w:t xml:space="preserve">the game result, so it stays within the rules-only constraint. Decisive</w:t>
-      </w:r>
-      <w:r>
-        <w:t xml:space="preserve"> </w:t>
-      </w:r>
-      <w:r>
-        <w:t xml:space="preserve">self-play games rose from about 14% to about 19%, but play got weaker:</w:t>
-      </w:r>
-    </w:p>
-    <w:tbl>
-      <w:tblPr>
-        <w:tblStyle w:val="Table"/>
-        <w:tblW w:type="auto" w:w="0"/>
-        <w:tblLook w:firstRow="1" w:lastRow="0" w:firstColumn="0" w:lastColumn="0" w:noHBand="0" w:noVBand="0" w:val="0020"/>
-      </w:tblPr>
-      <w:tblGrid>
-        <w:gridCol w:w="1320"/>
-        <w:gridCol w:w="1320"/>
-        <w:gridCol w:w="1320"/>
-        <w:gridCol w:w="1320"/>
-        <w:gridCol w:w="1320"/>
-        <w:gridCol w:w="1320"/>
-      </w:tblGrid>
-      <w:tr>
-        <w:trPr>
-          <w:tblHeader w:val="on"/>
-        </w:trPr>
-        <w:tc>
-          <w:tcPr/>
-          <w:p>
-            <w:pPr>
-              <w:pStyle w:val="Compact"/>
-            </w:pPr>
-            <w:r>
-              <w:t xml:space="preserve">Match (100 games)</w:t>
-            </w:r>
-          </w:p>
-        </w:tc>
-        <w:tc>
-          <w:tcPr/>
-          <w:p>
-            <w:pPr>
-              <w:pStyle w:val="Compact"/>
-            </w:pPr>
-            <w:r>
-              <w:t xml:space="preserve">Wins</w:t>
-            </w:r>
-          </w:p>
-        </w:tc>
-        <w:tc>
-          <w:tcPr/>
-          <w:p>
-            <w:pPr>
-              <w:pStyle w:val="Compact"/>
-            </w:pPr>
-            <w:r>
-              <w:t xml:space="preserve">Losses</w:t>
-            </w:r>
-          </w:p>
-        </w:tc>
-        <w:tc>
-          <w:tcPr/>
-          <w:p>
-            <w:pPr>
-              <w:pStyle w:val="Compact"/>
-            </w:pPr>
-            <w:r>
-              <w:t xml:space="preserve">Draws</w:t>
-            </w:r>
-          </w:p>
-        </w:tc>
-        <w:tc>
-          <w:tcPr/>
-          <w:p>
-            <w:pPr>
-              <w:pStyle w:val="Compact"/>
-            </w:pPr>
-            <w:r>
-              <w:t xml:space="preserve">Unfinished</w:t>
-            </w:r>
-          </w:p>
-        </w:tc>
-        <w:tc>
-          <w:tcPr/>
-          <w:p>
-            <w:pPr>
-              <w:pStyle w:val="Compact"/>
-            </w:pPr>
-            <w:r>
-              <w:t xml:space="preserve">Score</w:t>
-            </w:r>
-          </w:p>
-        </w:tc>
-      </w:tr>
-      <w:tr>
-        <w:tc>
-          <w:tcPr/>
-          <w:p>
-            <w:pPr>
-              <w:pStyle w:val="Compact"/>
-            </w:pPr>
-            <w:r>
-              <w:t xml:space="preserve">iteration 600 vs final (560)</w:t>
-            </w:r>
-          </w:p>
-        </w:tc>
-        <w:tc>
-          <w:tcPr/>
-          <w:p>
-            <w:pPr>
-              <w:pStyle w:val="Compact"/>
-            </w:pPr>
-            <w:r>
-              <w:t xml:space="preserve">4</w:t>
-            </w:r>
-          </w:p>
-        </w:tc>
-        <w:tc>
-          <w:tcPr/>
-          <w:p>
-            <w:pPr>
-              <w:pStyle w:val="Compact"/>
-            </w:pPr>
-            <w:r>
-              <w:t xml:space="preserve">9</w:t>
-            </w:r>
-          </w:p>
-        </w:tc>
-        <w:tc>
-          <w:tcPr/>
-          <w:p>
-            <w:pPr>
-              <w:pStyle w:val="Compact"/>
-            </w:pPr>
-            <w:r>
-              <w:t xml:space="preserve">85</w:t>
-            </w:r>
-          </w:p>
-        </w:tc>
-        <w:tc>
-          <w:tcPr/>
-          <w:p>
-            <w:pPr>
-              <w:pStyle w:val="Compact"/>
-            </w:pPr>
-            <w:r>
-              <w:t xml:space="preserve">2</w:t>
-            </w:r>
-          </w:p>
-        </w:tc>
-        <w:tc>
-          <w:tcPr/>
-          <w:p>
-            <w:pPr>
-              <w:pStyle w:val="Compact"/>
-            </w:pPr>
-            <w:r>
-              <w:t xml:space="preserve">0.474 +/- 0.036</w:t>
-            </w:r>
-          </w:p>
-        </w:tc>
-      </w:tr>
-      <w:tr>
-        <w:tc>
-          <w:tcPr/>
-          <w:p>
-            <w:pPr>
-              <w:pStyle w:val="Compact"/>
-            </w:pPr>
-            <w:r>
-              <w:t xml:space="preserve">iteration 630 vs final (560)</w:t>
-            </w:r>
-          </w:p>
-        </w:tc>
-        <w:tc>
-          <w:tcPr/>
-          <w:p>
-            <w:pPr>
-              <w:pStyle w:val="Compact"/>
-            </w:pPr>
-            <w:r>
-              <w:t xml:space="preserve">0</w:t>
-            </w:r>
-          </w:p>
-        </w:tc>
-        <w:tc>
-          <w:tcPr/>
-          <w:p>
-            <w:pPr>
-              <w:pStyle w:val="Compact"/>
-            </w:pPr>
-            <w:r>
-              <w:t xml:space="preserve">9</w:t>
-            </w:r>
-          </w:p>
-        </w:tc>
-        <w:tc>
-          <w:tcPr/>
-          <w:p>
-            <w:pPr>
-              <w:pStyle w:val="Compact"/>
-            </w:pPr>
-            <w:r>
-              <w:t xml:space="preserve">89</w:t>
-            </w:r>
-          </w:p>
-        </w:tc>
-        <w:tc>
-          <w:tcPr/>
-          <w:p>
-            <w:pPr>
-              <w:pStyle w:val="Compact"/>
-            </w:pPr>
-            <w:r>
-              <w:t xml:space="preserve">2</w:t>
-            </w:r>
-          </w:p>
-        </w:tc>
-        <w:tc>
-          <w:tcPr/>
-          <w:p>
-            <w:pPr>
-              <w:pStyle w:val="Compact"/>
-            </w:pPr>
-            <w:r>
-              <w:t xml:space="preserve">0.454 +/- 0.029</w:t>
-            </w:r>
-          </w:p>
-        </w:tc>
-      </w:tr>
-    </w:tbl>
-    <w:p>
-      <w:pPr>
-        <w:pStyle w:val="BodyText"/>
-      </w:pPr>
-      <w:r>
-        <w:t xml:space="preserve">We stopped it at iteration 631 and kept iteration 560 as the final model.</w:t>
-      </w:r>
-    </w:p>
-    <w:bookmarkEnd w:id="47"/>
-    <w:bookmarkStart w:id="48" w:name="the-larger-network-second-attempt"/>
-    <w:p>
-      <w:pPr>
-        <w:pStyle w:val="Heading2"/>
-      </w:pPr>
-      <w:r>
-        <w:t xml:space="preserve">6.12 The larger network, second attempt</w:t>
-      </w:r>
-    </w:p>
-    <w:p>
-      <w:pPr>
-        <w:pStyle w:val="FirstParagraph"/>
-      </w:pPr>
-      <w:r>
-        <w:t xml:space="preserve">With GPU self-play an iteration of the 6 x 128 network takes about 10</w:t>
-      </w:r>
-      <w:r>
-        <w:t xml:space="preserve"> </w:t>
-      </w:r>
-      <w:r>
-        <w:t xml:space="preserve">minutes instead of 25 to 30. We trained it again, this time learning for 30</w:t>
-      </w:r>
-      <w:r>
-        <w:t xml:space="preserve"> </w:t>
-      </w:r>
-      <w:r>
-        <w:t xml:space="preserve">iterations from games played by the final model before playing its own.</w:t>
+        <w:t xml:space="preserve">9 wins, 4 losses and 86 draws (0.525 +/- 0.035). More search helps more:</w:t>
       </w:r>
     </w:p>
     <w:tbl>
@@ -6774,6 +6478,637 @@
               <w:pStyle w:val="Compact"/>
             </w:pPr>
             <w:r>
+              <w:t xml:space="preserve">Final model, simulations per move (vs itself at 50, 100 games)</w:t>
+            </w:r>
+          </w:p>
+        </w:tc>
+        <w:tc>
+          <w:tcPr/>
+          <w:p>
+            <w:pPr>
+              <w:pStyle w:val="Compact"/>
+            </w:pPr>
+            <w:r>
+              <w:t xml:space="preserve">Wins</w:t>
+            </w:r>
+          </w:p>
+        </w:tc>
+        <w:tc>
+          <w:tcPr/>
+          <w:p>
+            <w:pPr>
+              <w:pStyle w:val="Compact"/>
+            </w:pPr>
+            <w:r>
+              <w:t xml:space="preserve">Losses</w:t>
+            </w:r>
+          </w:p>
+        </w:tc>
+        <w:tc>
+          <w:tcPr/>
+          <w:p>
+            <w:pPr>
+              <w:pStyle w:val="Compact"/>
+            </w:pPr>
+            <w:r>
+              <w:t xml:space="preserve">Draws</w:t>
+            </w:r>
+          </w:p>
+        </w:tc>
+        <w:tc>
+          <w:tcPr/>
+          <w:p>
+            <w:pPr>
+              <w:pStyle w:val="Compact"/>
+            </w:pPr>
+            <w:r>
+              <w:t xml:space="preserve">Unfinished</w:t>
+            </w:r>
+          </w:p>
+        </w:tc>
+        <w:tc>
+          <w:tcPr/>
+          <w:p>
+            <w:pPr>
+              <w:pStyle w:val="Compact"/>
+            </w:pPr>
+            <w:r>
+              <w:t xml:space="preserve">Score</w:t>
+            </w:r>
+          </w:p>
+        </w:tc>
+      </w:tr>
+      <w:tr>
+        <w:tc>
+          <w:tcPr/>
+          <w:p>
+            <w:pPr>
+              <w:pStyle w:val="Compact"/>
+            </w:pPr>
+            <w:r>
+              <w:t xml:space="preserve">200</w:t>
+            </w:r>
+          </w:p>
+        </w:tc>
+        <w:tc>
+          <w:tcPr/>
+          <w:p>
+            <w:pPr>
+              <w:pStyle w:val="Compact"/>
+            </w:pPr>
+            <w:r>
+              <w:t xml:space="preserve">9</w:t>
+            </w:r>
+          </w:p>
+        </w:tc>
+        <w:tc>
+          <w:tcPr/>
+          <w:p>
+            <w:pPr>
+              <w:pStyle w:val="Compact"/>
+            </w:pPr>
+            <w:r>
+              <w:t xml:space="preserve">4</w:t>
+            </w:r>
+          </w:p>
+        </w:tc>
+        <w:tc>
+          <w:tcPr/>
+          <w:p>
+            <w:pPr>
+              <w:pStyle w:val="Compact"/>
+            </w:pPr>
+            <w:r>
+              <w:t xml:space="preserve">86</w:t>
+            </w:r>
+          </w:p>
+        </w:tc>
+        <w:tc>
+          <w:tcPr/>
+          <w:p>
+            <w:pPr>
+              <w:pStyle w:val="Compact"/>
+            </w:pPr>
+            <w:r>
+              <w:t xml:space="preserve">1</w:t>
+            </w:r>
+          </w:p>
+        </w:tc>
+        <w:tc>
+          <w:tcPr/>
+          <w:p>
+            <w:pPr>
+              <w:pStyle w:val="Compact"/>
+            </w:pPr>
+            <w:r>
+              <w:t xml:space="preserve">0.525 +/- 0.035</w:t>
+            </w:r>
+          </w:p>
+        </w:tc>
+      </w:tr>
+      <w:tr>
+        <w:tc>
+          <w:tcPr/>
+          <w:p>
+            <w:pPr>
+              <w:pStyle w:val="Compact"/>
+            </w:pPr>
+            <w:r>
+              <w:t xml:space="preserve">400</w:t>
+            </w:r>
+          </w:p>
+        </w:tc>
+        <w:tc>
+          <w:tcPr/>
+          <w:p>
+            <w:pPr>
+              <w:pStyle w:val="Compact"/>
+            </w:pPr>
+            <w:r>
+              <w:t xml:space="preserve">12</w:t>
+            </w:r>
+          </w:p>
+        </w:tc>
+        <w:tc>
+          <w:tcPr/>
+          <w:p>
+            <w:pPr>
+              <w:pStyle w:val="Compact"/>
+            </w:pPr>
+            <w:r>
+              <w:t xml:space="preserve">0</w:t>
+            </w:r>
+          </w:p>
+        </w:tc>
+        <w:tc>
+          <w:tcPr/>
+          <w:p>
+            <w:pPr>
+              <w:pStyle w:val="Compact"/>
+            </w:pPr>
+            <w:r>
+              <w:t xml:space="preserve">88</w:t>
+            </w:r>
+          </w:p>
+        </w:tc>
+        <w:tc>
+          <w:tcPr/>
+          <w:p>
+            <w:pPr>
+              <w:pStyle w:val="Compact"/>
+            </w:pPr>
+            <w:r>
+              <w:t xml:space="preserve">0</w:t>
+            </w:r>
+          </w:p>
+        </w:tc>
+        <w:tc>
+          <w:tcPr/>
+          <w:p>
+            <w:pPr>
+              <w:pStyle w:val="Compact"/>
+            </w:pPr>
+            <w:r>
+              <w:t xml:space="preserve">0.560 +/- 0.032</w:t>
+            </w:r>
+          </w:p>
+        </w:tc>
+      </w:tr>
+      <w:tr>
+        <w:tc>
+          <w:tcPr/>
+          <w:p>
+            <w:pPr>
+              <w:pStyle w:val="Compact"/>
+            </w:pPr>
+            <w:r>
+              <w:t xml:space="preserve">800</w:t>
+            </w:r>
+          </w:p>
+        </w:tc>
+        <w:tc>
+          <w:tcPr/>
+          <w:p>
+            <w:pPr>
+              <w:pStyle w:val="Compact"/>
+            </w:pPr>
+            <w:r>
+              <w:t xml:space="preserve">23</w:t>
+            </w:r>
+          </w:p>
+        </w:tc>
+        <w:tc>
+          <w:tcPr/>
+          <w:p>
+            <w:pPr>
+              <w:pStyle w:val="Compact"/>
+            </w:pPr>
+            <w:r>
+              <w:t xml:space="preserve">0</w:t>
+            </w:r>
+          </w:p>
+        </w:tc>
+        <w:tc>
+          <w:tcPr/>
+          <w:p>
+            <w:pPr>
+              <w:pStyle w:val="Compact"/>
+            </w:pPr>
+            <w:r>
+              <w:t xml:space="preserve">76</w:t>
+            </w:r>
+          </w:p>
+        </w:tc>
+        <w:tc>
+          <w:tcPr/>
+          <w:p>
+            <w:pPr>
+              <w:pStyle w:val="Compact"/>
+            </w:pPr>
+            <w:r>
+              <w:t xml:space="preserve">1</w:t>
+            </w:r>
+          </w:p>
+        </w:tc>
+        <w:tc>
+          <w:tcPr/>
+          <w:p>
+            <w:pPr>
+              <w:pStyle w:val="Compact"/>
+            </w:pPr>
+            <w:r>
+              <w:t xml:space="preserve">0.616 +/- 0.042</w:t>
+            </w:r>
+          </w:p>
+        </w:tc>
+      </w:tr>
+    </w:tbl>
+    <w:p>
+      <w:pPr>
+        <w:pStyle w:val="BodyText"/>
+      </w:pPr>
+      <w:r>
+        <w:t xml:space="preserve">At 800 simulations the model won 23 games and lost none, a larger gain than</w:t>
+      </w:r>
+      <w:r>
+        <w:t xml:space="preserve"> </w:t>
+      </w:r>
+      <w:r>
+        <w:t xml:space="preserve">the last 100 iterations of training gave. Most games are still drawn, so the</w:t>
+      </w:r>
+      <w:r>
+        <w:t xml:space="preserve"> </w:t>
+      </w:r>
+      <w:r>
+        <w:t xml:space="preserve">extra search mainly avoids mistakes and punishes the opponent’s, rather than</w:t>
+      </w:r>
+      <w:r>
+        <w:t xml:space="preserve"> </w:t>
+      </w:r>
+      <w:r>
+        <w:t xml:space="preserve">converting slow advantages. A move then takes about 1 to 2 seconds, which is</w:t>
+      </w:r>
+      <w:r>
+        <w:t xml:space="preserve"> </w:t>
+      </w:r>
+      <w:r>
+        <w:t xml:space="preserve">fine for play against a person, so this is the setting we recommend for</w:t>
+      </w:r>
+      <w:r>
+        <w:t xml:space="preserve"> </w:t>
+      </w:r>
+      <w:r>
+        <w:t xml:space="preserve">games against the final model.</w:t>
+      </w:r>
+    </w:p>
+    <w:p>
+      <w:pPr>
+        <w:pStyle w:val="BodyText"/>
+      </w:pPr>
+      <w:r>
+        <w:rPr>
+          <w:b/>
+          <w:bCs/>
+        </w:rPr>
+        <w:t xml:space="preserve">Counting draws as slightly bad.</w:t>
+      </w:r>
+      <w:r>
+        <w:t xml:space="preserve"> </w:t>
+      </w:r>
+      <w:r>
+        <w:t xml:space="preserve">We continued the final model from</w:t>
+      </w:r>
+      <w:r>
+        <w:t xml:space="preserve"> </w:t>
+      </w:r>
+      <w:r>
+        <w:t xml:space="preserve">iteration 560 with a value target of -0.2 for both sides in every drawn or</w:t>
+      </w:r>
+      <w:r>
+        <w:t xml:space="preserve"> </w:t>
+      </w:r>
+      <w:r>
+        <w:t xml:space="preserve">unfinished self-play game, instead of 0, at learning rate 1e-4. It uses only</w:t>
+      </w:r>
+      <w:r>
+        <w:t xml:space="preserve"> </w:t>
+      </w:r>
+      <w:r>
+        <w:t xml:space="preserve">the game result, so it stays within the rules-only constraint. Decisive</w:t>
+      </w:r>
+      <w:r>
+        <w:t xml:space="preserve"> </w:t>
+      </w:r>
+      <w:r>
+        <w:t xml:space="preserve">self-play games rose from about 14% to about 19%, but play got weaker:</w:t>
+      </w:r>
+    </w:p>
+    <w:tbl>
+      <w:tblPr>
+        <w:tblStyle w:val="Table"/>
+        <w:tblW w:type="auto" w:w="0"/>
+        <w:tblLook w:firstRow="1" w:lastRow="0" w:firstColumn="0" w:lastColumn="0" w:noHBand="0" w:noVBand="0" w:val="0020"/>
+      </w:tblPr>
+      <w:tblGrid>
+        <w:gridCol w:w="1320"/>
+        <w:gridCol w:w="1320"/>
+        <w:gridCol w:w="1320"/>
+        <w:gridCol w:w="1320"/>
+        <w:gridCol w:w="1320"/>
+        <w:gridCol w:w="1320"/>
+      </w:tblGrid>
+      <w:tr>
+        <w:trPr>
+          <w:tblHeader w:val="on"/>
+        </w:trPr>
+        <w:tc>
+          <w:tcPr/>
+          <w:p>
+            <w:pPr>
+              <w:pStyle w:val="Compact"/>
+            </w:pPr>
+            <w:r>
+              <w:t xml:space="preserve">Match (100 games)</w:t>
+            </w:r>
+          </w:p>
+        </w:tc>
+        <w:tc>
+          <w:tcPr/>
+          <w:p>
+            <w:pPr>
+              <w:pStyle w:val="Compact"/>
+            </w:pPr>
+            <w:r>
+              <w:t xml:space="preserve">Wins</w:t>
+            </w:r>
+          </w:p>
+        </w:tc>
+        <w:tc>
+          <w:tcPr/>
+          <w:p>
+            <w:pPr>
+              <w:pStyle w:val="Compact"/>
+            </w:pPr>
+            <w:r>
+              <w:t xml:space="preserve">Losses</w:t>
+            </w:r>
+          </w:p>
+        </w:tc>
+        <w:tc>
+          <w:tcPr/>
+          <w:p>
+            <w:pPr>
+              <w:pStyle w:val="Compact"/>
+            </w:pPr>
+            <w:r>
+              <w:t xml:space="preserve">Draws</w:t>
+            </w:r>
+          </w:p>
+        </w:tc>
+        <w:tc>
+          <w:tcPr/>
+          <w:p>
+            <w:pPr>
+              <w:pStyle w:val="Compact"/>
+            </w:pPr>
+            <w:r>
+              <w:t xml:space="preserve">Unfinished</w:t>
+            </w:r>
+          </w:p>
+        </w:tc>
+        <w:tc>
+          <w:tcPr/>
+          <w:p>
+            <w:pPr>
+              <w:pStyle w:val="Compact"/>
+            </w:pPr>
+            <w:r>
+              <w:t xml:space="preserve">Score</w:t>
+            </w:r>
+          </w:p>
+        </w:tc>
+      </w:tr>
+      <w:tr>
+        <w:tc>
+          <w:tcPr/>
+          <w:p>
+            <w:pPr>
+              <w:pStyle w:val="Compact"/>
+            </w:pPr>
+            <w:r>
+              <w:t xml:space="preserve">iteration 600 vs final (560)</w:t>
+            </w:r>
+          </w:p>
+        </w:tc>
+        <w:tc>
+          <w:tcPr/>
+          <w:p>
+            <w:pPr>
+              <w:pStyle w:val="Compact"/>
+            </w:pPr>
+            <w:r>
+              <w:t xml:space="preserve">4</w:t>
+            </w:r>
+          </w:p>
+        </w:tc>
+        <w:tc>
+          <w:tcPr/>
+          <w:p>
+            <w:pPr>
+              <w:pStyle w:val="Compact"/>
+            </w:pPr>
+            <w:r>
+              <w:t xml:space="preserve">9</w:t>
+            </w:r>
+          </w:p>
+        </w:tc>
+        <w:tc>
+          <w:tcPr/>
+          <w:p>
+            <w:pPr>
+              <w:pStyle w:val="Compact"/>
+            </w:pPr>
+            <w:r>
+              <w:t xml:space="preserve">85</w:t>
+            </w:r>
+          </w:p>
+        </w:tc>
+        <w:tc>
+          <w:tcPr/>
+          <w:p>
+            <w:pPr>
+              <w:pStyle w:val="Compact"/>
+            </w:pPr>
+            <w:r>
+              <w:t xml:space="preserve">2</w:t>
+            </w:r>
+          </w:p>
+        </w:tc>
+        <w:tc>
+          <w:tcPr/>
+          <w:p>
+            <w:pPr>
+              <w:pStyle w:val="Compact"/>
+            </w:pPr>
+            <w:r>
+              <w:t xml:space="preserve">0.474 +/- 0.036</w:t>
+            </w:r>
+          </w:p>
+        </w:tc>
+      </w:tr>
+      <w:tr>
+        <w:tc>
+          <w:tcPr/>
+          <w:p>
+            <w:pPr>
+              <w:pStyle w:val="Compact"/>
+            </w:pPr>
+            <w:r>
+              <w:t xml:space="preserve">iteration 630 vs final (560)</w:t>
+            </w:r>
+          </w:p>
+        </w:tc>
+        <w:tc>
+          <w:tcPr/>
+          <w:p>
+            <w:pPr>
+              <w:pStyle w:val="Compact"/>
+            </w:pPr>
+            <w:r>
+              <w:t xml:space="preserve">0</w:t>
+            </w:r>
+          </w:p>
+        </w:tc>
+        <w:tc>
+          <w:tcPr/>
+          <w:p>
+            <w:pPr>
+              <w:pStyle w:val="Compact"/>
+            </w:pPr>
+            <w:r>
+              <w:t xml:space="preserve">9</w:t>
+            </w:r>
+          </w:p>
+        </w:tc>
+        <w:tc>
+          <w:tcPr/>
+          <w:p>
+            <w:pPr>
+              <w:pStyle w:val="Compact"/>
+            </w:pPr>
+            <w:r>
+              <w:t xml:space="preserve">89</w:t>
+            </w:r>
+          </w:p>
+        </w:tc>
+        <w:tc>
+          <w:tcPr/>
+          <w:p>
+            <w:pPr>
+              <w:pStyle w:val="Compact"/>
+            </w:pPr>
+            <w:r>
+              <w:t xml:space="preserve">2</w:t>
+            </w:r>
+          </w:p>
+        </w:tc>
+        <w:tc>
+          <w:tcPr/>
+          <w:p>
+            <w:pPr>
+              <w:pStyle w:val="Compact"/>
+            </w:pPr>
+            <w:r>
+              <w:t xml:space="preserve">0.454 +/- 0.029</w:t>
+            </w:r>
+          </w:p>
+        </w:tc>
+      </w:tr>
+    </w:tbl>
+    <w:p>
+      <w:pPr>
+        <w:pStyle w:val="BodyText"/>
+      </w:pPr>
+      <w:r>
+        <w:t xml:space="preserve">We stopped it at iteration 631 and kept iteration 560 as the final model.</w:t>
+      </w:r>
+    </w:p>
+    <w:bookmarkEnd w:id="47"/>
+    <w:bookmarkStart w:id="48" w:name="the-larger-network-second-attempt"/>
+    <w:p>
+      <w:pPr>
+        <w:pStyle w:val="Heading2"/>
+      </w:pPr>
+      <w:r>
+        <w:t xml:space="preserve">6.12 The larger network, second attempt</w:t>
+      </w:r>
+    </w:p>
+    <w:p>
+      <w:pPr>
+        <w:pStyle w:val="FirstParagraph"/>
+      </w:pPr>
+      <w:r>
+        <w:t xml:space="preserve">With GPU self-play an iteration of the 6 x 128 network takes about 10</w:t>
+      </w:r>
+      <w:r>
+        <w:t xml:space="preserve"> </w:t>
+      </w:r>
+      <w:r>
+        <w:t xml:space="preserve">minutes instead of 25 to 30. We trained it again, this time learning for 30</w:t>
+      </w:r>
+      <w:r>
+        <w:t xml:space="preserve"> </w:t>
+      </w:r>
+      <w:r>
+        <w:t xml:space="preserve">iterations from games played by the final model before playing its own.</w:t>
+      </w:r>
+    </w:p>
+    <w:tbl>
+      <w:tblPr>
+        <w:tblStyle w:val="Table"/>
+        <w:tblW w:type="pct" w:w="5000"/>
+        <w:tblLayout w:type="fixed"/>
+        <w:tblLook w:firstRow="1" w:lastRow="0" w:firstColumn="0" w:lastColumn="0" w:noHBand="0" w:noVBand="0" w:val="0020"/>
+      </w:tblPr>
+      <w:tblGrid>
+        <w:gridCol w:w="1320"/>
+        <w:gridCol w:w="1320"/>
+        <w:gridCol w:w="1320"/>
+        <w:gridCol w:w="1320"/>
+        <w:gridCol w:w="1320"/>
+        <w:gridCol w:w="1320"/>
+      </w:tblGrid>
+      <w:tr>
+        <w:trPr>
+          <w:tblHeader w:val="on"/>
+        </w:trPr>
+        <w:tc>
+          <w:tcPr/>
+          <w:p>
+            <w:pPr>
+              <w:pStyle w:val="Compact"/>
+            </w:pPr>
+            <w:r>
               <w:t xml:space="preserve">Run</w:t>
             </w:r>
           </w:p>
@@ -7489,13 +7824,347 @@
       </w:r>
     </w:p>
     <w:bookmarkEnd w:id="49"/>
-    <w:bookmarkStart w:id="53" w:name="X7e697f50ae1dd5e44c97332acfdfba23be11cde"/>
+    <w:bookmarkStart w:id="50" w:name="even-smaller-learning-steps"/>
     <w:p>
       <w:pPr>
         <w:pStyle w:val="Heading2"/>
       </w:pPr>
       <w:r>
-        <w:t xml:space="preserve">6.14 Exploratory runs (outside the course constraints)</w:t>
+        <w:t xml:space="preserve">6.14 Even smaller learning steps</w:t>
+      </w:r>
+    </w:p>
+    <w:p>
+      <w:pPr>
+        <w:pStyle w:val="FirstParagraph"/>
+      </w:pPr>
+      <w:r>
+        <w:t xml:space="preserve">The lower learning rates of Section 6.8 still gave small gains, so we</w:t>
+      </w:r>
+      <w:r>
+        <w:t xml:space="preserve"> </w:t>
+      </w:r>
+      <w:r>
+        <w:t xml:space="preserve">continued the final model from iteration 560 for 140 more iterations at</w:t>
+      </w:r>
+      <w:r>
+        <w:t xml:space="preserve"> </w:t>
+      </w:r>
+      <w:r>
+        <w:t xml:space="preserve">learning rate 2e-5 (about 10 hours with GPU self-play):</w:t>
+      </w:r>
+    </w:p>
+    <w:tbl>
+      <w:tblPr>
+        <w:tblStyle w:val="Table"/>
+        <w:tblW w:type="auto" w:w="0"/>
+        <w:tblLook w:firstRow="1" w:lastRow="0" w:firstColumn="0" w:lastColumn="0" w:noHBand="0" w:noVBand="0" w:val="0020"/>
+      </w:tblPr>
+      <w:tblGrid>
+        <w:gridCol w:w="1320"/>
+        <w:gridCol w:w="1320"/>
+        <w:gridCol w:w="1320"/>
+        <w:gridCol w:w="1320"/>
+        <w:gridCol w:w="1320"/>
+        <w:gridCol w:w="1320"/>
+      </w:tblGrid>
+      <w:tr>
+        <w:trPr>
+          <w:tblHeader w:val="on"/>
+        </w:trPr>
+        <w:tc>
+          <w:tcPr/>
+          <w:p>
+            <w:pPr>
+              <w:pStyle w:val="Compact"/>
+            </w:pPr>
+            <w:r>
+              <w:t xml:space="preserve">Match vs final (560)</w:t>
+            </w:r>
+          </w:p>
+        </w:tc>
+        <w:tc>
+          <w:tcPr/>
+          <w:p>
+            <w:pPr>
+              <w:pStyle w:val="Compact"/>
+            </w:pPr>
+            <w:r>
+              <w:t xml:space="preserve">Games</w:t>
+            </w:r>
+          </w:p>
+        </w:tc>
+        <w:tc>
+          <w:tcPr/>
+          <w:p>
+            <w:pPr>
+              <w:pStyle w:val="Compact"/>
+            </w:pPr>
+            <w:r>
+              <w:t xml:space="preserve">Wins</w:t>
+            </w:r>
+          </w:p>
+        </w:tc>
+        <w:tc>
+          <w:tcPr/>
+          <w:p>
+            <w:pPr>
+              <w:pStyle w:val="Compact"/>
+            </w:pPr>
+            <w:r>
+              <w:t xml:space="preserve">Losses</w:t>
+            </w:r>
+          </w:p>
+        </w:tc>
+        <w:tc>
+          <w:tcPr/>
+          <w:p>
+            <w:pPr>
+              <w:pStyle w:val="Compact"/>
+            </w:pPr>
+            <w:r>
+              <w:t xml:space="preserve">Draws</w:t>
+            </w:r>
+          </w:p>
+        </w:tc>
+        <w:tc>
+          <w:tcPr/>
+          <w:p>
+            <w:pPr>
+              <w:pStyle w:val="Compact"/>
+            </w:pPr>
+            <w:r>
+              <w:t xml:space="preserve">Score</w:t>
+            </w:r>
+          </w:p>
+        </w:tc>
+      </w:tr>
+      <w:tr>
+        <w:tc>
+          <w:tcPr/>
+          <w:p>
+            <w:pPr>
+              <w:pStyle w:val="Compact"/>
+            </w:pPr>
+            <w:r>
+              <w:t xml:space="preserve">iteration 620</w:t>
+            </w:r>
+          </w:p>
+        </w:tc>
+        <w:tc>
+          <w:tcPr/>
+          <w:p>
+            <w:pPr>
+              <w:pStyle w:val="Compact"/>
+            </w:pPr>
+            <w:r>
+              <w:t xml:space="preserve">100</w:t>
+            </w:r>
+          </w:p>
+        </w:tc>
+        <w:tc>
+          <w:tcPr/>
+          <w:p>
+            <w:pPr>
+              <w:pStyle w:val="Compact"/>
+            </w:pPr>
+            <w:r>
+              <w:t xml:space="preserve">3</w:t>
+            </w:r>
+          </w:p>
+        </w:tc>
+        <w:tc>
+          <w:tcPr/>
+          <w:p>
+            <w:pPr>
+              <w:pStyle w:val="Compact"/>
+            </w:pPr>
+            <w:r>
+              <w:t xml:space="preserve">1</w:t>
+            </w:r>
+          </w:p>
+        </w:tc>
+        <w:tc>
+          <w:tcPr/>
+          <w:p>
+            <w:pPr>
+              <w:pStyle w:val="Compact"/>
+            </w:pPr>
+            <w:r>
+              <w:t xml:space="preserve">96</w:t>
+            </w:r>
+          </w:p>
+        </w:tc>
+        <w:tc>
+          <w:tcPr/>
+          <w:p>
+            <w:pPr>
+              <w:pStyle w:val="Compact"/>
+            </w:pPr>
+            <w:r>
+              <w:t xml:space="preserve">0.510 +/- 0.020</w:t>
+            </w:r>
+          </w:p>
+        </w:tc>
+      </w:tr>
+      <w:tr>
+        <w:tc>
+          <w:tcPr/>
+          <w:p>
+            <w:pPr>
+              <w:pStyle w:val="Compact"/>
+            </w:pPr>
+            <w:r>
+              <w:t xml:space="preserve">iteration 660</w:t>
+            </w:r>
+          </w:p>
+        </w:tc>
+        <w:tc>
+          <w:tcPr/>
+          <w:p>
+            <w:pPr>
+              <w:pStyle w:val="Compact"/>
+            </w:pPr>
+            <w:r>
+              <w:t xml:space="preserve">100</w:t>
+            </w:r>
+          </w:p>
+        </w:tc>
+        <w:tc>
+          <w:tcPr/>
+          <w:p>
+            <w:pPr>
+              <w:pStyle w:val="Compact"/>
+            </w:pPr>
+            <w:r>
+              <w:t xml:space="preserve">7</w:t>
+            </w:r>
+          </w:p>
+        </w:tc>
+        <w:tc>
+          <w:tcPr/>
+          <w:p>
+            <w:pPr>
+              <w:pStyle w:val="Compact"/>
+            </w:pPr>
+            <w:r>
+              <w:t xml:space="preserve">7</w:t>
+            </w:r>
+          </w:p>
+        </w:tc>
+        <w:tc>
+          <w:tcPr/>
+          <w:p>
+            <w:pPr>
+              <w:pStyle w:val="Compact"/>
+            </w:pPr>
+            <w:r>
+              <w:t xml:space="preserve">84</w:t>
+            </w:r>
+          </w:p>
+        </w:tc>
+        <w:tc>
+          <w:tcPr/>
+          <w:p>
+            <w:pPr>
+              <w:pStyle w:val="Compact"/>
+            </w:pPr>
+            <w:r>
+              <w:t xml:space="preserve">0.500 +/- 0.037</w:t>
+            </w:r>
+          </w:p>
+        </w:tc>
+      </w:tr>
+      <w:tr>
+        <w:tc>
+          <w:tcPr/>
+          <w:p>
+            <w:pPr>
+              <w:pStyle w:val="Compact"/>
+            </w:pPr>
+            <w:r>
+              <w:t xml:space="preserve">iteration 700</w:t>
+            </w:r>
+          </w:p>
+        </w:tc>
+        <w:tc>
+          <w:tcPr/>
+          <w:p>
+            <w:pPr>
+              <w:pStyle w:val="Compact"/>
+            </w:pPr>
+            <w:r>
+              <w:t xml:space="preserve">200</w:t>
+            </w:r>
+          </w:p>
+        </w:tc>
+        <w:tc>
+          <w:tcPr/>
+          <w:p>
+            <w:pPr>
+              <w:pStyle w:val="Compact"/>
+            </w:pPr>
+            <w:r>
+              <w:t xml:space="preserve">15</w:t>
+            </w:r>
+          </w:p>
+        </w:tc>
+        <w:tc>
+          <w:tcPr/>
+          <w:p>
+            <w:pPr>
+              <w:pStyle w:val="Compact"/>
+            </w:pPr>
+            <w:r>
+              <w:t xml:space="preserve">9</w:t>
+            </w:r>
+          </w:p>
+        </w:tc>
+        <w:tc>
+          <w:tcPr/>
+          <w:p>
+            <w:pPr>
+              <w:pStyle w:val="Compact"/>
+            </w:pPr>
+            <w:r>
+              <w:t xml:space="preserve">173</w:t>
+            </w:r>
+          </w:p>
+        </w:tc>
+        <w:tc>
+          <w:tcPr/>
+          <w:p>
+            <w:pPr>
+              <w:pStyle w:val="Compact"/>
+            </w:pPr>
+            <w:r>
+              <w:t xml:space="preserve">0.515 +/- 0.024</w:t>
+            </w:r>
+          </w:p>
+        </w:tc>
+      </w:tr>
+    </w:tbl>
+    <w:p>
+      <w:pPr>
+        <w:pStyle w:val="BodyText"/>
+      </w:pPr>
+      <w:r>
+        <w:t xml:space="preserve">No checkpoint is clearly stronger than the final model, so we kept</w:t>
+      </w:r>
+      <w:r>
+        <w:t xml:space="preserve"> </w:t>
+      </w:r>
+      <w:r>
+        <w:t xml:space="preserve">iteration 560 and stopped the run at iteration 702.</w:t>
+      </w:r>
+    </w:p>
+    <w:bookmarkEnd w:id="50"/>
+    <w:bookmarkStart w:id="54" w:name="X7e697f50ae1dd5e44c97332acfdfba23be11cde"/>
+    <w:p>
+      <w:pPr>
+        <w:pStyle w:val="Heading2"/>
+      </w:pPr>
+      <w:r>
+        <w:t xml:space="preserve">6.15 Exploratory runs (outside the course constraints)</w:t>
       </w:r>
     </w:p>
     <w:p>
@@ -7601,18 +8270,18 @@
           <wp:inline>
             <wp:extent cx="5334000" cy="3394363"/>
             <wp:effectExtent b="0" l="0" r="0" t="0"/>
-            <wp:docPr descr="Exploratory runs: loss, decisive share and game length." title="" id="51" name="Picture"/>
+            <wp:docPr descr="Exploratory runs: loss, decisive share and game length." title="" id="52" name="Picture"/>
             <a:graphic>
               <a:graphicData uri="http://schemas.openxmlformats.org/drawingml/2006/picture">
                 <pic:pic>
                   <pic:nvPicPr>
-                    <pic:cNvPr descr="../results/training_curves_exploratory.png" id="52" name="Picture"/>
+                    <pic:cNvPr descr="../results/training_curves_exploratory.png" id="53" name="Picture"/>
                     <pic:cNvPicPr>
                       <a:picLocks noChangeArrowheads="1" noChangeAspect="1"/>
                     </pic:cNvPicPr>
                   </pic:nvPicPr>
                   <pic:blipFill>
-                    <a:blip r:embed="rId50"/>
+                    <a:blip r:embed="rId51"/>
                     <a:stretch>
                       <a:fillRect/>
                     </a:stretch>
@@ -7647,9 +8316,9 @@
         <w:t xml:space="preserve">Exploratory runs: loss, decisive share and game length.</w:t>
       </w:r>
     </w:p>
-    <w:bookmarkEnd w:id="53"/>
     <w:bookmarkEnd w:id="54"/>
-    <w:bookmarkStart w:id="55" w:name="discussion"/>
+    <w:bookmarkEnd w:id="55"/>
+    <w:bookmarkStart w:id="56" w:name="discussion"/>
     <w:p>
       <w:pPr>
         <w:pStyle w:val="Heading1"/>
@@ -7953,19 +8622,19 @@
         <w:t xml:space="preserve"> </w:t>
       </w:r>
       <w:r>
-        <w:t xml:space="preserve">previous checkpoint), four times more search at play time gave 0.525, and</w:t>
-      </w:r>
-      <w:r>
-        <w:t xml:space="preserve"> </w:t>
-      </w:r>
-      <w:r>
-        <w:t xml:space="preserve">penalizing draws made the agent play more decisive games against itself but</w:t>
-      </w:r>
-      <w:r>
-        <w:t xml:space="preserve"> </w:t>
-      </w:r>
-      <w:r>
-        <w:t xml:space="preserve">lose more against the final model (Section 6.11). Pushing for decisive results</w:t>
+        <w:t xml:space="preserve">previous checkpoint) and then none at all (0.515 after 140 iterations at</w:t>
+      </w:r>
+      <w:r>
+        <w:t xml:space="preserve"> </w:t>
+      </w:r>
+      <w:r>
+        <w:t xml:space="preserve">2e-5, Section 6.14), and penalizing draws made the agent play more decisive</w:t>
+      </w:r>
+      <w:r>
+        <w:t xml:space="preserve"> </w:t>
+      </w:r>
+      <w:r>
+        <w:t xml:space="preserve">games against itself but lose more against the final model (Section 6.11). Pushing for decisive results</w:t>
       </w:r>
       <w:r>
         <w:t xml:space="preserve"> </w:t>
@@ -7983,7 +8652,19 @@
         <w:t xml:space="preserve"> </w:t>
       </w:r>
       <w:r>
-        <w:t xml:space="preserve">simulations appears close to its limit.</w:t>
+        <w:t xml:space="preserve">simulations appears close to its limit. The one clear gain left is outside</w:t>
+      </w:r>
+      <w:r>
+        <w:t xml:space="preserve"> </w:t>
+      </w:r>
+      <w:r>
+        <w:t xml:space="preserve">training: 800 simulations per move at play time beat the final model at 50</w:t>
+      </w:r>
+      <w:r>
+        <w:t xml:space="preserve"> </w:t>
+      </w:r>
+      <w:r>
+        <w:t xml:space="preserve">by 23 wins to 0 (Section 6.11).</w:t>
       </w:r>
     </w:p>
     <w:p>
@@ -8052,8 +8733,8 @@
         <w:t xml:space="preserve">problem every change we tried ran into.</w:t>
       </w:r>
     </w:p>
-    <w:bookmarkEnd w:id="55"/>
-    <w:bookmarkStart w:id="56" w:name="limitations-and-future-work"/>
+    <w:bookmarkEnd w:id="56"/>
+    <w:bookmarkStart w:id="57" w:name="limitations-and-future-work"/>
     <w:p>
       <w:pPr>
         <w:pStyle w:val="Heading1"/>
@@ -8202,8 +8883,8 @@
         <w:t xml:space="preserve">play to improve on it.</w:t>
       </w:r>
     </w:p>
-    <w:bookmarkEnd w:id="56"/>
-    <w:bookmarkStart w:id="57" w:name="conclusion"/>
+    <w:bookmarkEnd w:id="57"/>
+    <w:bookmarkStart w:id="58" w:name="conclusion"/>
     <w:p>
       <w:pPr>
         <w:pStyle w:val="Heading1"/>
@@ -8265,13 +8946,25 @@
         <w:t xml:space="preserve"> </w:t>
       </w:r>
       <w:r>
-        <w:t xml:space="preserve">advantage remains the open problem: neither more search at play time,</w:t>
-      </w:r>
-      <w:r>
-        <w:t xml:space="preserve"> </w:t>
-      </w:r>
-      <w:r>
-        <w:t xml:space="preserve">counting draws as bad in training, nor a larger network solved it, and the</w:t>
+        <w:t xml:space="preserve">advantage remains the open problem. More search at play time makes it</w:t>
+      </w:r>
+      <w:r>
+        <w:t xml:space="preserve"> </w:t>
+      </w:r>
+      <w:r>
+        <w:t xml:space="preserve">clearly stronger (23 wins to 0 at 800 simulations against 50), but neither</w:t>
+      </w:r>
+      <w:r>
+        <w:t xml:space="preserve"> </w:t>
+      </w:r>
+      <w:r>
+        <w:t xml:space="preserve">that, longer training at smaller learning rates, counting draws as bad, nor a</w:t>
+      </w:r>
+      <w:r>
+        <w:t xml:space="preserve"> </w:t>
+      </w:r>
+      <w:r>
+        <w:t xml:space="preserve">larger network solved it, and the</w:t>
       </w:r>
       <w:r>
         <w:t xml:space="preserve"> </w:t>
@@ -8298,8 +8991,8 @@
         <w:t xml:space="preserve">both the negative and the positive result measurable.</w:t>
       </w:r>
     </w:p>
-    <w:bookmarkEnd w:id="57"/>
-    <w:bookmarkStart w:id="58" w:name="references"/>
+    <w:bookmarkEnd w:id="58"/>
+    <w:bookmarkStart w:id="59" w:name="references"/>
     <w:p>
       <w:pPr>
         <w:pStyle w:val="Heading1"/>
@@ -8370,8 +9063,8 @@
         <w:t xml:space="preserve">, 550, 354-359.</w:t>
       </w:r>
     </w:p>
-    <w:bookmarkEnd w:id="58"/>
-    <w:bookmarkStart w:id="59" w:name="appendix-a-team-roles"/>
+    <w:bookmarkEnd w:id="59"/>
+    <w:bookmarkStart w:id="60" w:name="appendix-a-team-roles"/>
     <w:p>
       <w:pPr>
         <w:pStyle w:val="Heading1"/>
@@ -8518,8 +9211,8 @@
         </w:tc>
       </w:tr>
     </w:tbl>
-    <w:bookmarkEnd w:id="59"/>
-    <w:bookmarkStart w:id="60" w:name="appendix-b-reproducing-the-results"/>
+    <w:bookmarkEnd w:id="60"/>
+    <w:bookmarkStart w:id="61" w:name="appendix-b-reproducing-the-results"/>
     <w:p>
       <w:pPr>
         <w:pStyle w:val="Heading1"/>
@@ -8680,7 +9373,7 @@
         <w:rPr>
           <w:rStyle w:val="VerbatimChar"/>
         </w:rPr>
-        <w:t xml:space="preserve">python play_vs_ai.py --checkpoint models/chaturangzero_final.pt --player NAME</w:t>
+        <w:t xml:space="preserve">python play_vs_ai.py --checkpoint models/chaturangzero_final.pt --player NAME --simulations 800</w:t>
       </w:r>
     </w:p>
     <w:p>
@@ -8721,7 +9414,7 @@
         <w:t xml:space="preserve">.</w:t>
       </w:r>
     </w:p>
-    <w:bookmarkEnd w:id="60"/>
+    <w:bookmarkEnd w:id="61"/>
     <w:sectPr>
       <w:footnotePr>
         <w:numRestart w:val="eachSect"/>

</xml_diff>

<commit_message>
Add the play-time search results and the 2e-5 training stretch (#21)
The final model at 400 and 800 simulations per move against itself at 50
(0.560 and 0.616, no losses), and 140 more iterations at learning rate 2e-5,
which were not measurably stronger than the final model (0.515 at iteration
700 over 200 games). Updates the report, the docx and the READMEs, and
recommends 800 simulations for games against the final model.

Co-authored-by: Claude Opus 5.5 <noreply@anthropic.com>
</commit_message>
<xml_diff>
--- a/report/REPORT.docx
+++ b/report/REPORT.docx
@@ -154,7 +154,19 @@
         <w:t xml:space="preserve"> </w:t>
       </w:r>
       <w:r>
-        <w:t xml:space="preserve">gave a small gain and a loss of strength respectively. After moving self-play</w:t>
+        <w:t xml:space="preserve">gave a gain and a loss of strength respectively: with 800 simulations per</w:t>
+      </w:r>
+      <w:r>
+        <w:t xml:space="preserve"> </w:t>
+      </w:r>
+      <w:r>
+        <w:t xml:space="preserve">move the final model beats itself at 50 by 23 wins to 0. 140 more iterations</w:t>
+      </w:r>
+      <w:r>
+        <w:t xml:space="preserve"> </w:t>
+      </w:r>
+      <w:r>
+        <w:t xml:space="preserve">at an even smaller learning rate gave no measurable gain. After moving self-play</w:t>
       </w:r>
       <w:r>
         <w:t xml:space="preserve"> </w:t>
@@ -340,7 +352,7 @@
         <w:t xml:space="preserve"> </w:t>
       </w:r>
       <w:r>
-        <w:t xml:space="preserve">(Sections 5.3 and 6.6 to 6.10). Sections 6.11 to 6.13 test what else could</w:t>
+        <w:t xml:space="preserve">(Sections 5.3 and 6.6 to 6.10). Sections 6.11 to 6.14 test what else could</w:t>
       </w:r>
       <w:r>
         <w:t xml:space="preserve"> </w:t>
@@ -2663,7 +2675,7 @@
     </w:p>
     <w:bookmarkEnd w:id="20"/>
     <w:bookmarkEnd w:id="21"/>
-    <w:bookmarkStart w:id="54" w:name="results"/>
+    <w:bookmarkStart w:id="55" w:name="results"/>
     <w:p>
       <w:pPr>
         <w:pStyle w:val="Heading1"/>
@@ -2683,7 +2695,7 @@
         <w:t xml:space="preserve"> </w:t>
       </w:r>
       <w:r>
-        <w:t xml:space="preserve">to 6.13 are later attempts to go further; 6.14 breaks the constraints.</w:t>
+        <w:t xml:space="preserve">to 6.14 are later attempts to go further; 6.15 breaks the constraints.</w:t>
       </w:r>
     </w:p>
     <w:bookmarkStart w:id="25" w:name="learning-curves"/>
@@ -6437,315 +6449,7 @@
         <w:t xml:space="preserve"> </w:t>
       </w:r>
       <w:r>
-        <w:t xml:space="preserve">9 wins, 4 losses and 86 draws (0.525 +/- 0.035). Four times the search gives</w:t>
-      </w:r>
-      <w:r>
-        <w:t xml:space="preserve"> </w:t>
-      </w:r>
-      <w:r>
-        <w:t xml:space="preserve">only a small edge, since the extra search does not help it finish games.</w:t>
-      </w:r>
-    </w:p>
-    <w:p>
-      <w:pPr>
-        <w:pStyle w:val="BodyText"/>
-      </w:pPr>
-      <w:r>
-        <w:rPr>
-          <w:b/>
-          <w:bCs/>
-        </w:rPr>
-        <w:t xml:space="preserve">Counting draws as slightly bad.</w:t>
-      </w:r>
-      <w:r>
-        <w:t xml:space="preserve"> </w:t>
-      </w:r>
-      <w:r>
-        <w:t xml:space="preserve">We continued the final model from</w:t>
-      </w:r>
-      <w:r>
-        <w:t xml:space="preserve"> </w:t>
-      </w:r>
-      <w:r>
-        <w:t xml:space="preserve">iteration 560 with a value target of -0.2 for both sides in every drawn or</w:t>
-      </w:r>
-      <w:r>
-        <w:t xml:space="preserve"> </w:t>
-      </w:r>
-      <w:r>
-        <w:t xml:space="preserve">unfinished self-play game, instead of 0, at learning rate 1e-4. It uses only</w:t>
-      </w:r>
-      <w:r>
-        <w:t xml:space="preserve"> </w:t>
-      </w:r>
-      <w:r>
-        <w:t xml:space="preserve">the game result, so it stays within the rules-only constraint. Decisive</w:t>
-      </w:r>
-      <w:r>
-        <w:t xml:space="preserve"> </w:t>
-      </w:r>
-      <w:r>
-        <w:t xml:space="preserve">self-play games rose from about 14% to about 19%, but play got weaker:</w:t>
-      </w:r>
-    </w:p>
-    <w:tbl>
-      <w:tblPr>
-        <w:tblStyle w:val="Table"/>
-        <w:tblW w:type="auto" w:w="0"/>
-        <w:tblLook w:firstRow="1" w:lastRow="0" w:firstColumn="0" w:lastColumn="0" w:noHBand="0" w:noVBand="0" w:val="0020"/>
-      </w:tblPr>
-      <w:tblGrid>
-        <w:gridCol w:w="1320"/>
-        <w:gridCol w:w="1320"/>
-        <w:gridCol w:w="1320"/>
-        <w:gridCol w:w="1320"/>
-        <w:gridCol w:w="1320"/>
-        <w:gridCol w:w="1320"/>
-      </w:tblGrid>
-      <w:tr>
-        <w:trPr>
-          <w:tblHeader w:val="on"/>
-        </w:trPr>
-        <w:tc>
-          <w:tcPr/>
-          <w:p>
-            <w:pPr>
-              <w:pStyle w:val="Compact"/>
-            </w:pPr>
-            <w:r>
-              <w:t xml:space="preserve">Match (100 games)</w:t>
-            </w:r>
-          </w:p>
-        </w:tc>
-        <w:tc>
-          <w:tcPr/>
-          <w:p>
-            <w:pPr>
-              <w:pStyle w:val="Compact"/>
-            </w:pPr>
-            <w:r>
-              <w:t xml:space="preserve">Wins</w:t>
-            </w:r>
-          </w:p>
-        </w:tc>
-        <w:tc>
-          <w:tcPr/>
-          <w:p>
-            <w:pPr>
-              <w:pStyle w:val="Compact"/>
-            </w:pPr>
-            <w:r>
-              <w:t xml:space="preserve">Losses</w:t>
-            </w:r>
-          </w:p>
-        </w:tc>
-        <w:tc>
-          <w:tcPr/>
-          <w:p>
-            <w:pPr>
-              <w:pStyle w:val="Compact"/>
-            </w:pPr>
-            <w:r>
-              <w:t xml:space="preserve">Draws</w:t>
-            </w:r>
-          </w:p>
-        </w:tc>
-        <w:tc>
-          <w:tcPr/>
-          <w:p>
-            <w:pPr>
-              <w:pStyle w:val="Compact"/>
-            </w:pPr>
-            <w:r>
-              <w:t xml:space="preserve">Unfinished</w:t>
-            </w:r>
-          </w:p>
-        </w:tc>
-        <w:tc>
-          <w:tcPr/>
-          <w:p>
-            <w:pPr>
-              <w:pStyle w:val="Compact"/>
-            </w:pPr>
-            <w:r>
-              <w:t xml:space="preserve">Score</w:t>
-            </w:r>
-          </w:p>
-        </w:tc>
-      </w:tr>
-      <w:tr>
-        <w:tc>
-          <w:tcPr/>
-          <w:p>
-            <w:pPr>
-              <w:pStyle w:val="Compact"/>
-            </w:pPr>
-            <w:r>
-              <w:t xml:space="preserve">iteration 600 vs final (560)</w:t>
-            </w:r>
-          </w:p>
-        </w:tc>
-        <w:tc>
-          <w:tcPr/>
-          <w:p>
-            <w:pPr>
-              <w:pStyle w:val="Compact"/>
-            </w:pPr>
-            <w:r>
-              <w:t xml:space="preserve">4</w:t>
-            </w:r>
-          </w:p>
-        </w:tc>
-        <w:tc>
-          <w:tcPr/>
-          <w:p>
-            <w:pPr>
-              <w:pStyle w:val="Compact"/>
-            </w:pPr>
-            <w:r>
-              <w:t xml:space="preserve">9</w:t>
-            </w:r>
-          </w:p>
-        </w:tc>
-        <w:tc>
-          <w:tcPr/>
-          <w:p>
-            <w:pPr>
-              <w:pStyle w:val="Compact"/>
-            </w:pPr>
-            <w:r>
-              <w:t xml:space="preserve">85</w:t>
-            </w:r>
-          </w:p>
-        </w:tc>
-        <w:tc>
-          <w:tcPr/>
-          <w:p>
-            <w:pPr>
-              <w:pStyle w:val="Compact"/>
-            </w:pPr>
-            <w:r>
-              <w:t xml:space="preserve">2</w:t>
-            </w:r>
-          </w:p>
-        </w:tc>
-        <w:tc>
-          <w:tcPr/>
-          <w:p>
-            <w:pPr>
-              <w:pStyle w:val="Compact"/>
-            </w:pPr>
-            <w:r>
-              <w:t xml:space="preserve">0.474 +/- 0.036</w:t>
-            </w:r>
-          </w:p>
-        </w:tc>
-      </w:tr>
-      <w:tr>
-        <w:tc>
-          <w:tcPr/>
-          <w:p>
-            <w:pPr>
-              <w:pStyle w:val="Compact"/>
-            </w:pPr>
-            <w:r>
-              <w:t xml:space="preserve">iteration 630 vs final (560)</w:t>
-            </w:r>
-          </w:p>
-        </w:tc>
-        <w:tc>
-          <w:tcPr/>
-          <w:p>
-            <w:pPr>
-              <w:pStyle w:val="Compact"/>
-            </w:pPr>
-            <w:r>
-              <w:t xml:space="preserve">0</w:t>
-            </w:r>
-          </w:p>
-        </w:tc>
-        <w:tc>
-          <w:tcPr/>
-          <w:p>
-            <w:pPr>
-              <w:pStyle w:val="Compact"/>
-            </w:pPr>
-            <w:r>
-              <w:t xml:space="preserve">9</w:t>
-            </w:r>
-          </w:p>
-        </w:tc>
-        <w:tc>
-          <w:tcPr/>
-          <w:p>
-            <w:pPr>
-              <w:pStyle w:val="Compact"/>
-            </w:pPr>
-            <w:r>
-              <w:t xml:space="preserve">89</w:t>
-            </w:r>
-          </w:p>
-        </w:tc>
-        <w:tc>
-          <w:tcPr/>
-          <w:p>
-            <w:pPr>
-              <w:pStyle w:val="Compact"/>
-            </w:pPr>
-            <w:r>
-              <w:t xml:space="preserve">2</w:t>
-            </w:r>
-          </w:p>
-        </w:tc>
-        <w:tc>
-          <w:tcPr/>
-          <w:p>
-            <w:pPr>
-              <w:pStyle w:val="Compact"/>
-            </w:pPr>
-            <w:r>
-              <w:t xml:space="preserve">0.454 +/- 0.029</w:t>
-            </w:r>
-          </w:p>
-        </w:tc>
-      </w:tr>
-    </w:tbl>
-    <w:p>
-      <w:pPr>
-        <w:pStyle w:val="BodyText"/>
-      </w:pPr>
-      <w:r>
-        <w:t xml:space="preserve">We stopped it at iteration 631 and kept iteration 560 as the final model.</w:t>
-      </w:r>
-    </w:p>
-    <w:bookmarkEnd w:id="47"/>
-    <w:bookmarkStart w:id="48" w:name="the-larger-network-second-attempt"/>
-    <w:p>
-      <w:pPr>
-        <w:pStyle w:val="Heading2"/>
-      </w:pPr>
-      <w:r>
-        <w:t xml:space="preserve">6.12 The larger network, second attempt</w:t>
-      </w:r>
-    </w:p>
-    <w:p>
-      <w:pPr>
-        <w:pStyle w:val="FirstParagraph"/>
-      </w:pPr>
-      <w:r>
-        <w:t xml:space="preserve">With GPU self-play an iteration of the 6 x 128 network takes about 10</w:t>
-      </w:r>
-      <w:r>
-        <w:t xml:space="preserve"> </w:t>
-      </w:r>
-      <w:r>
-        <w:t xml:space="preserve">minutes instead of 25 to 30. We trained it again, this time learning for 30</w:t>
-      </w:r>
-      <w:r>
-        <w:t xml:space="preserve"> </w:t>
-      </w:r>
-      <w:r>
-        <w:t xml:space="preserve">iterations from games played by the final model before playing its own.</w:t>
+        <w:t xml:space="preserve">9 wins, 4 losses and 86 draws (0.525 +/- 0.035). More search helps more:</w:t>
       </w:r>
     </w:p>
     <w:tbl>
@@ -6774,6 +6478,637 @@
               <w:pStyle w:val="Compact"/>
             </w:pPr>
             <w:r>
+              <w:t xml:space="preserve">Final model, simulations per move (vs itself at 50, 100 games)</w:t>
+            </w:r>
+          </w:p>
+        </w:tc>
+        <w:tc>
+          <w:tcPr/>
+          <w:p>
+            <w:pPr>
+              <w:pStyle w:val="Compact"/>
+            </w:pPr>
+            <w:r>
+              <w:t xml:space="preserve">Wins</w:t>
+            </w:r>
+          </w:p>
+        </w:tc>
+        <w:tc>
+          <w:tcPr/>
+          <w:p>
+            <w:pPr>
+              <w:pStyle w:val="Compact"/>
+            </w:pPr>
+            <w:r>
+              <w:t xml:space="preserve">Losses</w:t>
+            </w:r>
+          </w:p>
+        </w:tc>
+        <w:tc>
+          <w:tcPr/>
+          <w:p>
+            <w:pPr>
+              <w:pStyle w:val="Compact"/>
+            </w:pPr>
+            <w:r>
+              <w:t xml:space="preserve">Draws</w:t>
+            </w:r>
+          </w:p>
+        </w:tc>
+        <w:tc>
+          <w:tcPr/>
+          <w:p>
+            <w:pPr>
+              <w:pStyle w:val="Compact"/>
+            </w:pPr>
+            <w:r>
+              <w:t xml:space="preserve">Unfinished</w:t>
+            </w:r>
+          </w:p>
+        </w:tc>
+        <w:tc>
+          <w:tcPr/>
+          <w:p>
+            <w:pPr>
+              <w:pStyle w:val="Compact"/>
+            </w:pPr>
+            <w:r>
+              <w:t xml:space="preserve">Score</w:t>
+            </w:r>
+          </w:p>
+        </w:tc>
+      </w:tr>
+      <w:tr>
+        <w:tc>
+          <w:tcPr/>
+          <w:p>
+            <w:pPr>
+              <w:pStyle w:val="Compact"/>
+            </w:pPr>
+            <w:r>
+              <w:t xml:space="preserve">200</w:t>
+            </w:r>
+          </w:p>
+        </w:tc>
+        <w:tc>
+          <w:tcPr/>
+          <w:p>
+            <w:pPr>
+              <w:pStyle w:val="Compact"/>
+            </w:pPr>
+            <w:r>
+              <w:t xml:space="preserve">9</w:t>
+            </w:r>
+          </w:p>
+        </w:tc>
+        <w:tc>
+          <w:tcPr/>
+          <w:p>
+            <w:pPr>
+              <w:pStyle w:val="Compact"/>
+            </w:pPr>
+            <w:r>
+              <w:t xml:space="preserve">4</w:t>
+            </w:r>
+          </w:p>
+        </w:tc>
+        <w:tc>
+          <w:tcPr/>
+          <w:p>
+            <w:pPr>
+              <w:pStyle w:val="Compact"/>
+            </w:pPr>
+            <w:r>
+              <w:t xml:space="preserve">86</w:t>
+            </w:r>
+          </w:p>
+        </w:tc>
+        <w:tc>
+          <w:tcPr/>
+          <w:p>
+            <w:pPr>
+              <w:pStyle w:val="Compact"/>
+            </w:pPr>
+            <w:r>
+              <w:t xml:space="preserve">1</w:t>
+            </w:r>
+          </w:p>
+        </w:tc>
+        <w:tc>
+          <w:tcPr/>
+          <w:p>
+            <w:pPr>
+              <w:pStyle w:val="Compact"/>
+            </w:pPr>
+            <w:r>
+              <w:t xml:space="preserve">0.525 +/- 0.035</w:t>
+            </w:r>
+          </w:p>
+        </w:tc>
+      </w:tr>
+      <w:tr>
+        <w:tc>
+          <w:tcPr/>
+          <w:p>
+            <w:pPr>
+              <w:pStyle w:val="Compact"/>
+            </w:pPr>
+            <w:r>
+              <w:t xml:space="preserve">400</w:t>
+            </w:r>
+          </w:p>
+        </w:tc>
+        <w:tc>
+          <w:tcPr/>
+          <w:p>
+            <w:pPr>
+              <w:pStyle w:val="Compact"/>
+            </w:pPr>
+            <w:r>
+              <w:t xml:space="preserve">12</w:t>
+            </w:r>
+          </w:p>
+        </w:tc>
+        <w:tc>
+          <w:tcPr/>
+          <w:p>
+            <w:pPr>
+              <w:pStyle w:val="Compact"/>
+            </w:pPr>
+            <w:r>
+              <w:t xml:space="preserve">0</w:t>
+            </w:r>
+          </w:p>
+        </w:tc>
+        <w:tc>
+          <w:tcPr/>
+          <w:p>
+            <w:pPr>
+              <w:pStyle w:val="Compact"/>
+            </w:pPr>
+            <w:r>
+              <w:t xml:space="preserve">88</w:t>
+            </w:r>
+          </w:p>
+        </w:tc>
+        <w:tc>
+          <w:tcPr/>
+          <w:p>
+            <w:pPr>
+              <w:pStyle w:val="Compact"/>
+            </w:pPr>
+            <w:r>
+              <w:t xml:space="preserve">0</w:t>
+            </w:r>
+          </w:p>
+        </w:tc>
+        <w:tc>
+          <w:tcPr/>
+          <w:p>
+            <w:pPr>
+              <w:pStyle w:val="Compact"/>
+            </w:pPr>
+            <w:r>
+              <w:t xml:space="preserve">0.560 +/- 0.032</w:t>
+            </w:r>
+          </w:p>
+        </w:tc>
+      </w:tr>
+      <w:tr>
+        <w:tc>
+          <w:tcPr/>
+          <w:p>
+            <w:pPr>
+              <w:pStyle w:val="Compact"/>
+            </w:pPr>
+            <w:r>
+              <w:t xml:space="preserve">800</w:t>
+            </w:r>
+          </w:p>
+        </w:tc>
+        <w:tc>
+          <w:tcPr/>
+          <w:p>
+            <w:pPr>
+              <w:pStyle w:val="Compact"/>
+            </w:pPr>
+            <w:r>
+              <w:t xml:space="preserve">23</w:t>
+            </w:r>
+          </w:p>
+        </w:tc>
+        <w:tc>
+          <w:tcPr/>
+          <w:p>
+            <w:pPr>
+              <w:pStyle w:val="Compact"/>
+            </w:pPr>
+            <w:r>
+              <w:t xml:space="preserve">0</w:t>
+            </w:r>
+          </w:p>
+        </w:tc>
+        <w:tc>
+          <w:tcPr/>
+          <w:p>
+            <w:pPr>
+              <w:pStyle w:val="Compact"/>
+            </w:pPr>
+            <w:r>
+              <w:t xml:space="preserve">76</w:t>
+            </w:r>
+          </w:p>
+        </w:tc>
+        <w:tc>
+          <w:tcPr/>
+          <w:p>
+            <w:pPr>
+              <w:pStyle w:val="Compact"/>
+            </w:pPr>
+            <w:r>
+              <w:t xml:space="preserve">1</w:t>
+            </w:r>
+          </w:p>
+        </w:tc>
+        <w:tc>
+          <w:tcPr/>
+          <w:p>
+            <w:pPr>
+              <w:pStyle w:val="Compact"/>
+            </w:pPr>
+            <w:r>
+              <w:t xml:space="preserve">0.616 +/- 0.042</w:t>
+            </w:r>
+          </w:p>
+        </w:tc>
+      </w:tr>
+    </w:tbl>
+    <w:p>
+      <w:pPr>
+        <w:pStyle w:val="BodyText"/>
+      </w:pPr>
+      <w:r>
+        <w:t xml:space="preserve">At 800 simulations the model won 23 games and lost none, a larger gain than</w:t>
+      </w:r>
+      <w:r>
+        <w:t xml:space="preserve"> </w:t>
+      </w:r>
+      <w:r>
+        <w:t xml:space="preserve">the last 100 iterations of training gave. Most games are still drawn, so the</w:t>
+      </w:r>
+      <w:r>
+        <w:t xml:space="preserve"> </w:t>
+      </w:r>
+      <w:r>
+        <w:t xml:space="preserve">extra search mainly avoids mistakes and punishes the opponent’s, rather than</w:t>
+      </w:r>
+      <w:r>
+        <w:t xml:space="preserve"> </w:t>
+      </w:r>
+      <w:r>
+        <w:t xml:space="preserve">converting slow advantages. A move then takes about 1 to 2 seconds, which is</w:t>
+      </w:r>
+      <w:r>
+        <w:t xml:space="preserve"> </w:t>
+      </w:r>
+      <w:r>
+        <w:t xml:space="preserve">fine for play against a person, so this is the setting we recommend for</w:t>
+      </w:r>
+      <w:r>
+        <w:t xml:space="preserve"> </w:t>
+      </w:r>
+      <w:r>
+        <w:t xml:space="preserve">games against the final model.</w:t>
+      </w:r>
+    </w:p>
+    <w:p>
+      <w:pPr>
+        <w:pStyle w:val="BodyText"/>
+      </w:pPr>
+      <w:r>
+        <w:rPr>
+          <w:b/>
+          <w:bCs/>
+        </w:rPr>
+        <w:t xml:space="preserve">Counting draws as slightly bad.</w:t>
+      </w:r>
+      <w:r>
+        <w:t xml:space="preserve"> </w:t>
+      </w:r>
+      <w:r>
+        <w:t xml:space="preserve">We continued the final model from</w:t>
+      </w:r>
+      <w:r>
+        <w:t xml:space="preserve"> </w:t>
+      </w:r>
+      <w:r>
+        <w:t xml:space="preserve">iteration 560 with a value target of -0.2 for both sides in every drawn or</w:t>
+      </w:r>
+      <w:r>
+        <w:t xml:space="preserve"> </w:t>
+      </w:r>
+      <w:r>
+        <w:t xml:space="preserve">unfinished self-play game, instead of 0, at learning rate 1e-4. It uses only</w:t>
+      </w:r>
+      <w:r>
+        <w:t xml:space="preserve"> </w:t>
+      </w:r>
+      <w:r>
+        <w:t xml:space="preserve">the game result, so it stays within the rules-only constraint. Decisive</w:t>
+      </w:r>
+      <w:r>
+        <w:t xml:space="preserve"> </w:t>
+      </w:r>
+      <w:r>
+        <w:t xml:space="preserve">self-play games rose from about 14% to about 19%, but play got weaker:</w:t>
+      </w:r>
+    </w:p>
+    <w:tbl>
+      <w:tblPr>
+        <w:tblStyle w:val="Table"/>
+        <w:tblW w:type="auto" w:w="0"/>
+        <w:tblLook w:firstRow="1" w:lastRow="0" w:firstColumn="0" w:lastColumn="0" w:noHBand="0" w:noVBand="0" w:val="0020"/>
+      </w:tblPr>
+      <w:tblGrid>
+        <w:gridCol w:w="1320"/>
+        <w:gridCol w:w="1320"/>
+        <w:gridCol w:w="1320"/>
+        <w:gridCol w:w="1320"/>
+        <w:gridCol w:w="1320"/>
+        <w:gridCol w:w="1320"/>
+      </w:tblGrid>
+      <w:tr>
+        <w:trPr>
+          <w:tblHeader w:val="on"/>
+        </w:trPr>
+        <w:tc>
+          <w:tcPr/>
+          <w:p>
+            <w:pPr>
+              <w:pStyle w:val="Compact"/>
+            </w:pPr>
+            <w:r>
+              <w:t xml:space="preserve">Match (100 games)</w:t>
+            </w:r>
+          </w:p>
+        </w:tc>
+        <w:tc>
+          <w:tcPr/>
+          <w:p>
+            <w:pPr>
+              <w:pStyle w:val="Compact"/>
+            </w:pPr>
+            <w:r>
+              <w:t xml:space="preserve">Wins</w:t>
+            </w:r>
+          </w:p>
+        </w:tc>
+        <w:tc>
+          <w:tcPr/>
+          <w:p>
+            <w:pPr>
+              <w:pStyle w:val="Compact"/>
+            </w:pPr>
+            <w:r>
+              <w:t xml:space="preserve">Losses</w:t>
+            </w:r>
+          </w:p>
+        </w:tc>
+        <w:tc>
+          <w:tcPr/>
+          <w:p>
+            <w:pPr>
+              <w:pStyle w:val="Compact"/>
+            </w:pPr>
+            <w:r>
+              <w:t xml:space="preserve">Draws</w:t>
+            </w:r>
+          </w:p>
+        </w:tc>
+        <w:tc>
+          <w:tcPr/>
+          <w:p>
+            <w:pPr>
+              <w:pStyle w:val="Compact"/>
+            </w:pPr>
+            <w:r>
+              <w:t xml:space="preserve">Unfinished</w:t>
+            </w:r>
+          </w:p>
+        </w:tc>
+        <w:tc>
+          <w:tcPr/>
+          <w:p>
+            <w:pPr>
+              <w:pStyle w:val="Compact"/>
+            </w:pPr>
+            <w:r>
+              <w:t xml:space="preserve">Score</w:t>
+            </w:r>
+          </w:p>
+        </w:tc>
+      </w:tr>
+      <w:tr>
+        <w:tc>
+          <w:tcPr/>
+          <w:p>
+            <w:pPr>
+              <w:pStyle w:val="Compact"/>
+            </w:pPr>
+            <w:r>
+              <w:t xml:space="preserve">iteration 600 vs final (560)</w:t>
+            </w:r>
+          </w:p>
+        </w:tc>
+        <w:tc>
+          <w:tcPr/>
+          <w:p>
+            <w:pPr>
+              <w:pStyle w:val="Compact"/>
+            </w:pPr>
+            <w:r>
+              <w:t xml:space="preserve">4</w:t>
+            </w:r>
+          </w:p>
+        </w:tc>
+        <w:tc>
+          <w:tcPr/>
+          <w:p>
+            <w:pPr>
+              <w:pStyle w:val="Compact"/>
+            </w:pPr>
+            <w:r>
+              <w:t xml:space="preserve">9</w:t>
+            </w:r>
+          </w:p>
+        </w:tc>
+        <w:tc>
+          <w:tcPr/>
+          <w:p>
+            <w:pPr>
+              <w:pStyle w:val="Compact"/>
+            </w:pPr>
+            <w:r>
+              <w:t xml:space="preserve">85</w:t>
+            </w:r>
+          </w:p>
+        </w:tc>
+        <w:tc>
+          <w:tcPr/>
+          <w:p>
+            <w:pPr>
+              <w:pStyle w:val="Compact"/>
+            </w:pPr>
+            <w:r>
+              <w:t xml:space="preserve">2</w:t>
+            </w:r>
+          </w:p>
+        </w:tc>
+        <w:tc>
+          <w:tcPr/>
+          <w:p>
+            <w:pPr>
+              <w:pStyle w:val="Compact"/>
+            </w:pPr>
+            <w:r>
+              <w:t xml:space="preserve">0.474 +/- 0.036</w:t>
+            </w:r>
+          </w:p>
+        </w:tc>
+      </w:tr>
+      <w:tr>
+        <w:tc>
+          <w:tcPr/>
+          <w:p>
+            <w:pPr>
+              <w:pStyle w:val="Compact"/>
+            </w:pPr>
+            <w:r>
+              <w:t xml:space="preserve">iteration 630 vs final (560)</w:t>
+            </w:r>
+          </w:p>
+        </w:tc>
+        <w:tc>
+          <w:tcPr/>
+          <w:p>
+            <w:pPr>
+              <w:pStyle w:val="Compact"/>
+            </w:pPr>
+            <w:r>
+              <w:t xml:space="preserve">0</w:t>
+            </w:r>
+          </w:p>
+        </w:tc>
+        <w:tc>
+          <w:tcPr/>
+          <w:p>
+            <w:pPr>
+              <w:pStyle w:val="Compact"/>
+            </w:pPr>
+            <w:r>
+              <w:t xml:space="preserve">9</w:t>
+            </w:r>
+          </w:p>
+        </w:tc>
+        <w:tc>
+          <w:tcPr/>
+          <w:p>
+            <w:pPr>
+              <w:pStyle w:val="Compact"/>
+            </w:pPr>
+            <w:r>
+              <w:t xml:space="preserve">89</w:t>
+            </w:r>
+          </w:p>
+        </w:tc>
+        <w:tc>
+          <w:tcPr/>
+          <w:p>
+            <w:pPr>
+              <w:pStyle w:val="Compact"/>
+            </w:pPr>
+            <w:r>
+              <w:t xml:space="preserve">2</w:t>
+            </w:r>
+          </w:p>
+        </w:tc>
+        <w:tc>
+          <w:tcPr/>
+          <w:p>
+            <w:pPr>
+              <w:pStyle w:val="Compact"/>
+            </w:pPr>
+            <w:r>
+              <w:t xml:space="preserve">0.454 +/- 0.029</w:t>
+            </w:r>
+          </w:p>
+        </w:tc>
+      </w:tr>
+    </w:tbl>
+    <w:p>
+      <w:pPr>
+        <w:pStyle w:val="BodyText"/>
+      </w:pPr>
+      <w:r>
+        <w:t xml:space="preserve">We stopped it at iteration 631 and kept iteration 560 as the final model.</w:t>
+      </w:r>
+    </w:p>
+    <w:bookmarkEnd w:id="47"/>
+    <w:bookmarkStart w:id="48" w:name="the-larger-network-second-attempt"/>
+    <w:p>
+      <w:pPr>
+        <w:pStyle w:val="Heading2"/>
+      </w:pPr>
+      <w:r>
+        <w:t xml:space="preserve">6.12 The larger network, second attempt</w:t>
+      </w:r>
+    </w:p>
+    <w:p>
+      <w:pPr>
+        <w:pStyle w:val="FirstParagraph"/>
+      </w:pPr>
+      <w:r>
+        <w:t xml:space="preserve">With GPU self-play an iteration of the 6 x 128 network takes about 10</w:t>
+      </w:r>
+      <w:r>
+        <w:t xml:space="preserve"> </w:t>
+      </w:r>
+      <w:r>
+        <w:t xml:space="preserve">minutes instead of 25 to 30. We trained it again, this time learning for 30</w:t>
+      </w:r>
+      <w:r>
+        <w:t xml:space="preserve"> </w:t>
+      </w:r>
+      <w:r>
+        <w:t xml:space="preserve">iterations from games played by the final model before playing its own.</w:t>
+      </w:r>
+    </w:p>
+    <w:tbl>
+      <w:tblPr>
+        <w:tblStyle w:val="Table"/>
+        <w:tblW w:type="pct" w:w="5000"/>
+        <w:tblLayout w:type="fixed"/>
+        <w:tblLook w:firstRow="1" w:lastRow="0" w:firstColumn="0" w:lastColumn="0" w:noHBand="0" w:noVBand="0" w:val="0020"/>
+      </w:tblPr>
+      <w:tblGrid>
+        <w:gridCol w:w="1320"/>
+        <w:gridCol w:w="1320"/>
+        <w:gridCol w:w="1320"/>
+        <w:gridCol w:w="1320"/>
+        <w:gridCol w:w="1320"/>
+        <w:gridCol w:w="1320"/>
+      </w:tblGrid>
+      <w:tr>
+        <w:trPr>
+          <w:tblHeader w:val="on"/>
+        </w:trPr>
+        <w:tc>
+          <w:tcPr/>
+          <w:p>
+            <w:pPr>
+              <w:pStyle w:val="Compact"/>
+            </w:pPr>
+            <w:r>
               <w:t xml:space="preserve">Run</w:t>
             </w:r>
           </w:p>
@@ -7489,13 +7824,347 @@
       </w:r>
     </w:p>
     <w:bookmarkEnd w:id="49"/>
-    <w:bookmarkStart w:id="53" w:name="X7e697f50ae1dd5e44c97332acfdfba23be11cde"/>
+    <w:bookmarkStart w:id="50" w:name="even-smaller-learning-steps"/>
     <w:p>
       <w:pPr>
         <w:pStyle w:val="Heading2"/>
       </w:pPr>
       <w:r>
-        <w:t xml:space="preserve">6.14 Exploratory runs (outside the course constraints)</w:t>
+        <w:t xml:space="preserve">6.14 Even smaller learning steps</w:t>
+      </w:r>
+    </w:p>
+    <w:p>
+      <w:pPr>
+        <w:pStyle w:val="FirstParagraph"/>
+      </w:pPr>
+      <w:r>
+        <w:t xml:space="preserve">The lower learning rates of Section 6.8 still gave small gains, so we</w:t>
+      </w:r>
+      <w:r>
+        <w:t xml:space="preserve"> </w:t>
+      </w:r>
+      <w:r>
+        <w:t xml:space="preserve">continued the final model from iteration 560 for 140 more iterations at</w:t>
+      </w:r>
+      <w:r>
+        <w:t xml:space="preserve"> </w:t>
+      </w:r>
+      <w:r>
+        <w:t xml:space="preserve">learning rate 2e-5 (about 10 hours with GPU self-play):</w:t>
+      </w:r>
+    </w:p>
+    <w:tbl>
+      <w:tblPr>
+        <w:tblStyle w:val="Table"/>
+        <w:tblW w:type="auto" w:w="0"/>
+        <w:tblLook w:firstRow="1" w:lastRow="0" w:firstColumn="0" w:lastColumn="0" w:noHBand="0" w:noVBand="0" w:val="0020"/>
+      </w:tblPr>
+      <w:tblGrid>
+        <w:gridCol w:w="1320"/>
+        <w:gridCol w:w="1320"/>
+        <w:gridCol w:w="1320"/>
+        <w:gridCol w:w="1320"/>
+        <w:gridCol w:w="1320"/>
+        <w:gridCol w:w="1320"/>
+      </w:tblGrid>
+      <w:tr>
+        <w:trPr>
+          <w:tblHeader w:val="on"/>
+        </w:trPr>
+        <w:tc>
+          <w:tcPr/>
+          <w:p>
+            <w:pPr>
+              <w:pStyle w:val="Compact"/>
+            </w:pPr>
+            <w:r>
+              <w:t xml:space="preserve">Match vs final (560)</w:t>
+            </w:r>
+          </w:p>
+        </w:tc>
+        <w:tc>
+          <w:tcPr/>
+          <w:p>
+            <w:pPr>
+              <w:pStyle w:val="Compact"/>
+            </w:pPr>
+            <w:r>
+              <w:t xml:space="preserve">Games</w:t>
+            </w:r>
+          </w:p>
+        </w:tc>
+        <w:tc>
+          <w:tcPr/>
+          <w:p>
+            <w:pPr>
+              <w:pStyle w:val="Compact"/>
+            </w:pPr>
+            <w:r>
+              <w:t xml:space="preserve">Wins</w:t>
+            </w:r>
+          </w:p>
+        </w:tc>
+        <w:tc>
+          <w:tcPr/>
+          <w:p>
+            <w:pPr>
+              <w:pStyle w:val="Compact"/>
+            </w:pPr>
+            <w:r>
+              <w:t xml:space="preserve">Losses</w:t>
+            </w:r>
+          </w:p>
+        </w:tc>
+        <w:tc>
+          <w:tcPr/>
+          <w:p>
+            <w:pPr>
+              <w:pStyle w:val="Compact"/>
+            </w:pPr>
+            <w:r>
+              <w:t xml:space="preserve">Draws</w:t>
+            </w:r>
+          </w:p>
+        </w:tc>
+        <w:tc>
+          <w:tcPr/>
+          <w:p>
+            <w:pPr>
+              <w:pStyle w:val="Compact"/>
+            </w:pPr>
+            <w:r>
+              <w:t xml:space="preserve">Score</w:t>
+            </w:r>
+          </w:p>
+        </w:tc>
+      </w:tr>
+      <w:tr>
+        <w:tc>
+          <w:tcPr/>
+          <w:p>
+            <w:pPr>
+              <w:pStyle w:val="Compact"/>
+            </w:pPr>
+            <w:r>
+              <w:t xml:space="preserve">iteration 620</w:t>
+            </w:r>
+          </w:p>
+        </w:tc>
+        <w:tc>
+          <w:tcPr/>
+          <w:p>
+            <w:pPr>
+              <w:pStyle w:val="Compact"/>
+            </w:pPr>
+            <w:r>
+              <w:t xml:space="preserve">100</w:t>
+            </w:r>
+          </w:p>
+        </w:tc>
+        <w:tc>
+          <w:tcPr/>
+          <w:p>
+            <w:pPr>
+              <w:pStyle w:val="Compact"/>
+            </w:pPr>
+            <w:r>
+              <w:t xml:space="preserve">3</w:t>
+            </w:r>
+          </w:p>
+        </w:tc>
+        <w:tc>
+          <w:tcPr/>
+          <w:p>
+            <w:pPr>
+              <w:pStyle w:val="Compact"/>
+            </w:pPr>
+            <w:r>
+              <w:t xml:space="preserve">1</w:t>
+            </w:r>
+          </w:p>
+        </w:tc>
+        <w:tc>
+          <w:tcPr/>
+          <w:p>
+            <w:pPr>
+              <w:pStyle w:val="Compact"/>
+            </w:pPr>
+            <w:r>
+              <w:t xml:space="preserve">96</w:t>
+            </w:r>
+          </w:p>
+        </w:tc>
+        <w:tc>
+          <w:tcPr/>
+          <w:p>
+            <w:pPr>
+              <w:pStyle w:val="Compact"/>
+            </w:pPr>
+            <w:r>
+              <w:t xml:space="preserve">0.510 +/- 0.020</w:t>
+            </w:r>
+          </w:p>
+        </w:tc>
+      </w:tr>
+      <w:tr>
+        <w:tc>
+          <w:tcPr/>
+          <w:p>
+            <w:pPr>
+              <w:pStyle w:val="Compact"/>
+            </w:pPr>
+            <w:r>
+              <w:t xml:space="preserve">iteration 660</w:t>
+            </w:r>
+          </w:p>
+        </w:tc>
+        <w:tc>
+          <w:tcPr/>
+          <w:p>
+            <w:pPr>
+              <w:pStyle w:val="Compact"/>
+            </w:pPr>
+            <w:r>
+              <w:t xml:space="preserve">100</w:t>
+            </w:r>
+          </w:p>
+        </w:tc>
+        <w:tc>
+          <w:tcPr/>
+          <w:p>
+            <w:pPr>
+              <w:pStyle w:val="Compact"/>
+            </w:pPr>
+            <w:r>
+              <w:t xml:space="preserve">7</w:t>
+            </w:r>
+          </w:p>
+        </w:tc>
+        <w:tc>
+          <w:tcPr/>
+          <w:p>
+            <w:pPr>
+              <w:pStyle w:val="Compact"/>
+            </w:pPr>
+            <w:r>
+              <w:t xml:space="preserve">7</w:t>
+            </w:r>
+          </w:p>
+        </w:tc>
+        <w:tc>
+          <w:tcPr/>
+          <w:p>
+            <w:pPr>
+              <w:pStyle w:val="Compact"/>
+            </w:pPr>
+            <w:r>
+              <w:t xml:space="preserve">84</w:t>
+            </w:r>
+          </w:p>
+        </w:tc>
+        <w:tc>
+          <w:tcPr/>
+          <w:p>
+            <w:pPr>
+              <w:pStyle w:val="Compact"/>
+            </w:pPr>
+            <w:r>
+              <w:t xml:space="preserve">0.500 +/- 0.037</w:t>
+            </w:r>
+          </w:p>
+        </w:tc>
+      </w:tr>
+      <w:tr>
+        <w:tc>
+          <w:tcPr/>
+          <w:p>
+            <w:pPr>
+              <w:pStyle w:val="Compact"/>
+            </w:pPr>
+            <w:r>
+              <w:t xml:space="preserve">iteration 700</w:t>
+            </w:r>
+          </w:p>
+        </w:tc>
+        <w:tc>
+          <w:tcPr/>
+          <w:p>
+            <w:pPr>
+              <w:pStyle w:val="Compact"/>
+            </w:pPr>
+            <w:r>
+              <w:t xml:space="preserve">200</w:t>
+            </w:r>
+          </w:p>
+        </w:tc>
+        <w:tc>
+          <w:tcPr/>
+          <w:p>
+            <w:pPr>
+              <w:pStyle w:val="Compact"/>
+            </w:pPr>
+            <w:r>
+              <w:t xml:space="preserve">15</w:t>
+            </w:r>
+          </w:p>
+        </w:tc>
+        <w:tc>
+          <w:tcPr/>
+          <w:p>
+            <w:pPr>
+              <w:pStyle w:val="Compact"/>
+            </w:pPr>
+            <w:r>
+              <w:t xml:space="preserve">9</w:t>
+            </w:r>
+          </w:p>
+        </w:tc>
+        <w:tc>
+          <w:tcPr/>
+          <w:p>
+            <w:pPr>
+              <w:pStyle w:val="Compact"/>
+            </w:pPr>
+            <w:r>
+              <w:t xml:space="preserve">173</w:t>
+            </w:r>
+          </w:p>
+        </w:tc>
+        <w:tc>
+          <w:tcPr/>
+          <w:p>
+            <w:pPr>
+              <w:pStyle w:val="Compact"/>
+            </w:pPr>
+            <w:r>
+              <w:t xml:space="preserve">0.515 +/- 0.024</w:t>
+            </w:r>
+          </w:p>
+        </w:tc>
+      </w:tr>
+    </w:tbl>
+    <w:p>
+      <w:pPr>
+        <w:pStyle w:val="BodyText"/>
+      </w:pPr>
+      <w:r>
+        <w:t xml:space="preserve">No checkpoint is clearly stronger than the final model, so we kept</w:t>
+      </w:r>
+      <w:r>
+        <w:t xml:space="preserve"> </w:t>
+      </w:r>
+      <w:r>
+        <w:t xml:space="preserve">iteration 560 and stopped the run at iteration 702.</w:t>
+      </w:r>
+    </w:p>
+    <w:bookmarkEnd w:id="50"/>
+    <w:bookmarkStart w:id="54" w:name="X7e697f50ae1dd5e44c97332acfdfba23be11cde"/>
+    <w:p>
+      <w:pPr>
+        <w:pStyle w:val="Heading2"/>
+      </w:pPr>
+      <w:r>
+        <w:t xml:space="preserve">6.15 Exploratory runs (outside the course constraints)</w:t>
       </w:r>
     </w:p>
     <w:p>
@@ -7601,18 +8270,18 @@
           <wp:inline>
             <wp:extent cx="5334000" cy="3394363"/>
             <wp:effectExtent b="0" l="0" r="0" t="0"/>
-            <wp:docPr descr="Exploratory runs: loss, decisive share and game length." title="" id="51" name="Picture"/>
+            <wp:docPr descr="Exploratory runs: loss, decisive share and game length." title="" id="52" name="Picture"/>
             <a:graphic>
               <a:graphicData uri="http://schemas.openxmlformats.org/drawingml/2006/picture">
                 <pic:pic>
                   <pic:nvPicPr>
-                    <pic:cNvPr descr="../results/training_curves_exploratory.png" id="52" name="Picture"/>
+                    <pic:cNvPr descr="../results/training_curves_exploratory.png" id="53" name="Picture"/>
                     <pic:cNvPicPr>
                       <a:picLocks noChangeArrowheads="1" noChangeAspect="1"/>
                     </pic:cNvPicPr>
                   </pic:nvPicPr>
                   <pic:blipFill>
-                    <a:blip r:embed="rId50"/>
+                    <a:blip r:embed="rId51"/>
                     <a:stretch>
                       <a:fillRect/>
                     </a:stretch>
@@ -7647,9 +8316,9 @@
         <w:t xml:space="preserve">Exploratory runs: loss, decisive share and game length.</w:t>
       </w:r>
     </w:p>
-    <w:bookmarkEnd w:id="53"/>
     <w:bookmarkEnd w:id="54"/>
-    <w:bookmarkStart w:id="55" w:name="discussion"/>
+    <w:bookmarkEnd w:id="55"/>
+    <w:bookmarkStart w:id="56" w:name="discussion"/>
     <w:p>
       <w:pPr>
         <w:pStyle w:val="Heading1"/>
@@ -7953,19 +8622,19 @@
         <w:t xml:space="preserve"> </w:t>
       </w:r>
       <w:r>
-        <w:t xml:space="preserve">previous checkpoint), four times more search at play time gave 0.525, and</w:t>
-      </w:r>
-      <w:r>
-        <w:t xml:space="preserve"> </w:t>
-      </w:r>
-      <w:r>
-        <w:t xml:space="preserve">penalizing draws made the agent play more decisive games against itself but</w:t>
-      </w:r>
-      <w:r>
-        <w:t xml:space="preserve"> </w:t>
-      </w:r>
-      <w:r>
-        <w:t xml:space="preserve">lose more against the final model (Section 6.11). Pushing for decisive results</w:t>
+        <w:t xml:space="preserve">previous checkpoint) and then none at all (0.515 after 140 iterations at</w:t>
+      </w:r>
+      <w:r>
+        <w:t xml:space="preserve"> </w:t>
+      </w:r>
+      <w:r>
+        <w:t xml:space="preserve">2e-5, Section 6.14), and penalizing draws made the agent play more decisive</w:t>
+      </w:r>
+      <w:r>
+        <w:t xml:space="preserve"> </w:t>
+      </w:r>
+      <w:r>
+        <w:t xml:space="preserve">games against itself but lose more against the final model (Section 6.11). Pushing for decisive results</w:t>
       </w:r>
       <w:r>
         <w:t xml:space="preserve"> </w:t>
@@ -7983,7 +8652,19 @@
         <w:t xml:space="preserve"> </w:t>
       </w:r>
       <w:r>
-        <w:t xml:space="preserve">simulations appears close to its limit.</w:t>
+        <w:t xml:space="preserve">simulations appears close to its limit. The one clear gain left is outside</w:t>
+      </w:r>
+      <w:r>
+        <w:t xml:space="preserve"> </w:t>
+      </w:r>
+      <w:r>
+        <w:t xml:space="preserve">training: 800 simulations per move at play time beat the final model at 50</w:t>
+      </w:r>
+      <w:r>
+        <w:t xml:space="preserve"> </w:t>
+      </w:r>
+      <w:r>
+        <w:t xml:space="preserve">by 23 wins to 0 (Section 6.11).</w:t>
       </w:r>
     </w:p>
     <w:p>
@@ -8052,8 +8733,8 @@
         <w:t xml:space="preserve">problem every change we tried ran into.</w:t>
       </w:r>
     </w:p>
-    <w:bookmarkEnd w:id="55"/>
-    <w:bookmarkStart w:id="56" w:name="limitations-and-future-work"/>
+    <w:bookmarkEnd w:id="56"/>
+    <w:bookmarkStart w:id="57" w:name="limitations-and-future-work"/>
     <w:p>
       <w:pPr>
         <w:pStyle w:val="Heading1"/>
@@ -8202,8 +8883,8 @@
         <w:t xml:space="preserve">play to improve on it.</w:t>
       </w:r>
     </w:p>
-    <w:bookmarkEnd w:id="56"/>
-    <w:bookmarkStart w:id="57" w:name="conclusion"/>
+    <w:bookmarkEnd w:id="57"/>
+    <w:bookmarkStart w:id="58" w:name="conclusion"/>
     <w:p>
       <w:pPr>
         <w:pStyle w:val="Heading1"/>
@@ -8265,13 +8946,25 @@
         <w:t xml:space="preserve"> </w:t>
       </w:r>
       <w:r>
-        <w:t xml:space="preserve">advantage remains the open problem: neither more search at play time,</w:t>
-      </w:r>
-      <w:r>
-        <w:t xml:space="preserve"> </w:t>
-      </w:r>
-      <w:r>
-        <w:t xml:space="preserve">counting draws as bad in training, nor a larger network solved it, and the</w:t>
+        <w:t xml:space="preserve">advantage remains the open problem. More search at play time makes it</w:t>
+      </w:r>
+      <w:r>
+        <w:t xml:space="preserve"> </w:t>
+      </w:r>
+      <w:r>
+        <w:t xml:space="preserve">clearly stronger (23 wins to 0 at 800 simulations against 50), but neither</w:t>
+      </w:r>
+      <w:r>
+        <w:t xml:space="preserve"> </w:t>
+      </w:r>
+      <w:r>
+        <w:t xml:space="preserve">that, longer training at smaller learning rates, counting draws as bad, nor a</w:t>
+      </w:r>
+      <w:r>
+        <w:t xml:space="preserve"> </w:t>
+      </w:r>
+      <w:r>
+        <w:t xml:space="preserve">larger network solved it, and the</w:t>
       </w:r>
       <w:r>
         <w:t xml:space="preserve"> </w:t>
@@ -8298,8 +8991,8 @@
         <w:t xml:space="preserve">both the negative and the positive result measurable.</w:t>
       </w:r>
     </w:p>
-    <w:bookmarkEnd w:id="57"/>
-    <w:bookmarkStart w:id="58" w:name="references"/>
+    <w:bookmarkEnd w:id="58"/>
+    <w:bookmarkStart w:id="59" w:name="references"/>
     <w:p>
       <w:pPr>
         <w:pStyle w:val="Heading1"/>
@@ -8370,8 +9063,8 @@
         <w:t xml:space="preserve">, 550, 354-359.</w:t>
       </w:r>
     </w:p>
-    <w:bookmarkEnd w:id="58"/>
-    <w:bookmarkStart w:id="59" w:name="appendix-a-team-roles"/>
+    <w:bookmarkEnd w:id="59"/>
+    <w:bookmarkStart w:id="60" w:name="appendix-a-team-roles"/>
     <w:p>
       <w:pPr>
         <w:pStyle w:val="Heading1"/>
@@ -8518,8 +9211,8 @@
         </w:tc>
       </w:tr>
     </w:tbl>
-    <w:bookmarkEnd w:id="59"/>
-    <w:bookmarkStart w:id="60" w:name="appendix-b-reproducing-the-results"/>
+    <w:bookmarkEnd w:id="60"/>
+    <w:bookmarkStart w:id="61" w:name="appendix-b-reproducing-the-results"/>
     <w:p>
       <w:pPr>
         <w:pStyle w:val="Heading1"/>
@@ -8680,7 +9373,7 @@
         <w:rPr>
           <w:rStyle w:val="VerbatimChar"/>
         </w:rPr>
-        <w:t xml:space="preserve">python play_vs_ai.py --checkpoint models/chaturangzero_final.pt --player NAME</w:t>
+        <w:t xml:space="preserve">python play_vs_ai.py --checkpoint models/chaturangzero_final.pt --player NAME --simulations 800</w:t>
       </w:r>
     </w:p>
     <w:p>
@@ -8721,7 +9414,7 @@
         <w:t xml:space="preserve">.</w:t>
       </w:r>
     </w:p>
-    <w:bookmarkEnd w:id="60"/>
+    <w:bookmarkEnd w:id="61"/>
     <w:sectPr>
       <w:footnotePr>
         <w:numRestart w:val="eachSect"/>

</xml_diff>